<commit_message>
Adição da Implementação no relatório
</commit_message>
<xml_diff>
--- a/Documentation/iteration03/fsoft2026_1DA_4.docx
+++ b/Documentation/iteration03/fsoft2026_1DA_4.docx
@@ -87,6 +87,13 @@
           <w:b/>
           <w:lang w:val="pt-BR"/>
         </w:rPr>
+        <w:t xml:space="preserve">    </w:t>
+      </w:r>
+      <w:r>
+        <w:rPr>
+          <w:b/>
+          <w:lang w:val="pt-BR"/>
+        </w:rPr>
         <w:t>Abstract.</w:t>
       </w:r>
       <w:r>
@@ -99,7 +106,19 @@
         <w:rPr>
           <w:lang w:val="pt-BR"/>
         </w:rPr>
-        <w:t>This report serves as the basis for the development of a "Battleship" console game in C++ using Object-Oriented Programming</w:t>
+        <w:t>This report serves as the basis for th</w:t>
+      </w:r>
+      <w:r>
+        <w:rPr>
+          <w:lang w:val="pt-BR"/>
+        </w:rPr>
+        <w:t xml:space="preserve">e development of a "Battleship" </w:t>
+      </w:r>
+      <w:r>
+        <w:rPr>
+          <w:lang w:val="pt-BR"/>
+        </w:rPr>
+        <w:t>console game in C++ using Object-Oriented Programming</w:t>
       </w:r>
       <w:r>
         <w:rPr>
@@ -373,51 +392,26 @@
     <w:p>
       <w:pPr>
         <w:pStyle w:val="Legenda"/>
-        <w:rPr>
-          <w:lang w:val="pt-BR"/>
-        </w:rPr>
-      </w:pPr>
-      <w:r>
-        <w:rPr>
-          <w:lang w:val="pt-BR"/>
-        </w:rPr>
+      </w:pPr>
+      <w:r>
         <w:t xml:space="preserve">Tabela </w:t>
       </w:r>
       <w:r>
-        <w:rPr>
-          <w:lang w:val="pt-BR"/>
-        </w:rPr>
         <w:fldChar w:fldCharType="begin"/>
       </w:r>
       <w:r>
-        <w:rPr>
-          <w:lang w:val="pt-BR"/>
-        </w:rPr>
         <w:instrText xml:space="preserve"> SEQ Tabela \* ARABIC </w:instrText>
       </w:r>
       <w:r>
-        <w:rPr>
-          <w:lang w:val="pt-BR"/>
-        </w:rPr>
         <w:fldChar w:fldCharType="separate"/>
       </w:r>
       <w:r>
-        <w:rPr>
-          <w:noProof/>
-          <w:lang w:val="pt-BR"/>
-        </w:rPr>
         <w:t>1</w:t>
       </w:r>
       <w:r>
-        <w:rPr>
-          <w:lang w:val="pt-BR"/>
-        </w:rPr>
         <w:fldChar w:fldCharType="end"/>
       </w:r>
       <w:r>
-        <w:rPr>
-          <w:lang w:val="pt-BR"/>
-        </w:rPr>
         <w:t>. Glossário</w:t>
       </w:r>
     </w:p>
@@ -1502,53 +1496,28 @@
     <w:p>
       <w:pPr>
         <w:pStyle w:val="Legenda"/>
-        <w:rPr>
-          <w:lang w:val="pt-BR"/>
-        </w:rPr>
       </w:pPr>
       <w:bookmarkStart w:id="0" w:name="_Ref232177625"/>
       <w:r>
-        <w:rPr>
-          <w:lang w:val="pt-BR"/>
-        </w:rPr>
         <w:t xml:space="preserve">Fig. </w:t>
       </w:r>
       <w:r>
-        <w:rPr>
-          <w:lang w:val="pt-BR"/>
-        </w:rPr>
         <w:fldChar w:fldCharType="begin"/>
       </w:r>
       <w:r>
-        <w:rPr>
-          <w:lang w:val="pt-BR"/>
-        </w:rPr>
         <w:instrText xml:space="preserve"> SEQ Fig. \* ARABIC </w:instrText>
       </w:r>
       <w:r>
-        <w:rPr>
-          <w:lang w:val="pt-BR"/>
-        </w:rPr>
         <w:fldChar w:fldCharType="separate"/>
       </w:r>
       <w:r>
-        <w:rPr>
-          <w:noProof/>
-          <w:lang w:val="pt-BR"/>
-        </w:rPr>
         <w:t>1</w:t>
       </w:r>
       <w:r>
-        <w:rPr>
-          <w:lang w:val="pt-BR"/>
-        </w:rPr>
         <w:fldChar w:fldCharType="end"/>
       </w:r>
       <w:bookmarkEnd w:id="0"/>
       <w:r>
-        <w:rPr>
-          <w:lang w:val="pt-BR"/>
-        </w:rPr>
         <w:t>. Modelo de domínio que será utilizado no desenvolvimento da aplicação</w:t>
       </w:r>
     </w:p>
@@ -2452,36 +2421,17 @@
     <w:p>
       <w:pPr>
         <w:pStyle w:val="Legenda"/>
-        <w:rPr>
-          <w:b w:val="0"/>
-          <w:bCs/>
-          <w:lang w:val="pt-BR"/>
-        </w:rPr>
-      </w:pPr>
-      <w:r>
-        <w:rPr>
-          <w:lang w:val="pt-BR"/>
-        </w:rPr>
+      </w:pPr>
+      <w:r>
         <w:t>UC 1</w:t>
       </w:r>
       <w:r>
-        <w:rPr>
-          <w:lang w:val="pt-BR"/>
-        </w:rPr>
         <w:t>.</w:t>
       </w:r>
       <w:r>
-        <w:rPr>
-          <w:lang w:val="pt-BR"/>
-        </w:rPr>
         <w:t xml:space="preserve"> </w:t>
       </w:r>
       <w:r>
-        <w:rPr>
-          <w:b w:val="0"/>
-          <w:bCs/>
-          <w:lang w:val="pt-BR"/>
-        </w:rPr>
         <w:t>Registrar Jogador</w:t>
       </w:r>
     </w:p>
@@ -2957,38 +2907,16 @@
     <w:p>
       <w:pPr>
         <w:pStyle w:val="Legenda"/>
-        <w:rPr>
-          <w:b w:val="0"/>
-          <w:bCs/>
-          <w:lang w:val="pt-BR"/>
-        </w:rPr>
-      </w:pPr>
-      <w:r>
-        <w:rPr>
-          <w:lang w:val="pt-BR"/>
-        </w:rPr>
+      </w:pPr>
+      <w:r>
         <w:lastRenderedPageBreak/>
         <w:t>UC 2</w:t>
       </w:r>
       <w:r>
-        <w:rPr>
-          <w:lang w:val="pt-BR"/>
-        </w:rPr>
         <w:t>.</w:t>
       </w:r>
       <w:r>
-        <w:rPr>
-          <w:lang w:val="pt-BR"/>
-        </w:rPr>
-        <w:t xml:space="preserve"> </w:t>
-      </w:r>
-      <w:r>
-        <w:rPr>
-          <w:b w:val="0"/>
-          <w:bCs/>
-          <w:lang w:val="pt-BR"/>
-        </w:rPr>
-        <w:t>Registar com Perfil Existente</w:t>
+        <w:t xml:space="preserve"> Registar com Perfil Existente</w:t>
       </w:r>
     </w:p>
     <w:tbl>
@@ -3345,36 +3273,17 @@
     <w:p>
       <w:pPr>
         <w:pStyle w:val="Legenda"/>
-        <w:rPr>
-          <w:b w:val="0"/>
-          <w:bCs/>
-          <w:lang w:val="pt-BR"/>
-        </w:rPr>
-      </w:pPr>
-      <w:r>
-        <w:rPr>
-          <w:lang w:val="pt-BR"/>
-        </w:rPr>
+      </w:pPr>
+      <w:r>
         <w:t>UC 3</w:t>
       </w:r>
       <w:r>
-        <w:rPr>
-          <w:lang w:val="pt-BR"/>
-        </w:rPr>
         <w:t>.</w:t>
       </w:r>
       <w:r>
-        <w:rPr>
-          <w:lang w:val="pt-BR"/>
-        </w:rPr>
         <w:t xml:space="preserve"> </w:t>
       </w:r>
       <w:r>
-        <w:rPr>
-          <w:b w:val="0"/>
-          <w:bCs/>
-          <w:lang w:val="pt-BR"/>
-        </w:rPr>
         <w:t>Consultar Ranking</w:t>
       </w:r>
     </w:p>
@@ -3775,39 +3684,20 @@
     <w:p>
       <w:pPr>
         <w:pStyle w:val="Legenda"/>
-        <w:rPr>
-          <w:lang w:val="pt-BR"/>
-        </w:rPr>
       </w:pPr>
     </w:p>
     <w:p>
       <w:pPr>
         <w:pStyle w:val="Legenda"/>
-        <w:rPr>
-          <w:b w:val="0"/>
-          <w:bCs/>
-          <w:lang w:val="pt-BR"/>
-        </w:rPr>
-      </w:pPr>
-      <w:r>
-        <w:rPr>
-          <w:lang w:val="pt-BR"/>
-        </w:rPr>
+      </w:pPr>
+      <w:r>
         <w:lastRenderedPageBreak/>
         <w:t>UC 4</w:t>
       </w:r>
       <w:r>
-        <w:rPr>
-          <w:lang w:val="pt-BR"/>
-        </w:rPr>
         <w:t xml:space="preserve">. </w:t>
       </w:r>
       <w:r>
-        <w:rPr>
-          <w:b w:val="0"/>
-          <w:bCs/>
-          <w:lang w:val="pt-BR"/>
-        </w:rPr>
         <w:t>Visualizar Estatísticas Individuais</w:t>
       </w:r>
     </w:p>
@@ -4074,37 +3964,15 @@
     <w:p>
       <w:pPr>
         <w:pStyle w:val="Legenda"/>
-        <w:rPr>
-          <w:b w:val="0"/>
-          <w:bCs/>
-          <w:lang w:val="pt-BR"/>
-        </w:rPr>
-      </w:pPr>
-      <w:r>
-        <w:rPr>
-          <w:lang w:val="pt-BR"/>
-        </w:rPr>
+      </w:pPr>
+      <w:r>
         <w:t>UC 5</w:t>
       </w:r>
       <w:r>
-        <w:rPr>
-          <w:lang w:val="pt-BR"/>
-        </w:rPr>
         <w:t>.</w:t>
       </w:r>
       <w:r>
-        <w:rPr>
-          <w:lang w:val="pt-BR"/>
-        </w:rPr>
-        <w:t xml:space="preserve"> </w:t>
-      </w:r>
-      <w:r>
-        <w:rPr>
-          <w:b w:val="0"/>
-          <w:bCs/>
-          <w:lang w:val="pt-BR"/>
-        </w:rPr>
-        <w:t>Consultar Ajuda e Regras</w:t>
+        <w:t xml:space="preserve"> Consultar Ajuda e Regras</w:t>
       </w:r>
     </w:p>
     <w:tbl>
@@ -4461,59 +4329,27 @@
     <w:p>
       <w:pPr>
         <w:pStyle w:val="Legenda"/>
-        <w:rPr>
-          <w:b w:val="0"/>
-          <w:bCs/>
-          <w:lang w:val="pt-BR"/>
-        </w:rPr>
-      </w:pPr>
-      <w:r>
-        <w:rPr>
-          <w:lang w:val="pt-BR"/>
-        </w:rPr>
+      </w:pPr>
+      <w:r>
         <w:br w:type="page"/>
       </w:r>
       <w:r>
-        <w:rPr>
-          <w:lang w:val="pt-BR"/>
-        </w:rPr>
         <w:lastRenderedPageBreak/>
         <w:t>UC 6</w:t>
       </w:r>
       <w:r>
-        <w:rPr>
-          <w:lang w:val="pt-BR"/>
-        </w:rPr>
         <w:t>.</w:t>
       </w:r>
       <w:r>
-        <w:rPr>
-          <w:lang w:val="pt-BR"/>
-        </w:rPr>
         <w:t xml:space="preserve"> </w:t>
       </w:r>
       <w:r>
-        <w:rPr>
-          <w:b w:val="0"/>
-          <w:bCs/>
-          <w:lang w:val="pt-BR"/>
-        </w:rPr>
         <w:t>Co</w:t>
       </w:r>
       <w:r>
-        <w:rPr>
-          <w:b w:val="0"/>
-          <w:bCs/>
-          <w:lang w:val="pt-BR"/>
-        </w:rPr>
         <w:t>meçar</w:t>
       </w:r>
       <w:r>
-        <w:rPr>
-          <w:b w:val="0"/>
-          <w:bCs/>
-          <w:lang w:val="pt-BR"/>
-        </w:rPr>
         <w:t xml:space="preserve"> Partida</w:t>
       </w:r>
     </w:p>
@@ -4897,37 +4733,15 @@
     <w:p>
       <w:pPr>
         <w:pStyle w:val="Legenda"/>
-        <w:rPr>
-          <w:b w:val="0"/>
-          <w:bCs/>
-          <w:lang w:val="pt-BR"/>
-        </w:rPr>
-      </w:pPr>
-      <w:r>
-        <w:rPr>
-          <w:lang w:val="pt-BR"/>
-        </w:rPr>
+      </w:pPr>
+      <w:r>
         <w:t>UC 7</w:t>
       </w:r>
       <w:r>
-        <w:rPr>
-          <w:lang w:val="pt-BR"/>
-        </w:rPr>
         <w:t>.</w:t>
       </w:r>
       <w:r>
-        <w:rPr>
-          <w:lang w:val="pt-BR"/>
-        </w:rPr>
-        <w:t xml:space="preserve"> </w:t>
-      </w:r>
-      <w:r>
-        <w:rPr>
-          <w:b w:val="0"/>
-          <w:bCs/>
-          <w:lang w:val="pt-BR"/>
-        </w:rPr>
-        <w:t>Desenhar Tabuleiro</w:t>
+        <w:t xml:space="preserve"> Desenhar Tabuleiro</w:t>
       </w:r>
     </w:p>
     <w:tbl>
@@ -5221,43 +5035,21 @@
     <w:p>
       <w:pPr>
         <w:pStyle w:val="Legenda"/>
-        <w:rPr>
-          <w:b w:val="0"/>
-          <w:bCs/>
-          <w:lang w:val="pt-BR"/>
-        </w:rPr>
-      </w:pPr>
-      <w:r>
-        <w:rPr>
-          <w:lang w:val="pt-BR"/>
-        </w:rPr>
+      </w:pPr>
+      <w:r>
         <w:br w:type="page"/>
       </w:r>
       <w:r>
-        <w:rPr>
-          <w:lang w:val="pt-BR"/>
-        </w:rPr>
         <w:lastRenderedPageBreak/>
         <w:t>UC 8</w:t>
       </w:r>
       <w:r>
-        <w:rPr>
-          <w:lang w:val="pt-BR"/>
-        </w:rPr>
         <w:t>.</w:t>
       </w:r>
       <w:r>
-        <w:rPr>
-          <w:lang w:val="pt-BR"/>
-        </w:rPr>
         <w:t xml:space="preserve"> </w:t>
       </w:r>
       <w:r>
-        <w:rPr>
-          <w:b w:val="0"/>
-          <w:bCs/>
-          <w:lang w:val="pt-BR"/>
-        </w:rPr>
         <w:t>Posicionar Navios</w:t>
       </w:r>
     </w:p>
@@ -5686,43 +5478,20 @@
     <w:p>
       <w:pPr>
         <w:pStyle w:val="Legenda"/>
-        <w:rPr>
-          <w:lang w:val="pt-BR"/>
-        </w:rPr>
       </w:pPr>
     </w:p>
     <w:p>
       <w:pPr>
         <w:pStyle w:val="Legenda"/>
-        <w:rPr>
-          <w:lang w:val="pt-BR"/>
-        </w:rPr>
-      </w:pPr>
-      <w:r>
-        <w:rPr>
-          <w:lang w:val="pt-BR"/>
-        </w:rPr>
+      </w:pPr>
+      <w:r>
         <w:t>UC 9</w:t>
       </w:r>
       <w:r>
-        <w:rPr>
-          <w:lang w:val="pt-BR"/>
-        </w:rPr>
         <w:t>.</w:t>
       </w:r>
       <w:r>
-        <w:rPr>
-          <w:lang w:val="pt-BR"/>
-        </w:rPr>
-        <w:t xml:space="preserve"> </w:t>
-      </w:r>
-      <w:r>
-        <w:rPr>
-          <w:b w:val="0"/>
-          <w:bCs/>
-          <w:lang w:val="pt-BR"/>
-        </w:rPr>
-        <w:t>Posicionamento Automático de Navios</w:t>
+        <w:t xml:space="preserve"> Posicionamento Automático de Navios</w:t>
       </w:r>
     </w:p>
     <w:tbl>
@@ -6066,28 +5835,14 @@
     <w:p>
       <w:pPr>
         <w:pStyle w:val="Legenda"/>
-        <w:rPr>
-          <w:lang w:val="pt-BR"/>
-        </w:rPr>
-      </w:pPr>
-      <w:r>
-        <w:rPr>
-          <w:lang w:val="pt-BR"/>
-        </w:rPr>
+      </w:pPr>
+      <w:r>
         <w:t>UC 10</w:t>
       </w:r>
       <w:r>
-        <w:rPr>
-          <w:lang w:val="pt-BR"/>
-        </w:rPr>
         <w:t xml:space="preserve">. </w:t>
       </w:r>
       <w:r>
-        <w:rPr>
-          <w:b w:val="0"/>
-          <w:bCs/>
-          <w:lang w:val="pt-BR"/>
-        </w:rPr>
         <w:t>Validar Posicionamento de Navio</w:t>
       </w:r>
     </w:p>
@@ -6400,41 +6155,21 @@
     <w:p>
       <w:pPr>
         <w:pStyle w:val="Legenda"/>
-        <w:rPr>
-          <w:lang w:val="pt-BR"/>
-        </w:rPr>
-      </w:pPr>
-      <w:r>
-        <w:rPr>
-          <w:lang w:val="pt-BR"/>
-        </w:rPr>
+      </w:pPr>
+      <w:r>
         <w:br w:type="page"/>
       </w:r>
       <w:r>
-        <w:rPr>
-          <w:lang w:val="pt-BR"/>
-        </w:rPr>
         <w:lastRenderedPageBreak/>
         <w:t>UC 11</w:t>
       </w:r>
       <w:r>
-        <w:rPr>
-          <w:lang w:val="pt-BR"/>
-        </w:rPr>
         <w:t>.</w:t>
       </w:r>
       <w:r>
-        <w:rPr>
-          <w:lang w:val="pt-BR"/>
-        </w:rPr>
         <w:t xml:space="preserve"> </w:t>
       </w:r>
       <w:r>
-        <w:rPr>
-          <w:b w:val="0"/>
-          <w:bCs/>
-          <w:lang w:val="pt-BR"/>
-        </w:rPr>
         <w:t>Efetuar Jogada</w:t>
       </w:r>
     </w:p>
@@ -6813,38 +6548,16 @@
     <w:p>
       <w:pPr>
         <w:pStyle w:val="Legenda"/>
-        <w:rPr>
-          <w:b w:val="0"/>
-          <w:bCs/>
-          <w:lang w:val="pt-BR"/>
-        </w:rPr>
-      </w:pPr>
-      <w:r>
-        <w:rPr>
-          <w:lang w:val="pt-BR"/>
-        </w:rPr>
+      </w:pPr>
+      <w:r>
         <w:br w:type="page"/>
       </w:r>
       <w:r>
-        <w:rPr>
-          <w:lang w:val="pt-BR"/>
-        </w:rPr>
         <w:lastRenderedPageBreak/>
         <w:t>UC 12</w:t>
       </w:r>
       <w:r>
-        <w:rPr>
-          <w:lang w:val="pt-BR"/>
-        </w:rPr>
-        <w:t xml:space="preserve"> - </w:t>
-      </w:r>
-      <w:r>
-        <w:rPr>
-          <w:b w:val="0"/>
-          <w:bCs/>
-          <w:lang w:val="pt-BR"/>
-        </w:rPr>
-        <w:t>Verificar Condição de Vitória</w:t>
+        <w:t xml:space="preserve"> - Verificar Condição de Vitória</w:t>
       </w:r>
     </w:p>
     <w:tbl>
@@ -7222,14 +6935,8 @@
     <w:p>
       <w:pPr>
         <w:pStyle w:val="heading3"/>
-        <w:rPr>
-          <w:lang w:val="pt-BR"/>
-        </w:rPr>
-      </w:pPr>
-      <w:r>
-        <w:rPr>
-          <w:lang w:val="pt-BR"/>
-        </w:rPr>
+      </w:pPr>
+      <w:r>
         <w:t>5.1.2   Fluxograma</w:t>
       </w:r>
     </w:p>
@@ -7364,75 +7071,36 @@
     <w:p>
       <w:pPr>
         <w:pStyle w:val="Legenda"/>
-        <w:rPr>
-          <w:lang w:val="pt-BR"/>
-        </w:rPr>
       </w:pPr>
       <w:bookmarkStart w:id="1" w:name="_Ref232177691"/>
       <w:r>
-        <w:rPr>
-          <w:lang w:val="pt-BR"/>
-        </w:rPr>
         <w:t xml:space="preserve">Fig. </w:t>
       </w:r>
       <w:r>
-        <w:rPr>
-          <w:lang w:val="pt-BR"/>
-        </w:rPr>
         <w:fldChar w:fldCharType="begin"/>
       </w:r>
       <w:r>
-        <w:rPr>
-          <w:lang w:val="pt-BR"/>
-        </w:rPr>
         <w:instrText xml:space="preserve"> SEQ Fig. \* ARABIC </w:instrText>
       </w:r>
       <w:r>
-        <w:rPr>
-          <w:lang w:val="pt-BR"/>
-        </w:rPr>
         <w:fldChar w:fldCharType="separate"/>
       </w:r>
       <w:r>
-        <w:rPr>
-          <w:noProof/>
-          <w:lang w:val="pt-BR"/>
-        </w:rPr>
         <w:t>2</w:t>
       </w:r>
       <w:r>
-        <w:rPr>
-          <w:lang w:val="pt-BR"/>
-        </w:rPr>
         <w:fldChar w:fldCharType="end"/>
       </w:r>
       <w:bookmarkEnd w:id="1"/>
       <w:r>
-        <w:rPr>
-          <w:lang w:val="pt-BR"/>
-        </w:rPr>
-        <w:t xml:space="preserve">. </w:t>
-      </w:r>
-      <w:r>
-        <w:rPr>
-          <w:b w:val="0"/>
-          <w:bCs/>
-          <w:lang w:val="pt-BR"/>
-        </w:rPr>
-        <w:t>Fluxograma que será utilizado no desenvolvimento da aplicação</w:t>
+        <w:t>. Fluxograma que será utilizado no desenvolvimento da aplicação</w:t>
       </w:r>
     </w:p>
     <w:p>
       <w:pPr>
         <w:pStyle w:val="heading2"/>
-        <w:rPr>
-          <w:lang w:val="pt-BR"/>
-        </w:rPr>
-      </w:pPr>
-      <w:r>
-        <w:rPr>
-          <w:lang w:val="pt-BR"/>
-        </w:rPr>
+      </w:pPr>
+      <w:r>
         <w:lastRenderedPageBreak/>
         <w:t>5.2   Requisitos não Funcionais</w:t>
       </w:r>
@@ -7703,60 +7371,33 @@
     <w:p>
       <w:pPr>
         <w:pStyle w:val="Legenda"/>
-        <w:rPr>
-          <w:lang w:val="pt-BR"/>
-        </w:rPr>
       </w:pPr>
       <w:bookmarkStart w:id="2" w:name="_Ref232177743"/>
       <w:r>
-        <w:rPr>
-          <w:lang w:val="pt-BR"/>
-        </w:rPr>
         <w:t xml:space="preserve">Fig. </w:t>
       </w:r>
       <w:r>
-        <w:rPr>
-          <w:lang w:val="pt-BR"/>
-        </w:rPr>
         <w:fldChar w:fldCharType="begin"/>
       </w:r>
       <w:r>
-        <w:rPr>
-          <w:lang w:val="pt-BR"/>
-        </w:rPr>
         <w:instrText xml:space="preserve"> SEQ Fig. \* ARABIC </w:instrText>
       </w:r>
       <w:r>
-        <w:rPr>
-          <w:lang w:val="pt-BR"/>
-        </w:rPr>
         <w:fldChar w:fldCharType="separate"/>
       </w:r>
       <w:r>
-        <w:rPr>
-          <w:noProof/>
-          <w:lang w:val="pt-BR"/>
-        </w:rPr>
         <w:t>3</w:t>
       </w:r>
       <w:r>
-        <w:rPr>
-          <w:lang w:val="pt-BR"/>
-        </w:rPr>
         <w:fldChar w:fldCharType="end"/>
       </w:r>
       <w:bookmarkEnd w:id="2"/>
       <w:r>
-        <w:rPr>
-          <w:lang w:val="pt-BR"/>
-        </w:rPr>
         <w:t xml:space="preserve">. </w:t>
       </w:r>
       <w:r>
         <w:rPr>
-          <w:b w:val="0"/>
           <w:bCs/>
-          <w:lang w:val="pt-BR"/>
         </w:rPr>
         <w:t>Arquitetura física da aplicação</w:t>
       </w:r>
@@ -7885,7 +7526,7 @@
           <w:lang w:val="pt-BR" w:eastAsia="pt-PT"/>
         </w:rPr>
         <w:pict w14:anchorId="458884E9">
-          <v:shape id="_x0000_i1037" type="#_x0000_t75" style="width:228.6pt;height:202.8pt;visibility:visible">
+          <v:shape id="_x0000_i1029" type="#_x0000_t75" style="width:228.6pt;height:202.8pt;visibility:visible">
             <v:imagedata r:id="rId12" o:title="" croptop="830f"/>
           </v:shape>
         </w:pict>
@@ -7894,60 +7535,33 @@
     <w:p>
       <w:pPr>
         <w:pStyle w:val="Legenda"/>
-        <w:rPr>
-          <w:lang w:val="pt-BR"/>
-        </w:rPr>
       </w:pPr>
       <w:bookmarkStart w:id="3" w:name="_Ref232177773"/>
       <w:r>
-        <w:rPr>
-          <w:lang w:val="pt-BR"/>
-        </w:rPr>
         <w:t xml:space="preserve">Fig. </w:t>
       </w:r>
       <w:r>
-        <w:rPr>
-          <w:lang w:val="pt-BR"/>
-        </w:rPr>
         <w:fldChar w:fldCharType="begin"/>
       </w:r>
       <w:r>
-        <w:rPr>
-          <w:lang w:val="pt-BR"/>
-        </w:rPr>
         <w:instrText xml:space="preserve"> SEQ Fig. \* ARABIC </w:instrText>
       </w:r>
       <w:r>
-        <w:rPr>
-          <w:lang w:val="pt-BR"/>
-        </w:rPr>
         <w:fldChar w:fldCharType="separate"/>
       </w:r>
       <w:r>
-        <w:rPr>
-          <w:noProof/>
-          <w:lang w:val="pt-BR"/>
-        </w:rPr>
         <w:t>4</w:t>
       </w:r>
       <w:r>
-        <w:rPr>
-          <w:lang w:val="pt-BR"/>
-        </w:rPr>
         <w:fldChar w:fldCharType="end"/>
       </w:r>
       <w:bookmarkEnd w:id="3"/>
       <w:r>
-        <w:rPr>
-          <w:lang w:val="pt-BR"/>
-        </w:rPr>
         <w:t xml:space="preserve">. </w:t>
       </w:r>
       <w:r>
         <w:rPr>
-          <w:b w:val="0"/>
           <w:bCs/>
-          <w:lang w:val="pt-BR"/>
         </w:rPr>
         <w:t>Arquitetura lógica da aplicação</w:t>
       </w:r>
@@ -8043,7 +7657,7 @@
           <w:lang w:val="pt-BR"/>
         </w:rPr>
         <w:pict w14:anchorId="703AFE75">
-          <v:shape id="_x0000_i1029" type="#_x0000_t75" style="width:234pt;height:411pt;visibility:visible">
+          <v:shape id="_x0000_i1030" type="#_x0000_t75" style="width:234pt;height:411pt;visibility:visible">
             <v:imagedata r:id="rId13" o:title=""/>
           </v:shape>
         </w:pict>
@@ -8052,39 +7666,17 @@
     <w:p>
       <w:pPr>
         <w:pStyle w:val="Legenda"/>
-        <w:rPr>
-          <w:b w:val="0"/>
-          <w:bCs/>
-          <w:lang w:val="pt-BR"/>
-        </w:rPr>
       </w:pPr>
       <w:bookmarkStart w:id="4" w:name="_Ref232178308"/>
       <w:r>
-        <w:rPr>
-          <w:lang w:val="pt-BR"/>
-        </w:rPr>
         <w:t>Fig.</w:t>
       </w:r>
       <w:bookmarkEnd w:id="4"/>
       <w:r>
-        <w:rPr>
-          <w:lang w:val="pt-BR"/>
-        </w:rPr>
         <w:t xml:space="preserve"> 5</w:t>
       </w:r>
       <w:r>
-        <w:rPr>
-          <w:lang w:val="pt-BR"/>
-        </w:rPr>
-        <w:t xml:space="preserve">. </w:t>
-      </w:r>
-      <w:r>
-        <w:rPr>
-          <w:b w:val="0"/>
-          <w:bCs/>
-          <w:lang w:val="pt-BR"/>
-        </w:rPr>
-        <w:t>Diagrama de classes de modelo que serão utilizadas na aplicação</w:t>
+        <w:t>. Diagrama de classes de modelo que serão utilizadas na aplicação</w:t>
       </w:r>
     </w:p>
     <w:p>
@@ -8162,7 +7754,7 @@
           <w:lang w:val="pt-BR" w:eastAsia="pt-PT"/>
         </w:rPr>
         <w:pict w14:anchorId="2240C604">
-          <v:shape id="_x0000_i1030" type="#_x0000_t75" style="width:346.2pt;height:139.2pt;visibility:visible">
+          <v:shape id="_x0000_i1031" type="#_x0000_t75" style="width:346.2pt;height:139.2pt;visibility:visible">
             <v:imagedata r:id="rId14" o:title=""/>
           </v:shape>
         </w:pict>
@@ -8171,32 +7763,16 @@
     <w:p>
       <w:pPr>
         <w:pStyle w:val="Legenda"/>
-        <w:rPr>
-          <w:b w:val="0"/>
-          <w:bCs/>
-          <w:lang w:val="pt-BR" w:eastAsia="pt-PT"/>
-        </w:rPr>
       </w:pPr>
       <w:bookmarkStart w:id="5" w:name="_Ref232178690"/>
       <w:r>
-        <w:rPr>
-          <w:lang w:val="pt-BR"/>
-        </w:rPr>
         <w:t>Fig.</w:t>
       </w:r>
       <w:bookmarkEnd w:id="5"/>
       <w:r>
-        <w:rPr>
-          <w:lang w:val="pt-BR"/>
-        </w:rPr>
         <w:t xml:space="preserve"> 6</w:t>
       </w:r>
       <w:r>
-        <w:rPr>
-          <w:b w:val="0"/>
-          <w:bCs/>
-          <w:lang w:val="pt-BR"/>
-        </w:rPr>
         <w:t>. Diagrama de classes de exceções que serão utilizadas na aplicação</w:t>
       </w:r>
     </w:p>
@@ -8298,7 +7874,7 @@
         </w:rPr>
         <w:lastRenderedPageBreak/>
         <w:pict w14:anchorId="29F95681">
-          <v:shape id="_x0000_i1031" type="#_x0000_t75" style="width:334.8pt;height:271.8pt;visibility:visible">
+          <v:shape id="_x0000_i1032" type="#_x0000_t75" style="width:334.8pt;height:271.8pt;visibility:visible">
             <v:imagedata r:id="rId15" o:title=""/>
           </v:shape>
         </w:pict>
@@ -8307,153 +7883,54 @@
     <w:p>
       <w:pPr>
         <w:pStyle w:val="Legenda"/>
-        <w:rPr>
-          <w:b w:val="0"/>
+      </w:pPr>
+      <w:bookmarkStart w:id="6" w:name="_Ref232179583"/>
+      <w:r>
+        <w:t>Fig.</w:t>
+      </w:r>
+      <w:bookmarkEnd w:id="6"/>
+      <w:r>
+        <w:t xml:space="preserve"> 7</w:t>
+      </w:r>
+      <w:r>
+        <w:t>. Interface de usuário da aplicação</w:t>
+      </w:r>
+    </w:p>
+    <w:p>
+      <w:pPr>
+        <w:rPr>
           <w:bCs/>
           <w:lang w:val="pt-BR"/>
         </w:rPr>
       </w:pPr>
-      <w:bookmarkStart w:id="6" w:name="_Ref232179583"/>
-      <w:r>
-        <w:rPr>
-          <w:lang w:val="pt-BR"/>
-        </w:rPr>
-        <w:t>Fig.</w:t>
-      </w:r>
-      <w:bookmarkEnd w:id="6"/>
-      <w:r>
-        <w:rPr>
-          <w:lang w:val="pt-BR"/>
-        </w:rPr>
-        <w:t xml:space="preserve"> 7</w:t>
-      </w:r>
-      <w:r>
-        <w:rPr>
-          <w:lang w:val="pt-BR"/>
-        </w:rPr>
-        <w:t xml:space="preserve">. </w:t>
-      </w:r>
-      <w:r>
-        <w:rPr>
-          <w:b w:val="0"/>
-          <w:bCs/>
-          <w:lang w:val="pt-BR"/>
-        </w:rPr>
-        <w:t>Interface de usuário da aplicação</w:t>
-      </w:r>
-    </w:p>
-    <w:p>
-      <w:pPr>
-        <w:rPr>
-          <w:bCs/>
-          <w:lang w:val="pt-BR"/>
-        </w:rPr>
-      </w:pPr>
-    </w:p>
-    <w:p>
-      <w:pPr>
-        <w:pStyle w:val="Legenda"/>
-        <w:jc w:val="left"/>
-        <w:rPr>
-          <w:lang w:val="pt-BR"/>
-        </w:rPr>
-      </w:pPr>
-    </w:p>
-    <w:p>
-      <w:pPr>
-        <w:pStyle w:val="Legenda"/>
-        <w:jc w:val="left"/>
-        <w:rPr>
-          <w:sz w:val="24"/>
-          <w:szCs w:val="24"/>
-          <w:lang w:val="pt-BR"/>
-        </w:rPr>
-      </w:pPr>
-      <w:r>
-        <w:rPr>
-          <w:lang w:val="pt-BR"/>
-        </w:rPr>
-        <w:br/>
-      </w:r>
-      <w:r>
-        <w:rPr>
-          <w:sz w:val="24"/>
-          <w:szCs w:val="24"/>
-          <w:lang w:val="pt-BR"/>
-        </w:rPr>
-        <w:t>11</w:t>
-      </w:r>
-      <w:r>
-        <w:rPr>
-          <w:sz w:val="24"/>
-          <w:szCs w:val="24"/>
-          <w:lang w:val="pt-BR"/>
-        </w:rPr>
-        <w:t xml:space="preserve">   Testes</w:t>
-      </w:r>
-    </w:p>
-    <w:p>
-      <w:pPr>
-        <w:rPr>
-          <w:lang w:val="pt-BR"/>
-        </w:rPr>
-      </w:pPr>
-      <w:r>
-        <w:rPr>
-          <w:lang w:val="pt-BR"/>
-        </w:rPr>
-        <w:br/>
-      </w:r>
-      <w:r>
-        <w:rPr>
-          <w:lang w:val="pt-BR"/>
-        </w:rPr>
-        <w:br/>
-        <w:t>Para garantir o correto funcionamento das classes</w:t>
-      </w:r>
-      <w:r>
-        <w:rPr>
-          <w:lang w:val="pt-BR"/>
-        </w:rPr>
-        <w:t xml:space="preserve">, </w:t>
-      </w:r>
-      <w:r>
-        <w:rPr>
-          <w:lang w:val="pt-BR"/>
-        </w:rPr>
-        <w:t xml:space="preserve">foram realizados testes unitários utilizando a framework Goodle C++ Testing Framework. Os testes feitos, cobrem </w:t>
-      </w:r>
-      <w:r>
-        <w:rPr>
-          <w:lang w:val="pt-BR"/>
-        </w:rPr>
-        <w:t>construtores</w:t>
-      </w:r>
-      <w:r>
-        <w:rPr>
-          <w:lang w:val="pt-BR"/>
-        </w:rPr>
-        <w:t>, funções e operadores de cada classe presente no projeto.</w:t>
-      </w:r>
-    </w:p>
-    <w:p>
-      <w:pPr>
-        <w:rPr>
-          <w:lang w:val="pt-BR"/>
-        </w:rPr>
-      </w:pPr>
-      <w:r>
-        <w:rPr>
-          <w:lang w:val="pt-BR"/>
-        </w:rPr>
-        <w:br/>
-        <w:t>Segue-se um exemplo de teste</w:t>
-      </w:r>
-      <w:r>
-        <w:rPr>
-          <w:lang w:val="pt-BR"/>
-        </w:rPr>
-        <w:t xml:space="preserve"> realizado</w:t>
+    </w:p>
+    <w:p>
+      <w:pPr>
+        <w:pStyle w:val="heading1"/>
+        <w:rPr>
+          <w:lang w:val="pt-BR"/>
+        </w:rPr>
+      </w:pPr>
+      <w:r>
+        <w:rPr>
+          <w:lang w:val="pt-BR"/>
+        </w:rPr>
+        <w:lastRenderedPageBreak/>
+        <w:t>11   Implementação</w:t>
+      </w:r>
+    </w:p>
+    <w:p>
+      <w:pPr>
+        <w:pStyle w:val="heading2"/>
+        <w:rPr>
+          <w:lang w:val="pt-BR"/>
+        </w:rPr>
+      </w:pPr>
+      <w:r>
+        <w:rPr>
+          <w:lang w:val="pt-BR"/>
+        </w:rPr>
+        <w:t>11.1</w:t>
       </w:r>
       <w:r>
         <w:rPr>
@@ -8465,628 +7942,246 @@
         <w:rPr>
           <w:lang w:val="pt-BR"/>
         </w:rPr>
-        <w:t>de cada classe.</w:t>
-      </w:r>
-    </w:p>
-    <w:p>
-      <w:pPr>
-        <w:pStyle w:val="Legenda"/>
-        <w:jc w:val="left"/>
-        <w:rPr>
-          <w:b w:val="0"/>
-          <w:bCs/>
-          <w:sz w:val="20"/>
-          <w:lang w:val="pt-BR"/>
-        </w:rPr>
-      </w:pPr>
-      <w:r>
-        <w:rPr>
-          <w:sz w:val="20"/>
-          <w:lang w:val="pt-BR"/>
-        </w:rPr>
-        <w:br/>
-        <w:t>Exemplo de teste para a classe Player:</w:t>
-      </w:r>
-      <w:r>
-        <w:rPr>
-          <w:b w:val="0"/>
-          <w:bCs/>
-          <w:sz w:val="20"/>
-          <w:lang w:val="pt-BR"/>
-        </w:rPr>
-        <w:br/>
-      </w:r>
-      <w:r>
-        <w:rPr>
-          <w:b w:val="0"/>
-          <w:bCs/>
-          <w:sz w:val="20"/>
-          <w:lang w:val="pt-BR"/>
-        </w:rPr>
-        <w:br/>
-      </w:r>
-      <w:r>
-        <w:rPr>
-          <w:b w:val="0"/>
-          <w:bCs/>
-          <w:sz w:val="20"/>
-          <w:szCs w:val="22"/>
-          <w:lang w:val="pt-BR"/>
-        </w:rPr>
-        <w:t>Este teste verifica que o construtor da classe Player lança uma InvalidDataException quando o nickname introduzido pelo jogador, tem menos de 3 caracteres. Com isto, este teste assegura que a validação do nickname está corretamente implementada no projeto.</w:t>
-      </w:r>
-      <w:r>
-        <w:rPr>
-          <w:b w:val="0"/>
-          <w:bCs/>
-          <w:sz w:val="20"/>
-          <w:lang w:val="pt-BR"/>
-        </w:rPr>
-        <w:br/>
-      </w:r>
-    </w:p>
-    <w:p>
-      <w:pPr>
-        <w:pStyle w:val="Legenda"/>
-        <w:jc w:val="left"/>
-        <w:rPr>
-          <w:b w:val="0"/>
-          <w:bCs/>
-          <w:lang w:val="pt-BR"/>
-        </w:rPr>
-      </w:pPr>
-      <w:r>
-        <w:rPr>
-          <w:b w:val="0"/>
-          <w:bCs/>
-          <w:sz w:val="20"/>
-          <w:lang w:val="pt-BR"/>
-        </w:rPr>
-        <w:lastRenderedPageBreak/>
-        <w:br/>
-      </w:r>
-      <w:r>
-        <w:rPr>
-          <w:b w:val="0"/>
+        <w:t xml:space="preserve">  </w:t>
+      </w:r>
+      <w:r>
+        <w:rPr>
+          <w:lang w:val="pt-BR"/>
+        </w:rPr>
+        <w:t>DTO</w:t>
+      </w:r>
+    </w:p>
+    <w:p>
+      <w:pPr>
+        <w:ind w:firstLine="0"/>
+        <w:jc w:val="center"/>
+        <w:rPr>
           <w:noProof/>
-          <w:sz w:val="20"/>
-          <w:lang w:val="pt-BR"/>
-        </w:rPr>
-        <w:pict w14:anchorId="5D785E8A">
-          <v:shape id="_x0000_i1032" type="#_x0000_t75" style="width:343.2pt;height:162pt;visibility:visible">
+          <w:lang w:val="pt-BR" w:eastAsia="pt-PT"/>
+        </w:rPr>
+      </w:pPr>
+      <w:r>
+        <w:rPr>
+          <w:noProof/>
+          <w:lang w:val="pt-BR" w:eastAsia="pt-PT"/>
+        </w:rPr>
+        <w:pict w14:anchorId="174F1BEB">
+          <v:shape id="_x0000_i1033" type="#_x0000_t75" style="width:159pt;height:152.4pt;visibility:visible;mso-wrap-style:square">
             <v:imagedata r:id="rId16" o:title=""/>
           </v:shape>
         </w:pict>
       </w:r>
-      <w:r>
-        <w:rPr>
+    </w:p>
+    <w:p>
+      <w:pPr>
+        <w:pStyle w:val="Legenda"/>
+      </w:pPr>
+      <w:r>
+        <w:t>Fig. 8. Código de PlayerDTO</w:t>
+      </w:r>
+      <w:r>
+        <w:t>.h</w:t>
+      </w:r>
+    </w:p>
+    <w:p>
+      <w:pPr>
+        <w:pStyle w:val="Legenda"/>
+        <w:rPr>
+          <w:rStyle w:val="p1aZchn"/>
           <w:b w:val="0"/>
-          <w:bCs/>
           <w:sz w:val="20"/>
           <w:lang w:val="pt-BR"/>
         </w:rPr>
-        <w:br/>
-      </w:r>
-      <w:r>
-        <w:rPr>
-          <w:lang w:val="pt-BR"/>
-        </w:rPr>
-        <w:t xml:space="preserve">                   Fig. 8</w:t>
-      </w:r>
-      <w:r>
-        <w:rPr>
-          <w:lang w:val="pt-BR"/>
-        </w:rPr>
-        <w:t xml:space="preserve">. </w:t>
-      </w:r>
-      <w:r>
-        <w:rPr>
+      </w:pPr>
+      <w:r>
+        <w:rPr>
+          <w:rStyle w:val="p1aZchn"/>
           <w:b w:val="0"/>
-          <w:bCs/>
-          <w:lang w:val="pt-BR"/>
-        </w:rPr>
-        <w:t>Teste unitário da classe Player – validação do nickname</w:t>
-      </w:r>
-    </w:p>
-    <w:p>
-      <w:pPr>
-        <w:pStyle w:val="Legenda"/>
-        <w:jc w:val="left"/>
-        <w:rPr>
-          <w:lang w:val="pt-BR"/>
-        </w:rPr>
-      </w:pPr>
-    </w:p>
-    <w:p>
-      <w:pPr>
-        <w:pStyle w:val="Legenda"/>
-        <w:jc w:val="left"/>
-        <w:rPr>
+          <w:sz w:val="20"/>
+          <w:lang w:val="pt-BR"/>
+        </w:rPr>
+        <w:t xml:space="preserve">PlayerDTO é uma estrutura que transporta os dados do jogador entre camadas </w:t>
+      </w:r>
+      <w:r>
+        <w:rPr>
+          <w:rStyle w:val="p1aZchn"/>
           <w:b w:val="0"/>
-          <w:bCs/>
           <w:sz w:val="20"/>
           <w:lang w:val="pt-BR"/>
         </w:rPr>
-      </w:pPr>
-      <w:r>
-        <w:rPr>
-          <w:lang w:val="pt-BR"/>
-        </w:rPr>
-        <w:br/>
-      </w:r>
-      <w:r>
-        <w:rPr>
+        <w:t>(Services, Controller e View). A</w:t>
+      </w:r>
+      <w:r>
+        <w:rPr>
+          <w:rStyle w:val="p1aZchn"/>
+          <w:b w:val="0"/>
           <w:sz w:val="20"/>
           <w:lang w:val="pt-BR"/>
         </w:rPr>
-        <w:t>Exemplo de teste para a classe Ship:</w:t>
-      </w:r>
-      <w:r>
-        <w:rPr>
-          <w:sz w:val="20"/>
-          <w:lang w:val="pt-BR"/>
-        </w:rPr>
-        <w:br/>
-      </w:r>
-      <w:r>
-        <w:rPr>
-          <w:sz w:val="20"/>
-          <w:lang w:val="pt-BR"/>
-        </w:rPr>
-        <w:br/>
-      </w:r>
-      <w:r>
-        <w:rPr>
-          <w:b w:val="0"/>
-          <w:bCs/>
-          <w:sz w:val="20"/>
-          <w:szCs w:val="22"/>
-          <w:lang w:val="pt-BR"/>
-        </w:rPr>
-        <w:t>Este teste verifica que um navio é considerado afundado, após receber um número de hits igual ao seu tamanho. Neste caso, foram adicionados 2 hits, dado o tamanho da fragata.  Este teste comprova que o método isSunk() reflete o estado do navio ao longo da partida.</w:t>
-      </w:r>
-    </w:p>
-    <w:p>
-      <w:pPr>
-        <w:pStyle w:val="Legenda"/>
-        <w:jc w:val="left"/>
-        <w:rPr>
-          <w:lang w:val="pt-BR"/>
-        </w:rPr>
-      </w:pPr>
-      <w:r>
-        <w:rPr>
-          <w:b w:val="0"/>
-          <w:bCs/>
-          <w:sz w:val="20"/>
-          <w:lang w:val="pt-BR"/>
-        </w:rPr>
-        <w:br/>
-      </w:r>
-      <w:r>
+        <w:t>penas armazena campos como nickname, estatísticas e precisão. Isto evita que a lógica de domínio seja exposta à interface.</w:t>
+      </w:r>
+    </w:p>
+    <w:p>
+      <w:pPr>
+        <w:pStyle w:val="heading2"/>
+        <w:rPr>
+          <w:rStyle w:val="p1aZchn"/>
+          <w:lang w:val="pt-BR"/>
+        </w:rPr>
+      </w:pPr>
+      <w:r>
+        <w:rPr>
+          <w:rStyle w:val="p1aZchn"/>
+          <w:lang w:val="pt-BR"/>
+        </w:rPr>
+        <w:t>11.2   Exceptions</w:t>
+      </w:r>
+    </w:p>
+    <w:p>
+      <w:pPr>
+        <w:pStyle w:val="p1a"/>
+        <w:jc w:val="center"/>
         <w:rPr>
           <w:noProof/>
-          <w:lang w:val="pt-BR"/>
-        </w:rPr>
-        <w:pict w14:anchorId="6DCFBF81">
-          <v:shape id="_x0000_i1033" type="#_x0000_t75" style="width:346.2pt;height:103.2pt;visibility:visible">
+          <w:lang w:val="pt-BR" w:eastAsia="pt-PT"/>
+        </w:rPr>
+      </w:pPr>
+      <w:r>
+        <w:rPr>
+          <w:noProof/>
+          <w:lang w:val="pt-BR" w:eastAsia="pt-PT"/>
+        </w:rPr>
+        <w:pict w14:anchorId="01F5E132">
+          <v:shape id="_x0000_i1034" type="#_x0000_t75" style="width:300.6pt;height:118.2pt;visibility:visible;mso-wrap-style:square">
             <v:imagedata r:id="rId17" o:title=""/>
           </v:shape>
         </w:pict>
       </w:r>
-      <w:r>
-        <w:rPr>
-          <w:szCs w:val="18"/>
-          <w:lang w:val="pt-BR"/>
-        </w:rPr>
-        <w:t xml:space="preserve">                  Fig. </w:t>
-      </w:r>
-      <w:r>
-        <w:rPr>
-          <w:szCs w:val="18"/>
-          <w:lang w:val="pt-BR"/>
-        </w:rPr>
-        <w:t>9</w:t>
-      </w:r>
-      <w:r>
-        <w:rPr>
-          <w:szCs w:val="18"/>
-          <w:lang w:val="pt-BR"/>
-        </w:rPr>
-        <w:t xml:space="preserve">. </w:t>
-      </w:r>
-      <w:r>
-        <w:rPr>
-          <w:b w:val="0"/>
-          <w:bCs/>
-          <w:szCs w:val="18"/>
-          <w:lang w:val="pt-BR"/>
-        </w:rPr>
-        <w:t>Teste unitário da classe Ship – verificação de navio afundado</w:t>
-      </w:r>
-      <w:r>
-        <w:rPr>
-          <w:lang w:val="pt-BR"/>
-        </w:rPr>
-        <w:br/>
-      </w:r>
     </w:p>
     <w:p>
       <w:pPr>
         <w:pStyle w:val="Legenda"/>
-        <w:jc w:val="left"/>
-        <w:rPr>
-          <w:lang w:val="pt-BR"/>
-        </w:rPr>
-      </w:pPr>
-      <w:r>
-        <w:rPr>
-          <w:lang w:val="pt-BR"/>
-        </w:rPr>
-        <w:br/>
-      </w:r>
-      <w:r>
-        <w:rPr>
-          <w:sz w:val="20"/>
-          <w:lang w:val="pt-BR"/>
-        </w:rPr>
-        <w:t xml:space="preserve">Exemplo de teste para a classe </w:t>
-      </w:r>
-      <w:r>
-        <w:rPr>
-          <w:sz w:val="20"/>
-          <w:lang w:val="pt-BR"/>
-        </w:rPr>
-        <w:t>Board</w:t>
-      </w:r>
-      <w:r>
-        <w:rPr>
-          <w:sz w:val="20"/>
-          <w:lang w:val="pt-BR"/>
-        </w:rPr>
-        <w:t>:</w:t>
-      </w:r>
-      <w:r>
-        <w:rPr>
-          <w:sz w:val="20"/>
-          <w:lang w:val="pt-BR"/>
-        </w:rPr>
-        <w:br/>
-      </w:r>
-      <w:r>
-        <w:rPr>
-          <w:sz w:val="20"/>
-          <w:lang w:val="pt-BR"/>
-        </w:rPr>
-        <w:br/>
-      </w:r>
-      <w:r>
-        <w:rPr>
-          <w:b w:val="0"/>
-          <w:bCs/>
-          <w:sz w:val="20"/>
-          <w:lang w:val="pt-BR"/>
-        </w:rPr>
-        <w:t>Este teste verifica que ao efetuar um disparo numa célula ocupada por um navio, neste caso novamente uma fragata, o método registerShot() devolve “X” e atualiza o estado do tabuleiro. Isto garante que ao longo da partida, após cada jogada, o tabuleiro é atualizado de forma correta.</w:t>
-      </w:r>
-      <w:r>
-        <w:rPr>
-          <w:sz w:val="20"/>
-          <w:lang w:val="pt-BR"/>
-        </w:rPr>
-        <w:br/>
-      </w:r>
-      <w:r>
+      </w:pPr>
+      <w:r>
+        <w:t>Fig. 8. Código de InvalidDataException.h</w:t>
+      </w:r>
+    </w:p>
+    <w:p>
+      <w:pPr>
+        <w:pStyle w:val="p1a"/>
+        <w:jc w:val="center"/>
         <w:rPr>
           <w:noProof/>
-          <w:sz w:val="20"/>
-          <w:lang w:val="pt-BR"/>
+          <w:lang w:val="pt-BR" w:eastAsia="pt-PT"/>
+        </w:rPr>
+      </w:pPr>
+      <w:r>
+        <w:rPr>
+          <w:noProof/>
+          <w:lang w:val="pt-BR" w:eastAsia="pt-PT"/>
         </w:rPr>
         <w:lastRenderedPageBreak/>
-        <w:br/>
-      </w:r>
-      <w:r>
-        <w:rPr>
-          <w:noProof/>
-          <w:sz w:val="20"/>
-          <w:lang w:val="pt-BR"/>
-        </w:rPr>
-        <w:pict w14:anchorId="55F29CDE">
-          <v:shape id="_x0000_i1034" type="#_x0000_t75" style="width:349.8pt;height:129.6pt;visibility:visible">
+        <w:pict w14:anchorId="676740B9">
+          <v:shape id="_x0000_i1035" type="#_x0000_t75" style="width:353.4pt;height:106.8pt;visibility:visible;mso-wrap-style:square">
             <v:imagedata r:id="rId18" o:title=""/>
           </v:shape>
         </w:pict>
       </w:r>
-      <w:r>
-        <w:rPr>
-          <w:szCs w:val="18"/>
-          <w:lang w:val="pt-BR"/>
-        </w:rPr>
-        <w:t xml:space="preserve">                    Fig. </w:t>
-      </w:r>
-      <w:r>
-        <w:rPr>
-          <w:szCs w:val="18"/>
-          <w:lang w:val="pt-BR"/>
-        </w:rPr>
-        <w:t>10</w:t>
-      </w:r>
-      <w:r>
-        <w:rPr>
-          <w:szCs w:val="18"/>
-          <w:lang w:val="pt-BR"/>
-        </w:rPr>
-        <w:t xml:space="preserve">. </w:t>
-      </w:r>
-      <w:r>
-        <w:rPr>
-          <w:b w:val="0"/>
-          <w:bCs/>
-          <w:szCs w:val="18"/>
-          <w:lang w:val="pt-BR"/>
-        </w:rPr>
-        <w:t xml:space="preserve">Teste unitário da classe Board – registo de tiro no navio     </w:t>
-      </w:r>
-      <w:r>
-        <w:rPr>
-          <w:szCs w:val="18"/>
-          <w:lang w:val="pt-BR"/>
-        </w:rPr>
-        <w:t xml:space="preserve">              </w:t>
-      </w:r>
-      <w:r>
-        <w:rPr>
-          <w:sz w:val="20"/>
-          <w:lang w:val="pt-BR"/>
-        </w:rPr>
-        <w:br/>
-      </w:r>
-      <w:r>
-        <w:rPr>
-          <w:lang w:val="pt-BR"/>
-        </w:rPr>
-        <w:br/>
-      </w:r>
-      <w:r>
-        <w:rPr>
-          <w:lang w:val="pt-BR"/>
-        </w:rPr>
-        <w:br/>
-      </w:r>
-      <w:r>
-        <w:rPr>
-          <w:lang w:val="pt-BR"/>
-        </w:rPr>
-        <w:br/>
-      </w:r>
-      <w:r>
-        <w:rPr>
-          <w:sz w:val="20"/>
-          <w:lang w:val="pt-BR"/>
-        </w:rPr>
-        <w:t>Exemplo de teste para a classe Game:</w:t>
-      </w:r>
-      <w:r>
-        <w:rPr>
-          <w:sz w:val="20"/>
-          <w:lang w:val="pt-BR"/>
-        </w:rPr>
-        <w:br/>
-      </w:r>
-      <w:r>
-        <w:rPr>
-          <w:sz w:val="20"/>
-          <w:lang w:val="pt-BR"/>
-        </w:rPr>
-        <w:br/>
-      </w:r>
-      <w:r>
-        <w:rPr>
-          <w:b w:val="0"/>
-          <w:bCs/>
-          <w:sz w:val="20"/>
-          <w:lang w:val="pt-BR"/>
-        </w:rPr>
-        <w:t xml:space="preserve">Este teste verifica que quando um jogador acerta num navio do adversário, o turno não é alterado, permitindo assim que o jogador continue a jogar até falhar algum navio. Isto verifica que o projeto segue a regra do jogo </w:t>
-      </w:r>
-      <w:r>
-        <w:rPr>
-          <w:b w:val="0"/>
-          <w:bCs/>
-          <w:sz w:val="20"/>
-          <w:lang w:val="pt-BR"/>
-        </w:rPr>
-        <w:t>clássico</w:t>
-      </w:r>
-      <w:r>
-        <w:rPr>
-          <w:b w:val="0"/>
-          <w:bCs/>
-          <w:sz w:val="20"/>
-          <w:lang w:val="pt-BR"/>
-        </w:rPr>
-        <w:t xml:space="preserve"> de batalha naval.</w:t>
-      </w:r>
-      <w:r>
-        <w:rPr>
-          <w:b w:val="0"/>
-          <w:bCs/>
-          <w:sz w:val="20"/>
-          <w:lang w:val="pt-BR"/>
-        </w:rPr>
-        <w:br/>
-      </w:r>
-      <w:r>
-        <w:rPr>
-          <w:b w:val="0"/>
-          <w:bCs/>
-          <w:sz w:val="20"/>
-          <w:lang w:val="pt-BR"/>
-        </w:rPr>
-        <w:br/>
-      </w:r>
-      <w:r>
+    </w:p>
+    <w:p>
+      <w:pPr>
+        <w:pStyle w:val="Legenda"/>
+      </w:pPr>
+      <w:r>
+        <w:t>Fig. 9. Código de InvalidDataException.cpp</w:t>
+      </w:r>
+    </w:p>
+    <w:p>
+      <w:pPr>
+        <w:pStyle w:val="p1a"/>
+        <w:rPr>
+          <w:lang w:val="pt-BR"/>
+        </w:rPr>
+      </w:pPr>
+      <w:r>
+        <w:rPr>
+          <w:lang w:val="pt-BR"/>
+        </w:rPr>
+        <w:t xml:space="preserve">InvalidDataException é uma exceção personalizada que herda de std::exception, ela recebe uma mensagem de erro e o método what() </w:t>
+      </w:r>
+      <w:r>
+        <w:rPr>
+          <w:lang w:val="pt-BR"/>
+        </w:rPr>
+        <w:t xml:space="preserve">e </w:t>
+      </w:r>
+      <w:r>
+        <w:rPr>
+          <w:lang w:val="pt-BR"/>
+        </w:rPr>
+        <w:t>devolve essa mensagem, permitindo que o Controller mostre o erro ao utilizador de forma simples. As exceções NoDataException e DuplicatedDataException funcionam da mesma forma, mudando apenas a mensagem apresentada.</w:t>
+      </w:r>
+    </w:p>
+    <w:p>
+      <w:pPr>
+        <w:pStyle w:val="heading2"/>
+        <w:rPr>
+          <w:lang w:val="pt-BR"/>
+        </w:rPr>
+      </w:pPr>
+      <w:r>
+        <w:rPr>
+          <w:lang w:val="pt-BR"/>
+        </w:rPr>
+        <w:t>11.3   Model</w:t>
+      </w:r>
+    </w:p>
+    <w:p>
+      <w:pPr>
+        <w:pStyle w:val="heading2"/>
+        <w:jc w:val="center"/>
         <w:rPr>
           <w:noProof/>
-          <w:sz w:val="20"/>
-          <w:lang w:val="pt-BR"/>
-        </w:rPr>
-        <w:pict w14:anchorId="5778C4CB">
-          <v:shape id="_x0000_i1035" type="#_x0000_t75" style="width:345.6pt;height:154.8pt;visibility:visible">
+          <w:lang w:val="pt-BR" w:eastAsia="pt-PT"/>
+        </w:rPr>
+      </w:pPr>
+      <w:r>
+        <w:rPr>
+          <w:noProof/>
+          <w:lang w:val="pt-BR" w:eastAsia="pt-PT"/>
+        </w:rPr>
+        <w:pict w14:anchorId="47FBF954">
+          <v:shape id="_x0000_i1036" type="#_x0000_t75" style="width:309pt;height:242.4pt;visibility:visible;mso-wrap-style:square">
             <v:imagedata r:id="rId19" o:title=""/>
           </v:shape>
         </w:pict>
       </w:r>
-      <w:r>
-        <w:rPr>
-          <w:sz w:val="20"/>
-          <w:lang w:val="pt-BR"/>
-        </w:rPr>
-        <w:br/>
-      </w:r>
-      <w:r>
-        <w:rPr>
-          <w:szCs w:val="18"/>
-          <w:lang w:val="pt-BR"/>
-        </w:rPr>
-        <w:t xml:space="preserve">                Fig. </w:t>
-      </w:r>
-      <w:r>
-        <w:rPr>
-          <w:szCs w:val="18"/>
-          <w:lang w:val="pt-BR"/>
-        </w:rPr>
-        <w:t>11</w:t>
-      </w:r>
-      <w:r>
-        <w:rPr>
-          <w:szCs w:val="18"/>
-          <w:lang w:val="pt-BR"/>
-        </w:rPr>
-        <w:t xml:space="preserve">. </w:t>
-      </w:r>
-      <w:r>
-        <w:rPr>
-          <w:b w:val="0"/>
-          <w:bCs/>
-          <w:szCs w:val="18"/>
-          <w:lang w:val="pt-BR"/>
-        </w:rPr>
-        <w:t>Teste unitário da classe Game – verificação de turno após acerto</w:t>
-      </w:r>
-      <w:r>
-        <w:rPr>
-          <w:lang w:val="pt-BR"/>
-        </w:rPr>
-        <w:br/>
-      </w:r>
     </w:p>
     <w:p>
       <w:pPr>
         <w:pStyle w:val="Legenda"/>
-        <w:jc w:val="left"/>
-        <w:rPr>
-          <w:sz w:val="20"/>
-          <w:lang w:val="pt-BR"/>
-        </w:rPr>
-      </w:pPr>
-    </w:p>
-    <w:p>
-      <w:pPr>
-        <w:pStyle w:val="Legenda"/>
-        <w:jc w:val="left"/>
-        <w:rPr>
-          <w:b w:val="0"/>
-          <w:bCs/>
-          <w:sz w:val="20"/>
-          <w:lang w:val="pt-BR"/>
-        </w:rPr>
-      </w:pPr>
-      <w:r>
-        <w:rPr>
-          <w:sz w:val="20"/>
-          <w:lang w:val="pt-BR"/>
-        </w:rPr>
-        <w:t>Exemplo de teste para a classe PlayerContainer:</w:t>
-      </w:r>
-      <w:r>
-        <w:rPr>
-          <w:sz w:val="20"/>
-          <w:lang w:val="pt-BR"/>
-        </w:rPr>
-        <w:br/>
-      </w:r>
-      <w:r>
-        <w:rPr>
-          <w:sz w:val="20"/>
-          <w:lang w:val="pt-BR"/>
-        </w:rPr>
-        <w:br/>
-      </w:r>
-      <w:r>
-        <w:rPr>
-          <w:b w:val="0"/>
-          <w:bCs/>
-          <w:sz w:val="20"/>
-          <w:lang w:val="pt-BR"/>
-        </w:rPr>
-        <w:t xml:space="preserve">Este teste </w:t>
-      </w:r>
-      <w:r>
-        <w:rPr>
-          <w:b w:val="0"/>
-          <w:bCs/>
-          <w:sz w:val="20"/>
-          <w:lang w:val="pt-BR"/>
-        </w:rPr>
-        <w:t>verifica</w:t>
-      </w:r>
-      <w:r>
-        <w:rPr>
-          <w:b w:val="0"/>
-          <w:bCs/>
-          <w:sz w:val="20"/>
-          <w:lang w:val="pt-BR"/>
-        </w:rPr>
-        <w:t xml:space="preserve"> que ao tentar encotnrar um jogador com um nickname que não se encontra no sistema, é lançado um NoDataException. Isto assegura que o projeto trata de forma correta a gestão dos nicknames.</w:t>
-      </w:r>
-      <w:r>
-        <w:rPr>
-          <w:b w:val="0"/>
-          <w:bCs/>
-          <w:sz w:val="20"/>
-          <w:lang w:val="pt-BR"/>
-        </w:rPr>
-        <w:br/>
-      </w:r>
-      <w:r>
-        <w:rPr>
-          <w:b w:val="0"/>
-          <w:bCs/>
-          <w:sz w:val="20"/>
-          <w:lang w:val="pt-BR"/>
-        </w:rPr>
-        <w:br/>
-      </w:r>
-      <w:r>
-        <w:rPr>
-          <w:b w:val="0"/>
-          <w:bCs/>
-          <w:sz w:val="20"/>
-          <w:lang w:val="pt-BR"/>
+      </w:pPr>
+      <w:r>
+        <w:t>Fig.10. Código de Board.h</w:t>
+      </w:r>
+    </w:p>
+    <w:p>
+      <w:pPr>
+        <w:pStyle w:val="heading2"/>
+        <w:jc w:val="center"/>
+        <w:rPr>
+          <w:noProof/>
+          <w:lang w:val="pt-BR" w:eastAsia="pt-PT"/>
+        </w:rPr>
+      </w:pPr>
+      <w:r>
+        <w:rPr>
+          <w:noProof/>
+          <w:lang w:val="pt-BR" w:eastAsia="pt-PT"/>
         </w:rPr>
         <w:lastRenderedPageBreak/>
-        <w:br/>
-      </w:r>
-      <w:r>
-        <w:rPr>
-          <w:b w:val="0"/>
-          <w:noProof/>
-          <w:sz w:val="20"/>
-          <w:lang w:val="pt-BR"/>
-        </w:rPr>
-        <w:pict w14:anchorId="4F2278E9">
-          <v:shape id="_x0000_i1036" type="#_x0000_t75" style="width:351.6pt;height:165.6pt;visibility:visible">
+        <w:pict w14:anchorId="772D06E1">
+          <v:shape id="_x0000_i1037" type="#_x0000_t75" style="width:317.4pt;height:188.4pt;visibility:visible;mso-wrap-style:square">
             <v:imagedata r:id="rId20" o:title=""/>
           </v:shape>
         </w:pict>
@@ -9095,100 +8190,1079 @@
     <w:p>
       <w:pPr>
         <w:pStyle w:val="Legenda"/>
-        <w:jc w:val="left"/>
-        <w:rPr>
+      </w:pPr>
+      <w:r>
+        <w:t>Fig. 11. Código de validatePosi</w:t>
+      </w:r>
+      <w:r>
+        <w:t xml:space="preserve">tion() </w:t>
+      </w:r>
+      <w:r>
+        <w:t xml:space="preserve">em </w:t>
+      </w:r>
+      <w:r>
+        <w:t>Board.cpp</w:t>
+      </w:r>
+    </w:p>
+    <w:p>
+      <w:pPr>
+        <w:pStyle w:val="Legenda"/>
+        <w:jc w:val="both"/>
+      </w:pPr>
+      <w:r>
+        <w:rPr>
+          <w:rStyle w:val="p1aZchn"/>
+          <w:b w:val="0"/>
           <w:sz w:val="20"/>
           <w:lang w:val="pt-BR"/>
         </w:rPr>
-      </w:pPr>
-      <w:r>
-        <w:rPr>
-          <w:szCs w:val="18"/>
-          <w:lang w:val="pt-BR"/>
-        </w:rPr>
-        <w:t xml:space="preserve">         Fig. </w:t>
-      </w:r>
-      <w:r>
-        <w:rPr>
-          <w:szCs w:val="18"/>
-          <w:lang w:val="pt-BR"/>
-        </w:rPr>
-        <w:t>12</w:t>
-      </w:r>
-      <w:r>
-        <w:rPr>
-          <w:szCs w:val="18"/>
-          <w:lang w:val="pt-BR"/>
-        </w:rPr>
-        <w:t xml:space="preserve">. </w:t>
-      </w:r>
-      <w:r>
-        <w:rPr>
+        <w:t>Board representa o tabuleiro do jogo, com uma grelha de 10x10 onde cada posição pode conter água, navio, acerto ou falha. O método validatePosition() verifica se um navio pode ser colocado numa determinada posição, garantindo que não fica encostado a outros navios. Já os métodos placeShip() e registerShot() atualizam o estado do tabuleiro, enquanto allShipsSunk() verifica se todos os navios foram afundados e se o jogo terminou</w:t>
+      </w:r>
+      <w:r>
+        <w:t>.</w:t>
+      </w:r>
+    </w:p>
+    <w:p>
+      <w:pPr>
+        <w:pStyle w:val="heading2"/>
+        <w:rPr>
+          <w:lang w:val="pt-BR"/>
+        </w:rPr>
+      </w:pPr>
+      <w:r>
+        <w:rPr>
+          <w:lang w:val="pt-BR"/>
+        </w:rPr>
+        <w:t xml:space="preserve">11.4 </w:t>
+      </w:r>
+      <w:r>
+        <w:rPr>
+          <w:lang w:val="pt-BR"/>
+        </w:rPr>
+        <w:t xml:space="preserve">  </w:t>
+      </w:r>
+      <w:r>
+        <w:rPr>
+          <w:lang w:val="pt-BR"/>
+        </w:rPr>
+        <w:t>Mappers</w:t>
+      </w:r>
+    </w:p>
+    <w:p>
+      <w:pPr>
+        <w:pStyle w:val="p1a"/>
+        <w:jc w:val="center"/>
+        <w:rPr>
+          <w:noProof/>
+          <w:lang w:val="pt-BR" w:eastAsia="pt-PT"/>
+        </w:rPr>
+      </w:pPr>
+      <w:r>
+        <w:rPr>
+          <w:noProof/>
+          <w:lang w:val="pt-BR" w:eastAsia="pt-PT"/>
+        </w:rPr>
+        <w:pict w14:anchorId="4C7A1D6E">
+          <v:shape id="_x0000_i1038" type="#_x0000_t75" style="width:320.4pt;height:63pt;visibility:visible;mso-wrap-style:square">
+            <v:imagedata r:id="rId21" o:title=""/>
+          </v:shape>
+        </w:pict>
+      </w:r>
+    </w:p>
+    <w:p>
+      <w:pPr>
+        <w:pStyle w:val="Legenda"/>
+      </w:pPr>
+      <w:r>
+        <w:t>Fig. 12. Código de BoardMapper.cpp</w:t>
+      </w:r>
+    </w:p>
+    <w:p>
+      <w:pPr>
+        <w:jc w:val="center"/>
+        <w:rPr>
+          <w:noProof/>
+          <w:lang w:val="pt-BR" w:eastAsia="pt-PT"/>
+        </w:rPr>
+      </w:pPr>
+      <w:r>
+        <w:rPr>
+          <w:noProof/>
+          <w:lang w:val="pt-BR" w:eastAsia="pt-PT"/>
+        </w:rPr>
+        <w:lastRenderedPageBreak/>
+        <w:pict w14:anchorId="15ADAE60">
+          <v:shape id="_x0000_i1039" type="#_x0000_t75" style="width:284.4pt;height:184.2pt;visibility:visible;mso-wrap-style:square">
+            <v:imagedata r:id="rId22" o:title=""/>
+          </v:shape>
+        </w:pict>
+      </w:r>
+    </w:p>
+    <w:p>
+      <w:pPr>
+        <w:pStyle w:val="Legenda"/>
+      </w:pPr>
+      <w:r>
+        <w:t>Fig. 13. Código de BoadMapper.cpp</w:t>
+      </w:r>
+    </w:p>
+    <w:p>
+      <w:pPr>
+        <w:pStyle w:val="p1a"/>
+        <w:rPr>
+          <w:rFonts w:ascii="Times New Roman" w:hAnsi="Times New Roman"/>
+          <w:lang w:val="pt-BR"/>
+        </w:rPr>
+      </w:pPr>
+      <w:r>
+        <w:rPr>
+          <w:rStyle w:val="Forte"/>
+          <w:rFonts w:ascii="Times New Roman" w:hAnsi="Times New Roman"/>
           <w:b w:val="0"/>
-          <w:bCs/>
-          <w:szCs w:val="18"/>
-          <w:lang w:val="pt-BR"/>
-        </w:rPr>
-        <w:t>Teste unitário da classe PlayerContainer – Acessar jogador que não existe</w:t>
-      </w:r>
+          <w:lang w:val="pt-BR"/>
+        </w:rPr>
+        <w:t>BoardMapper</w:t>
+      </w:r>
+      <w:r>
+        <w:rPr>
+          <w:rFonts w:ascii="Times New Roman" w:hAnsi="Times New Roman"/>
+          <w:lang w:val="pt-BR"/>
+        </w:rPr>
+        <w:t xml:space="preserve"> converte um objeto </w:t>
+      </w:r>
+      <w:r>
+        <w:rPr>
+          <w:rStyle w:val="CdigoHTML"/>
+          <w:rFonts w:ascii="Times New Roman" w:hAnsi="Times New Roman" w:cs="Times New Roman"/>
+          <w:lang w:val="pt-BR"/>
+        </w:rPr>
+        <w:t>Board</w:t>
+      </w:r>
+      <w:r>
+        <w:rPr>
+          <w:rFonts w:ascii="Times New Roman" w:hAnsi="Times New Roman"/>
+          <w:lang w:val="pt-BR"/>
+        </w:rPr>
+        <w:t xml:space="preserve"> num </w:t>
+      </w:r>
+      <w:r>
+        <w:rPr>
+          <w:rStyle w:val="CdigoHTML"/>
+          <w:rFonts w:ascii="Times New Roman" w:hAnsi="Times New Roman" w:cs="Times New Roman"/>
+          <w:lang w:val="pt-BR"/>
+        </w:rPr>
+        <w:t>BoardDTO</w:t>
+      </w:r>
+      <w:r>
+        <w:rPr>
+          <w:rFonts w:ascii="Times New Roman" w:hAnsi="Times New Roman"/>
+          <w:lang w:val="pt-BR"/>
+        </w:rPr>
+        <w:t xml:space="preserve">, copiando as informações necessárias para serem apresentadas na interface. Também utiliza o </w:t>
+      </w:r>
+      <w:r>
+        <w:rPr>
+          <w:rStyle w:val="CdigoHTML"/>
+          <w:rFonts w:ascii="Times New Roman" w:hAnsi="Times New Roman" w:cs="Times New Roman"/>
+          <w:lang w:val="pt-BR"/>
+        </w:rPr>
+        <w:t>ShipMapper</w:t>
+      </w:r>
+      <w:r>
+        <w:rPr>
+          <w:rFonts w:ascii="Times New Roman" w:hAnsi="Times New Roman"/>
+          <w:lang w:val="pt-BR"/>
+        </w:rPr>
+        <w:t xml:space="preserve"> para converter os navios da frota. O método é </w:t>
+      </w:r>
+      <w:r>
+        <w:rPr>
+          <w:rStyle w:val="CdigoHTML"/>
+          <w:rFonts w:ascii="Times New Roman" w:hAnsi="Times New Roman" w:cs="Times New Roman"/>
+          <w:lang w:val="pt-BR"/>
+        </w:rPr>
+        <w:t>static</w:t>
+      </w:r>
+      <w:r>
+        <w:rPr>
+          <w:rFonts w:ascii="Times New Roman" w:hAnsi="Times New Roman"/>
+          <w:lang w:val="pt-BR"/>
+        </w:rPr>
+        <w:t xml:space="preserve"> porque apenas realiza a conversão de dados e não precisa de guardar qualquer estado</w:t>
+      </w:r>
+      <w:r>
+        <w:rPr>
+          <w:rFonts w:ascii="Times New Roman" w:hAnsi="Times New Roman"/>
+          <w:lang w:val="pt-BR"/>
+        </w:rPr>
+        <w:t>.</w:t>
+      </w:r>
+    </w:p>
+    <w:p>
+      <w:pPr>
+        <w:pStyle w:val="heading2"/>
+        <w:rPr>
+          <w:lang w:val="pt-BR"/>
+        </w:rPr>
+      </w:pPr>
+      <w:r>
+        <w:rPr>
+          <w:lang w:val="pt-BR"/>
+        </w:rPr>
+        <w:lastRenderedPageBreak/>
+        <w:t>11.5   Repo</w:t>
+      </w:r>
+    </w:p>
+    <w:p>
+      <w:pPr>
+        <w:pStyle w:val="Legenda"/>
+      </w:pPr>
+      <w:r>
+        <w:pict w14:anchorId="1B6DD970">
+          <v:shape id="_x0000_i1040" type="#_x0000_t75" style="width:298.2pt;height:263.4pt;visibility:visible;mso-wrap-style:square">
+            <v:imagedata r:id="rId23" o:title=""/>
+          </v:shape>
+        </w:pict>
+      </w:r>
+    </w:p>
+    <w:p>
+      <w:pPr>
+        <w:pStyle w:val="Legenda"/>
+      </w:pPr>
+      <w:r>
+        <w:t>Fig. 14. Código de ProfileRepositoryFile.h</w:t>
+      </w:r>
+    </w:p>
+    <w:p>
+      <w:pPr>
+        <w:ind w:firstLine="0"/>
+        <w:jc w:val="center"/>
+        <w:rPr>
+          <w:noProof/>
+          <w:lang w:val="pt-BR" w:eastAsia="pt-PT"/>
+        </w:rPr>
+      </w:pPr>
+      <w:r>
+        <w:rPr>
+          <w:noProof/>
+          <w:lang w:val="pt-BR" w:eastAsia="pt-PT"/>
+        </w:rPr>
+        <w:pict w14:anchorId="10781889">
+          <v:shape id="_x0000_i1041" type="#_x0000_t75" style="width:313.8pt;height:142.2pt;visibility:visible;mso-wrap-style:square">
+            <v:imagedata r:id="rId24" o:title=""/>
+          </v:shape>
+        </w:pict>
+      </w:r>
+    </w:p>
+    <w:p>
+      <w:pPr>
+        <w:pStyle w:val="Legenda"/>
+      </w:pPr>
+      <w:r>
+        <w:t>Fig. 15. Código de save() em ProfileRepositoryFile.cpp</w:t>
+      </w:r>
+    </w:p>
+    <w:p>
+      <w:pPr>
+        <w:pStyle w:val="p1a"/>
+        <w:rPr>
+          <w:lang w:val="pt-BR"/>
+        </w:rPr>
+      </w:pPr>
+      <w:r>
+        <w:rPr>
+          <w:rStyle w:val="Forte"/>
+          <w:b w:val="0"/>
+          <w:lang w:val="pt-BR"/>
+        </w:rPr>
+        <w:t>ProfileRepositoryFile</w:t>
+      </w:r>
+      <w:r>
+        <w:rPr>
+          <w:lang w:val="pt-BR"/>
+        </w:rPr>
+        <w:t xml:space="preserve"> é a classe responsável por guardar e carregar os perfis dos jogadores num ficheiro </w:t>
+      </w:r>
+      <w:r>
+        <w:rPr>
+          <w:lang w:val="pt-BR"/>
+        </w:rPr>
+        <w:t>CSV (players.txt).</w:t>
+      </w:r>
+      <w:r>
+        <w:rPr>
+          <w:lang w:val="pt-BR"/>
+        </w:rPr>
+        <w:t xml:space="preserve"> Utiliza o padrão </w:t>
+      </w:r>
+      <w:r>
+        <w:rPr>
+          <w:rStyle w:val="Forte"/>
+          <w:b w:val="0"/>
+          <w:lang w:val="pt-BR"/>
+        </w:rPr>
+        <w:t>Singleton</w:t>
+      </w:r>
+      <w:r>
+        <w:rPr>
+          <w:lang w:val="pt-BR"/>
+        </w:rPr>
+        <w:t xml:space="preserve">, garantindo que existe apenas uma instância da classe. Os métodos </w:t>
+      </w:r>
+      <w:r>
+        <w:rPr>
+          <w:lang w:val="pt-BR"/>
+        </w:rPr>
+        <w:t>load()</w:t>
+      </w:r>
+      <w:r>
+        <w:rPr>
+          <w:lang w:val="pt-BR"/>
+        </w:rPr>
+        <w:t xml:space="preserve"> </w:t>
+      </w:r>
+      <w:r>
+        <w:rPr>
+          <w:lang w:val="pt-BR"/>
+        </w:rPr>
+        <w:t>e save()</w:t>
+      </w:r>
+      <w:r>
+        <w:rPr>
+          <w:lang w:val="pt-BR"/>
+        </w:rPr>
+        <w:t xml:space="preserve"> permitem ler e guardar os dados dos jogadores, mantendo as suas estatísticas entre diferentes execuções do programa</w:t>
+      </w:r>
+      <w:r>
+        <w:rPr>
+          <w:lang w:val="pt-BR"/>
+        </w:rPr>
+        <w:t>.</w:t>
+      </w:r>
+    </w:p>
+    <w:p>
+      <w:pPr>
+        <w:pStyle w:val="heading2"/>
+        <w:rPr>
+          <w:lang w:val="pt-BR"/>
+        </w:rPr>
+      </w:pPr>
+      <w:r>
+        <w:rPr>
+          <w:lang w:val="pt-BR"/>
+        </w:rPr>
+        <w:lastRenderedPageBreak/>
+        <w:t>11.6   Services</w:t>
+      </w:r>
+    </w:p>
+    <w:p>
+      <w:pPr>
+        <w:pStyle w:val="p1a"/>
+        <w:jc w:val="center"/>
+        <w:rPr>
+          <w:noProof/>
+          <w:lang w:val="pt-BR" w:eastAsia="pt-PT"/>
+        </w:rPr>
+      </w:pPr>
+      <w:r>
+        <w:rPr>
+          <w:noProof/>
+          <w:lang w:val="pt-BR" w:eastAsia="pt-PT"/>
+        </w:rPr>
+        <w:pict w14:anchorId="57831F45">
+          <v:shape id="_x0000_i1042" type="#_x0000_t75" style="width:297pt;height:229.2pt;visibility:visible;mso-wrap-style:square">
+            <v:imagedata r:id="rId25" o:title=""/>
+          </v:shape>
+        </w:pict>
+      </w:r>
+    </w:p>
+    <w:p>
+      <w:pPr>
+        <w:pStyle w:val="Legenda"/>
+      </w:pPr>
+      <w:r>
+        <w:t>Fig.16. Código de PlayerService.h</w:t>
+      </w:r>
+    </w:p>
+    <w:p>
+      <w:pPr>
+        <w:pStyle w:val="Legenda"/>
+      </w:pPr>
+      <w:r>
+        <w:pict w14:anchorId="6E4C43A9">
+          <v:shape id="_x0000_i1043" type="#_x0000_t75" style="width:340.8pt;height:133.2pt;visibility:visible;mso-wrap-style:square">
+            <v:imagedata r:id="rId26" o:title=""/>
+          </v:shape>
+        </w:pict>
+      </w:r>
+    </w:p>
+    <w:p>
+      <w:pPr>
+        <w:pStyle w:val="Legenda"/>
+        <w:rPr>
+          <w:szCs w:val="24"/>
+        </w:rPr>
+      </w:pPr>
+      <w:r>
+        <w:t>Fig. 17. Código de registerPlayer() em PlayerService</w:t>
+      </w:r>
+    </w:p>
+    <w:p>
+      <w:pPr>
+        <w:pStyle w:val="Legenda"/>
+        <w:jc w:val="both"/>
+        <w:rPr>
+          <w:rStyle w:val="p1aZchn"/>
+          <w:b w:val="0"/>
+          <w:sz w:val="20"/>
+          <w:lang w:val="pt-BR"/>
+        </w:rPr>
+      </w:pPr>
+      <w:r>
+        <w:rPr>
+          <w:rStyle w:val="p1aZchn"/>
+          <w:b w:val="0"/>
+          <w:sz w:val="20"/>
+          <w:lang w:val="pt-BR"/>
+        </w:rPr>
+        <w:t>PlayerService é a camada responsável pelas regras de negócio relacionadas com os jogadores. Faz validações no registo, verifica se já existem jogadores com o mesmo nome e obtém os rankings. Também organiza os jogadores com base nas vitórias ou na precisão. Em caso de erro, lança exceções específicas para que o Controller trate a situação adequadamente.</w:t>
+      </w:r>
+    </w:p>
+    <w:p>
+      <w:pPr>
+        <w:pStyle w:val="heading2"/>
+        <w:rPr>
+          <w:lang w:val="pt-BR"/>
+        </w:rPr>
+      </w:pPr>
+      <w:r>
+        <w:rPr>
+          <w:lang w:val="pt-BR"/>
+        </w:rPr>
+        <w:lastRenderedPageBreak/>
+        <w:t>11.7   View</w:t>
+      </w:r>
+    </w:p>
+    <w:p>
+      <w:pPr>
+        <w:ind w:firstLine="0"/>
+        <w:jc w:val="center"/>
+        <w:rPr>
+          <w:noProof/>
+          <w:lang w:val="pt-BR" w:eastAsia="pt-PT"/>
+        </w:rPr>
+      </w:pPr>
+      <w:r>
+        <w:rPr>
+          <w:noProof/>
+          <w:lang w:val="pt-BR" w:eastAsia="pt-PT"/>
+        </w:rPr>
+        <w:pict w14:anchorId="763FE111">
+          <v:shape id="_x0000_i1044" type="#_x0000_t75" style="width:345.6pt;height:215.4pt;visibility:visible;mso-wrap-style:square">
+            <v:imagedata r:id="rId27" o:title=""/>
+          </v:shape>
+        </w:pict>
+      </w:r>
+    </w:p>
+    <w:p>
+      <w:pPr>
+        <w:pStyle w:val="Legenda"/>
+      </w:pPr>
+      <w:r>
+        <w:t>Fig. 18. Código de View.h</w:t>
+      </w:r>
+    </w:p>
+    <w:p>
+      <w:pPr>
+        <w:ind w:firstLine="0"/>
+        <w:jc w:val="center"/>
+        <w:rPr>
+          <w:noProof/>
+          <w:lang w:val="pt-BR" w:eastAsia="pt-PT"/>
+        </w:rPr>
+      </w:pPr>
+      <w:r>
+        <w:rPr>
+          <w:noProof/>
+          <w:lang w:val="pt-BR" w:eastAsia="pt-PT"/>
+        </w:rPr>
+        <w:lastRenderedPageBreak/>
+        <w:pict w14:anchorId="6A559318">
+          <v:shape id="_x0000_i1045" type="#_x0000_t75" style="width:329.4pt;height:291pt;visibility:visible;mso-wrap-style:square">
+            <v:imagedata r:id="rId28" o:title=""/>
+          </v:shape>
+        </w:pict>
+      </w:r>
+    </w:p>
+    <w:p>
+      <w:pPr>
+        <w:pStyle w:val="Legenda"/>
+      </w:pPr>
+      <w:r>
+        <w:t>Fig. 19. Código em showBoard() em View.cpp</w:t>
+      </w:r>
+    </w:p>
+    <w:p>
+      <w:pPr>
+        <w:pStyle w:val="p1a"/>
+        <w:rPr>
+          <w:lang w:val="pt-BR" w:eastAsia="pt-PT"/>
+        </w:rPr>
+      </w:pPr>
+      <w:r>
+        <w:rPr>
+          <w:rStyle w:val="Forte"/>
+          <w:b w:val="0"/>
+          <w:lang w:val="pt-BR"/>
+        </w:rPr>
+        <w:t>View</w:t>
+      </w:r>
+      <w:r>
+        <w:rPr>
+          <w:lang w:val="pt-BR"/>
+        </w:rPr>
+        <w:t xml:space="preserve"> é a classe responsável pela interação com o utilizador através da consola. Mostra o tabuleiro, recebe as jogadas e apresenta mensagens e </w:t>
+      </w:r>
+      <w:r>
+        <w:rPr>
+          <w:lang w:val="pt-BR"/>
+        </w:rPr>
+        <w:t>resultados do jogo. Também oculta</w:t>
+      </w:r>
+      <w:r>
+        <w:rPr>
+          <w:lang w:val="pt-BR"/>
+        </w:rPr>
+        <w:t xml:space="preserve"> os navios do adversário durante a partida e exibir as estatísticas finais quando o jogo termina.</w:t>
+      </w:r>
+    </w:p>
+    <w:p>
+      <w:pPr>
+        <w:pStyle w:val="heading2"/>
+      </w:pPr>
+      <w:bookmarkStart w:id="7" w:name="_GoBack"/>
+      <w:r>
+        <w:lastRenderedPageBreak/>
+        <w:t>11.8   Controller</w:t>
+      </w:r>
+    </w:p>
+    <w:bookmarkEnd w:id="7"/>
+    <w:p>
+      <w:pPr>
+        <w:pStyle w:val="Legenda"/>
+      </w:pPr>
+      <w:r>
+        <w:pict w14:anchorId="1B5E44F9">
+          <v:shape id="_x0000_i1046" type="#_x0000_t75" style="width:237.6pt;height:345.6pt;visibility:visible;mso-wrap-style:square">
+            <v:imagedata r:id="rId29" o:title=""/>
+          </v:shape>
+        </w:pict>
+      </w:r>
+    </w:p>
+    <w:p>
+      <w:pPr>
+        <w:pStyle w:val="Legenda"/>
+      </w:pPr>
+      <w:r>
+        <w:t>Fig. 20. Código de Controller.h</w:t>
+      </w:r>
+    </w:p>
+    <w:p>
+      <w:pPr>
+        <w:jc w:val="center"/>
+        <w:rPr>
+          <w:noProof/>
+          <w:lang w:val="pt-BR" w:eastAsia="pt-PT"/>
+        </w:rPr>
+      </w:pPr>
+      <w:r>
+        <w:rPr>
+          <w:noProof/>
+          <w:lang w:val="pt-BR" w:eastAsia="pt-PT"/>
+        </w:rPr>
+        <w:lastRenderedPageBreak/>
+        <w:pict w14:anchorId="447639AE">
+          <v:shape id="_x0000_i1047" type="#_x0000_t75" style="width:202.2pt;height:370.2pt;visibility:visible;mso-wrap-style:square">
+            <v:imagedata r:id="rId30" o:title=""/>
+          </v:shape>
+        </w:pict>
+      </w:r>
+    </w:p>
+    <w:p>
+      <w:pPr>
+        <w:pStyle w:val="Legenda"/>
+      </w:pPr>
+      <w:r>
+        <w:t>Fig. 21. Código de runMain() em Controller.cpp</w:t>
+      </w:r>
+    </w:p>
+    <w:p>
+      <w:pPr>
+        <w:pStyle w:val="Legenda"/>
+        <w:jc w:val="both"/>
+        <w:rPr>
+          <w:rStyle w:val="p1aZchn"/>
+          <w:b w:val="0"/>
+          <w:sz w:val="20"/>
+          <w:lang w:val="pt-BR"/>
+        </w:rPr>
+      </w:pPr>
+      <w:r>
+        <w:rPr>
+          <w:rStyle w:val="p1aZchn"/>
+          <w:b w:val="0"/>
+          <w:sz w:val="20"/>
+          <w:lang w:val="pt-BR"/>
+        </w:rPr>
+        <w:t>Controller é a classe principal da aplicação, responsável por ligar a View, os Services e o Model. Controla o fluxo do programa, recebendo ações do utilizador, executando as regras de negócio e atualizando o estado do jogo. Além disso, organiza as diferentes funcionalidades em métodos separados.</w:t>
+      </w:r>
+    </w:p>
+    <w:p>
+      <w:pPr>
+        <w:pStyle w:val="heading1"/>
+      </w:pPr>
+      <w:r>
+        <w:rPr>
+          <w:rStyle w:val="p1aZchn"/>
+          <w:b w:val="0"/>
+          <w:sz w:val="20"/>
+          <w:lang w:val="pt-BR"/>
+        </w:rPr>
+        <w:br w:type="page"/>
+      </w:r>
+      <w:r>
+        <w:lastRenderedPageBreak/>
+        <w:br/>
+      </w:r>
+      <w:r>
+        <w:t>11</w:t>
+      </w:r>
+      <w:r>
+        <w:t xml:space="preserve">   Testes</w:t>
+      </w:r>
+    </w:p>
+    <w:p>
+      <w:pPr>
+        <w:pStyle w:val="p1a"/>
+        <w:rPr>
+          <w:lang w:val="pt-BR"/>
+        </w:rPr>
+      </w:pPr>
+      <w:r>
+        <w:rPr>
+          <w:lang w:val="pt-BR"/>
+        </w:rPr>
+        <w:br/>
+      </w:r>
+      <w:r>
+        <w:rPr>
+          <w:lang w:val="pt-BR"/>
+        </w:rPr>
+        <w:br/>
+        <w:t>Para garantir o correto funcionamento das classes</w:t>
+      </w:r>
+      <w:r>
+        <w:rPr>
+          <w:lang w:val="pt-BR"/>
+        </w:rPr>
+        <w:t xml:space="preserve">, </w:t>
+      </w:r>
+      <w:r>
+        <w:rPr>
+          <w:lang w:val="pt-BR"/>
+        </w:rPr>
+        <w:t xml:space="preserve">foram realizados testes unitários utilizando a framework Goodle C++ Testing Framework. Os testes feitos, cobrem </w:t>
+      </w:r>
+      <w:r>
+        <w:rPr>
+          <w:lang w:val="pt-BR"/>
+        </w:rPr>
+        <w:t>construtores</w:t>
+      </w:r>
+      <w:r>
+        <w:rPr>
+          <w:lang w:val="pt-BR"/>
+        </w:rPr>
+        <w:t>, funções e operadores de cada classe presente no projeto.</w:t>
+      </w:r>
+    </w:p>
+    <w:p>
+      <w:pPr>
+        <w:pStyle w:val="p1a"/>
+        <w:rPr>
+          <w:lang w:val="pt-BR"/>
+        </w:rPr>
+      </w:pPr>
+      <w:r>
+        <w:rPr>
+          <w:lang w:val="pt-BR"/>
+        </w:rPr>
+        <w:br/>
+        <w:t>Segue-se um exemplo de teste</w:t>
+      </w:r>
+      <w:r>
+        <w:rPr>
+          <w:lang w:val="pt-BR"/>
+        </w:rPr>
+        <w:t xml:space="preserve"> realizado</w:t>
+      </w:r>
+      <w:r>
+        <w:rPr>
+          <w:lang w:val="pt-BR"/>
+        </w:rPr>
+        <w:t xml:space="preserve"> </w:t>
+      </w:r>
+      <w:r>
+        <w:rPr>
+          <w:lang w:val="pt-BR"/>
+        </w:rPr>
+        <w:t>de cada classe.</w:t>
+      </w:r>
+    </w:p>
+    <w:p>
+      <w:pPr>
+        <w:pStyle w:val="Legenda"/>
+        <w:jc w:val="both"/>
+      </w:pPr>
+      <w:r>
+        <w:br/>
+      </w:r>
+      <w:r>
+        <w:rPr>
+          <w:sz w:val="20"/>
+        </w:rPr>
+        <w:t>Exemplo de teste para a classe Player:</w:t>
+      </w:r>
+      <w:r>
+        <w:br/>
+      </w:r>
+      <w:r>
+        <w:br/>
+      </w:r>
+      <w:r>
+        <w:rPr>
+          <w:b w:val="0"/>
+        </w:rPr>
+        <w:t>Este teste verifica que o construtor da classe Player lança uma InvalidDataException quando o nickname introduzido pelo jogador, tem menos de 3 caracteres. Com isto, este teste assegura que a validação do nickname está corretamente implementada no projeto.</w:t>
+      </w:r>
+      <w:r>
+        <w:rPr>
+          <w:b w:val="0"/>
+        </w:rPr>
+        <w:br/>
+      </w:r>
+    </w:p>
+    <w:p>
+      <w:pPr>
+        <w:pStyle w:val="Legenda"/>
+      </w:pPr>
+      <w:r>
+        <w:br/>
+      </w:r>
+      <w:r>
+        <w:pict w14:anchorId="5D785E8A">
+          <v:shape id="_x0000_i1048" type="#_x0000_t75" style="width:343.2pt;height:162pt;visibility:visible">
+            <v:imagedata r:id="rId31" o:title=""/>
+          </v:shape>
+        </w:pict>
+      </w:r>
+      <w:r>
+        <w:br/>
+      </w:r>
+      <w:r>
+        <w:t xml:space="preserve">                   Fig. 8</w:t>
+      </w:r>
+      <w:r>
+        <w:t>. Teste unitário da classe Player – validação do nickname</w:t>
+      </w:r>
+    </w:p>
+    <w:p>
+      <w:pPr>
+        <w:pStyle w:val="Legenda"/>
+      </w:pPr>
     </w:p>
     <w:p>
       <w:pPr>
         <w:pStyle w:val="Legenda"/>
         <w:jc w:val="left"/>
+      </w:pPr>
+      <w:r>
+        <w:br/>
+      </w:r>
+      <w:r>
         <w:rPr>
           <w:sz w:val="20"/>
-          <w:lang w:val="pt-BR"/>
-        </w:rPr>
+        </w:rPr>
+        <w:t>Exemplo de teste para a classe Ship:</w:t>
+      </w:r>
+      <w:r>
+        <w:br/>
+      </w:r>
+      <w:r>
+        <w:br/>
+      </w:r>
+      <w:r>
+        <w:rPr>
+          <w:b w:val="0"/>
+          <w:sz w:val="20"/>
+        </w:rPr>
+        <w:t>Este teste verifica que um navio é considerado afundado, após receber um número de hits igual ao seu tamanho. Neste caso, foram adicionados 2 hits, dado o tamanho da fragata.  Este teste comprova que o método isSunk() reflete o estado do navio ao longo da partida.</w:t>
+      </w:r>
+    </w:p>
+    <w:p>
+      <w:pPr>
+        <w:pStyle w:val="Legenda"/>
+      </w:pPr>
+      <w:r>
+        <w:lastRenderedPageBreak/>
+        <w:br/>
+      </w:r>
+      <w:r>
+        <w:pict w14:anchorId="6DCFBF81">
+          <v:shape id="_x0000_i1049" type="#_x0000_t75" style="width:346.2pt;height:103.2pt;visibility:visible">
+            <v:imagedata r:id="rId32" o:title=""/>
+          </v:shape>
+        </w:pict>
+      </w:r>
+      <w:r>
+        <w:t xml:space="preserve">                  Fig. </w:t>
+      </w:r>
+      <w:r>
+        <w:t>9</w:t>
+      </w:r>
+      <w:r>
+        <w:t>. Teste unitário da classe Ship – verificação de navio afundado</w:t>
+      </w:r>
+      <w:r>
+        <w:br/>
+      </w:r>
+    </w:p>
+    <w:p>
+      <w:pPr>
+        <w:pStyle w:val="Legenda"/>
+        <w:jc w:val="both"/>
+      </w:pPr>
+      <w:r>
+        <w:br/>
+      </w:r>
+      <w:r>
+        <w:rPr>
+          <w:sz w:val="20"/>
+        </w:rPr>
+        <w:t xml:space="preserve">Exemplo de teste para a classe </w:t>
+      </w:r>
+      <w:r>
+        <w:rPr>
+          <w:sz w:val="20"/>
+        </w:rPr>
+        <w:t>Board</w:t>
+      </w:r>
+      <w:r>
+        <w:rPr>
+          <w:sz w:val="20"/>
+        </w:rPr>
+        <w:t>:</w:t>
+      </w:r>
+      <w:r>
+        <w:br/>
+      </w:r>
+      <w:r>
+        <w:br/>
+      </w:r>
+      <w:r>
+        <w:rPr>
+          <w:b w:val="0"/>
+        </w:rPr>
+        <w:t>Este teste verifica que ao efetuar um disparo numa célula ocupada por um navio, neste caso novamente uma fragata, o método registerShot() devolve “X” e atualiza o estado do tabuleiro. Isto garante que ao longo da partida, após cada jogada, o tabuleiro é atualizado de forma correta.</w:t>
+      </w:r>
+      <w:r>
+        <w:br/>
+      </w:r>
+      <w:r>
+        <w:br/>
+      </w:r>
+      <w:r>
+        <w:pict w14:anchorId="55F29CDE">
+          <v:shape id="_x0000_i1050" type="#_x0000_t75" style="width:349.8pt;height:129.6pt;visibility:visible">
+            <v:imagedata r:id="rId33" o:title=""/>
+          </v:shape>
+        </w:pict>
+      </w:r>
+      <w:r>
+        <w:t xml:space="preserve">                    Fig. </w:t>
+      </w:r>
+      <w:r>
+        <w:t>10</w:t>
+      </w:r>
+      <w:r>
+        <w:t xml:space="preserve">. Teste unitário da classe Board – registo de tiro no navio                   </w:t>
+      </w:r>
+      <w:r>
+        <w:br/>
+      </w:r>
+      <w:r>
+        <w:br/>
+      </w:r>
+      <w:r>
+        <w:br/>
+      </w:r>
+      <w:r>
+        <w:br/>
+      </w:r>
+      <w:r>
+        <w:rPr>
+          <w:sz w:val="20"/>
+        </w:rPr>
+        <w:t>Exemplo de teste para a classe Game:</w:t>
+      </w:r>
+      <w:r>
+        <w:br/>
+      </w:r>
+      <w:r>
+        <w:br/>
+      </w:r>
+      <w:r>
+        <w:rPr>
+          <w:b w:val="0"/>
+        </w:rPr>
+        <w:t xml:space="preserve">Este teste verifica que quando um jogador acerta num navio do adversário, o turno não é alterado, permitindo assim que o jogador continue a jogar até falhar algum navio. Isto verifica que o projeto segue a regra do jogo </w:t>
+      </w:r>
+      <w:r>
+        <w:rPr>
+          <w:b w:val="0"/>
+        </w:rPr>
+        <w:t>clássico</w:t>
+      </w:r>
+      <w:r>
+        <w:rPr>
+          <w:b w:val="0"/>
+        </w:rPr>
+        <w:t xml:space="preserve"> de batalha naval.</w:t>
+      </w:r>
+      <w:r>
+        <w:br/>
+      </w:r>
+      <w:r>
+        <w:br/>
+      </w:r>
+      <w:r>
+        <w:lastRenderedPageBreak/>
+        <w:pict w14:anchorId="5778C4CB">
+          <v:shape id="_x0000_i1051" type="#_x0000_t75" style="width:345.6pt;height:154.8pt;visibility:visible">
+            <v:imagedata r:id="rId34" o:title=""/>
+          </v:shape>
+        </w:pict>
+      </w:r>
+      <w:r>
+        <w:br/>
+        <w:t xml:space="preserve">                Fig. </w:t>
+      </w:r>
+      <w:r>
+        <w:t>11</w:t>
+      </w:r>
+      <w:r>
+        <w:t>. Teste unitário da classe Game – verificação de turno após acerto</w:t>
+      </w:r>
+      <w:r>
+        <w:br/>
+      </w:r>
+    </w:p>
+    <w:p>
+      <w:pPr>
+        <w:pStyle w:val="Legenda"/>
       </w:pPr>
     </w:p>
     <w:p>
       <w:pPr>
         <w:pStyle w:val="Legenda"/>
         <w:jc w:val="left"/>
+      </w:pPr>
+      <w:r>
+        <w:rPr>
+          <w:sz w:val="20"/>
+        </w:rPr>
+        <w:t>Exemplo de teste para a classe PlayerContainer:</w:t>
+      </w:r>
+      <w:r>
+        <w:br/>
+      </w:r>
+      <w:r>
+        <w:br/>
+      </w:r>
+      <w:r>
         <w:rPr>
           <w:b w:val="0"/>
-          <w:bCs/>
-          <w:sz w:val="20"/>
-          <w:lang w:val="pt-BR"/>
-        </w:rPr>
-      </w:pPr>
-      <w:r>
-        <w:rPr>
-          <w:sz w:val="20"/>
-          <w:lang w:val="pt-BR"/>
-        </w:rPr>
+        </w:rPr>
+        <w:t xml:space="preserve">Este teste </w:t>
+      </w:r>
+      <w:r>
+        <w:rPr>
+          <w:b w:val="0"/>
+        </w:rPr>
+        <w:t>verifica</w:t>
+      </w:r>
+      <w:r>
+        <w:rPr>
+          <w:b w:val="0"/>
+        </w:rPr>
+        <w:t xml:space="preserve"> que ao tentar encotnrar um jogador com um nickname que não se encontra no sistema, é lançado um NoDataException. Isto assegura que o projeto trata de forma correta a gestão dos nicknames.</w:t>
+      </w:r>
+      <w:r>
+        <w:br/>
+      </w:r>
+      <w:r>
+        <w:br/>
+      </w:r>
+      <w:r>
+        <w:br/>
+      </w:r>
+      <w:r>
+        <w:pict w14:anchorId="4F2278E9">
+          <v:shape id="_x0000_i1052" type="#_x0000_t75" style="width:351.6pt;height:165.6pt;visibility:visible">
+            <v:imagedata r:id="rId35" o:title=""/>
+          </v:shape>
+        </w:pict>
+      </w:r>
+    </w:p>
+    <w:p>
+      <w:pPr>
+        <w:pStyle w:val="Legenda"/>
+      </w:pPr>
+      <w:r>
+        <w:t xml:space="preserve">         Fig. </w:t>
+      </w:r>
+      <w:r>
+        <w:t>12</w:t>
+      </w:r>
+      <w:r>
+        <w:t>. Teste unitário da classe PlayerContainer – Acessar jogador que não existe</w:t>
+      </w:r>
+    </w:p>
+    <w:p>
+      <w:pPr>
+        <w:pStyle w:val="Legenda"/>
+      </w:pPr>
+    </w:p>
+    <w:p>
+      <w:pPr>
+        <w:pStyle w:val="heading2"/>
+      </w:pPr>
+      <w:r>
+        <w:lastRenderedPageBreak/>
         <w:t>11</w:t>
       </w:r>
-      <w:bookmarkStart w:id="7" w:name="_GoBack"/>
-      <w:bookmarkEnd w:id="7"/>
-      <w:r>
-        <w:rPr>
-          <w:sz w:val="20"/>
-          <w:lang w:val="pt-BR"/>
-        </w:rPr>
+      <w:r>
         <w:t>.1 Tabela de taxa de sucesso dos testes</w:t>
       </w:r>
       <w:r>
-        <w:rPr>
-          <w:sz w:val="20"/>
-          <w:lang w:val="pt-BR"/>
-        </w:rPr>
         <w:br/>
       </w:r>
       <w:r>
-        <w:rPr>
-          <w:sz w:val="20"/>
-          <w:lang w:val="pt-BR"/>
-        </w:rPr>
         <w:br/>
       </w:r>
       <w:r>
         <w:rPr>
           <w:b w:val="0"/>
-          <w:bCs/>
-          <w:sz w:val="20"/>
-          <w:lang w:val="pt-BR"/>
         </w:rPr>
         <w:t>A tabela seguinte apresenta os resultados obtidos na execução dos 35 testes unitários, indicando a taxa de sucesso de cada teste sobre as classes do projeto.</w:t>
       </w:r>
@@ -9196,61 +9270,20 @@
     <w:p>
       <w:pPr>
         <w:pStyle w:val="Legenda"/>
-        <w:rPr>
-          <w:b w:val="0"/>
-          <w:bCs/>
-          <w:sz w:val="20"/>
-          <w:lang w:val="pt-BR"/>
-        </w:rPr>
-      </w:pPr>
-      <w:r>
-        <w:rPr>
-          <w:b w:val="0"/>
-          <w:bCs/>
-          <w:sz w:val="20"/>
-          <w:lang w:val="pt-BR"/>
-        </w:rPr>
+      </w:pPr>
+      <w:r>
         <w:br/>
       </w:r>
       <w:r>
-        <w:rPr>
-          <w:b w:val="0"/>
-          <w:bCs/>
-          <w:sz w:val="20"/>
-          <w:lang w:val="pt-BR"/>
-        </w:rPr>
         <w:br/>
       </w:r>
       <w:r>
-        <w:rPr>
-          <w:szCs w:val="18"/>
-          <w:lang w:val="pt-BR"/>
-        </w:rPr>
         <w:t xml:space="preserve">Tabela </w:t>
       </w:r>
       <w:r>
-        <w:rPr>
-          <w:szCs w:val="18"/>
-          <w:lang w:val="pt-BR"/>
-        </w:rPr>
-        <w:t>1.</w:t>
-      </w:r>
-      <w:r>
-        <w:rPr>
-          <w:b w:val="0"/>
-          <w:bCs/>
-          <w:szCs w:val="18"/>
-          <w:lang w:val="pt-BR"/>
-        </w:rPr>
-        <w:t xml:space="preserve"> Taxa</w:t>
-      </w:r>
-      <w:r>
-        <w:rPr>
-          <w:b w:val="0"/>
-          <w:bCs/>
-          <w:szCs w:val="18"/>
-          <w:lang w:val="pt-BR"/>
-        </w:rPr>
+        <w:t>1. Taxa</w:t>
+      </w:r>
+      <w:r>
         <w:t xml:space="preserve"> de sucesso dos testes unitários realizados</w:t>
       </w:r>
     </w:p>
@@ -10335,7 +10368,6 @@
                 <w:rFonts w:ascii="Calibri" w:eastAsia="Calibri" w:hAnsi="Calibri" w:cs="Calibri"/>
                 <w:lang w:val="pt-BR"/>
               </w:rPr>
-              <w:lastRenderedPageBreak/>
               <w:t>Ship — Construtor válido</w:t>
             </w:r>
           </w:p>
@@ -11548,6 +11580,7 @@
                 <w:rFonts w:ascii="Calibri" w:eastAsia="Calibri" w:hAnsi="Calibri" w:cs="Calibri"/>
                 <w:lang w:val="pt-BR"/>
               </w:rPr>
+              <w:lastRenderedPageBreak/>
               <w:t>Board — allShipsSunk (afundado)</w:t>
             </w:r>
           </w:p>
@@ -12833,70 +12866,30 @@
     <w:p>
       <w:pPr>
         <w:pStyle w:val="Legenda"/>
-        <w:jc w:val="left"/>
-        <w:rPr>
-          <w:sz w:val="20"/>
-          <w:lang w:val="pt-BR"/>
-        </w:rPr>
       </w:pPr>
     </w:p>
     <w:p>
       <w:pPr>
         <w:pStyle w:val="Legenda"/>
-        <w:jc w:val="left"/>
-        <w:rPr>
-          <w:sz w:val="20"/>
-          <w:lang w:val="pt-BR"/>
-        </w:rPr>
-      </w:pPr>
-    </w:p>
-    <w:p>
-      <w:pPr>
-        <w:pStyle w:val="Legenda"/>
-        <w:jc w:val="left"/>
-        <w:rPr>
-          <w:sz w:val="20"/>
-          <w:lang w:val="pt-BR"/>
-        </w:rPr>
-      </w:pPr>
-      <w:r>
-        <w:rPr>
-          <w:sz w:val="24"/>
-          <w:szCs w:val="24"/>
-          <w:lang w:val="pt-BR"/>
-        </w:rPr>
+      </w:pPr>
+    </w:p>
+    <w:p>
+      <w:pPr>
+        <w:pStyle w:val="heading1"/>
+      </w:pPr>
+      <w:r>
         <w:br/>
       </w:r>
       <w:r>
-        <w:rPr>
-          <w:sz w:val="24"/>
-          <w:szCs w:val="24"/>
-          <w:lang w:val="pt-BR"/>
-        </w:rPr>
         <w:t>1</w:t>
       </w:r>
       <w:r>
-        <w:rPr>
-          <w:sz w:val="24"/>
-          <w:szCs w:val="24"/>
-          <w:lang w:val="pt-BR"/>
-        </w:rPr>
         <w:t>2</w:t>
       </w:r>
       <w:r>
-        <w:rPr>
-          <w:sz w:val="24"/>
-          <w:szCs w:val="24"/>
-          <w:lang w:val="pt-BR"/>
-        </w:rPr>
         <w:t xml:space="preserve">   </w:t>
       </w:r>
       <w:r>
-        <w:rPr>
-          <w:sz w:val="24"/>
-          <w:szCs w:val="24"/>
-          <w:lang w:val="pt-BR"/>
-        </w:rPr>
         <w:t>Conclusão</w:t>
       </w:r>
     </w:p>
@@ -13029,7 +13022,7 @@
     </w:p>
     <w:p>
       <w:pPr>
-        <w:pStyle w:val="Ttulo2"/>
+        <w:pStyle w:val="heading2"/>
         <w:rPr>
           <w:lang w:val="pt-BR" w:eastAsia="pt-PT"/>
         </w:rPr>
@@ -14689,7 +14682,7 @@
     <w:lsdException w:name="heading 9" w:qFormat="1"/>
     <w:lsdException w:name="Title" w:qFormat="1"/>
     <w:lsdException w:name="Subtitle" w:qFormat="1"/>
-    <w:lsdException w:name="Strong" w:qFormat="1"/>
+    <w:lsdException w:name="Strong" w:uiPriority="22" w:qFormat="1"/>
     <w:lsdException w:name="Emphasis" w:qFormat="1"/>
     <w:lsdException w:name="Normal (Web)" w:uiPriority="99"/>
     <w:lsdException w:name="HTML Code" w:uiPriority="99"/>
@@ -15161,7 +15154,6 @@
   <w:style w:type="character" w:default="1" w:styleId="Fontepargpadro">
     <w:name w:val="Default Paragraph Font"/>
     <w:uiPriority w:val="1"/>
-    <w:semiHidden/>
     <w:unhideWhenUsed/>
   </w:style>
   <w:style w:type="table" w:default="1" w:styleId="Tabelanormal">
@@ -15521,7 +15513,7 @@
     <w:basedOn w:val="Normal"/>
     <w:next w:val="Normal"/>
     <w:autoRedefine/>
-    <w:rsid w:val="00B1442B"/>
+    <w:rsid w:val="00FF5025"/>
     <w:pPr>
       <w:spacing w:before="120" w:after="120"/>
       <w:ind w:firstLine="0"/>
@@ -15529,7 +15521,10 @@
     </w:pPr>
     <w:rPr>
       <w:b/>
+      <w:noProof/>
       <w:sz w:val="18"/>
+      <w:szCs w:val="18"/>
+      <w:lang w:val="pt-BR" w:eastAsia="pt-PT"/>
     </w:rPr>
   </w:style>
   <w:style w:type="paragraph" w:customStyle="1" w:styleId="heading4">
@@ -15882,6 +15877,16 @@
   <w:style w:type="character" w:customStyle="1" w:styleId="citation-66">
     <w:name w:val="citation-66"/>
     <w:rsid w:val="005B59A1"/>
+  </w:style>
+  <w:style w:type="character" w:styleId="Forte">
+    <w:name w:val="Strong"/>
+    <w:uiPriority w:val="22"/>
+    <w:qFormat/>
+    <w:rsid w:val="007376FC"/>
+    <w:rPr>
+      <w:b/>
+      <w:bCs/>
+    </w:rPr>
   </w:style>
 </w:styles>
 </file>
@@ -16245,7 +16250,7 @@
 </file>
 
 <file path=customXml/itemProps1.xml><?xml version="1.0" encoding="utf-8"?>
-<ds:datastoreItem xmlns:ds="http://schemas.openxmlformats.org/officeDocument/2006/customXml" ds:itemID="{33172FA5-022F-421A-8DBA-D7A7D68F63A3}">
+<ds:datastoreItem xmlns:ds="http://schemas.openxmlformats.org/officeDocument/2006/customXml" ds:itemID="{9ADDAB5F-C280-4140-886B-33CDFA6D2FE5}">
   <ds:schemaRefs>
     <ds:schemaRef ds:uri="http://schemas.openxmlformats.org/officeDocument/2006/bibliography"/>
   </ds:schemaRefs>

</xml_diff>

<commit_message>
Relatório: Correção do diagrama "Organização do Código"
</commit_message>
<xml_diff>
--- a/Documentation/iteration03/fsoft2026_1DA_4.docx
+++ b/Documentation/iteration03/fsoft2026_1DA_4.docx
@@ -1,6 +1,6 @@
 
 <file path=word/document.xml><?xml version="1.0" encoding="utf-8"?>
-<w:document xmlns:wpc="http://schemas.microsoft.com/office/word/2010/wordprocessingCanvas" xmlns:mc="http://schemas.openxmlformats.org/markup-compatibility/2006" xmlns:o="urn:schemas-microsoft-com:office:office" xmlns:r="http://schemas.openxmlformats.org/officeDocument/2006/relationships" xmlns:m="http://schemas.openxmlformats.org/officeDocument/2006/math" xmlns:v="urn:schemas-microsoft-com:vml" xmlns:wp14="http://schemas.microsoft.com/office/word/2010/wordprocessingDrawing" xmlns:wp="http://schemas.openxmlformats.org/drawingml/2006/wordprocessingDrawing" xmlns:w10="urn:schemas-microsoft-com:office:word" xmlns:w="http://schemas.openxmlformats.org/wordprocessingml/2006/main" xmlns:w14="http://schemas.microsoft.com/office/word/2010/wordml" xmlns:w15="http://schemas.microsoft.com/office/word/2012/wordml" xmlns:wpg="http://schemas.microsoft.com/office/word/2010/wordprocessingGroup" xmlns:wpi="http://schemas.microsoft.com/office/word/2010/wordprocessingInk" xmlns:wne="http://schemas.microsoft.com/office/word/2006/wordml" xmlns:wps="http://schemas.microsoft.com/office/word/2010/wordprocessingShape" mc:Ignorable="w14 w15 wp14">
+<w:document xmlns:wpc="http://schemas.microsoft.com/office/word/2010/wordprocessingCanvas" xmlns:cx="http://schemas.microsoft.com/office/drawing/2014/chartex" xmlns:cx1="http://schemas.microsoft.com/office/drawing/2015/9/8/chartex" xmlns:cx2="http://schemas.microsoft.com/office/drawing/2015/10/21/chartex" xmlns:cx3="http://schemas.microsoft.com/office/drawing/2016/5/9/chartex" xmlns:cx4="http://schemas.microsoft.com/office/drawing/2016/5/10/chartex" xmlns:cx5="http://schemas.microsoft.com/office/drawing/2016/5/11/chartex" xmlns:cx6="http://schemas.microsoft.com/office/drawing/2016/5/12/chartex" xmlns:cx7="http://schemas.microsoft.com/office/drawing/2016/5/13/chartex" xmlns:cx8="http://schemas.microsoft.com/office/drawing/2016/5/14/chartex" xmlns:mc="http://schemas.openxmlformats.org/markup-compatibility/2006" xmlns:aink="http://schemas.microsoft.com/office/drawing/2016/ink" xmlns:am3d="http://schemas.microsoft.com/office/drawing/2017/model3d" xmlns:o="urn:schemas-microsoft-com:office:office" xmlns:oel="http://schemas.microsoft.com/office/2019/extlst" xmlns:r="http://schemas.openxmlformats.org/officeDocument/2006/relationships" xmlns:m="http://schemas.openxmlformats.org/officeDocument/2006/math" xmlns:v="urn:schemas-microsoft-com:vml" xmlns:wp14="http://schemas.microsoft.com/office/word/2010/wordprocessingDrawing" xmlns:wp="http://schemas.openxmlformats.org/drawingml/2006/wordprocessingDrawing" xmlns:w10="urn:schemas-microsoft-com:office:word" xmlns:w="http://schemas.openxmlformats.org/wordprocessingml/2006/main" xmlns:w14="http://schemas.microsoft.com/office/word/2010/wordml" xmlns:w15="http://schemas.microsoft.com/office/word/2012/wordml" xmlns:w16cex="http://schemas.microsoft.com/office/word/2018/wordml/cex" xmlns:w16cid="http://schemas.microsoft.com/office/word/2016/wordml/cid" xmlns:w16="http://schemas.microsoft.com/office/word/2018/wordml" xmlns:w16du="http://schemas.microsoft.com/office/word/2023/wordml/word16du" xmlns:w16sdtdh="http://schemas.microsoft.com/office/word/2020/wordml/sdtdatahash" xmlns:w16sdtfl="http://schemas.microsoft.com/office/word/2024/wordml/sdtformatlock" xmlns:w16se="http://schemas.microsoft.com/office/word/2015/wordml/symex" xmlns:wpg="http://schemas.microsoft.com/office/word/2010/wordprocessingGroup" xmlns:wpi="http://schemas.microsoft.com/office/word/2010/wordprocessingInk" xmlns:wne="http://schemas.microsoft.com/office/word/2006/wordml" xmlns:wps="http://schemas.microsoft.com/office/word/2010/wordprocessingShape" mc:Ignorable="w14 w15 w16se w16cid w16 w16cex w16sdtdh w16sdtfl w16du wp14">
   <w:body>
     <w:p>
       <w:pPr>
@@ -6937,8 +6937,13 @@
         <w:pStyle w:val="heading3"/>
       </w:pPr>
       <w:r>
-        <w:t>5.1.2   Fluxograma</w:t>
-      </w:r>
+        <w:t xml:space="preserve">5.1.2   </w:t>
+      </w:r>
+      <w:proofErr w:type="spellStart"/>
+      <w:r>
+        <w:t>Fluxograma</w:t>
+      </w:r>
+      <w:proofErr w:type="spellEnd"/>
     </w:p>
     <w:p>
       <w:pPr>
@@ -7102,8 +7107,31 @@
       </w:pPr>
       <w:r>
         <w:lastRenderedPageBreak/>
-        <w:t>5.2   Requisitos não Funcionais</w:t>
-      </w:r>
+        <w:t xml:space="preserve">5.2   </w:t>
+      </w:r>
+      <w:proofErr w:type="spellStart"/>
+      <w:r>
+        <w:t>Requisitos</w:t>
+      </w:r>
+      <w:proofErr w:type="spellEnd"/>
+      <w:r>
+        <w:t xml:space="preserve"> </w:t>
+      </w:r>
+      <w:proofErr w:type="spellStart"/>
+      <w:proofErr w:type="gramStart"/>
+      <w:r>
+        <w:t>não</w:t>
+      </w:r>
+      <w:proofErr w:type="spellEnd"/>
+      <w:proofErr w:type="gramEnd"/>
+      <w:r>
+        <w:t xml:space="preserve"> </w:t>
+      </w:r>
+      <w:proofErr w:type="spellStart"/>
+      <w:r>
+        <w:t>Funcionais</w:t>
+      </w:r>
+      <w:proofErr w:type="spellEnd"/>
     </w:p>
     <w:p>
       <w:pPr>
@@ -7505,6 +7533,14 @@
     </w:p>
     <w:p>
       <w:pPr>
+        <w:ind w:firstLine="0"/>
+        <w:rPr>
+          <w:lang w:val="pt-BR"/>
+        </w:rPr>
+      </w:pPr>
+    </w:p>
+    <w:p>
+      <w:pPr>
         <w:pStyle w:val="p1a"/>
         <w:rPr>
           <w:lang w:val="pt-BR" w:eastAsia="pt-PT"/>
@@ -7526,7 +7562,7 @@
           <w:lang w:val="pt-BR" w:eastAsia="pt-PT"/>
         </w:rPr>
         <w:pict w14:anchorId="458884E9">
-          <v:shape id="_x0000_i1029" type="#_x0000_t75" style="width:228.6pt;height:202.8pt;visibility:visible">
+          <v:shape id="_x0000_i1029" type="#_x0000_t75" style="width:343.8pt;height:305.4pt;visibility:visible">
             <v:imagedata r:id="rId12" o:title="" croptop="830f"/>
           </v:shape>
         </w:pict>
@@ -7535,6 +7571,9 @@
     <w:p>
       <w:pPr>
         <w:pStyle w:val="Legenda"/>
+        <w:rPr>
+          <w:bCs/>
+        </w:rPr>
       </w:pPr>
       <w:bookmarkStart w:id="3" w:name="_Ref232177773"/>
       <w:r>
@@ -7584,12 +7623,225 @@
           <w:lang w:val="pt-BR" w:eastAsia="pt-PT"/>
         </w:rPr>
         <w:lastRenderedPageBreak/>
-        <w:t>8</w:t>
+        <w:t xml:space="preserve">8  </w:t>
       </w:r>
       <w:r>
         <w:rPr>
           <w:lang w:val="pt-BR" w:eastAsia="pt-PT"/>
         </w:rPr>
+        <w:t>Diagrama de Classes de Modelo</w:t>
+      </w:r>
+    </w:p>
+    <w:p>
+      <w:pPr>
+        <w:pStyle w:val="p1a"/>
+        <w:rPr>
+          <w:lang w:val="pt-BR" w:eastAsia="pt-PT"/>
+        </w:rPr>
+      </w:pPr>
+      <w:r>
+        <w:rPr>
+          <w:lang w:val="pt-BR" w:eastAsia="pt-PT"/>
+        </w:rPr>
+        <w:t xml:space="preserve">De forma a complementar a arquitetura lógica apresentada anteriormente, a </w:t>
+      </w:r>
+      <w:r>
+        <w:rPr>
+          <w:lang w:val="pt-BR" w:eastAsia="pt-PT"/>
+        </w:rPr>
+        <w:fldChar w:fldCharType="begin"/>
+      </w:r>
+      <w:r>
+        <w:rPr>
+          <w:lang w:val="pt-BR" w:eastAsia="pt-PT"/>
+        </w:rPr>
+        <w:instrText xml:space="preserve"> REF _Ref232178039 \h </w:instrText>
+      </w:r>
+      <w:r>
+        <w:rPr>
+          <w:lang w:val="pt-BR" w:eastAsia="pt-PT"/>
+        </w:rPr>
+      </w:r>
+      <w:r>
+        <w:rPr>
+          <w:lang w:val="pt-BR" w:eastAsia="pt-PT"/>
+        </w:rPr>
+        <w:instrText xml:space="preserve"> \* MERGEFORMAT </w:instrText>
+      </w:r>
+      <w:r>
+        <w:rPr>
+          <w:lang w:val="pt-BR" w:eastAsia="pt-PT"/>
+        </w:rPr>
+        <w:fldChar w:fldCharType="separate"/>
+      </w:r>
+      <w:r>
+        <w:t xml:space="preserve">Fig. </w:t>
+      </w:r>
+      <w:r>
+        <w:rPr>
+          <w:noProof/>
+        </w:rPr>
+        <w:t>5</w:t>
+      </w:r>
+      <w:r>
+        <w:rPr>
+          <w:lang w:val="pt-BR" w:eastAsia="pt-PT"/>
+        </w:rPr>
+        <w:fldChar w:fldCharType="end"/>
+      </w:r>
+      <w:r>
+        <w:rPr>
+          <w:lang w:val="pt-BR" w:eastAsia="pt-PT"/>
+        </w:rPr>
+        <w:t xml:space="preserve"> </w:t>
+      </w:r>
+      <w:r>
+        <w:rPr>
+          <w:lang w:val="pt-BR" w:eastAsia="pt-PT"/>
+        </w:rPr>
+        <w:t>mostra como o código da aplicação está organizado, assim como as dependências de inclusão existentes entre cada um.</w:t>
+      </w:r>
+    </w:p>
+    <w:p>
+      <w:pPr>
+        <w:rPr>
+          <w:lang w:val="pt-BR" w:eastAsia="pt-PT"/>
+        </w:rPr>
+      </w:pPr>
+    </w:p>
+    <w:p>
+      <w:pPr>
+        <w:ind w:firstLine="0"/>
+        <w:rPr>
+          <w:lang w:val="pt-BR" w:eastAsia="pt-PT"/>
+        </w:rPr>
+      </w:pPr>
+    </w:p>
+    <w:p>
+      <w:pPr>
+        <w:keepNext/>
+        <w:ind w:firstLine="0"/>
+        <w:jc w:val="center"/>
+      </w:pPr>
+      <w:r>
+        <w:rPr>
+          <w:lang w:val="pt-PT" w:eastAsia="pt-PT"/>
+        </w:rPr>
+        <w:fldChar w:fldCharType="begin"/>
+      </w:r>
+      <w:r>
+        <w:rPr>
+          <w:lang w:val="pt-PT" w:eastAsia="pt-PT"/>
+        </w:rPr>
+        <w:instrText xml:space="preserve"> INCLUDEPICTURE "C:\\Users\\tiago\\Downloads\\Organização do Código.png" \* MERGEFORMATINET </w:instrText>
+      </w:r>
+      <w:r>
+        <w:rPr>
+          <w:lang w:val="pt-PT" w:eastAsia="pt-PT"/>
+        </w:rPr>
+        <w:fldChar w:fldCharType="separate"/>
+      </w:r>
+      <w:r>
+        <w:rPr>
+          <w:lang w:val="pt-PT" w:eastAsia="pt-PT"/>
+        </w:rPr>
+        <w:pict w14:anchorId="58FF8682">
+          <v:shape id="_x0000_i1059" type="#_x0000_t75" alt="" style="width:365.4pt;height:291pt">
+            <v:imagedata r:id="rId13" r:href="rId14"/>
+          </v:shape>
+        </w:pict>
+      </w:r>
+      <w:r>
+        <w:rPr>
+          <w:lang w:val="pt-BR" w:eastAsia="pt-PT"/>
+        </w:rPr>
+        <w:fldChar w:fldCharType="end"/>
+      </w:r>
+    </w:p>
+    <w:p>
+      <w:pPr>
+        <w:pStyle w:val="Legenda"/>
+        <w:rPr>
+          <w:lang w:val="pt-PT"/>
+        </w:rPr>
+      </w:pPr>
+      <w:r>
+        <w:t xml:space="preserve">Fig. </w:t>
+      </w:r>
+      <w:r>
+        <w:fldChar w:fldCharType="begin"/>
+      </w:r>
+      <w:r>
+        <w:instrText xml:space="preserve"> SEQ Fig. \* ARABIC </w:instrText>
+      </w:r>
+      <w:r>
+        <w:fldChar w:fldCharType="separate"/>
+      </w:r>
+      <w:r>
+        <w:t>5</w:t>
+      </w:r>
+      <w:r>
+        <w:fldChar w:fldCharType="end"/>
+      </w:r>
+      <w:r>
+        <w:t>. Organização do Código</w:t>
+      </w:r>
+    </w:p>
+    <w:p>
+      <w:pPr>
+        <w:ind w:firstLine="0"/>
+        <w:rPr>
+          <w:lang w:val="pt-BR" w:eastAsia="pt-PT"/>
+        </w:rPr>
+      </w:pPr>
+    </w:p>
+    <w:p>
+      <w:pPr>
+        <w:rPr>
+          <w:lang w:val="pt-BR" w:eastAsia="pt-PT"/>
+        </w:rPr>
+      </w:pPr>
+    </w:p>
+    <w:p>
+      <w:pPr>
+        <w:ind w:firstLine="0"/>
+        <w:rPr>
+          <w:lang w:val="pt-BR" w:eastAsia="pt-PT"/>
+        </w:rPr>
+      </w:pPr>
+    </w:p>
+    <w:p>
+      <w:pPr>
+        <w:ind w:firstLine="0"/>
+        <w:rPr>
+          <w:lang w:val="pt-BR" w:eastAsia="pt-PT"/>
+        </w:rPr>
+      </w:pPr>
+    </w:p>
+    <w:p>
+      <w:pPr>
+        <w:pStyle w:val="heading1"/>
+        <w:rPr>
+          <w:lang w:val="pt-BR" w:eastAsia="pt-PT"/>
+        </w:rPr>
+      </w:pPr>
+      <w:r>
+        <w:rPr>
+          <w:lang w:val="pt-BR" w:eastAsia="pt-PT"/>
+        </w:rPr>
+        <w:br w:type="page"/>
+      </w:r>
+      <w:r>
+        <w:rPr>
+          <w:lang w:val="pt-BR" w:eastAsia="pt-PT"/>
+        </w:rPr>
+        <w:lastRenderedPageBreak/>
+        <w:t>9</w:t>
+      </w:r>
+      <w:r>
+        <w:rPr>
+          <w:lang w:val="pt-BR" w:eastAsia="pt-PT"/>
+        </w:rPr>
         <w:t xml:space="preserve">   </w:t>
       </w:r>
       <w:r>
@@ -7616,7 +7868,13 @@
         <w:rPr>
           <w:lang w:val="pt-BR" w:eastAsia="pt-PT"/>
         </w:rPr>
-        <w:t>Fig. 5</w:t>
+        <w:t xml:space="preserve">Fig. </w:t>
+      </w:r>
+      <w:r>
+        <w:rPr>
+          <w:lang w:val="pt-BR" w:eastAsia="pt-PT"/>
+        </w:rPr>
+        <w:t>6</w:t>
       </w:r>
       <w:r>
         <w:rPr>
@@ -7658,7 +7916,7 @@
         </w:rPr>
         <w:pict w14:anchorId="703AFE75">
           <v:shape id="_x0000_i1030" type="#_x0000_t75" style="width:234pt;height:411pt;visibility:visible">
-            <v:imagedata r:id="rId13" o:title=""/>
+            <v:imagedata r:id="rId15" o:title=""/>
           </v:shape>
         </w:pict>
       </w:r>
@@ -7673,7 +7931,10 @@
       </w:r>
       <w:bookmarkEnd w:id="4"/>
       <w:r>
-        <w:t xml:space="preserve"> 5</w:t>
+        <w:t xml:space="preserve"> </w:t>
+      </w:r>
+      <w:r>
+        <w:t>6</w:t>
       </w:r>
       <w:r>
         <w:t>. Diagrama de classes de modelo que serão utilizadas na aplicação</w:t>
@@ -7691,7 +7952,7 @@
           <w:lang w:val="pt-BR" w:eastAsia="pt-PT"/>
         </w:rPr>
         <w:lastRenderedPageBreak/>
-        <w:t>9</w:t>
+        <w:t>10</w:t>
       </w:r>
       <w:r>
         <w:rPr>
@@ -7723,7 +7984,13 @@
         <w:rPr>
           <w:lang w:val="pt-BR" w:eastAsia="pt-PT"/>
         </w:rPr>
-        <w:t>Fig. 6</w:t>
+        <w:t xml:space="preserve">Fig. </w:t>
+      </w:r>
+      <w:r>
+        <w:rPr>
+          <w:lang w:val="pt-BR" w:eastAsia="pt-PT"/>
+        </w:rPr>
+        <w:t>7</w:t>
       </w:r>
       <w:r>
         <w:rPr>
@@ -7755,7 +8022,7 @@
         </w:rPr>
         <w:pict w14:anchorId="2240C604">
           <v:shape id="_x0000_i1031" type="#_x0000_t75" style="width:346.2pt;height:139.2pt;visibility:visible">
-            <v:imagedata r:id="rId14" o:title=""/>
+            <v:imagedata r:id="rId16" o:title=""/>
           </v:shape>
         </w:pict>
       </w:r>
@@ -7770,7 +8037,10 @@
       </w:r>
       <w:bookmarkEnd w:id="5"/>
       <w:r>
-        <w:t xml:space="preserve"> 6</w:t>
+        <w:t xml:space="preserve"> </w:t>
+      </w:r>
+      <w:r>
+        <w:t>7</w:t>
       </w:r>
       <w:r>
         <w:t>. Diagrama de classes de exceções que serão utilizadas na aplicação</w:t>
@@ -7787,12 +8057,18 @@
         <w:rPr>
           <w:lang w:val="pt-BR" w:eastAsia="pt-PT"/>
         </w:rPr>
-        <w:t>10</w:t>
+        <w:t>1</w:t>
       </w:r>
       <w:r>
         <w:rPr>
           <w:lang w:val="pt-BR" w:eastAsia="pt-PT"/>
         </w:rPr>
+        <w:t>1</w:t>
+      </w:r>
+      <w:r>
+        <w:rPr>
+          <w:lang w:val="pt-BR" w:eastAsia="pt-PT"/>
+        </w:rPr>
         <w:t xml:space="preserve">   Interface de Usuário</w:t>
       </w:r>
     </w:p>
@@ -7819,7 +8095,13 @@
         <w:rPr>
           <w:lang w:val="pt-BR" w:eastAsia="pt-PT"/>
         </w:rPr>
-        <w:t>Fig. 7</w:t>
+        <w:t xml:space="preserve">Fig. </w:t>
+      </w:r>
+      <w:r>
+        <w:rPr>
+          <w:lang w:val="pt-BR" w:eastAsia="pt-PT"/>
+        </w:rPr>
+        <w:t>8</w:t>
       </w:r>
       <w:r>
         <w:rPr>
@@ -7875,7 +8157,7 @@
         <w:lastRenderedPageBreak/>
         <w:pict w14:anchorId="29F95681">
           <v:shape id="_x0000_i1032" type="#_x0000_t75" style="width:334.8pt;height:271.8pt;visibility:visible">
-            <v:imagedata r:id="rId15" o:title=""/>
+            <v:imagedata r:id="rId17" o:title=""/>
           </v:shape>
         </w:pict>
       </w:r>
@@ -7890,7 +8172,10 @@
       </w:r>
       <w:bookmarkEnd w:id="6"/>
       <w:r>
-        <w:t xml:space="preserve"> 7</w:t>
+        <w:t xml:space="preserve"> </w:t>
+      </w:r>
+      <w:r>
+        <w:t>8</w:t>
       </w:r>
       <w:r>
         <w:t>. Interface de usuário da aplicação</w:t>
@@ -7916,7 +8201,19 @@
           <w:lang w:val="pt-BR"/>
         </w:rPr>
         <w:lastRenderedPageBreak/>
-        <w:t>11   Implementação</w:t>
+        <w:t>1</w:t>
+      </w:r>
+      <w:r>
+        <w:rPr>
+          <w:lang w:val="pt-BR"/>
+        </w:rPr>
+        <w:t>2</w:t>
+      </w:r>
+      <w:r>
+        <w:rPr>
+          <w:lang w:val="pt-BR"/>
+        </w:rPr>
+        <w:t xml:space="preserve">   Implementação</w:t>
       </w:r>
     </w:p>
     <w:p>
@@ -7930,7 +8227,19 @@
         <w:rPr>
           <w:lang w:val="pt-BR"/>
         </w:rPr>
-        <w:t>11.1</w:t>
+        <w:t>1</w:t>
+      </w:r>
+      <w:r>
+        <w:rPr>
+          <w:lang w:val="pt-BR"/>
+        </w:rPr>
+        <w:t>2</w:t>
+      </w:r>
+      <w:r>
+        <w:rPr>
+          <w:lang w:val="pt-BR"/>
+        </w:rPr>
+        <w:t>.1</w:t>
       </w:r>
       <w:r>
         <w:rPr>
@@ -7967,7 +8276,7 @@
         </w:rPr>
         <w:pict w14:anchorId="174F1BEB">
           <v:shape id="_x0000_i1033" type="#_x0000_t75" style="width:159pt;height:152.4pt;visibility:visible;mso-wrap-style:square">
-            <v:imagedata r:id="rId16" o:title=""/>
+            <v:imagedata r:id="rId18" o:title=""/>
           </v:shape>
         </w:pict>
       </w:r>
@@ -7977,7 +8286,13 @@
         <w:pStyle w:val="Legenda"/>
       </w:pPr>
       <w:r>
-        <w:t>Fig. 8. Código de PlayerDTO</w:t>
+        <w:t xml:space="preserve">Fig. </w:t>
+      </w:r>
+      <w:r>
+        <w:t>9</w:t>
+      </w:r>
+      <w:r>
+        <w:t>. Código de PlayerDTO</w:t>
       </w:r>
       <w:r>
         <w:t>.h</w:t>
@@ -7986,222 +8301,1035 @@
     <w:p>
       <w:pPr>
         <w:pStyle w:val="Legenda"/>
+        <w:rPr>
+          <w:rStyle w:val="p1aZchn"/>
+          <w:b/>
+          <w:sz w:val="20"/>
+          <w:lang w:val="pt-BR"/>
+        </w:rPr>
+      </w:pPr>
+      <w:r>
+        <w:rPr>
+          <w:rStyle w:val="p1aZchn"/>
+          <w:sz w:val="20"/>
+          <w:lang w:val="pt-BR"/>
+        </w:rPr>
+        <w:t xml:space="preserve">PlayerDTO é uma estrutura que transporta os dados do jogador entre camadas </w:t>
+      </w:r>
+      <w:r>
+        <w:rPr>
+          <w:rStyle w:val="p1aZchn"/>
+          <w:sz w:val="20"/>
+          <w:lang w:val="pt-BR"/>
+        </w:rPr>
+        <w:t>(Services, Controller e View). A</w:t>
+      </w:r>
+      <w:r>
+        <w:rPr>
+          <w:rStyle w:val="p1aZchn"/>
+          <w:sz w:val="20"/>
+          <w:lang w:val="pt-BR"/>
+        </w:rPr>
+        <w:t>penas armazena campos como nickname, estatísticas e precisão. Isto evita que a lógica de domínio seja exposta à interface.</w:t>
+      </w:r>
+    </w:p>
+    <w:p>
+      <w:pPr>
+        <w:pStyle w:val="heading2"/>
+        <w:rPr>
+          <w:rStyle w:val="p1aZchn"/>
+          <w:lang w:val="pt-BR"/>
+        </w:rPr>
+      </w:pPr>
+      <w:r>
+        <w:rPr>
+          <w:rStyle w:val="p1aZchn"/>
+          <w:lang w:val="pt-BR"/>
+        </w:rPr>
+        <w:t>1</w:t>
+      </w:r>
+      <w:r>
+        <w:rPr>
+          <w:rStyle w:val="p1aZchn"/>
+          <w:lang w:val="pt-BR"/>
+        </w:rPr>
+        <w:t>2</w:t>
+      </w:r>
+      <w:r>
+        <w:rPr>
+          <w:rStyle w:val="p1aZchn"/>
+          <w:lang w:val="pt-BR"/>
+        </w:rPr>
+        <w:t>.2   Exceptions</w:t>
+      </w:r>
+    </w:p>
+    <w:p>
+      <w:pPr>
+        <w:pStyle w:val="p1a"/>
+        <w:jc w:val="center"/>
+        <w:rPr>
+          <w:noProof/>
+          <w:lang w:val="pt-BR" w:eastAsia="pt-PT"/>
+        </w:rPr>
+      </w:pPr>
+      <w:r>
+        <w:rPr>
+          <w:noProof/>
+          <w:lang w:val="pt-BR" w:eastAsia="pt-PT"/>
+        </w:rPr>
+        <w:pict w14:anchorId="01F5E132">
+          <v:shape id="_x0000_i1034" type="#_x0000_t75" style="width:300.6pt;height:118.2pt;visibility:visible;mso-wrap-style:square">
+            <v:imagedata r:id="rId19" o:title=""/>
+          </v:shape>
+        </w:pict>
+      </w:r>
+    </w:p>
+    <w:p>
+      <w:pPr>
+        <w:pStyle w:val="Legenda"/>
+      </w:pPr>
+      <w:r>
+        <w:t xml:space="preserve">Fig. </w:t>
+      </w:r>
+      <w:r>
+        <w:t>10</w:t>
+      </w:r>
+      <w:r>
+        <w:t>. Código de InvalidDataException.h</w:t>
+      </w:r>
+    </w:p>
+    <w:p>
+      <w:pPr>
+        <w:pStyle w:val="p1a"/>
+        <w:jc w:val="center"/>
+        <w:rPr>
+          <w:noProof/>
+          <w:lang w:val="pt-BR" w:eastAsia="pt-PT"/>
+        </w:rPr>
+      </w:pPr>
+      <w:r>
+        <w:rPr>
+          <w:noProof/>
+          <w:lang w:val="pt-BR" w:eastAsia="pt-PT"/>
+        </w:rPr>
+        <w:lastRenderedPageBreak/>
+        <w:pict w14:anchorId="676740B9">
+          <v:shape id="_x0000_i1035" type="#_x0000_t75" style="width:353.4pt;height:106.8pt;visibility:visible;mso-wrap-style:square">
+            <v:imagedata r:id="rId20" o:title=""/>
+          </v:shape>
+        </w:pict>
+      </w:r>
+    </w:p>
+    <w:p>
+      <w:pPr>
+        <w:pStyle w:val="Legenda"/>
+      </w:pPr>
+      <w:r>
+        <w:t xml:space="preserve">Fig. </w:t>
+      </w:r>
+      <w:r>
+        <w:t>11</w:t>
+      </w:r>
+      <w:r>
+        <w:t>. Código de InvalidDataException.cpp</w:t>
+      </w:r>
+    </w:p>
+    <w:p>
+      <w:pPr>
+        <w:pStyle w:val="p1a"/>
+        <w:rPr>
+          <w:lang w:val="pt-BR"/>
+        </w:rPr>
+      </w:pPr>
+      <w:r>
+        <w:rPr>
+          <w:lang w:val="pt-BR"/>
+        </w:rPr>
+        <w:t xml:space="preserve">InvalidDataException é uma exceção personalizada que herda de std::exception, ela recebe uma mensagem de erro e o método what() </w:t>
+      </w:r>
+      <w:r>
+        <w:rPr>
+          <w:lang w:val="pt-BR"/>
+        </w:rPr>
+        <w:t xml:space="preserve">e </w:t>
+      </w:r>
+      <w:r>
+        <w:rPr>
+          <w:lang w:val="pt-BR"/>
+        </w:rPr>
+        <w:t>devolve essa mensagem, permitindo que o Controller mostre o erro ao utilizador de forma simples. As exceções NoDataException e DuplicatedDataException funcionam da mesma forma, mudando apenas a mensagem apresentada.</w:t>
+      </w:r>
+    </w:p>
+    <w:p>
+      <w:pPr>
+        <w:pStyle w:val="heading2"/>
+        <w:rPr>
+          <w:lang w:val="pt-BR"/>
+        </w:rPr>
+      </w:pPr>
+      <w:r>
+        <w:rPr>
+          <w:lang w:val="pt-BR"/>
+        </w:rPr>
+        <w:t>1</w:t>
+      </w:r>
+      <w:r>
+        <w:rPr>
+          <w:lang w:val="pt-BR"/>
+        </w:rPr>
+        <w:t>2</w:t>
+      </w:r>
+      <w:r>
+        <w:rPr>
+          <w:lang w:val="pt-BR"/>
+        </w:rPr>
+        <w:t>.3   Model</w:t>
+      </w:r>
+    </w:p>
+    <w:p>
+      <w:pPr>
+        <w:pStyle w:val="heading2"/>
+        <w:jc w:val="center"/>
+        <w:rPr>
+          <w:noProof/>
+          <w:lang w:val="pt-BR" w:eastAsia="pt-PT"/>
+        </w:rPr>
+      </w:pPr>
+      <w:r>
+        <w:rPr>
+          <w:noProof/>
+          <w:lang w:val="pt-BR" w:eastAsia="pt-PT"/>
+        </w:rPr>
+        <w:pict w14:anchorId="47FBF954">
+          <v:shape id="_x0000_i1036" type="#_x0000_t75" style="width:309pt;height:242.4pt;visibility:visible;mso-wrap-style:square">
+            <v:imagedata r:id="rId21" o:title=""/>
+          </v:shape>
+        </w:pict>
+      </w:r>
+    </w:p>
+    <w:p>
+      <w:pPr>
+        <w:pStyle w:val="Legenda"/>
+      </w:pPr>
+      <w:r>
+        <w:t>Fig.1</w:t>
+      </w:r>
+      <w:r>
+        <w:t>2</w:t>
+      </w:r>
+      <w:r>
+        <w:t>. Código de Board.h</w:t>
+      </w:r>
+    </w:p>
+    <w:p>
+      <w:pPr>
+        <w:pStyle w:val="heading2"/>
+        <w:jc w:val="center"/>
+        <w:rPr>
+          <w:noProof/>
+          <w:lang w:val="pt-BR" w:eastAsia="pt-PT"/>
+        </w:rPr>
+      </w:pPr>
+      <w:r>
+        <w:rPr>
+          <w:noProof/>
+          <w:lang w:val="pt-BR" w:eastAsia="pt-PT"/>
+        </w:rPr>
+        <w:lastRenderedPageBreak/>
+        <w:pict w14:anchorId="772D06E1">
+          <v:shape id="_x0000_i1037" type="#_x0000_t75" style="width:317.4pt;height:188.4pt;visibility:visible;mso-wrap-style:square">
+            <v:imagedata r:id="rId22" o:title=""/>
+          </v:shape>
+        </w:pict>
+      </w:r>
+    </w:p>
+    <w:p>
+      <w:pPr>
+        <w:pStyle w:val="Legenda"/>
+      </w:pPr>
+      <w:r>
+        <w:t>Fig. 1</w:t>
+      </w:r>
+      <w:r>
+        <w:t>3</w:t>
+      </w:r>
+      <w:r>
+        <w:t>. Código de validatePosi</w:t>
+      </w:r>
+      <w:r>
+        <w:t xml:space="preserve">tion() </w:t>
+      </w:r>
+      <w:r>
+        <w:t xml:space="preserve">em </w:t>
+      </w:r>
+      <w:r>
+        <w:t>Board.cpp</w:t>
+      </w:r>
+    </w:p>
+    <w:p>
+      <w:pPr>
+        <w:pStyle w:val="Legenda"/>
+        <w:jc w:val="both"/>
+      </w:pPr>
+      <w:r>
+        <w:rPr>
+          <w:rStyle w:val="p1aZchn"/>
+          <w:sz w:val="20"/>
+          <w:lang w:val="pt-BR"/>
+        </w:rPr>
+        <w:t>Board representa o tabuleiro do jogo, com uma grelha de 10x10 onde cada posição pode conter água, navio, acerto ou falha. O método validatePosition() verifica se um navio pode ser colocado numa determinada posição, garantindo que não fica encostado a outros navios. Já os métodos placeShip() e registerShot() atualizam o estado do tabuleiro, enquanto allShipsSunk() verifica se todos os navios foram afundados e se o jogo terminou</w:t>
+      </w:r>
+      <w:r>
+        <w:t>.</w:t>
+      </w:r>
+    </w:p>
+    <w:p>
+      <w:pPr>
+        <w:pStyle w:val="heading2"/>
+        <w:rPr>
+          <w:lang w:val="pt-BR"/>
+        </w:rPr>
+      </w:pPr>
+      <w:r>
+        <w:rPr>
+          <w:lang w:val="pt-BR"/>
+        </w:rPr>
+        <w:t>1</w:t>
+      </w:r>
+      <w:r>
+        <w:rPr>
+          <w:lang w:val="pt-BR"/>
+        </w:rPr>
+        <w:t>2</w:t>
+      </w:r>
+      <w:r>
+        <w:rPr>
+          <w:lang w:val="pt-BR"/>
+        </w:rPr>
+        <w:t xml:space="preserve">.4 </w:t>
+      </w:r>
+      <w:r>
+        <w:rPr>
+          <w:lang w:val="pt-BR"/>
+        </w:rPr>
+        <w:t xml:space="preserve">  </w:t>
+      </w:r>
+      <w:r>
+        <w:rPr>
+          <w:lang w:val="pt-BR"/>
+        </w:rPr>
+        <w:t>Mappers</w:t>
+      </w:r>
+    </w:p>
+    <w:p>
+      <w:pPr>
+        <w:pStyle w:val="p1a"/>
+        <w:jc w:val="center"/>
+        <w:rPr>
+          <w:noProof/>
+          <w:lang w:val="pt-BR" w:eastAsia="pt-PT"/>
+        </w:rPr>
+      </w:pPr>
+      <w:r>
+        <w:rPr>
+          <w:noProof/>
+          <w:lang w:val="pt-BR" w:eastAsia="pt-PT"/>
+        </w:rPr>
+        <w:pict w14:anchorId="4C7A1D6E">
+          <v:shape id="_x0000_i1038" type="#_x0000_t75" style="width:320.4pt;height:63pt;visibility:visible;mso-wrap-style:square">
+            <v:imagedata r:id="rId23" o:title=""/>
+          </v:shape>
+        </w:pict>
+      </w:r>
+    </w:p>
+    <w:p>
+      <w:pPr>
+        <w:pStyle w:val="Legenda"/>
+      </w:pPr>
+      <w:r>
+        <w:t>Fig. 1</w:t>
+      </w:r>
+      <w:r>
+        <w:t>4</w:t>
+      </w:r>
+      <w:r>
+        <w:t>. Código de BoardMapper.cpp</w:t>
+      </w:r>
+    </w:p>
+    <w:p>
+      <w:pPr>
+        <w:jc w:val="center"/>
+        <w:rPr>
+          <w:noProof/>
+          <w:lang w:val="pt-BR" w:eastAsia="pt-PT"/>
+        </w:rPr>
+      </w:pPr>
+      <w:r>
+        <w:rPr>
+          <w:noProof/>
+          <w:lang w:val="pt-BR" w:eastAsia="pt-PT"/>
+        </w:rPr>
+        <w:lastRenderedPageBreak/>
+        <w:pict w14:anchorId="15ADAE60">
+          <v:shape id="_x0000_i1039" type="#_x0000_t75" style="width:284.4pt;height:184.2pt;visibility:visible;mso-wrap-style:square">
+            <v:imagedata r:id="rId24" o:title=""/>
+          </v:shape>
+        </w:pict>
+      </w:r>
+    </w:p>
+    <w:p>
+      <w:pPr>
+        <w:pStyle w:val="Legenda"/>
+      </w:pPr>
+      <w:r>
+        <w:t>Fig. 1</w:t>
+      </w:r>
+      <w:r>
+        <w:t>5</w:t>
+      </w:r>
+      <w:r>
+        <w:t>. Código de BoadMapper.cpp</w:t>
+      </w:r>
+    </w:p>
+    <w:p>
+      <w:pPr>
+        <w:pStyle w:val="p1a"/>
+        <w:rPr>
+          <w:rFonts w:ascii="Times New Roman" w:hAnsi="Times New Roman"/>
+          <w:lang w:val="pt-BR"/>
+        </w:rPr>
+      </w:pPr>
+      <w:r>
+        <w:rPr>
+          <w:rStyle w:val="Forte"/>
+          <w:rFonts w:ascii="Times New Roman" w:hAnsi="Times New Roman"/>
+          <w:b w:val="0"/>
+          <w:lang w:val="pt-BR"/>
+        </w:rPr>
+        <w:t>BoardMapper</w:t>
+      </w:r>
+      <w:r>
+        <w:rPr>
+          <w:rFonts w:ascii="Times New Roman" w:hAnsi="Times New Roman"/>
+          <w:lang w:val="pt-BR"/>
+        </w:rPr>
+        <w:t xml:space="preserve"> converte um objeto </w:t>
+      </w:r>
+      <w:r>
+        <w:rPr>
+          <w:rStyle w:val="CdigoHTML"/>
+          <w:rFonts w:ascii="Times New Roman" w:hAnsi="Times New Roman" w:cs="Times New Roman"/>
+          <w:lang w:val="pt-BR"/>
+        </w:rPr>
+        <w:t>Board</w:t>
+      </w:r>
+      <w:r>
+        <w:rPr>
+          <w:rFonts w:ascii="Times New Roman" w:hAnsi="Times New Roman"/>
+          <w:lang w:val="pt-BR"/>
+        </w:rPr>
+        <w:t xml:space="preserve"> num </w:t>
+      </w:r>
+      <w:r>
+        <w:rPr>
+          <w:rStyle w:val="CdigoHTML"/>
+          <w:rFonts w:ascii="Times New Roman" w:hAnsi="Times New Roman" w:cs="Times New Roman"/>
+          <w:lang w:val="pt-BR"/>
+        </w:rPr>
+        <w:t>BoardDTO</w:t>
+      </w:r>
+      <w:r>
+        <w:rPr>
+          <w:rFonts w:ascii="Times New Roman" w:hAnsi="Times New Roman"/>
+          <w:lang w:val="pt-BR"/>
+        </w:rPr>
+        <w:t xml:space="preserve">, copiando as informações necessárias para serem apresentadas na interface. Também utiliza o </w:t>
+      </w:r>
+      <w:r>
+        <w:rPr>
+          <w:rStyle w:val="CdigoHTML"/>
+          <w:rFonts w:ascii="Times New Roman" w:hAnsi="Times New Roman" w:cs="Times New Roman"/>
+          <w:lang w:val="pt-BR"/>
+        </w:rPr>
+        <w:t>ShipMapper</w:t>
+      </w:r>
+      <w:r>
+        <w:rPr>
+          <w:rFonts w:ascii="Times New Roman" w:hAnsi="Times New Roman"/>
+          <w:lang w:val="pt-BR"/>
+        </w:rPr>
+        <w:t xml:space="preserve"> para converter os navios da frota. O método é </w:t>
+      </w:r>
+      <w:r>
+        <w:rPr>
+          <w:rStyle w:val="CdigoHTML"/>
+          <w:rFonts w:ascii="Times New Roman" w:hAnsi="Times New Roman" w:cs="Times New Roman"/>
+          <w:lang w:val="pt-BR"/>
+        </w:rPr>
+        <w:t>static</w:t>
+      </w:r>
+      <w:r>
+        <w:rPr>
+          <w:rFonts w:ascii="Times New Roman" w:hAnsi="Times New Roman"/>
+          <w:lang w:val="pt-BR"/>
+        </w:rPr>
+        <w:t xml:space="preserve"> porque apenas realiza a conversão de dados e não precisa de guardar qualquer estado.</w:t>
+      </w:r>
+    </w:p>
+    <w:p>
+      <w:pPr>
+        <w:pStyle w:val="heading2"/>
+        <w:rPr>
+          <w:lang w:val="pt-BR"/>
+        </w:rPr>
+      </w:pPr>
+      <w:r>
+        <w:rPr>
+          <w:lang w:val="pt-BR"/>
+        </w:rPr>
+        <w:lastRenderedPageBreak/>
+        <w:t>1</w:t>
+      </w:r>
+      <w:r>
+        <w:rPr>
+          <w:lang w:val="pt-BR"/>
+        </w:rPr>
+        <w:t>2</w:t>
+      </w:r>
+      <w:r>
+        <w:rPr>
+          <w:lang w:val="pt-BR"/>
+        </w:rPr>
+        <w:t>.5   Repo</w:t>
+      </w:r>
+    </w:p>
+    <w:p>
+      <w:pPr>
+        <w:pStyle w:val="Legenda"/>
+      </w:pPr>
+      <w:r>
+        <w:pict w14:anchorId="1B6DD970">
+          <v:shape id="_x0000_i1040" type="#_x0000_t75" style="width:298.2pt;height:263.4pt;visibility:visible;mso-wrap-style:square">
+            <v:imagedata r:id="rId25" o:title=""/>
+          </v:shape>
+        </w:pict>
+      </w:r>
+    </w:p>
+    <w:p>
+      <w:pPr>
+        <w:pStyle w:val="Legenda"/>
+      </w:pPr>
+      <w:r>
+        <w:t>Fig. 1</w:t>
+      </w:r>
+      <w:r>
+        <w:t>6</w:t>
+      </w:r>
+      <w:r>
+        <w:t>. Código de ProfileRepositoryFile.h</w:t>
+      </w:r>
+    </w:p>
+    <w:p>
+      <w:pPr>
+        <w:ind w:firstLine="0"/>
+        <w:jc w:val="center"/>
+        <w:rPr>
+          <w:noProof/>
+          <w:lang w:val="pt-BR" w:eastAsia="pt-PT"/>
+        </w:rPr>
+      </w:pPr>
+      <w:r>
+        <w:rPr>
+          <w:noProof/>
+          <w:lang w:val="pt-BR" w:eastAsia="pt-PT"/>
+        </w:rPr>
+        <w:pict w14:anchorId="10781889">
+          <v:shape id="_x0000_i1041" type="#_x0000_t75" style="width:313.8pt;height:142.2pt;visibility:visible;mso-wrap-style:square">
+            <v:imagedata r:id="rId26" o:title=""/>
+          </v:shape>
+        </w:pict>
+      </w:r>
+    </w:p>
+    <w:p>
+      <w:pPr>
+        <w:pStyle w:val="Legenda"/>
+      </w:pPr>
+      <w:r>
+        <w:t>Fig. 1</w:t>
+      </w:r>
+      <w:r>
+        <w:t>7</w:t>
+      </w:r>
+      <w:r>
+        <w:t>. Código de save() em ProfileRepositoryFile.cpp</w:t>
+      </w:r>
+    </w:p>
+    <w:p>
+      <w:pPr>
+        <w:pStyle w:val="p1a"/>
+        <w:rPr>
+          <w:lang w:val="pt-BR"/>
+        </w:rPr>
+      </w:pPr>
+      <w:r>
+        <w:rPr>
+          <w:rStyle w:val="Forte"/>
+          <w:b w:val="0"/>
+          <w:lang w:val="pt-BR"/>
+        </w:rPr>
+        <w:t>ProfileRepositoryFile</w:t>
+      </w:r>
+      <w:r>
+        <w:rPr>
+          <w:lang w:val="pt-BR"/>
+        </w:rPr>
+        <w:t xml:space="preserve"> é a classe responsável por guardar e carregar os perfis dos jogadores num ficheiro CSV (players.txt). Utiliza o padrão </w:t>
+      </w:r>
+      <w:r>
+        <w:rPr>
+          <w:rStyle w:val="Forte"/>
+          <w:b w:val="0"/>
+          <w:lang w:val="pt-BR"/>
+        </w:rPr>
+        <w:t>Singleton</w:t>
+      </w:r>
+      <w:r>
+        <w:rPr>
+          <w:lang w:val="pt-BR"/>
+        </w:rPr>
+        <w:t>, garantindo que existe apenas uma instância da classe. Os métodos load() e save() permitem ler e guardar os dados dos jogadores, mantendo as suas estatísticas entre diferentes execuções do programa.</w:t>
+      </w:r>
+    </w:p>
+    <w:p>
+      <w:pPr>
+        <w:pStyle w:val="heading2"/>
+        <w:rPr>
+          <w:lang w:val="pt-BR"/>
+        </w:rPr>
+      </w:pPr>
+      <w:r>
+        <w:rPr>
+          <w:lang w:val="pt-BR"/>
+        </w:rPr>
+        <w:lastRenderedPageBreak/>
+        <w:t>1</w:t>
+      </w:r>
+      <w:r>
+        <w:rPr>
+          <w:lang w:val="pt-BR"/>
+        </w:rPr>
+        <w:t>2</w:t>
+      </w:r>
+      <w:r>
+        <w:rPr>
+          <w:lang w:val="pt-BR"/>
+        </w:rPr>
+        <w:t>.6   Services</w:t>
+      </w:r>
+    </w:p>
+    <w:p>
+      <w:pPr>
+        <w:pStyle w:val="p1a"/>
+        <w:jc w:val="center"/>
+        <w:rPr>
+          <w:noProof/>
+          <w:lang w:val="pt-BR" w:eastAsia="pt-PT"/>
+        </w:rPr>
+      </w:pPr>
+      <w:r>
+        <w:rPr>
+          <w:noProof/>
+          <w:lang w:val="pt-BR" w:eastAsia="pt-PT"/>
+        </w:rPr>
+        <w:pict w14:anchorId="57831F45">
+          <v:shape id="_x0000_i1042" type="#_x0000_t75" style="width:297pt;height:229.2pt;visibility:visible;mso-wrap-style:square">
+            <v:imagedata r:id="rId27" o:title=""/>
+          </v:shape>
+        </w:pict>
+      </w:r>
+    </w:p>
+    <w:p>
+      <w:pPr>
+        <w:pStyle w:val="Legenda"/>
+      </w:pPr>
+      <w:r>
+        <w:t>Fig.1</w:t>
+      </w:r>
+      <w:r>
+        <w:t>8</w:t>
+      </w:r>
+      <w:r>
+        <w:t>. Código de PlayerService.h</w:t>
+      </w:r>
+    </w:p>
+    <w:p>
+      <w:pPr>
+        <w:pStyle w:val="Legenda"/>
+      </w:pPr>
+      <w:r>
+        <w:pict w14:anchorId="6E4C43A9">
+          <v:shape id="_x0000_i1043" type="#_x0000_t75" style="width:340.8pt;height:133.2pt;visibility:visible;mso-wrap-style:square">
+            <v:imagedata r:id="rId28" o:title=""/>
+          </v:shape>
+        </w:pict>
+      </w:r>
+    </w:p>
+    <w:p>
+      <w:pPr>
+        <w:pStyle w:val="Legenda"/>
+        <w:rPr>
+          <w:szCs w:val="24"/>
+        </w:rPr>
+      </w:pPr>
+      <w:r>
+        <w:t>Fig. 1</w:t>
+      </w:r>
+      <w:r>
+        <w:t>9</w:t>
+      </w:r>
+      <w:r>
+        <w:t>. Código de registerPlayer() em PlayerService</w:t>
+      </w:r>
+    </w:p>
+    <w:p>
+      <w:pPr>
+        <w:pStyle w:val="Legenda"/>
+        <w:jc w:val="both"/>
+        <w:rPr>
+          <w:rStyle w:val="p1aZchn"/>
+          <w:b/>
+          <w:sz w:val="20"/>
+          <w:lang w:val="pt-BR"/>
+        </w:rPr>
+      </w:pPr>
+      <w:r>
+        <w:rPr>
+          <w:rStyle w:val="p1aZchn"/>
+          <w:sz w:val="20"/>
+          <w:lang w:val="pt-BR"/>
+        </w:rPr>
+        <w:t>PlayerService é a camada responsável pelas regras de negócio relacionadas com os jogadores. Faz validações no registo, verifica se já existem jogadores com o mesmo nome e obtém os rankings. Também organiza os jogadores com base nas vitórias ou na precisão. Em caso de erro, lança exceções específicas para que o Controller trate a situação adequadamente.</w:t>
+      </w:r>
+    </w:p>
+    <w:p>
+      <w:pPr>
+        <w:pStyle w:val="heading2"/>
+        <w:rPr>
+          <w:lang w:val="pt-BR"/>
+        </w:rPr>
+      </w:pPr>
+      <w:r>
+        <w:rPr>
+          <w:lang w:val="pt-BR"/>
+        </w:rPr>
+        <w:lastRenderedPageBreak/>
+        <w:t>1</w:t>
+      </w:r>
+      <w:r>
+        <w:rPr>
+          <w:lang w:val="pt-BR"/>
+        </w:rPr>
+        <w:t>2</w:t>
+      </w:r>
+      <w:r>
+        <w:rPr>
+          <w:lang w:val="pt-BR"/>
+        </w:rPr>
+        <w:t>.7   View</w:t>
+      </w:r>
+    </w:p>
+    <w:p>
+      <w:pPr>
+        <w:ind w:firstLine="0"/>
+        <w:jc w:val="center"/>
+        <w:rPr>
+          <w:noProof/>
+          <w:lang w:val="pt-BR" w:eastAsia="pt-PT"/>
+        </w:rPr>
+      </w:pPr>
+      <w:r>
+        <w:rPr>
+          <w:noProof/>
+          <w:lang w:val="pt-BR" w:eastAsia="pt-PT"/>
+        </w:rPr>
+        <w:pict w14:anchorId="763FE111">
+          <v:shape id="_x0000_i1044" type="#_x0000_t75" style="width:345.6pt;height:215.4pt;visibility:visible;mso-wrap-style:square">
+            <v:imagedata r:id="rId29" o:title=""/>
+          </v:shape>
+        </w:pict>
+      </w:r>
+    </w:p>
+    <w:p>
+      <w:pPr>
+        <w:pStyle w:val="Legenda"/>
+      </w:pPr>
+      <w:r>
+        <w:t xml:space="preserve">Fig. </w:t>
+      </w:r>
+      <w:r>
+        <w:t>20</w:t>
+      </w:r>
+      <w:r>
+        <w:t>. Código de View.h</w:t>
+      </w:r>
+    </w:p>
+    <w:p>
+      <w:pPr>
+        <w:ind w:firstLine="0"/>
+        <w:jc w:val="center"/>
+        <w:rPr>
+          <w:noProof/>
+          <w:lang w:val="pt-BR" w:eastAsia="pt-PT"/>
+        </w:rPr>
+      </w:pPr>
+      <w:r>
+        <w:rPr>
+          <w:noProof/>
+          <w:lang w:val="pt-BR" w:eastAsia="pt-PT"/>
+        </w:rPr>
+        <w:lastRenderedPageBreak/>
+        <w:pict w14:anchorId="6A559318">
+          <v:shape id="_x0000_i1045" type="#_x0000_t75" style="width:329.4pt;height:291pt;visibility:visible;mso-wrap-style:square">
+            <v:imagedata r:id="rId30" o:title=""/>
+          </v:shape>
+        </w:pict>
+      </w:r>
+    </w:p>
+    <w:p>
+      <w:pPr>
+        <w:pStyle w:val="Legenda"/>
+      </w:pPr>
+      <w:r>
+        <w:t xml:space="preserve">Fig. </w:t>
+      </w:r>
+      <w:r>
+        <w:t>21</w:t>
+      </w:r>
+      <w:r>
+        <w:t>. Código em showBoard() em View.cpp</w:t>
+      </w:r>
+    </w:p>
+    <w:p>
+      <w:pPr>
+        <w:pStyle w:val="p1a"/>
+        <w:rPr>
+          <w:lang w:val="pt-BR" w:eastAsia="pt-PT"/>
+        </w:rPr>
+      </w:pPr>
+      <w:r>
+        <w:rPr>
+          <w:rStyle w:val="Forte"/>
+          <w:b w:val="0"/>
+          <w:lang w:val="pt-BR"/>
+        </w:rPr>
+        <w:t>View</w:t>
+      </w:r>
+      <w:r>
+        <w:rPr>
+          <w:lang w:val="pt-BR"/>
+        </w:rPr>
+        <w:t xml:space="preserve"> é a classe responsável pela interação com o utilizador através da consola. Mostra o tabuleiro, recebe as jogadas e apresenta mensagens e resultados do jogo. Também oculta os navios do adversário durante a partida e exibir as estatísticas finais quando o jogo termina.</w:t>
+      </w:r>
+    </w:p>
+    <w:p>
+      <w:pPr>
+        <w:pStyle w:val="heading2"/>
+      </w:pPr>
+      <w:r>
+        <w:lastRenderedPageBreak/>
+        <w:t>1</w:t>
+      </w:r>
+      <w:r>
+        <w:t>2</w:t>
+      </w:r>
+      <w:r>
+        <w:t>.8   Controller</w:t>
+      </w:r>
+    </w:p>
+    <w:p>
+      <w:pPr>
+        <w:pStyle w:val="Legenda"/>
+      </w:pPr>
+      <w:r>
+        <w:pict w14:anchorId="1B5E44F9">
+          <v:shape id="_x0000_i1046" type="#_x0000_t75" style="width:237.6pt;height:345.6pt;visibility:visible;mso-wrap-style:square">
+            <v:imagedata r:id="rId31" o:title=""/>
+          </v:shape>
+        </w:pict>
+      </w:r>
+    </w:p>
+    <w:p>
+      <w:pPr>
+        <w:pStyle w:val="Legenda"/>
+      </w:pPr>
+      <w:r>
+        <w:t>Fig. 2</w:t>
+      </w:r>
+      <w:r>
+        <w:t>2</w:t>
+      </w:r>
+      <w:r>
+        <w:t>. Código de Controller.h</w:t>
+      </w:r>
+    </w:p>
+    <w:p>
+      <w:pPr>
+        <w:jc w:val="center"/>
+        <w:rPr>
+          <w:noProof/>
+          <w:lang w:val="pt-BR" w:eastAsia="pt-PT"/>
+        </w:rPr>
+      </w:pPr>
+      <w:r>
+        <w:rPr>
+          <w:noProof/>
+          <w:lang w:val="pt-BR" w:eastAsia="pt-PT"/>
+        </w:rPr>
+        <w:lastRenderedPageBreak/>
+        <w:pict w14:anchorId="447639AE">
+          <v:shape id="_x0000_i1047" type="#_x0000_t75" style="width:202.2pt;height:370.2pt;visibility:visible;mso-wrap-style:square">
+            <v:imagedata r:id="rId32" o:title=""/>
+          </v:shape>
+        </w:pict>
+      </w:r>
+    </w:p>
+    <w:p>
+      <w:pPr>
+        <w:pStyle w:val="Legenda"/>
+      </w:pPr>
+      <w:r>
+        <w:t>Fig. 2</w:t>
+      </w:r>
+      <w:r>
+        <w:t>3</w:t>
+      </w:r>
+      <w:r>
+        <w:t>. Código de runMain() em Controller.cpp</w:t>
+      </w:r>
+    </w:p>
+    <w:p>
+      <w:pPr>
+        <w:pStyle w:val="Legenda"/>
+        <w:jc w:val="both"/>
+        <w:rPr>
+          <w:rStyle w:val="p1aZchn"/>
+          <w:b/>
+          <w:sz w:val="20"/>
+          <w:lang w:val="pt-BR"/>
+        </w:rPr>
+      </w:pPr>
+      <w:r>
+        <w:rPr>
+          <w:rStyle w:val="p1aZchn"/>
+          <w:sz w:val="20"/>
+          <w:lang w:val="pt-BR"/>
+        </w:rPr>
+        <w:t>Controller é a classe principal da aplicação, responsável por ligar a View, os Services e o Model. Controla o fluxo do programa, recebendo ações do utilizador, executando as regras de negócio e atualizando o estado do jogo. Além disso, organiza as diferentes funcionalidades em métodos separados.</w:t>
+      </w:r>
+    </w:p>
+    <w:p>
+      <w:pPr>
+        <w:pStyle w:val="heading1"/>
+      </w:pPr>
+      <w:r>
         <w:rPr>
           <w:rStyle w:val="p1aZchn"/>
           <w:b w:val="0"/>
           <w:sz w:val="20"/>
           <w:lang w:val="pt-BR"/>
         </w:rPr>
-      </w:pPr>
-      <w:r>
-        <w:rPr>
-          <w:rStyle w:val="p1aZchn"/>
-          <w:b w:val="0"/>
-          <w:sz w:val="20"/>
-          <w:lang w:val="pt-BR"/>
-        </w:rPr>
-        <w:t xml:space="preserve">PlayerDTO é uma estrutura que transporta os dados do jogador entre camadas </w:t>
-      </w:r>
-      <w:r>
-        <w:rPr>
-          <w:rStyle w:val="p1aZchn"/>
-          <w:b w:val="0"/>
-          <w:sz w:val="20"/>
-          <w:lang w:val="pt-BR"/>
-        </w:rPr>
-        <w:t>(Services, Controller e View). A</w:t>
-      </w:r>
-      <w:r>
-        <w:rPr>
-          <w:rStyle w:val="p1aZchn"/>
-          <w:b w:val="0"/>
-          <w:sz w:val="20"/>
-          <w:lang w:val="pt-BR"/>
-        </w:rPr>
-        <w:t>penas armazena campos como nickname, estatísticas e precisão. Isto evita que a lógica de domínio seja exposta à interface.</w:t>
-      </w:r>
-    </w:p>
-    <w:p>
-      <w:pPr>
-        <w:pStyle w:val="heading2"/>
-        <w:rPr>
-          <w:rStyle w:val="p1aZchn"/>
-          <w:lang w:val="pt-BR"/>
-        </w:rPr>
-      </w:pPr>
-      <w:r>
-        <w:rPr>
-          <w:rStyle w:val="p1aZchn"/>
-          <w:lang w:val="pt-BR"/>
-        </w:rPr>
-        <w:t>11.2   Exceptions</w:t>
+        <w:br w:type="page"/>
+      </w:r>
+      <w:r>
+        <w:lastRenderedPageBreak/>
+        <w:br/>
+      </w:r>
+      <w:r>
+        <w:t>1</w:t>
+      </w:r>
+      <w:r>
+        <w:t>3</w:t>
+      </w:r>
+      <w:r>
+        <w:t xml:space="preserve">   Testes</w:t>
       </w:r>
     </w:p>
     <w:p>
       <w:pPr>
         <w:pStyle w:val="p1a"/>
-        <w:jc w:val="center"/>
-        <w:rPr>
-          <w:noProof/>
-          <w:lang w:val="pt-BR" w:eastAsia="pt-PT"/>
-        </w:rPr>
-      </w:pPr>
-      <w:r>
-        <w:rPr>
-          <w:noProof/>
-          <w:lang w:val="pt-BR" w:eastAsia="pt-PT"/>
-        </w:rPr>
-        <w:pict w14:anchorId="01F5E132">
-          <v:shape id="_x0000_i1034" type="#_x0000_t75" style="width:300.6pt;height:118.2pt;visibility:visible;mso-wrap-style:square">
-            <v:imagedata r:id="rId17" o:title=""/>
-          </v:shape>
-        </w:pict>
-      </w:r>
-    </w:p>
-    <w:p>
-      <w:pPr>
-        <w:pStyle w:val="Legenda"/>
-      </w:pPr>
-      <w:r>
-        <w:t>Fig. 8. Código de InvalidDataException.h</w:t>
+        <w:rPr>
+          <w:lang w:val="pt-BR"/>
+        </w:rPr>
+      </w:pPr>
+      <w:r>
+        <w:rPr>
+          <w:lang w:val="pt-BR"/>
+        </w:rPr>
+        <w:br/>
+      </w:r>
+      <w:r>
+        <w:rPr>
+          <w:lang w:val="pt-BR"/>
+        </w:rPr>
+        <w:br/>
+        <w:t>Para garantir o correto funcionamento das classes</w:t>
+      </w:r>
+      <w:r>
+        <w:rPr>
+          <w:lang w:val="pt-BR"/>
+        </w:rPr>
+        <w:t xml:space="preserve">, </w:t>
+      </w:r>
+      <w:r>
+        <w:rPr>
+          <w:lang w:val="pt-BR"/>
+        </w:rPr>
+        <w:t xml:space="preserve">foram realizados testes unitários utilizando a framework Goodle C++ Testing Framework. Os testes feitos, cobrem </w:t>
+      </w:r>
+      <w:r>
+        <w:rPr>
+          <w:lang w:val="pt-BR"/>
+        </w:rPr>
+        <w:t>construtores</w:t>
+      </w:r>
+      <w:r>
+        <w:rPr>
+          <w:lang w:val="pt-BR"/>
+        </w:rPr>
+        <w:t>, funções e operadores de cada classe presente no projeto.</w:t>
       </w:r>
     </w:p>
     <w:p>
       <w:pPr>
         <w:pStyle w:val="p1a"/>
-        <w:jc w:val="center"/>
-        <w:rPr>
-          <w:noProof/>
-          <w:lang w:val="pt-BR" w:eastAsia="pt-PT"/>
-        </w:rPr>
-      </w:pPr>
-      <w:r>
-        <w:rPr>
-          <w:noProof/>
-          <w:lang w:val="pt-BR" w:eastAsia="pt-PT"/>
-        </w:rPr>
-        <w:lastRenderedPageBreak/>
-        <w:pict w14:anchorId="676740B9">
-          <v:shape id="_x0000_i1035" type="#_x0000_t75" style="width:353.4pt;height:106.8pt;visibility:visible;mso-wrap-style:square">
-            <v:imagedata r:id="rId18" o:title=""/>
-          </v:shape>
-        </w:pict>
-      </w:r>
-    </w:p>
-    <w:p>
-      <w:pPr>
-        <w:pStyle w:val="Legenda"/>
-      </w:pPr>
-      <w:r>
-        <w:t>Fig. 9. Código de InvalidDataException.cpp</w:t>
-      </w:r>
-    </w:p>
-    <w:p>
-      <w:pPr>
-        <w:pStyle w:val="p1a"/>
-        <w:rPr>
-          <w:lang w:val="pt-BR"/>
-        </w:rPr>
-      </w:pPr>
-      <w:r>
-        <w:rPr>
-          <w:lang w:val="pt-BR"/>
-        </w:rPr>
-        <w:t xml:space="preserve">InvalidDataException é uma exceção personalizada que herda de std::exception, ela recebe uma mensagem de erro e o método what() </w:t>
-      </w:r>
-      <w:r>
-        <w:rPr>
-          <w:lang w:val="pt-BR"/>
-        </w:rPr>
-        <w:t xml:space="preserve">e </w:t>
-      </w:r>
-      <w:r>
-        <w:rPr>
-          <w:lang w:val="pt-BR"/>
-        </w:rPr>
-        <w:t>devolve essa mensagem, permitindo que o Controller mostre o erro ao utilizador de forma simples. As exceções NoDataException e DuplicatedDataException funcionam da mesma forma, mudando apenas a mensagem apresentada.</w:t>
-      </w:r>
-    </w:p>
-    <w:p>
-      <w:pPr>
-        <w:pStyle w:val="heading2"/>
-        <w:rPr>
-          <w:lang w:val="pt-BR"/>
-        </w:rPr>
-      </w:pPr>
-      <w:r>
-        <w:rPr>
-          <w:lang w:val="pt-BR"/>
-        </w:rPr>
-        <w:t>11.3   Model</w:t>
-      </w:r>
-    </w:p>
-    <w:p>
-      <w:pPr>
-        <w:pStyle w:val="heading2"/>
-        <w:jc w:val="center"/>
-        <w:rPr>
-          <w:noProof/>
-          <w:lang w:val="pt-BR" w:eastAsia="pt-PT"/>
-        </w:rPr>
-      </w:pPr>
-      <w:r>
-        <w:rPr>
-          <w:noProof/>
-          <w:lang w:val="pt-BR" w:eastAsia="pt-PT"/>
-        </w:rPr>
-        <w:pict w14:anchorId="47FBF954">
-          <v:shape id="_x0000_i1036" type="#_x0000_t75" style="width:309pt;height:242.4pt;visibility:visible;mso-wrap-style:square">
-            <v:imagedata r:id="rId19" o:title=""/>
-          </v:shape>
-        </w:pict>
-      </w:r>
-    </w:p>
-    <w:p>
-      <w:pPr>
-        <w:pStyle w:val="Legenda"/>
-      </w:pPr>
-      <w:r>
-        <w:t>Fig.10. Código de Board.h</w:t>
-      </w:r>
-    </w:p>
-    <w:p>
-      <w:pPr>
-        <w:pStyle w:val="heading2"/>
-        <w:jc w:val="center"/>
-        <w:rPr>
-          <w:noProof/>
-          <w:lang w:val="pt-BR" w:eastAsia="pt-PT"/>
-        </w:rPr>
-      </w:pPr>
-      <w:r>
-        <w:rPr>
-          <w:noProof/>
-          <w:lang w:val="pt-BR" w:eastAsia="pt-PT"/>
-        </w:rPr>
-        <w:lastRenderedPageBreak/>
-        <w:pict w14:anchorId="772D06E1">
-          <v:shape id="_x0000_i1037" type="#_x0000_t75" style="width:317.4pt;height:188.4pt;visibility:visible;mso-wrap-style:square">
-            <v:imagedata r:id="rId20" o:title=""/>
-          </v:shape>
-        </w:pict>
-      </w:r>
-    </w:p>
-    <w:p>
-      <w:pPr>
-        <w:pStyle w:val="Legenda"/>
-      </w:pPr>
-      <w:r>
-        <w:t>Fig. 11. Código de validatePosi</w:t>
-      </w:r>
-      <w:r>
-        <w:t xml:space="preserve">tion() </w:t>
-      </w:r>
-      <w:r>
-        <w:t xml:space="preserve">em </w:t>
-      </w:r>
-      <w:r>
-        <w:t>Board.cpp</w:t>
+        <w:rPr>
+          <w:lang w:val="pt-BR"/>
+        </w:rPr>
+      </w:pPr>
+      <w:r>
+        <w:rPr>
+          <w:lang w:val="pt-BR"/>
+        </w:rPr>
+        <w:br/>
+        <w:t>Segue-se um exemplo de teste</w:t>
+      </w:r>
+      <w:r>
+        <w:rPr>
+          <w:lang w:val="pt-BR"/>
+        </w:rPr>
+        <w:t xml:space="preserve"> realizado</w:t>
+      </w:r>
+      <w:r>
+        <w:rPr>
+          <w:lang w:val="pt-BR"/>
+        </w:rPr>
+        <w:t xml:space="preserve"> </w:t>
+      </w:r>
+      <w:r>
+        <w:rPr>
+          <w:lang w:val="pt-BR"/>
+        </w:rPr>
+        <w:t>de cada classe.</w:t>
       </w:r>
     </w:p>
     <w:p>
@@ -8210,745 +9338,24 @@
         <w:jc w:val="both"/>
       </w:pPr>
       <w:r>
-        <w:rPr>
-          <w:rStyle w:val="p1aZchn"/>
-          <w:b w:val="0"/>
+        <w:br/>
+      </w:r>
+      <w:r>
+        <w:rPr>
           <w:sz w:val="20"/>
-          <w:lang w:val="pt-BR"/>
-        </w:rPr>
-        <w:t>Board representa o tabuleiro do jogo, com uma grelha de 10x10 onde cada posição pode conter água, navio, acerto ou falha. O método validatePosition() verifica se um navio pode ser colocado numa determinada posição, garantindo que não fica encostado a outros navios. Já os métodos placeShip() e registerShot() atualizam o estado do tabuleiro, enquanto allShipsSunk() verifica se todos os navios foram afundados e se o jogo terminou</w:t>
-      </w:r>
-      <w:r>
-        <w:t>.</w:t>
-      </w:r>
-    </w:p>
-    <w:p>
-      <w:pPr>
-        <w:pStyle w:val="heading2"/>
-        <w:rPr>
-          <w:lang w:val="pt-BR"/>
-        </w:rPr>
-      </w:pPr>
-      <w:r>
-        <w:rPr>
-          <w:lang w:val="pt-BR"/>
-        </w:rPr>
-        <w:t xml:space="preserve">11.4 </w:t>
-      </w:r>
-      <w:r>
-        <w:rPr>
-          <w:lang w:val="pt-BR"/>
-        </w:rPr>
-        <w:t xml:space="preserve">  </w:t>
-      </w:r>
-      <w:r>
-        <w:rPr>
-          <w:lang w:val="pt-BR"/>
-        </w:rPr>
-        <w:t>Mappers</w:t>
-      </w:r>
-    </w:p>
-    <w:p>
-      <w:pPr>
-        <w:pStyle w:val="p1a"/>
-        <w:jc w:val="center"/>
-        <w:rPr>
-          <w:noProof/>
-          <w:lang w:val="pt-BR" w:eastAsia="pt-PT"/>
-        </w:rPr>
-      </w:pPr>
-      <w:r>
-        <w:rPr>
-          <w:noProof/>
-          <w:lang w:val="pt-BR" w:eastAsia="pt-PT"/>
-        </w:rPr>
-        <w:pict w14:anchorId="4C7A1D6E">
-          <v:shape id="_x0000_i1038" type="#_x0000_t75" style="width:320.4pt;height:63pt;visibility:visible;mso-wrap-style:square">
-            <v:imagedata r:id="rId21" o:title=""/>
-          </v:shape>
-        </w:pict>
-      </w:r>
-    </w:p>
-    <w:p>
-      <w:pPr>
-        <w:pStyle w:val="Legenda"/>
-      </w:pPr>
-      <w:r>
-        <w:t>Fig. 12. Código de BoardMapper.cpp</w:t>
-      </w:r>
-    </w:p>
-    <w:p>
-      <w:pPr>
-        <w:jc w:val="center"/>
-        <w:rPr>
-          <w:noProof/>
-          <w:lang w:val="pt-BR" w:eastAsia="pt-PT"/>
-        </w:rPr>
-      </w:pPr>
-      <w:r>
-        <w:rPr>
-          <w:noProof/>
-          <w:lang w:val="pt-BR" w:eastAsia="pt-PT"/>
-        </w:rPr>
-        <w:lastRenderedPageBreak/>
-        <w:pict w14:anchorId="15ADAE60">
-          <v:shape id="_x0000_i1039" type="#_x0000_t75" style="width:284.4pt;height:184.2pt;visibility:visible;mso-wrap-style:square">
-            <v:imagedata r:id="rId22" o:title=""/>
-          </v:shape>
-        </w:pict>
-      </w:r>
-    </w:p>
-    <w:p>
-      <w:pPr>
-        <w:pStyle w:val="Legenda"/>
-      </w:pPr>
-      <w:r>
-        <w:t>Fig. 13. Código de BoadMapper.cpp</w:t>
-      </w:r>
-    </w:p>
-    <w:p>
-      <w:pPr>
-        <w:pStyle w:val="p1a"/>
-        <w:rPr>
-          <w:rFonts w:ascii="Times New Roman" w:hAnsi="Times New Roman"/>
-          <w:lang w:val="pt-BR"/>
-        </w:rPr>
-      </w:pPr>
-      <w:r>
-        <w:rPr>
-          <w:rStyle w:val="Forte"/>
-          <w:rFonts w:ascii="Times New Roman" w:hAnsi="Times New Roman"/>
-          <w:b w:val="0"/>
-          <w:lang w:val="pt-BR"/>
-        </w:rPr>
-        <w:t>BoardMapper</w:t>
-      </w:r>
-      <w:r>
-        <w:rPr>
-          <w:rFonts w:ascii="Times New Roman" w:hAnsi="Times New Roman"/>
-          <w:lang w:val="pt-BR"/>
-        </w:rPr>
-        <w:t xml:space="preserve"> converte um objeto </w:t>
-      </w:r>
-      <w:r>
-        <w:rPr>
-          <w:rStyle w:val="CdigoHTML"/>
-          <w:rFonts w:ascii="Times New Roman" w:hAnsi="Times New Roman" w:cs="Times New Roman"/>
-          <w:lang w:val="pt-BR"/>
-        </w:rPr>
-        <w:t>Board</w:t>
-      </w:r>
-      <w:r>
-        <w:rPr>
-          <w:rFonts w:ascii="Times New Roman" w:hAnsi="Times New Roman"/>
-          <w:lang w:val="pt-BR"/>
-        </w:rPr>
-        <w:t xml:space="preserve"> num </w:t>
-      </w:r>
-      <w:r>
-        <w:rPr>
-          <w:rStyle w:val="CdigoHTML"/>
-          <w:rFonts w:ascii="Times New Roman" w:hAnsi="Times New Roman" w:cs="Times New Roman"/>
-          <w:lang w:val="pt-BR"/>
-        </w:rPr>
-        <w:t>BoardDTO</w:t>
-      </w:r>
-      <w:r>
-        <w:rPr>
-          <w:rFonts w:ascii="Times New Roman" w:hAnsi="Times New Roman"/>
-          <w:lang w:val="pt-BR"/>
-        </w:rPr>
-        <w:t xml:space="preserve">, copiando as informações necessárias para serem apresentadas na interface. Também utiliza o </w:t>
-      </w:r>
-      <w:r>
-        <w:rPr>
-          <w:rStyle w:val="CdigoHTML"/>
-          <w:rFonts w:ascii="Times New Roman" w:hAnsi="Times New Roman" w:cs="Times New Roman"/>
-          <w:lang w:val="pt-BR"/>
-        </w:rPr>
-        <w:t>ShipMapper</w:t>
-      </w:r>
-      <w:r>
-        <w:rPr>
-          <w:rFonts w:ascii="Times New Roman" w:hAnsi="Times New Roman"/>
-          <w:lang w:val="pt-BR"/>
-        </w:rPr>
-        <w:t xml:space="preserve"> para converter os navios da frota. O método é </w:t>
-      </w:r>
-      <w:r>
-        <w:rPr>
-          <w:rStyle w:val="CdigoHTML"/>
-          <w:rFonts w:ascii="Times New Roman" w:hAnsi="Times New Roman" w:cs="Times New Roman"/>
-          <w:lang w:val="pt-BR"/>
-        </w:rPr>
-        <w:t>static</w:t>
-      </w:r>
-      <w:r>
-        <w:rPr>
-          <w:rFonts w:ascii="Times New Roman" w:hAnsi="Times New Roman"/>
-          <w:lang w:val="pt-BR"/>
-        </w:rPr>
-        <w:t xml:space="preserve"> porque apenas realiza a conversão de dados e não precisa de guardar qualquer estado</w:t>
-      </w:r>
-      <w:r>
-        <w:rPr>
-          <w:rFonts w:ascii="Times New Roman" w:hAnsi="Times New Roman"/>
-          <w:lang w:val="pt-BR"/>
-        </w:rPr>
-        <w:t>.</w:t>
-      </w:r>
-    </w:p>
-    <w:p>
-      <w:pPr>
-        <w:pStyle w:val="heading2"/>
-        <w:rPr>
-          <w:lang w:val="pt-BR"/>
-        </w:rPr>
-      </w:pPr>
-      <w:r>
-        <w:rPr>
-          <w:lang w:val="pt-BR"/>
-        </w:rPr>
-        <w:lastRenderedPageBreak/>
-        <w:t>11.5   Repo</w:t>
-      </w:r>
-    </w:p>
-    <w:p>
-      <w:pPr>
-        <w:pStyle w:val="Legenda"/>
-      </w:pPr>
-      <w:r>
-        <w:pict w14:anchorId="1B6DD970">
-          <v:shape id="_x0000_i1040" type="#_x0000_t75" style="width:298.2pt;height:263.4pt;visibility:visible;mso-wrap-style:square">
-            <v:imagedata r:id="rId23" o:title=""/>
-          </v:shape>
-        </w:pict>
-      </w:r>
-    </w:p>
-    <w:p>
-      <w:pPr>
-        <w:pStyle w:val="Legenda"/>
-      </w:pPr>
-      <w:r>
-        <w:t>Fig. 14. Código de ProfileRepositoryFile.h</w:t>
-      </w:r>
-    </w:p>
-    <w:p>
-      <w:pPr>
-        <w:ind w:firstLine="0"/>
-        <w:jc w:val="center"/>
-        <w:rPr>
-          <w:noProof/>
-          <w:lang w:val="pt-BR" w:eastAsia="pt-PT"/>
-        </w:rPr>
-      </w:pPr>
-      <w:r>
-        <w:rPr>
-          <w:noProof/>
-          <w:lang w:val="pt-BR" w:eastAsia="pt-PT"/>
-        </w:rPr>
-        <w:pict w14:anchorId="10781889">
-          <v:shape id="_x0000_i1041" type="#_x0000_t75" style="width:313.8pt;height:142.2pt;visibility:visible;mso-wrap-style:square">
-            <v:imagedata r:id="rId24" o:title=""/>
-          </v:shape>
-        </w:pict>
-      </w:r>
-    </w:p>
-    <w:p>
-      <w:pPr>
-        <w:pStyle w:val="Legenda"/>
-      </w:pPr>
-      <w:r>
-        <w:t>Fig. 15. Código de save() em ProfileRepositoryFile.cpp</w:t>
-      </w:r>
-    </w:p>
-    <w:p>
-      <w:pPr>
-        <w:pStyle w:val="p1a"/>
-        <w:rPr>
-          <w:lang w:val="pt-BR"/>
-        </w:rPr>
-      </w:pPr>
-      <w:r>
-        <w:rPr>
-          <w:rStyle w:val="Forte"/>
-          <w:b w:val="0"/>
-          <w:lang w:val="pt-BR"/>
-        </w:rPr>
-        <w:t>ProfileRepositoryFile</w:t>
-      </w:r>
-      <w:r>
-        <w:rPr>
-          <w:lang w:val="pt-BR"/>
-        </w:rPr>
-        <w:t xml:space="preserve"> é a classe responsável por guardar e carregar os perfis dos jogadores num ficheiro </w:t>
-      </w:r>
-      <w:r>
-        <w:rPr>
-          <w:lang w:val="pt-BR"/>
-        </w:rPr>
-        <w:t>CSV (players.txt).</w:t>
-      </w:r>
-      <w:r>
-        <w:rPr>
-          <w:lang w:val="pt-BR"/>
-        </w:rPr>
-        <w:t xml:space="preserve"> Utiliza o padrão </w:t>
-      </w:r>
-      <w:r>
-        <w:rPr>
-          <w:rStyle w:val="Forte"/>
-          <w:b w:val="0"/>
-          <w:lang w:val="pt-BR"/>
-        </w:rPr>
-        <w:t>Singleton</w:t>
-      </w:r>
-      <w:r>
-        <w:rPr>
-          <w:lang w:val="pt-BR"/>
-        </w:rPr>
-        <w:t xml:space="preserve">, garantindo que existe apenas uma instância da classe. Os métodos </w:t>
-      </w:r>
-      <w:r>
-        <w:rPr>
-          <w:lang w:val="pt-BR"/>
-        </w:rPr>
-        <w:t>load()</w:t>
-      </w:r>
-      <w:r>
-        <w:rPr>
-          <w:lang w:val="pt-BR"/>
-        </w:rPr>
-        <w:t xml:space="preserve"> </w:t>
-      </w:r>
-      <w:r>
-        <w:rPr>
-          <w:lang w:val="pt-BR"/>
-        </w:rPr>
-        <w:t>e save()</w:t>
-      </w:r>
-      <w:r>
-        <w:rPr>
-          <w:lang w:val="pt-BR"/>
-        </w:rPr>
-        <w:t xml:space="preserve"> permitem ler e guardar os dados dos jogadores, mantendo as suas estatísticas entre diferentes execuções do programa</w:t>
-      </w:r>
-      <w:r>
-        <w:rPr>
-          <w:lang w:val="pt-BR"/>
-        </w:rPr>
-        <w:t>.</w:t>
-      </w:r>
-    </w:p>
-    <w:p>
-      <w:pPr>
-        <w:pStyle w:val="heading2"/>
-        <w:rPr>
-          <w:lang w:val="pt-BR"/>
-        </w:rPr>
-      </w:pPr>
-      <w:r>
-        <w:rPr>
-          <w:lang w:val="pt-BR"/>
-        </w:rPr>
-        <w:lastRenderedPageBreak/>
-        <w:t>11.6   Services</w:t>
-      </w:r>
-    </w:p>
-    <w:p>
-      <w:pPr>
-        <w:pStyle w:val="p1a"/>
-        <w:jc w:val="center"/>
-        <w:rPr>
-          <w:noProof/>
-          <w:lang w:val="pt-BR" w:eastAsia="pt-PT"/>
-        </w:rPr>
-      </w:pPr>
-      <w:r>
-        <w:rPr>
-          <w:noProof/>
-          <w:lang w:val="pt-BR" w:eastAsia="pt-PT"/>
-        </w:rPr>
-        <w:pict w14:anchorId="57831F45">
-          <v:shape id="_x0000_i1042" type="#_x0000_t75" style="width:297pt;height:229.2pt;visibility:visible;mso-wrap-style:square">
-            <v:imagedata r:id="rId25" o:title=""/>
-          </v:shape>
-        </w:pict>
-      </w:r>
-    </w:p>
-    <w:p>
-      <w:pPr>
-        <w:pStyle w:val="Legenda"/>
-      </w:pPr>
-      <w:r>
-        <w:t>Fig.16. Código de PlayerService.h</w:t>
-      </w:r>
-    </w:p>
-    <w:p>
-      <w:pPr>
-        <w:pStyle w:val="Legenda"/>
-      </w:pPr>
-      <w:r>
-        <w:pict w14:anchorId="6E4C43A9">
-          <v:shape id="_x0000_i1043" type="#_x0000_t75" style="width:340.8pt;height:133.2pt;visibility:visible;mso-wrap-style:square">
-            <v:imagedata r:id="rId26" o:title=""/>
-          </v:shape>
-        </w:pict>
-      </w:r>
-    </w:p>
-    <w:p>
-      <w:pPr>
-        <w:pStyle w:val="Legenda"/>
-        <w:rPr>
-          <w:szCs w:val="24"/>
-        </w:rPr>
-      </w:pPr>
-      <w:r>
-        <w:t>Fig. 17. Código de registerPlayer() em PlayerService</w:t>
-      </w:r>
-    </w:p>
-    <w:p>
-      <w:pPr>
-        <w:pStyle w:val="Legenda"/>
-        <w:jc w:val="both"/>
-        <w:rPr>
-          <w:rStyle w:val="p1aZchn"/>
-          <w:b w:val="0"/>
-          <w:sz w:val="20"/>
-          <w:lang w:val="pt-BR"/>
-        </w:rPr>
-      </w:pPr>
-      <w:r>
-        <w:rPr>
-          <w:rStyle w:val="p1aZchn"/>
-          <w:b w:val="0"/>
-          <w:sz w:val="20"/>
-          <w:lang w:val="pt-BR"/>
-        </w:rPr>
-        <w:t>PlayerService é a camada responsável pelas regras de negócio relacionadas com os jogadores. Faz validações no registo, verifica se já existem jogadores com o mesmo nome e obtém os rankings. Também organiza os jogadores com base nas vitórias ou na precisão. Em caso de erro, lança exceções específicas para que o Controller trate a situação adequadamente.</w:t>
-      </w:r>
-    </w:p>
-    <w:p>
-      <w:pPr>
-        <w:pStyle w:val="heading2"/>
-        <w:rPr>
-          <w:lang w:val="pt-BR"/>
-        </w:rPr>
-      </w:pPr>
-      <w:r>
-        <w:rPr>
-          <w:lang w:val="pt-BR"/>
-        </w:rPr>
-        <w:lastRenderedPageBreak/>
-        <w:t>11.7   View</w:t>
-      </w:r>
-    </w:p>
-    <w:p>
-      <w:pPr>
-        <w:ind w:firstLine="0"/>
-        <w:jc w:val="center"/>
-        <w:rPr>
-          <w:noProof/>
-          <w:lang w:val="pt-BR" w:eastAsia="pt-PT"/>
-        </w:rPr>
-      </w:pPr>
-      <w:r>
-        <w:rPr>
-          <w:noProof/>
-          <w:lang w:val="pt-BR" w:eastAsia="pt-PT"/>
-        </w:rPr>
-        <w:pict w14:anchorId="763FE111">
-          <v:shape id="_x0000_i1044" type="#_x0000_t75" style="width:345.6pt;height:215.4pt;visibility:visible;mso-wrap-style:square">
-            <v:imagedata r:id="rId27" o:title=""/>
-          </v:shape>
-        </w:pict>
-      </w:r>
-    </w:p>
-    <w:p>
-      <w:pPr>
-        <w:pStyle w:val="Legenda"/>
-      </w:pPr>
-      <w:r>
-        <w:t>Fig. 18. Código de View.h</w:t>
-      </w:r>
-    </w:p>
-    <w:p>
-      <w:pPr>
-        <w:ind w:firstLine="0"/>
-        <w:jc w:val="center"/>
-        <w:rPr>
-          <w:noProof/>
-          <w:lang w:val="pt-BR" w:eastAsia="pt-PT"/>
-        </w:rPr>
-      </w:pPr>
-      <w:r>
-        <w:rPr>
-          <w:noProof/>
-          <w:lang w:val="pt-BR" w:eastAsia="pt-PT"/>
-        </w:rPr>
-        <w:lastRenderedPageBreak/>
-        <w:pict w14:anchorId="6A559318">
-          <v:shape id="_x0000_i1045" type="#_x0000_t75" style="width:329.4pt;height:291pt;visibility:visible;mso-wrap-style:square">
-            <v:imagedata r:id="rId28" o:title=""/>
-          </v:shape>
-        </w:pict>
-      </w:r>
-    </w:p>
-    <w:p>
-      <w:pPr>
-        <w:pStyle w:val="Legenda"/>
-      </w:pPr>
-      <w:r>
-        <w:t>Fig. 19. Código em showBoard() em View.cpp</w:t>
-      </w:r>
-    </w:p>
-    <w:p>
-      <w:pPr>
-        <w:pStyle w:val="p1a"/>
-        <w:rPr>
-          <w:lang w:val="pt-BR" w:eastAsia="pt-PT"/>
-        </w:rPr>
-      </w:pPr>
-      <w:r>
-        <w:rPr>
-          <w:rStyle w:val="Forte"/>
-          <w:b w:val="0"/>
-          <w:lang w:val="pt-BR"/>
-        </w:rPr>
-        <w:t>View</w:t>
-      </w:r>
-      <w:r>
-        <w:rPr>
-          <w:lang w:val="pt-BR"/>
-        </w:rPr>
-        <w:t xml:space="preserve"> é a classe responsável pela interação com o utilizador através da consola. Mostra o tabuleiro, recebe as jogadas e apresenta mensagens e </w:t>
-      </w:r>
-      <w:r>
-        <w:rPr>
-          <w:lang w:val="pt-BR"/>
-        </w:rPr>
-        <w:t>resultados do jogo. Também oculta</w:t>
-      </w:r>
-      <w:r>
-        <w:rPr>
-          <w:lang w:val="pt-BR"/>
-        </w:rPr>
-        <w:t xml:space="preserve"> os navios do adversário durante a partida e exibir as estatísticas finais quando o jogo termina.</w:t>
-      </w:r>
-    </w:p>
-    <w:p>
-      <w:pPr>
-        <w:pStyle w:val="heading2"/>
-      </w:pPr>
-      <w:bookmarkStart w:id="7" w:name="_GoBack"/>
-      <w:r>
-        <w:lastRenderedPageBreak/>
-        <w:t>11.8   Controller</w:t>
-      </w:r>
-    </w:p>
-    <w:bookmarkEnd w:id="7"/>
-    <w:p>
-      <w:pPr>
-        <w:pStyle w:val="Legenda"/>
-      </w:pPr>
-      <w:r>
-        <w:pict w14:anchorId="1B5E44F9">
-          <v:shape id="_x0000_i1046" type="#_x0000_t75" style="width:237.6pt;height:345.6pt;visibility:visible;mso-wrap-style:square">
-            <v:imagedata r:id="rId29" o:title=""/>
-          </v:shape>
-        </w:pict>
-      </w:r>
-    </w:p>
-    <w:p>
-      <w:pPr>
-        <w:pStyle w:val="Legenda"/>
-      </w:pPr>
-      <w:r>
-        <w:t>Fig. 20. Código de Controller.h</w:t>
-      </w:r>
-    </w:p>
-    <w:p>
-      <w:pPr>
-        <w:jc w:val="center"/>
-        <w:rPr>
-          <w:noProof/>
-          <w:lang w:val="pt-BR" w:eastAsia="pt-PT"/>
-        </w:rPr>
-      </w:pPr>
-      <w:r>
-        <w:rPr>
-          <w:noProof/>
-          <w:lang w:val="pt-BR" w:eastAsia="pt-PT"/>
-        </w:rPr>
-        <w:lastRenderedPageBreak/>
-        <w:pict w14:anchorId="447639AE">
-          <v:shape id="_x0000_i1047" type="#_x0000_t75" style="width:202.2pt;height:370.2pt;visibility:visible;mso-wrap-style:square">
-            <v:imagedata r:id="rId30" o:title=""/>
-          </v:shape>
-        </w:pict>
-      </w:r>
-    </w:p>
-    <w:p>
-      <w:pPr>
-        <w:pStyle w:val="Legenda"/>
-      </w:pPr>
-      <w:r>
-        <w:t>Fig. 21. Código de runMain() em Controller.cpp</w:t>
-      </w:r>
-    </w:p>
-    <w:p>
-      <w:pPr>
-        <w:pStyle w:val="Legenda"/>
-        <w:jc w:val="both"/>
-        <w:rPr>
-          <w:rStyle w:val="p1aZchn"/>
-          <w:b w:val="0"/>
-          <w:sz w:val="20"/>
-          <w:lang w:val="pt-BR"/>
-        </w:rPr>
-      </w:pPr>
-      <w:r>
-        <w:rPr>
-          <w:rStyle w:val="p1aZchn"/>
-          <w:b w:val="0"/>
-          <w:sz w:val="20"/>
-          <w:lang w:val="pt-BR"/>
-        </w:rPr>
-        <w:t>Controller é a classe principal da aplicação, responsável por ligar a View, os Services e o Model. Controla o fluxo do programa, recebendo ações do utilizador, executando as regras de negócio e atualizando o estado do jogo. Além disso, organiza as diferentes funcionalidades em métodos separados.</w:t>
-      </w:r>
-    </w:p>
-    <w:p>
-      <w:pPr>
-        <w:pStyle w:val="heading1"/>
-      </w:pPr>
-      <w:r>
-        <w:rPr>
-          <w:rStyle w:val="p1aZchn"/>
-          <w:b w:val="0"/>
-          <w:sz w:val="20"/>
-          <w:lang w:val="pt-BR"/>
-        </w:rPr>
-        <w:br w:type="page"/>
-      </w:r>
-      <w:r>
-        <w:lastRenderedPageBreak/>
+        </w:rPr>
+        <w:t>Exemplo de teste para a classe Player:</w:t>
+      </w:r>
+      <w:r>
         <w:br/>
       </w:r>
       <w:r>
-        <w:t>11</w:t>
-      </w:r>
-      <w:r>
-        <w:t xml:space="preserve">   Testes</w:t>
-      </w:r>
-    </w:p>
-    <w:p>
-      <w:pPr>
-        <w:pStyle w:val="p1a"/>
-        <w:rPr>
-          <w:lang w:val="pt-BR"/>
-        </w:rPr>
-      </w:pPr>
-      <w:r>
-        <w:rPr>
-          <w:lang w:val="pt-BR"/>
-        </w:rPr>
         <w:br/>
       </w:r>
       <w:r>
-        <w:rPr>
-          <w:lang w:val="pt-BR"/>
-        </w:rPr>
-        <w:br/>
-        <w:t>Para garantir o correto funcionamento das classes</w:t>
-      </w:r>
-      <w:r>
-        <w:rPr>
-          <w:lang w:val="pt-BR"/>
-        </w:rPr>
-        <w:t xml:space="preserve">, </w:t>
-      </w:r>
-      <w:r>
-        <w:rPr>
-          <w:lang w:val="pt-BR"/>
-        </w:rPr>
-        <w:t xml:space="preserve">foram realizados testes unitários utilizando a framework Goodle C++ Testing Framework. Os testes feitos, cobrem </w:t>
-      </w:r>
-      <w:r>
-        <w:rPr>
-          <w:lang w:val="pt-BR"/>
-        </w:rPr>
-        <w:t>construtores</w:t>
-      </w:r>
-      <w:r>
-        <w:rPr>
-          <w:lang w:val="pt-BR"/>
-        </w:rPr>
-        <w:t>, funções e operadores de cada classe presente no projeto.</w:t>
-      </w:r>
-    </w:p>
-    <w:p>
-      <w:pPr>
-        <w:pStyle w:val="p1a"/>
-        <w:rPr>
-          <w:lang w:val="pt-BR"/>
-        </w:rPr>
-      </w:pPr>
-      <w:r>
-        <w:rPr>
-          <w:lang w:val="pt-BR"/>
-        </w:rPr>
-        <w:br/>
-        <w:t>Segue-se um exemplo de teste</w:t>
-      </w:r>
-      <w:r>
-        <w:rPr>
-          <w:lang w:val="pt-BR"/>
-        </w:rPr>
-        <w:t xml:space="preserve"> realizado</w:t>
-      </w:r>
-      <w:r>
-        <w:rPr>
-          <w:lang w:val="pt-BR"/>
-        </w:rPr>
-        <w:t xml:space="preserve"> </w:t>
-      </w:r>
-      <w:r>
-        <w:rPr>
-          <w:lang w:val="pt-BR"/>
-        </w:rPr>
-        <w:t>de cada classe.</w:t>
-      </w:r>
-    </w:p>
-    <w:p>
-      <w:pPr>
-        <w:pStyle w:val="Legenda"/>
-        <w:jc w:val="both"/>
-      </w:pPr>
-      <w:r>
-        <w:br/>
-      </w:r>
-      <w:r>
-        <w:rPr>
-          <w:sz w:val="20"/>
-        </w:rPr>
-        <w:t>Exemplo de teste para a classe Player:</w:t>
-      </w:r>
-      <w:r>
-        <w:br/>
-      </w:r>
-      <w:r>
-        <w:br/>
-      </w:r>
-      <w:r>
-        <w:rPr>
-          <w:b w:val="0"/>
-        </w:rPr>
         <w:t>Este teste verifica que o construtor da classe Player lança uma InvalidDataException quando o nickname introduzido pelo jogador, tem menos de 3 caracteres. Com isto, este teste assegura que a validação do nickname está corretamente implementada no projeto.</w:t>
       </w:r>
       <w:r>
-        <w:rPr>
-          <w:b w:val="0"/>
-        </w:rPr>
         <w:br/>
       </w:r>
     </w:p>
@@ -8962,137 +9369,136 @@
       <w:r>
         <w:pict w14:anchorId="5D785E8A">
           <v:shape id="_x0000_i1048" type="#_x0000_t75" style="width:343.2pt;height:162pt;visibility:visible">
-            <v:imagedata r:id="rId31" o:title=""/>
-          </v:shape>
-        </w:pict>
-      </w:r>
-      <w:r>
-        <w:br/>
-      </w:r>
-      <w:r>
-        <w:t xml:space="preserve">                   Fig. 8</w:t>
-      </w:r>
-      <w:r>
-        <w:t>. Teste unitário da classe Player – validação do nickname</w:t>
-      </w:r>
-    </w:p>
-    <w:p>
-      <w:pPr>
-        <w:pStyle w:val="Legenda"/>
-      </w:pPr>
-    </w:p>
-    <w:p>
-      <w:pPr>
-        <w:pStyle w:val="Legenda"/>
-        <w:jc w:val="left"/>
-      </w:pPr>
-      <w:r>
-        <w:br/>
-      </w:r>
-      <w:r>
-        <w:rPr>
-          <w:sz w:val="20"/>
-        </w:rPr>
-        <w:t>Exemplo de teste para a classe Ship:</w:t>
-      </w:r>
-      <w:r>
-        <w:br/>
-      </w:r>
-      <w:r>
-        <w:br/>
-      </w:r>
-      <w:r>
-        <w:rPr>
-          <w:b w:val="0"/>
-          <w:sz w:val="20"/>
-        </w:rPr>
-        <w:t>Este teste verifica que um navio é considerado afundado, após receber um número de hits igual ao seu tamanho. Neste caso, foram adicionados 2 hits, dado o tamanho da fragata.  Este teste comprova que o método isSunk() reflete o estado do navio ao longo da partida.</w:t>
-      </w:r>
-    </w:p>
-    <w:p>
-      <w:pPr>
-        <w:pStyle w:val="Legenda"/>
-      </w:pPr>
-      <w:r>
-        <w:lastRenderedPageBreak/>
-        <w:br/>
-      </w:r>
-      <w:r>
-        <w:pict w14:anchorId="6DCFBF81">
-          <v:shape id="_x0000_i1049" type="#_x0000_t75" style="width:346.2pt;height:103.2pt;visibility:visible">
-            <v:imagedata r:id="rId32" o:title=""/>
-          </v:shape>
-        </w:pict>
-      </w:r>
-      <w:r>
-        <w:t xml:space="preserve">                  Fig. </w:t>
-      </w:r>
-      <w:r>
-        <w:t>9</w:t>
-      </w:r>
-      <w:r>
-        <w:t>. Teste unitário da classe Ship – verificação de navio afundado</w:t>
-      </w:r>
-      <w:r>
-        <w:br/>
-      </w:r>
-    </w:p>
-    <w:p>
-      <w:pPr>
-        <w:pStyle w:val="Legenda"/>
-        <w:jc w:val="both"/>
-      </w:pPr>
-      <w:r>
-        <w:br/>
-      </w:r>
-      <w:r>
-        <w:rPr>
-          <w:sz w:val="20"/>
-        </w:rPr>
-        <w:t xml:space="preserve">Exemplo de teste para a classe </w:t>
-      </w:r>
-      <w:r>
-        <w:rPr>
-          <w:sz w:val="20"/>
-        </w:rPr>
-        <w:t>Board</w:t>
-      </w:r>
-      <w:r>
-        <w:rPr>
-          <w:sz w:val="20"/>
-        </w:rPr>
-        <w:t>:</w:t>
-      </w:r>
-      <w:r>
-        <w:br/>
-      </w:r>
-      <w:r>
-        <w:br/>
-      </w:r>
-      <w:r>
-        <w:rPr>
-          <w:b w:val="0"/>
-        </w:rPr>
-        <w:t>Este teste verifica que ao efetuar um disparo numa célula ocupada por um navio, neste caso novamente uma fragata, o método registerShot() devolve “X” e atualiza o estado do tabuleiro. Isto garante que ao longo da partida, após cada jogada, o tabuleiro é atualizado de forma correta.</w:t>
-      </w:r>
-      <w:r>
-        <w:br/>
-      </w:r>
-      <w:r>
-        <w:br/>
-      </w:r>
-      <w:r>
-        <w:pict w14:anchorId="55F29CDE">
-          <v:shape id="_x0000_i1050" type="#_x0000_t75" style="width:349.8pt;height:129.6pt;visibility:visible">
             <v:imagedata r:id="rId33" o:title=""/>
           </v:shape>
         </w:pict>
       </w:r>
       <w:r>
+        <w:br/>
+      </w:r>
+      <w:r>
+        <w:t xml:space="preserve">                   Fig. </w:t>
+      </w:r>
+      <w:r>
+        <w:t>24</w:t>
+      </w:r>
+      <w:r>
+        <w:t>. Teste unitário da classe Player – validação do nickname</w:t>
+      </w:r>
+    </w:p>
+    <w:p>
+      <w:pPr>
+        <w:pStyle w:val="Legenda"/>
+      </w:pPr>
+    </w:p>
+    <w:p>
+      <w:pPr>
+        <w:pStyle w:val="Legenda"/>
+        <w:jc w:val="left"/>
+      </w:pPr>
+      <w:r>
+        <w:br/>
+      </w:r>
+      <w:r>
+        <w:rPr>
+          <w:sz w:val="20"/>
+        </w:rPr>
+        <w:t>Exemplo de teste para a classe Ship:</w:t>
+      </w:r>
+      <w:r>
+        <w:br/>
+      </w:r>
+      <w:r>
+        <w:br/>
+      </w:r>
+      <w:r>
+        <w:rPr>
+          <w:sz w:val="20"/>
+        </w:rPr>
+        <w:t>Este teste verifica que um navio é considerado afundado, após receber um número de hits igual ao seu tamanho. Neste caso, foram adicionados 2 hits, dado o tamanho da fragata.  Este teste comprova que o método isSunk() reflete o estado do navio ao longo da partida.</w:t>
+      </w:r>
+    </w:p>
+    <w:p>
+      <w:pPr>
+        <w:pStyle w:val="Legenda"/>
+      </w:pPr>
+      <w:r>
+        <w:lastRenderedPageBreak/>
+        <w:br/>
+      </w:r>
+      <w:r>
+        <w:pict w14:anchorId="6DCFBF81">
+          <v:shape id="_x0000_i1049" type="#_x0000_t75" style="width:346.2pt;height:103.2pt;visibility:visible">
+            <v:imagedata r:id="rId34" o:title=""/>
+          </v:shape>
+        </w:pict>
+      </w:r>
+      <w:r>
+        <w:t xml:space="preserve">                  Fig. </w:t>
+      </w:r>
+      <w:r>
+        <w:t>25</w:t>
+      </w:r>
+      <w:r>
+        <w:t>. Teste unitário da classe Ship – verificação de navio afundado</w:t>
+      </w:r>
+      <w:r>
+        <w:br/>
+      </w:r>
+    </w:p>
+    <w:p>
+      <w:pPr>
+        <w:pStyle w:val="Legenda"/>
+        <w:jc w:val="both"/>
+      </w:pPr>
+      <w:r>
+        <w:br/>
+      </w:r>
+      <w:r>
+        <w:rPr>
+          <w:sz w:val="20"/>
+        </w:rPr>
+        <w:t xml:space="preserve">Exemplo de teste para a classe </w:t>
+      </w:r>
+      <w:r>
+        <w:rPr>
+          <w:sz w:val="20"/>
+        </w:rPr>
+        <w:t>Board</w:t>
+      </w:r>
+      <w:r>
+        <w:rPr>
+          <w:sz w:val="20"/>
+        </w:rPr>
+        <w:t>:</w:t>
+      </w:r>
+      <w:r>
+        <w:br/>
+      </w:r>
+      <w:r>
+        <w:br/>
+      </w:r>
+      <w:r>
+        <w:t>Este teste verifica que ao efetuar um disparo numa célula ocupada por um navio, neste caso novamente uma fragata, o método registerShot() devolve “X” e atualiza o estado do tabuleiro. Isto garante que ao longo da partida, após cada jogada, o tabuleiro é atualizado de forma correta.</w:t>
+      </w:r>
+      <w:r>
+        <w:br/>
+      </w:r>
+      <w:r>
+        <w:br/>
+      </w:r>
+      <w:r>
+        <w:pict w14:anchorId="55F29CDE">
+          <v:shape id="_x0000_i1050" type="#_x0000_t75" style="width:349.8pt;height:129.6pt;visibility:visible">
+            <v:imagedata r:id="rId35" o:title=""/>
+          </v:shape>
+        </w:pict>
+      </w:r>
+      <w:r>
         <w:t xml:space="preserve">                    Fig. </w:t>
       </w:r>
       <w:r>
-        <w:t>10</w:t>
+        <w:t>26</w:t>
       </w:r>
       <w:r>
         <w:t xml:space="preserve">. Teste unitário da classe Board – registo de tiro no navio                   </w:t>
@@ -9122,21 +9528,12 @@
         <w:br/>
       </w:r>
       <w:r>
-        <w:rPr>
-          <w:b w:val="0"/>
-        </w:rPr>
         <w:t xml:space="preserve">Este teste verifica que quando um jogador acerta num navio do adversário, o turno não é alterado, permitindo assim que o jogador continue a jogar até falhar algum navio. Isto verifica que o projeto segue a regra do jogo </w:t>
       </w:r>
       <w:r>
-        <w:rPr>
-          <w:b w:val="0"/>
-        </w:rPr>
         <w:t>clássico</w:t>
       </w:r>
       <w:r>
-        <w:rPr>
-          <w:b w:val="0"/>
-        </w:rPr>
         <w:t xml:space="preserve"> de batalha naval.</w:t>
       </w:r>
       <w:r>
@@ -9149,7 +9546,7 @@
         <w:lastRenderedPageBreak/>
         <w:pict w14:anchorId="5778C4CB">
           <v:shape id="_x0000_i1051" type="#_x0000_t75" style="width:345.6pt;height:154.8pt;visibility:visible">
-            <v:imagedata r:id="rId34" o:title=""/>
+            <v:imagedata r:id="rId36" o:title=""/>
           </v:shape>
         </w:pict>
       </w:r>
@@ -9158,7 +9555,7 @@
         <w:t xml:space="preserve">                Fig. </w:t>
       </w:r>
       <w:r>
-        <w:t>11</w:t>
+        <w:t>27</w:t>
       </w:r>
       <w:r>
         <w:t>. Teste unitário da classe Game – verificação de turno após acerto</w:t>
@@ -9190,21 +9587,12 @@
         <w:br/>
       </w:r>
       <w:r>
-        <w:rPr>
-          <w:b w:val="0"/>
-        </w:rPr>
         <w:t xml:space="preserve">Este teste </w:t>
       </w:r>
       <w:r>
-        <w:rPr>
-          <w:b w:val="0"/>
-        </w:rPr>
         <w:t>verifica</w:t>
       </w:r>
       <w:r>
-        <w:rPr>
-          <w:b w:val="0"/>
-        </w:rPr>
         <w:t xml:space="preserve"> que ao tentar encotnrar um jogador com um nickname que não se encontra no sistema, é lançado um NoDataException. Isto assegura que o projeto trata de forma correta a gestão dos nicknames.</w:t>
       </w:r>
       <w:r>
@@ -9219,7 +9607,7 @@
       <w:r>
         <w:pict w14:anchorId="4F2278E9">
           <v:shape id="_x0000_i1052" type="#_x0000_t75" style="width:351.6pt;height:165.6pt;visibility:visible">
-            <v:imagedata r:id="rId35" o:title=""/>
+            <v:imagedata r:id="rId37" o:title=""/>
           </v:shape>
         </w:pict>
       </w:r>
@@ -9232,7 +9620,7 @@
         <w:t xml:space="preserve">         Fig. </w:t>
       </w:r>
       <w:r>
-        <w:t>12</w:t>
+        <w:t>28</w:t>
       </w:r>
       <w:r>
         <w:t>. Teste unitário da classe PlayerContainer – Acessar jogador que não existe</w:t>
@@ -9249,10 +9637,29 @@
       </w:pPr>
       <w:r>
         <w:lastRenderedPageBreak/>
-        <w:t>11</w:t>
-      </w:r>
-      <w:r>
-        <w:t>.1 Tabela de taxa de sucesso dos testes</w:t>
+        <w:t>1</w:t>
+      </w:r>
+      <w:r>
+        <w:t>3</w:t>
+      </w:r>
+      <w:r>
+        <w:t xml:space="preserve">.1 </w:t>
+      </w:r>
+      <w:proofErr w:type="spellStart"/>
+      <w:r>
+        <w:t>Tabela</w:t>
+      </w:r>
+      <w:proofErr w:type="spellEnd"/>
+      <w:r>
+        <w:t xml:space="preserve"> de taxa de </w:t>
+      </w:r>
+      <w:proofErr w:type="spellStart"/>
+      <w:r>
+        <w:t>sucesso</w:t>
+      </w:r>
+      <w:proofErr w:type="spellEnd"/>
+      <w:r>
+        <w:t xml:space="preserve"> dos testes</w:t>
       </w:r>
       <w:r>
         <w:br/>
@@ -9264,7 +9671,217 @@
         <w:rPr>
           <w:b w:val="0"/>
         </w:rPr>
-        <w:t>A tabela seguinte apresenta os resultados obtidos na execução dos 35 testes unitários, indicando a taxa de sucesso de cada teste sobre as classes do projeto.</w:t>
+        <w:t xml:space="preserve">A </w:t>
+      </w:r>
+      <w:proofErr w:type="spellStart"/>
+      <w:r>
+        <w:rPr>
+          <w:b w:val="0"/>
+        </w:rPr>
+        <w:t>tabela</w:t>
+      </w:r>
+      <w:proofErr w:type="spellEnd"/>
+      <w:r>
+        <w:rPr>
+          <w:b w:val="0"/>
+        </w:rPr>
+        <w:t xml:space="preserve"> </w:t>
+      </w:r>
+      <w:proofErr w:type="spellStart"/>
+      <w:r>
+        <w:rPr>
+          <w:b w:val="0"/>
+        </w:rPr>
+        <w:t>seguinte</w:t>
+      </w:r>
+      <w:proofErr w:type="spellEnd"/>
+      <w:r>
+        <w:rPr>
+          <w:b w:val="0"/>
+        </w:rPr>
+        <w:t xml:space="preserve"> </w:t>
+      </w:r>
+      <w:proofErr w:type="spellStart"/>
+      <w:r>
+        <w:rPr>
+          <w:b w:val="0"/>
+        </w:rPr>
+        <w:t>apresenta</w:t>
+      </w:r>
+      <w:proofErr w:type="spellEnd"/>
+      <w:r>
+        <w:rPr>
+          <w:b w:val="0"/>
+        </w:rPr>
+        <w:t xml:space="preserve"> </w:t>
+      </w:r>
+      <w:proofErr w:type="spellStart"/>
+      <w:r>
+        <w:rPr>
+          <w:b w:val="0"/>
+        </w:rPr>
+        <w:t>os</w:t>
+      </w:r>
+      <w:proofErr w:type="spellEnd"/>
+      <w:r>
+        <w:rPr>
+          <w:b w:val="0"/>
+        </w:rPr>
+        <w:t xml:space="preserve"> </w:t>
+      </w:r>
+      <w:proofErr w:type="spellStart"/>
+      <w:r>
+        <w:rPr>
+          <w:b w:val="0"/>
+        </w:rPr>
+        <w:t>resultados</w:t>
+      </w:r>
+      <w:proofErr w:type="spellEnd"/>
+      <w:r>
+        <w:rPr>
+          <w:b w:val="0"/>
+        </w:rPr>
+        <w:t xml:space="preserve"> </w:t>
+      </w:r>
+      <w:proofErr w:type="spellStart"/>
+      <w:r>
+        <w:rPr>
+          <w:b w:val="0"/>
+        </w:rPr>
+        <w:t>obtidos</w:t>
+      </w:r>
+      <w:proofErr w:type="spellEnd"/>
+      <w:r>
+        <w:rPr>
+          <w:b w:val="0"/>
+        </w:rPr>
+        <w:t xml:space="preserve"> </w:t>
+      </w:r>
+      <w:proofErr w:type="spellStart"/>
+      <w:r>
+        <w:rPr>
+          <w:b w:val="0"/>
+        </w:rPr>
+        <w:t>na</w:t>
+      </w:r>
+      <w:proofErr w:type="spellEnd"/>
+      <w:r>
+        <w:rPr>
+          <w:b w:val="0"/>
+        </w:rPr>
+        <w:t xml:space="preserve"> </w:t>
+      </w:r>
+      <w:proofErr w:type="spellStart"/>
+      <w:r>
+        <w:rPr>
+          <w:b w:val="0"/>
+        </w:rPr>
+        <w:t>execução</w:t>
+      </w:r>
+      <w:proofErr w:type="spellEnd"/>
+      <w:r>
+        <w:rPr>
+          <w:b w:val="0"/>
+        </w:rPr>
+        <w:t xml:space="preserve"> dos 35 testes </w:t>
+      </w:r>
+      <w:proofErr w:type="spellStart"/>
+      <w:r>
+        <w:rPr>
+          <w:b w:val="0"/>
+        </w:rPr>
+        <w:t>unitários</w:t>
+      </w:r>
+      <w:proofErr w:type="spellEnd"/>
+      <w:r>
+        <w:rPr>
+          <w:b w:val="0"/>
+        </w:rPr>
+        <w:t xml:space="preserve">, </w:t>
+      </w:r>
+      <w:proofErr w:type="spellStart"/>
+      <w:r>
+        <w:rPr>
+          <w:b w:val="0"/>
+        </w:rPr>
+        <w:t>indicando</w:t>
+      </w:r>
+      <w:proofErr w:type="spellEnd"/>
+      <w:r>
+        <w:rPr>
+          <w:b w:val="0"/>
+        </w:rPr>
+        <w:t xml:space="preserve"> a </w:t>
+      </w:r>
+      <w:proofErr w:type="gramStart"/>
+      <w:r>
+        <w:rPr>
+          <w:b w:val="0"/>
+        </w:rPr>
+        <w:t>taxa</w:t>
+      </w:r>
+      <w:proofErr w:type="gramEnd"/>
+      <w:r>
+        <w:rPr>
+          <w:b w:val="0"/>
+        </w:rPr>
+        <w:t xml:space="preserve"> de </w:t>
+      </w:r>
+      <w:proofErr w:type="spellStart"/>
+      <w:r>
+        <w:rPr>
+          <w:b w:val="0"/>
+        </w:rPr>
+        <w:t>sucesso</w:t>
+      </w:r>
+      <w:proofErr w:type="spellEnd"/>
+      <w:r>
+        <w:rPr>
+          <w:b w:val="0"/>
+        </w:rPr>
+        <w:t xml:space="preserve"> de </w:t>
+      </w:r>
+      <w:proofErr w:type="spellStart"/>
+      <w:r>
+        <w:rPr>
+          <w:b w:val="0"/>
+        </w:rPr>
+        <w:t>cada</w:t>
+      </w:r>
+      <w:proofErr w:type="spellEnd"/>
+      <w:r>
+        <w:rPr>
+          <w:b w:val="0"/>
+        </w:rPr>
+        <w:t xml:space="preserve"> teste </w:t>
+      </w:r>
+      <w:proofErr w:type="spellStart"/>
+      <w:r>
+        <w:rPr>
+          <w:b w:val="0"/>
+        </w:rPr>
+        <w:t>sobre</w:t>
+      </w:r>
+      <w:proofErr w:type="spellEnd"/>
+      <w:r>
+        <w:rPr>
+          <w:b w:val="0"/>
+        </w:rPr>
+        <w:t xml:space="preserve"> as classes do </w:t>
+      </w:r>
+      <w:proofErr w:type="spellStart"/>
+      <w:r>
+        <w:rPr>
+          <w:b w:val="0"/>
+        </w:rPr>
+        <w:t>projeto</w:t>
+      </w:r>
+      <w:proofErr w:type="spellEnd"/>
+      <w:r>
+        <w:rPr>
+          <w:b w:val="0"/>
+        </w:rPr>
+        <w:t>.</w:t>
       </w:r>
     </w:p>
     <w:p>
@@ -12884,14 +13501,16 @@
         <w:t>1</w:t>
       </w:r>
       <w:r>
-        <w:t>2</w:t>
+        <w:t>4</w:t>
       </w:r>
       <w:r>
         <w:t xml:space="preserve">   </w:t>
       </w:r>
+      <w:proofErr w:type="spellStart"/>
       <w:r>
         <w:t>Conclusão</w:t>
       </w:r>
+      <w:proofErr w:type="spellEnd"/>
     </w:p>
     <w:p>
       <w:pPr>
@@ -13031,12 +13650,18 @@
         <w:rPr>
           <w:lang w:val="pt-BR" w:eastAsia="pt-PT"/>
         </w:rPr>
-        <w:t>12</w:t>
+        <w:t>1</w:t>
       </w:r>
       <w:r>
         <w:rPr>
           <w:lang w:val="pt-BR" w:eastAsia="pt-PT"/>
         </w:rPr>
+        <w:t>4</w:t>
+      </w:r>
+      <w:r>
+        <w:rPr>
+          <w:lang w:val="pt-BR" w:eastAsia="pt-PT"/>
+        </w:rPr>
         <w:t>.1  Programação Orientada a Objetos</w:t>
       </w:r>
     </w:p>
@@ -13195,6 +13820,22 @@
         </w:rPr>
         <w:t>Em resumo, os princípios foram bem aplicados ao longo de toda a implementação.</w:t>
       </w:r>
+    </w:p>
+    <w:p>
+      <w:pPr>
+        <w:ind w:firstLine="0"/>
+        <w:rPr>
+          <w:lang w:val="pt-BR" w:eastAsia="pt-PT"/>
+        </w:rPr>
+      </w:pPr>
+    </w:p>
+    <w:p>
+      <w:pPr>
+        <w:ind w:firstLine="0"/>
+        <w:rPr>
+          <w:lang w:val="pt-BR" w:eastAsia="pt-PT"/>
+        </w:rPr>
+      </w:pPr>
     </w:p>
     <w:sectPr>
       <w:type w:val="continuous"/>
@@ -13209,7 +13850,7 @@
 </file>
 
 <file path=word/endnotes.xml><?xml version="1.0" encoding="utf-8"?>
-<w:endnotes xmlns:wpc="http://schemas.microsoft.com/office/word/2010/wordprocessingCanvas" xmlns:mc="http://schemas.openxmlformats.org/markup-compatibility/2006" xmlns:o="urn:schemas-microsoft-com:office:office" xmlns:r="http://schemas.openxmlformats.org/officeDocument/2006/relationships" xmlns:m="http://schemas.openxmlformats.org/officeDocument/2006/math" xmlns:v="urn:schemas-microsoft-com:vml" xmlns:wp14="http://schemas.microsoft.com/office/word/2010/wordprocessingDrawing" xmlns:wp="http://schemas.openxmlformats.org/drawingml/2006/wordprocessingDrawing" xmlns:w10="urn:schemas-microsoft-com:office:word" xmlns:w="http://schemas.openxmlformats.org/wordprocessingml/2006/main" xmlns:w14="http://schemas.microsoft.com/office/word/2010/wordml" xmlns:w15="http://schemas.microsoft.com/office/word/2012/wordml" xmlns:wpg="http://schemas.microsoft.com/office/word/2010/wordprocessingGroup" xmlns:wpi="http://schemas.microsoft.com/office/word/2010/wordprocessingInk" xmlns:wne="http://schemas.microsoft.com/office/word/2006/wordml" xmlns:wps="http://schemas.microsoft.com/office/word/2010/wordprocessingShape" mc:Ignorable="w14 w15 wp14">
+<w:endnotes xmlns:wpc="http://schemas.microsoft.com/office/word/2010/wordprocessingCanvas" xmlns:cx="http://schemas.microsoft.com/office/drawing/2014/chartex" xmlns:cx1="http://schemas.microsoft.com/office/drawing/2015/9/8/chartex" xmlns:cx2="http://schemas.microsoft.com/office/drawing/2015/10/21/chartex" xmlns:cx3="http://schemas.microsoft.com/office/drawing/2016/5/9/chartex" xmlns:cx4="http://schemas.microsoft.com/office/drawing/2016/5/10/chartex" xmlns:cx5="http://schemas.microsoft.com/office/drawing/2016/5/11/chartex" xmlns:cx6="http://schemas.microsoft.com/office/drawing/2016/5/12/chartex" xmlns:cx7="http://schemas.microsoft.com/office/drawing/2016/5/13/chartex" xmlns:cx8="http://schemas.microsoft.com/office/drawing/2016/5/14/chartex" xmlns:mc="http://schemas.openxmlformats.org/markup-compatibility/2006" xmlns:aink="http://schemas.microsoft.com/office/drawing/2016/ink" xmlns:am3d="http://schemas.microsoft.com/office/drawing/2017/model3d" xmlns:o="urn:schemas-microsoft-com:office:office" xmlns:oel="http://schemas.microsoft.com/office/2019/extlst" xmlns:r="http://schemas.openxmlformats.org/officeDocument/2006/relationships" xmlns:m="http://schemas.openxmlformats.org/officeDocument/2006/math" xmlns:v="urn:schemas-microsoft-com:vml" xmlns:wp14="http://schemas.microsoft.com/office/word/2010/wordprocessingDrawing" xmlns:wp="http://schemas.openxmlformats.org/drawingml/2006/wordprocessingDrawing" xmlns:w10="urn:schemas-microsoft-com:office:word" xmlns:w="http://schemas.openxmlformats.org/wordprocessingml/2006/main" xmlns:w14="http://schemas.microsoft.com/office/word/2010/wordml" xmlns:w15="http://schemas.microsoft.com/office/word/2012/wordml" xmlns:w16cex="http://schemas.microsoft.com/office/word/2018/wordml/cex" xmlns:w16cid="http://schemas.microsoft.com/office/word/2016/wordml/cid" xmlns:w16="http://schemas.microsoft.com/office/word/2018/wordml" xmlns:w16du="http://schemas.microsoft.com/office/word/2023/wordml/word16du" xmlns:w16sdtdh="http://schemas.microsoft.com/office/word/2020/wordml/sdtdatahash" xmlns:w16sdtfl="http://schemas.microsoft.com/office/word/2024/wordml/sdtformatlock" xmlns:w16se="http://schemas.microsoft.com/office/word/2015/wordml/symex" xmlns:wpg="http://schemas.microsoft.com/office/word/2010/wordprocessingGroup" xmlns:wpi="http://schemas.microsoft.com/office/word/2010/wordprocessingInk" xmlns:wne="http://schemas.microsoft.com/office/word/2006/wordml" xmlns:wps="http://schemas.microsoft.com/office/word/2010/wordprocessingShape" mc:Ignorable="w14 w15 w16se w16cid w16 w16cex w16sdtdh w16sdtfl w16du wp14">
   <w:endnote w:type="separator" w:id="-1">
     <w:p>
       <w:r>
@@ -13228,7 +13869,7 @@
 </file>
 
 <file path=word/footnotes.xml><?xml version="1.0" encoding="utf-8"?>
-<w:footnotes xmlns:wpc="http://schemas.microsoft.com/office/word/2010/wordprocessingCanvas" xmlns:mc="http://schemas.openxmlformats.org/markup-compatibility/2006" xmlns:o="urn:schemas-microsoft-com:office:office" xmlns:r="http://schemas.openxmlformats.org/officeDocument/2006/relationships" xmlns:m="http://schemas.openxmlformats.org/officeDocument/2006/math" xmlns:v="urn:schemas-microsoft-com:vml" xmlns:wp14="http://schemas.microsoft.com/office/word/2010/wordprocessingDrawing" xmlns:wp="http://schemas.openxmlformats.org/drawingml/2006/wordprocessingDrawing" xmlns:w10="urn:schemas-microsoft-com:office:word" xmlns:w="http://schemas.openxmlformats.org/wordprocessingml/2006/main" xmlns:w14="http://schemas.microsoft.com/office/word/2010/wordml" xmlns:w15="http://schemas.microsoft.com/office/word/2012/wordml" xmlns:wpg="http://schemas.microsoft.com/office/word/2010/wordprocessingGroup" xmlns:wpi="http://schemas.microsoft.com/office/word/2010/wordprocessingInk" xmlns:wne="http://schemas.microsoft.com/office/word/2006/wordml" xmlns:wps="http://schemas.microsoft.com/office/word/2010/wordprocessingShape" mc:Ignorable="w14 w15 wp14">
+<w:footnotes xmlns:wpc="http://schemas.microsoft.com/office/word/2010/wordprocessingCanvas" xmlns:cx="http://schemas.microsoft.com/office/drawing/2014/chartex" xmlns:cx1="http://schemas.microsoft.com/office/drawing/2015/9/8/chartex" xmlns:cx2="http://schemas.microsoft.com/office/drawing/2015/10/21/chartex" xmlns:cx3="http://schemas.microsoft.com/office/drawing/2016/5/9/chartex" xmlns:cx4="http://schemas.microsoft.com/office/drawing/2016/5/10/chartex" xmlns:cx5="http://schemas.microsoft.com/office/drawing/2016/5/11/chartex" xmlns:cx6="http://schemas.microsoft.com/office/drawing/2016/5/12/chartex" xmlns:cx7="http://schemas.microsoft.com/office/drawing/2016/5/13/chartex" xmlns:cx8="http://schemas.microsoft.com/office/drawing/2016/5/14/chartex" xmlns:mc="http://schemas.openxmlformats.org/markup-compatibility/2006" xmlns:aink="http://schemas.microsoft.com/office/drawing/2016/ink" xmlns:am3d="http://schemas.microsoft.com/office/drawing/2017/model3d" xmlns:o="urn:schemas-microsoft-com:office:office" xmlns:oel="http://schemas.microsoft.com/office/2019/extlst" xmlns:r="http://schemas.openxmlformats.org/officeDocument/2006/relationships" xmlns:m="http://schemas.openxmlformats.org/officeDocument/2006/math" xmlns:v="urn:schemas-microsoft-com:vml" xmlns:wp14="http://schemas.microsoft.com/office/word/2010/wordprocessingDrawing" xmlns:wp="http://schemas.openxmlformats.org/drawingml/2006/wordprocessingDrawing" xmlns:w10="urn:schemas-microsoft-com:office:word" xmlns:w="http://schemas.openxmlformats.org/wordprocessingml/2006/main" xmlns:w14="http://schemas.microsoft.com/office/word/2010/wordml" xmlns:w15="http://schemas.microsoft.com/office/word/2012/wordml" xmlns:w16cex="http://schemas.microsoft.com/office/word/2018/wordml/cex" xmlns:w16cid="http://schemas.microsoft.com/office/word/2016/wordml/cid" xmlns:w16="http://schemas.microsoft.com/office/word/2018/wordml" xmlns:w16du="http://schemas.microsoft.com/office/word/2023/wordml/word16du" xmlns:w16sdtdh="http://schemas.microsoft.com/office/word/2020/wordml/sdtdatahash" xmlns:w16sdtfl="http://schemas.microsoft.com/office/word/2024/wordml/sdtformatlock" xmlns:w16se="http://schemas.microsoft.com/office/word/2015/wordml/symex" xmlns:wpg="http://schemas.microsoft.com/office/word/2010/wordprocessingGroup" xmlns:wpi="http://schemas.microsoft.com/office/word/2010/wordprocessingInk" xmlns:wne="http://schemas.microsoft.com/office/word/2006/wordml" xmlns:wps="http://schemas.microsoft.com/office/word/2010/wordprocessingShape" mc:Ignorable="w14 w15 w16se w16cid w16 w16cex w16sdtdh w16sdtfl w16du wp14">
   <w:footnote w:type="separator" w:id="-1">
     <w:p>
       <w:r>
@@ -13247,7 +13888,7 @@
 </file>
 
 <file path=word/numbering.xml><?xml version="1.0" encoding="utf-8"?>
-<w:numbering xmlns:wpc="http://schemas.microsoft.com/office/word/2010/wordprocessingCanvas" xmlns:mc="http://schemas.openxmlformats.org/markup-compatibility/2006" xmlns:o="urn:schemas-microsoft-com:office:office" xmlns:r="http://schemas.openxmlformats.org/officeDocument/2006/relationships" xmlns:m="http://schemas.openxmlformats.org/officeDocument/2006/math" xmlns:v="urn:schemas-microsoft-com:vml" xmlns:wp14="http://schemas.microsoft.com/office/word/2010/wordprocessingDrawing" xmlns:wp="http://schemas.openxmlformats.org/drawingml/2006/wordprocessingDrawing" xmlns:w10="urn:schemas-microsoft-com:office:word" xmlns:w="http://schemas.openxmlformats.org/wordprocessingml/2006/main" xmlns:w14="http://schemas.microsoft.com/office/word/2010/wordml" xmlns:w15="http://schemas.microsoft.com/office/word/2012/wordml" xmlns:wpg="http://schemas.microsoft.com/office/word/2010/wordprocessingGroup" xmlns:wpi="http://schemas.microsoft.com/office/word/2010/wordprocessingInk" xmlns:wne="http://schemas.microsoft.com/office/word/2006/wordml" xmlns:wps="http://schemas.microsoft.com/office/word/2010/wordprocessingShape" mc:Ignorable="w14 w15 wp14">
+<w:numbering xmlns:wpc="http://schemas.microsoft.com/office/word/2010/wordprocessingCanvas" xmlns:cx="http://schemas.microsoft.com/office/drawing/2014/chartex" xmlns:cx1="http://schemas.microsoft.com/office/drawing/2015/9/8/chartex" xmlns:cx2="http://schemas.microsoft.com/office/drawing/2015/10/21/chartex" xmlns:cx3="http://schemas.microsoft.com/office/drawing/2016/5/9/chartex" xmlns:cx4="http://schemas.microsoft.com/office/drawing/2016/5/10/chartex" xmlns:cx5="http://schemas.microsoft.com/office/drawing/2016/5/11/chartex" xmlns:cx6="http://schemas.microsoft.com/office/drawing/2016/5/12/chartex" xmlns:cx7="http://schemas.microsoft.com/office/drawing/2016/5/13/chartex" xmlns:cx8="http://schemas.microsoft.com/office/drawing/2016/5/14/chartex" xmlns:mc="http://schemas.openxmlformats.org/markup-compatibility/2006" xmlns:aink="http://schemas.microsoft.com/office/drawing/2016/ink" xmlns:am3d="http://schemas.microsoft.com/office/drawing/2017/model3d" xmlns:o="urn:schemas-microsoft-com:office:office" xmlns:oel="http://schemas.microsoft.com/office/2019/extlst" xmlns:r="http://schemas.openxmlformats.org/officeDocument/2006/relationships" xmlns:m="http://schemas.openxmlformats.org/officeDocument/2006/math" xmlns:v="urn:schemas-microsoft-com:vml" xmlns:wp14="http://schemas.microsoft.com/office/word/2010/wordprocessingDrawing" xmlns:wp="http://schemas.openxmlformats.org/drawingml/2006/wordprocessingDrawing" xmlns:w10="urn:schemas-microsoft-com:office:word" xmlns:w="http://schemas.openxmlformats.org/wordprocessingml/2006/main" xmlns:w14="http://schemas.microsoft.com/office/word/2010/wordml" xmlns:w15="http://schemas.microsoft.com/office/word/2012/wordml" xmlns:w16cex="http://schemas.microsoft.com/office/word/2018/wordml/cex" xmlns:w16cid="http://schemas.microsoft.com/office/word/2016/wordml/cid" xmlns:w16="http://schemas.microsoft.com/office/word/2018/wordml" xmlns:w16du="http://schemas.microsoft.com/office/word/2023/wordml/word16du" xmlns:w16sdtdh="http://schemas.microsoft.com/office/word/2020/wordml/sdtdatahash" xmlns:w16sdtfl="http://schemas.microsoft.com/office/word/2024/wordml/sdtformatlock" xmlns:w16se="http://schemas.microsoft.com/office/word/2015/wordml/symex" xmlns:wpg="http://schemas.microsoft.com/office/word/2010/wordprocessingGroup" xmlns:wpi="http://schemas.microsoft.com/office/word/2010/wordprocessingInk" xmlns:wne="http://schemas.microsoft.com/office/word/2006/wordml" xmlns:wps="http://schemas.microsoft.com/office/word/2010/wordprocessingShape" mc:Ignorable="w14 w15 w16se w16cid w16 w16cex w16sdtdh w16sdtfl w16du wp14">
   <w:abstractNum w:abstractNumId="0" w15:restartNumberingAfterBreak="0">
     <w:nsid w:val="FFFFFFFB"/>
     <w:multiLevelType w:val="multilevel"/>
@@ -14609,49 +15250,49 @@
       </w:pPr>
     </w:lvl>
   </w:abstractNum>
-  <w:num w:numId="1">
+  <w:num w:numId="1" w16cid:durableId="407849311">
     <w:abstractNumId w:val="0"/>
   </w:num>
-  <w:num w:numId="2">
+  <w:num w:numId="2" w16cid:durableId="1306547663">
     <w:abstractNumId w:val="1"/>
   </w:num>
-  <w:num w:numId="3">
+  <w:num w:numId="3" w16cid:durableId="343022338">
     <w:abstractNumId w:val="11"/>
   </w:num>
-  <w:num w:numId="4">
+  <w:num w:numId="4" w16cid:durableId="545414508">
     <w:abstractNumId w:val="7"/>
   </w:num>
-  <w:num w:numId="5">
+  <w:num w:numId="5" w16cid:durableId="276452191">
     <w:abstractNumId w:val="8"/>
   </w:num>
-  <w:num w:numId="6">
+  <w:num w:numId="6" w16cid:durableId="2028285083">
     <w:abstractNumId w:val="14"/>
   </w:num>
-  <w:num w:numId="7">
+  <w:num w:numId="7" w16cid:durableId="1058087304">
     <w:abstractNumId w:val="3"/>
   </w:num>
-  <w:num w:numId="8">
+  <w:num w:numId="8" w16cid:durableId="1405568508">
     <w:abstractNumId w:val="10"/>
   </w:num>
-  <w:num w:numId="9">
+  <w:num w:numId="9" w16cid:durableId="1020165573">
     <w:abstractNumId w:val="12"/>
   </w:num>
-  <w:num w:numId="10">
+  <w:num w:numId="10" w16cid:durableId="1718119882">
     <w:abstractNumId w:val="4"/>
   </w:num>
-  <w:num w:numId="11">
+  <w:num w:numId="11" w16cid:durableId="624192524">
     <w:abstractNumId w:val="6"/>
   </w:num>
-  <w:num w:numId="12">
+  <w:num w:numId="12" w16cid:durableId="1513186213">
     <w:abstractNumId w:val="9"/>
   </w:num>
-  <w:num w:numId="13">
+  <w:num w:numId="13" w16cid:durableId="2040160065">
     <w:abstractNumId w:val="13"/>
   </w:num>
-  <w:num w:numId="14">
+  <w:num w:numId="14" w16cid:durableId="1123496401">
     <w:abstractNumId w:val="2"/>
   </w:num>
-  <w:num w:numId="15">
+  <w:num w:numId="15" w16cid:durableId="1829856042">
     <w:abstractNumId w:val="5"/>
   </w:num>
   <w:numIdMacAtCleanup w:val="15"/>
@@ -14659,7 +15300,7 @@
 </file>
 
 <file path=word/styles.xml><?xml version="1.0" encoding="utf-8"?>
-<w:styles xmlns:mc="http://schemas.openxmlformats.org/markup-compatibility/2006" xmlns:r="http://schemas.openxmlformats.org/officeDocument/2006/relationships" xmlns:w="http://schemas.openxmlformats.org/wordprocessingml/2006/main" xmlns:w14="http://schemas.microsoft.com/office/word/2010/wordml" xmlns:w15="http://schemas.microsoft.com/office/word/2012/wordml" mc:Ignorable="w14 w15">
+<w:styles xmlns:mc="http://schemas.openxmlformats.org/markup-compatibility/2006" xmlns:r="http://schemas.openxmlformats.org/officeDocument/2006/relationships" xmlns:w="http://schemas.openxmlformats.org/wordprocessingml/2006/main" xmlns:w14="http://schemas.microsoft.com/office/word/2010/wordml" xmlns:w15="http://schemas.microsoft.com/office/word/2012/wordml" xmlns:w16cex="http://schemas.microsoft.com/office/word/2018/wordml/cex" xmlns:w16cid="http://schemas.microsoft.com/office/word/2016/wordml/cid" xmlns:w16="http://schemas.microsoft.com/office/word/2018/wordml" xmlns:w16du="http://schemas.microsoft.com/office/word/2023/wordml/word16du" xmlns:w16sdtdh="http://schemas.microsoft.com/office/word/2020/wordml/sdtdatahash" xmlns:w16sdtfl="http://schemas.microsoft.com/office/word/2024/wordml/sdtformatlock" xmlns:w16se="http://schemas.microsoft.com/office/word/2015/wordml/symex" mc:Ignorable="w14 w15 w16se w16cid w16 w16cex w16sdtdh w16sdtfl w16du">
   <w:docDefaults>
     <w:rPrDefault>
       <w:rPr>
@@ -14669,7 +15310,7 @@
     </w:rPrDefault>
     <w:pPrDefault/>
   </w:docDefaults>
-  <w:latentStyles w:defLockedState="0" w:defUIPriority="0" w:defSemiHidden="0" w:defUnhideWhenUsed="0" w:defQFormat="0" w:count="371">
+  <w:latentStyles w:defLockedState="0" w:defUIPriority="0" w:defSemiHidden="0" w:defUnhideWhenUsed="0" w:defQFormat="0" w:count="376">
     <w:lsdException w:name="Normal" w:qFormat="1"/>
     <w:lsdException w:name="heading 1" w:uiPriority="9" w:qFormat="1"/>
     <w:lsdException w:name="heading 2" w:qFormat="1"/>
@@ -14946,6 +15587,11 @@
     <w:lsdException w:name="List Table 5 Dark Accent 6" w:uiPriority="50"/>
     <w:lsdException w:name="List Table 6 Colorful Accent 6" w:uiPriority="51"/>
     <w:lsdException w:name="List Table 7 Colorful Accent 6" w:uiPriority="52"/>
+    <w:lsdException w:name="Mention" w:semiHidden="1" w:uiPriority="99" w:unhideWhenUsed="1"/>
+    <w:lsdException w:name="Smart Hyperlink" w:semiHidden="1" w:uiPriority="99" w:unhideWhenUsed="1"/>
+    <w:lsdException w:name="Hashtag" w:semiHidden="1" w:uiPriority="99" w:unhideWhenUsed="1"/>
+    <w:lsdException w:name="Unresolved Mention" w:semiHidden="1" w:uiPriority="99" w:unhideWhenUsed="1"/>
+    <w:lsdException w:name="Smart Link" w:semiHidden="1" w:uiPriority="99" w:unhideWhenUsed="1"/>
   </w:latentStyles>
   <w:style w:type="paragraph" w:default="1" w:styleId="Normal">
     <w:name w:val="Normal"/>
@@ -14964,7 +15610,7 @@
     <w:name w:val="heading 1"/>
     <w:basedOn w:val="Normal"/>
     <w:next w:val="Normal"/>
-    <w:link w:val="Ttulo1Char"/>
+    <w:link w:val="Ttulo1Carter"/>
     <w:uiPriority w:val="9"/>
     <w:qFormat/>
     <w:rsid w:val="006B229F"/>
@@ -15151,7 +15797,7 @@
       <w:sz w:val="18"/>
     </w:rPr>
   </w:style>
-  <w:style w:type="character" w:default="1" w:styleId="Fontepargpadro">
+  <w:style w:type="character" w:default="1" w:styleId="Tipodeletrapredefinidodopargrafo">
     <w:name w:val="Default Paragraph Font"/>
     <w:uiPriority w:val="1"/>
     <w:unhideWhenUsed/>
@@ -15201,7 +15847,7 @@
   </w:style>
   <w:style w:type="character" w:styleId="Nmerodepgina">
     <w:name w:val="page number"/>
-    <w:basedOn w:val="Fontepargpadro"/>
+    <w:basedOn w:val="Tipodeletrapredefinidodopargrafo"/>
     <w:rsid w:val="006B229F"/>
   </w:style>
   <w:style w:type="paragraph" w:customStyle="1" w:styleId="Ttulo10">
@@ -15513,14 +16159,13 @@
     <w:basedOn w:val="Normal"/>
     <w:next w:val="Normal"/>
     <w:autoRedefine/>
-    <w:rsid w:val="00FF5025"/>
+    <w:rsid w:val="00310FF2"/>
     <w:pPr>
       <w:spacing w:before="120" w:after="120"/>
       <w:ind w:firstLine="0"/>
       <w:jc w:val="center"/>
     </w:pPr>
     <w:rPr>
-      <w:b/>
       <w:noProof/>
       <w:sz w:val="18"/>
       <w:szCs w:val="18"/>
@@ -15594,7 +16239,7 @@
       <w:sz w:val="18"/>
     </w:rPr>
   </w:style>
-  <w:style w:type="character" w:styleId="Hyperlink">
+  <w:style w:type="character" w:styleId="Hiperligao">
     <w:name w:val="Hyperlink"/>
     <w:rsid w:val="009B1D59"/>
     <w:rPr>
@@ -15641,7 +16286,7 @@
     <w:semiHidden/>
     <w:rsid w:val="00C16F71"/>
   </w:style>
-  <w:style w:type="paragraph" w:styleId="Assuntodocomentrio">
+  <w:style w:type="paragraph" w:styleId="Assuntodecomentrio">
     <w:name w:val="annotation subject"/>
     <w:basedOn w:val="Textodecomentrio"/>
     <w:next w:val="Textodecomentrio"/>
@@ -15663,7 +16308,7 @@
       <w:szCs w:val="16"/>
     </w:rPr>
   </w:style>
-  <w:style w:type="character" w:styleId="HiperlinkVisitado">
+  <w:style w:type="character" w:styleId="Hiperligaovisitada">
     <w:name w:val="FollowedHyperlink"/>
     <w:rsid w:val="00F36F61"/>
     <w:rPr>
@@ -15671,7 +16316,7 @@
       <w:u w:val="single"/>
     </w:rPr>
   </w:style>
-  <w:style w:type="table" w:styleId="Tabelacomgrade">
+  <w:style w:type="table" w:styleId="TabelacomGrelha">
     <w:name w:val="Table Grid"/>
     <w:basedOn w:val="Tabelanormal"/>
     <w:rsid w:val="009625FF"/>
@@ -15715,8 +16360,8 @@
       <w:szCs w:val="20"/>
     </w:rPr>
   </w:style>
-  <w:style w:type="character" w:customStyle="1" w:styleId="Ttulo1Char">
-    <w:name w:val="Título 1 Char"/>
+  <w:style w:type="character" w:customStyle="1" w:styleId="Ttulo1Carter">
+    <w:name w:val="Título 1 Caráter"/>
     <w:link w:val="Ttulo1"/>
     <w:uiPriority w:val="9"/>
     <w:rsid w:val="00B21233"/>
@@ -15735,10 +16380,10 @@
     <w:unhideWhenUsed/>
     <w:rsid w:val="00B21233"/>
   </w:style>
-  <w:style w:type="paragraph" w:styleId="Pr-formataoHTML">
+  <w:style w:type="paragraph" w:styleId="HTMLpr-formatado">
     <w:name w:val="HTML Preformatted"/>
     <w:basedOn w:val="Normal"/>
-    <w:link w:val="Pr-formataoHTMLChar"/>
+    <w:link w:val="HTMLpr-formatadoCarter"/>
     <w:uiPriority w:val="99"/>
     <w:unhideWhenUsed/>
     <w:rsid w:val="00B564E0"/>
@@ -15769,9 +16414,9 @@
       <w:lang w:val="pt-PT" w:eastAsia="pt-PT"/>
     </w:rPr>
   </w:style>
-  <w:style w:type="character" w:customStyle="1" w:styleId="Pr-formataoHTMLChar">
-    <w:name w:val="Pré-formatação HTML Char"/>
-    <w:link w:val="Pr-formataoHTML"/>
+  <w:style w:type="character" w:customStyle="1" w:styleId="HTMLpr-formatadoCarter">
+    <w:name w:val="HTML pré-formatado Caráter"/>
+    <w:link w:val="HTMLpr-formatado"/>
     <w:uiPriority w:val="99"/>
     <w:rsid w:val="00B564E0"/>
     <w:rPr>

</xml_diff>

<commit_message>
Relatório: Adição de uma sub-secção para discutir o cumprimento dos requisitos funcionais
</commit_message>
<xml_diff>
--- a/Documentation/iteration03/fsoft2026_1DA_4.docx
+++ b/Documentation/iteration03/fsoft2026_1DA_4.docx
@@ -7118,12 +7118,10 @@
         <w:t xml:space="preserve"> </w:t>
       </w:r>
       <w:proofErr w:type="spellStart"/>
-      <w:proofErr w:type="gramStart"/>
       <w:r>
         <w:t>não</w:t>
       </w:r>
       <w:proofErr w:type="spellEnd"/>
-      <w:proofErr w:type="gramEnd"/>
       <w:r>
         <w:t xml:space="preserve"> </w:t>
       </w:r>
@@ -7655,18 +7653,12 @@
         <w:rPr>
           <w:lang w:val="pt-BR" w:eastAsia="pt-PT"/>
         </w:rPr>
-        <w:instrText xml:space="preserve"> REF _Ref232178039 \h </w:instrText>
+        <w:instrText xml:space="preserve"> REF _Ref232178039 \h  \* MERGEFORMAT </w:instrText>
       </w:r>
       <w:r>
         <w:rPr>
           <w:lang w:val="pt-BR" w:eastAsia="pt-PT"/>
         </w:rPr>
-      </w:r>
-      <w:r>
-        <w:rPr>
-          <w:lang w:val="pt-BR" w:eastAsia="pt-PT"/>
-        </w:rPr>
-        <w:instrText xml:space="preserve"> \* MERGEFORMAT </w:instrText>
       </w:r>
       <w:r>
         <w:rPr>
@@ -7745,14 +7737,38 @@
         <w:rPr>
           <w:lang w:val="pt-PT" w:eastAsia="pt-PT"/>
         </w:rPr>
+        <w:fldChar w:fldCharType="begin"/>
+      </w:r>
+      <w:r>
+        <w:rPr>
+          <w:lang w:val="pt-PT" w:eastAsia="pt-PT"/>
+        </w:rPr>
+        <w:instrText xml:space="preserve"> INCLUDEPICTURE  "C:\\Users\\tiago\\Downloads\\Organização do Código.png" \* MERGEFORMATINET </w:instrText>
+      </w:r>
+      <w:r>
+        <w:rPr>
+          <w:lang w:val="pt-PT" w:eastAsia="pt-PT"/>
+        </w:rPr>
+        <w:fldChar w:fldCharType="separate"/>
+      </w:r>
+      <w:r>
+        <w:rPr>
+          <w:lang w:val="pt-PT" w:eastAsia="pt-PT"/>
+        </w:rPr>
         <w:pict w14:anchorId="58FF8682">
-          <v:shape id="_x0000_i1059" type="#_x0000_t75" alt="" style="width:365.4pt;height:291pt">
+          <v:shape id="_x0000_i1030" type="#_x0000_t75" alt="" style="width:365.4pt;height:291pt">
             <v:imagedata r:id="rId13" r:href="rId14"/>
           </v:shape>
         </w:pict>
       </w:r>
       <w:r>
         <w:rPr>
+          <w:lang w:val="pt-PT" w:eastAsia="pt-PT"/>
+        </w:rPr>
+        <w:fldChar w:fldCharType="end"/>
+      </w:r>
+      <w:r>
+        <w:rPr>
           <w:lang w:val="pt-BR" w:eastAsia="pt-PT"/>
         </w:rPr>
         <w:fldChar w:fldCharType="end"/>
@@ -7915,7 +7931,7 @@
           <w:lang w:val="pt-BR"/>
         </w:rPr>
         <w:pict w14:anchorId="703AFE75">
-          <v:shape id="_x0000_i1030" type="#_x0000_t75" style="width:234pt;height:411pt;visibility:visible">
+          <v:shape id="_x0000_i1031" type="#_x0000_t75" style="width:234pt;height:411pt;visibility:visible">
             <v:imagedata r:id="rId15" o:title=""/>
           </v:shape>
         </w:pict>
@@ -8021,7 +8037,7 @@
           <w:lang w:val="pt-BR" w:eastAsia="pt-PT"/>
         </w:rPr>
         <w:pict w14:anchorId="2240C604">
-          <v:shape id="_x0000_i1031" type="#_x0000_t75" style="width:346.2pt;height:139.2pt;visibility:visible">
+          <v:shape id="_x0000_i1032" type="#_x0000_t75" style="width:346.2pt;height:139.2pt;visibility:visible">
             <v:imagedata r:id="rId16" o:title=""/>
           </v:shape>
         </w:pict>
@@ -8156,7 +8172,7 @@
         </w:rPr>
         <w:lastRenderedPageBreak/>
         <w:pict w14:anchorId="29F95681">
-          <v:shape id="_x0000_i1032" type="#_x0000_t75" style="width:334.8pt;height:271.8pt;visibility:visible">
+          <v:shape id="_x0000_i1033" type="#_x0000_t75" style="width:334.8pt;height:271.8pt;visibility:visible">
             <v:imagedata r:id="rId17" o:title=""/>
           </v:shape>
         </w:pict>
@@ -8275,7 +8291,7 @@
           <w:lang w:val="pt-BR" w:eastAsia="pt-PT"/>
         </w:rPr>
         <w:pict w14:anchorId="174F1BEB">
-          <v:shape id="_x0000_i1033" type="#_x0000_t75" style="width:159pt;height:152.4pt;visibility:visible;mso-wrap-style:square">
+          <v:shape id="_x0000_i1034" type="#_x0000_t75" style="width:159pt;height:152.4pt;visibility:visible;mso-wrap-style:square">
             <v:imagedata r:id="rId18" o:title=""/>
           </v:shape>
         </w:pict>
@@ -8378,7 +8394,7 @@
           <w:lang w:val="pt-BR" w:eastAsia="pt-PT"/>
         </w:rPr>
         <w:pict w14:anchorId="01F5E132">
-          <v:shape id="_x0000_i1034" type="#_x0000_t75" style="width:300.6pt;height:118.2pt;visibility:visible;mso-wrap-style:square">
+          <v:shape id="_x0000_i1035" type="#_x0000_t75" style="width:300.6pt;height:118.2pt;visibility:visible;mso-wrap-style:square">
             <v:imagedata r:id="rId19" o:title=""/>
           </v:shape>
         </w:pict>
@@ -8414,7 +8430,7 @@
         </w:rPr>
         <w:lastRenderedPageBreak/>
         <w:pict w14:anchorId="676740B9">
-          <v:shape id="_x0000_i1035" type="#_x0000_t75" style="width:353.4pt;height:106.8pt;visibility:visible;mso-wrap-style:square">
+          <v:shape id="_x0000_i1036" type="#_x0000_t75" style="width:353.4pt;height:106.8pt;visibility:visible;mso-wrap-style:square">
             <v:imagedata r:id="rId20" o:title=""/>
           </v:shape>
         </w:pict>
@@ -8501,7 +8517,7 @@
           <w:lang w:val="pt-BR" w:eastAsia="pt-PT"/>
         </w:rPr>
         <w:pict w14:anchorId="47FBF954">
-          <v:shape id="_x0000_i1036" type="#_x0000_t75" style="width:309pt;height:242.4pt;visibility:visible;mso-wrap-style:square">
+          <v:shape id="_x0000_i1037" type="#_x0000_t75" style="width:309pt;height:242.4pt;visibility:visible;mso-wrap-style:square">
             <v:imagedata r:id="rId21" o:title=""/>
           </v:shape>
         </w:pict>
@@ -8537,7 +8553,7 @@
         </w:rPr>
         <w:lastRenderedPageBreak/>
         <w:pict w14:anchorId="772D06E1">
-          <v:shape id="_x0000_i1037" type="#_x0000_t75" style="width:317.4pt;height:188.4pt;visibility:visible;mso-wrap-style:square">
+          <v:shape id="_x0000_i1038" type="#_x0000_t75" style="width:317.4pt;height:188.4pt;visibility:visible;mso-wrap-style:square">
             <v:imagedata r:id="rId22" o:title=""/>
           </v:shape>
         </w:pict>
@@ -8636,7 +8652,7 @@
           <w:lang w:val="pt-BR" w:eastAsia="pt-PT"/>
         </w:rPr>
         <w:pict w14:anchorId="4C7A1D6E">
-          <v:shape id="_x0000_i1038" type="#_x0000_t75" style="width:320.4pt;height:63pt;visibility:visible;mso-wrap-style:square">
+          <v:shape id="_x0000_i1039" type="#_x0000_t75" style="width:320.4pt;height:63pt;visibility:visible;mso-wrap-style:square">
             <v:imagedata r:id="rId23" o:title=""/>
           </v:shape>
         </w:pict>
@@ -8671,7 +8687,7 @@
         </w:rPr>
         <w:lastRenderedPageBreak/>
         <w:pict w14:anchorId="15ADAE60">
-          <v:shape id="_x0000_i1039" type="#_x0000_t75" style="width:284.4pt;height:184.2pt;visibility:visible;mso-wrap-style:square">
+          <v:shape id="_x0000_i1040" type="#_x0000_t75" style="width:284.4pt;height:184.2pt;visibility:visible;mso-wrap-style:square">
             <v:imagedata r:id="rId24" o:title=""/>
           </v:shape>
         </w:pict>
@@ -8809,7 +8825,7 @@
       </w:pPr>
       <w:r>
         <w:pict w14:anchorId="1B6DD970">
-          <v:shape id="_x0000_i1040" type="#_x0000_t75" style="width:298.2pt;height:263.4pt;visibility:visible;mso-wrap-style:square">
+          <v:shape id="_x0000_i1041" type="#_x0000_t75" style="width:298.2pt;height:263.4pt;visibility:visible;mso-wrap-style:square">
             <v:imagedata r:id="rId25" o:title=""/>
           </v:shape>
         </w:pict>
@@ -8844,7 +8860,7 @@
           <w:lang w:val="pt-BR" w:eastAsia="pt-PT"/>
         </w:rPr>
         <w:pict w14:anchorId="10781889">
-          <v:shape id="_x0000_i1041" type="#_x0000_t75" style="width:313.8pt;height:142.2pt;visibility:visible;mso-wrap-style:square">
+          <v:shape id="_x0000_i1042" type="#_x0000_t75" style="width:313.8pt;height:142.2pt;visibility:visible;mso-wrap-style:square">
             <v:imagedata r:id="rId26" o:title=""/>
           </v:shape>
         </w:pict>
@@ -8942,7 +8958,7 @@
           <w:lang w:val="pt-BR" w:eastAsia="pt-PT"/>
         </w:rPr>
         <w:pict w14:anchorId="57831F45">
-          <v:shape id="_x0000_i1042" type="#_x0000_t75" style="width:297pt;height:229.2pt;visibility:visible;mso-wrap-style:square">
+          <v:shape id="_x0000_i1043" type="#_x0000_t75" style="width:297pt;height:229.2pt;visibility:visible;mso-wrap-style:square">
             <v:imagedata r:id="rId27" o:title=""/>
           </v:shape>
         </w:pict>
@@ -8968,7 +8984,7 @@
       </w:pPr>
       <w:r>
         <w:pict w14:anchorId="6E4C43A9">
-          <v:shape id="_x0000_i1043" type="#_x0000_t75" style="width:340.8pt;height:133.2pt;visibility:visible;mso-wrap-style:square">
+          <v:shape id="_x0000_i1044" type="#_x0000_t75" style="width:340.8pt;height:133.2pt;visibility:visible;mso-wrap-style:square">
             <v:imagedata r:id="rId28" o:title=""/>
           </v:shape>
         </w:pict>
@@ -9053,7 +9069,7 @@
           <w:lang w:val="pt-BR" w:eastAsia="pt-PT"/>
         </w:rPr>
         <w:pict w14:anchorId="763FE111">
-          <v:shape id="_x0000_i1044" type="#_x0000_t75" style="width:345.6pt;height:215.4pt;visibility:visible;mso-wrap-style:square">
+          <v:shape id="_x0000_i1045" type="#_x0000_t75" style="width:345.6pt;height:215.4pt;visibility:visible;mso-wrap-style:square">
             <v:imagedata r:id="rId29" o:title=""/>
           </v:shape>
         </w:pict>
@@ -9089,7 +9105,7 @@
         </w:rPr>
         <w:lastRenderedPageBreak/>
         <w:pict w14:anchorId="6A559318">
-          <v:shape id="_x0000_i1045" type="#_x0000_t75" style="width:329.4pt;height:291pt;visibility:visible;mso-wrap-style:square">
+          <v:shape id="_x0000_i1046" type="#_x0000_t75" style="width:329.4pt;height:291pt;visibility:visible;mso-wrap-style:square">
             <v:imagedata r:id="rId30" o:title=""/>
           </v:shape>
         </w:pict>
@@ -9152,7 +9168,7 @@
       </w:pPr>
       <w:r>
         <w:pict w14:anchorId="1B5E44F9">
-          <v:shape id="_x0000_i1046" type="#_x0000_t75" style="width:237.6pt;height:345.6pt;visibility:visible;mso-wrap-style:square">
+          <v:shape id="_x0000_i1047" type="#_x0000_t75" style="width:237.6pt;height:345.6pt;visibility:visible;mso-wrap-style:square">
             <v:imagedata r:id="rId31" o:title=""/>
           </v:shape>
         </w:pict>
@@ -9187,7 +9203,7 @@
         </w:rPr>
         <w:lastRenderedPageBreak/>
         <w:pict w14:anchorId="447639AE">
-          <v:shape id="_x0000_i1047" type="#_x0000_t75" style="width:202.2pt;height:370.2pt;visibility:visible;mso-wrap-style:square">
+          <v:shape id="_x0000_i1048" type="#_x0000_t75" style="width:202.2pt;height:370.2pt;visibility:visible;mso-wrap-style:square">
             <v:imagedata r:id="rId32" o:title=""/>
           </v:shape>
         </w:pict>
@@ -9368,7 +9384,7 @@
       </w:r>
       <w:r>
         <w:pict w14:anchorId="5D785E8A">
-          <v:shape id="_x0000_i1048" type="#_x0000_t75" style="width:343.2pt;height:162pt;visibility:visible">
+          <v:shape id="_x0000_i1049" type="#_x0000_t75" style="width:343.2pt;height:162pt;visibility:visible">
             <v:imagedata r:id="rId33" o:title=""/>
           </v:shape>
         </w:pict>
@@ -9428,7 +9444,7 @@
       </w:r>
       <w:r>
         <w:pict w14:anchorId="6DCFBF81">
-          <v:shape id="_x0000_i1049" type="#_x0000_t75" style="width:346.2pt;height:103.2pt;visibility:visible">
+          <v:shape id="_x0000_i1050" type="#_x0000_t75" style="width:346.2pt;height:103.2pt;visibility:visible">
             <v:imagedata r:id="rId34" o:title=""/>
           </v:shape>
         </w:pict>
@@ -9489,7 +9505,7 @@
       </w:r>
       <w:r>
         <w:pict w14:anchorId="55F29CDE">
-          <v:shape id="_x0000_i1050" type="#_x0000_t75" style="width:349.8pt;height:129.6pt;visibility:visible">
+          <v:shape id="_x0000_i1051" type="#_x0000_t75" style="width:349.8pt;height:129.6pt;visibility:visible">
             <v:imagedata r:id="rId35" o:title=""/>
           </v:shape>
         </w:pict>
@@ -9545,7 +9561,7 @@
       <w:r>
         <w:lastRenderedPageBreak/>
         <w:pict w14:anchorId="5778C4CB">
-          <v:shape id="_x0000_i1051" type="#_x0000_t75" style="width:345.6pt;height:154.8pt;visibility:visible">
+          <v:shape id="_x0000_i1052" type="#_x0000_t75" style="width:345.6pt;height:154.8pt;visibility:visible">
             <v:imagedata r:id="rId36" o:title=""/>
           </v:shape>
         </w:pict>
@@ -9606,7 +9622,7 @@
       </w:r>
       <w:r>
         <w:pict w14:anchorId="4F2278E9">
-          <v:shape id="_x0000_i1052" type="#_x0000_t75" style="width:351.6pt;height:165.6pt;visibility:visible">
+          <v:shape id="_x0000_i1053" type="#_x0000_t75" style="width:351.6pt;height:165.6pt;visibility:visible">
             <v:imagedata r:id="rId37" o:title=""/>
           </v:shape>
         </w:pict>
@@ -9811,21 +9827,7 @@
         <w:rPr>
           <w:b w:val="0"/>
         </w:rPr>
-        <w:t xml:space="preserve"> a </w:t>
-      </w:r>
-      <w:proofErr w:type="gramStart"/>
-      <w:r>
-        <w:rPr>
-          <w:b w:val="0"/>
-        </w:rPr>
-        <w:t>taxa</w:t>
-      </w:r>
-      <w:proofErr w:type="gramEnd"/>
-      <w:r>
-        <w:rPr>
-          <w:b w:val="0"/>
-        </w:rPr>
-        <w:t xml:space="preserve"> de </w:t>
+        <w:t xml:space="preserve"> a taxa de </w:t>
       </w:r>
       <w:proofErr w:type="spellStart"/>
       <w:r>
@@ -13516,326 +13518,333 @@
       <w:pPr>
         <w:pStyle w:val="p1a"/>
         <w:rPr>
-          <w:lang w:val="pt-BR"/>
-        </w:rPr>
-      </w:pPr>
-      <w:r>
-        <w:rPr>
           <w:rStyle w:val="citation-658"/>
-          <w:lang w:val="pt-BR"/>
-        </w:rPr>
-        <w:t xml:space="preserve">Para concluir, este relatório será o </w:t>
-      </w:r>
+          <w:b/>
+        </w:rPr>
+      </w:pPr>
       <w:r>
         <w:rPr>
           <w:rStyle w:val="citation-658"/>
           <w:lang w:val="pt-BR"/>
         </w:rPr>
-        <w:t>guia</w:t>
+        <w:t xml:space="preserve">Esta secção apresenta as considerações finais do projeto, </w:t>
       </w:r>
       <w:r>
         <w:rPr>
           <w:rStyle w:val="citation-658"/>
           <w:lang w:val="pt-BR"/>
         </w:rPr>
-        <w:t xml:space="preserve"> fundam</w:t>
+        <w:t>resumindo</w:t>
       </w:r>
       <w:r>
         <w:rPr>
           <w:rStyle w:val="citation-658"/>
           <w:lang w:val="pt-BR"/>
         </w:rPr>
-        <w:t xml:space="preserve">ental para o desenvolvimento da </w:t>
+        <w:t xml:space="preserve"> os resultados alcançados com o desenvolvimento da aplicação </w:t>
       </w:r>
       <w:r>
         <w:rPr>
           <w:rStyle w:val="citation-658"/>
           <w:lang w:val="pt-BR"/>
         </w:rPr>
-        <w:t>aplicação</w:t>
-      </w:r>
-      <w:r>
-        <w:rPr>
-          <w:lang w:val="pt-BR"/>
+        <w:t>e o seu cumprimento dos requisitos funcionais e não funcionais.</w:t>
+      </w:r>
+    </w:p>
+    <w:p>
+      <w:pPr>
+        <w:pStyle w:val="heading2"/>
+        <w:rPr>
+          <w:lang w:val="pt-BR" w:eastAsia="pt-PT"/>
+        </w:rPr>
+      </w:pPr>
+      <w:r>
+        <w:rPr>
+          <w:lang w:val="pt-BR" w:eastAsia="pt-PT"/>
+        </w:rPr>
+        <w:t>1</w:t>
+      </w:r>
+      <w:r>
+        <w:rPr>
+          <w:lang w:val="pt-BR" w:eastAsia="pt-PT"/>
+        </w:rPr>
+        <w:t>4</w:t>
+      </w:r>
+      <w:r>
+        <w:rPr>
+          <w:lang w:val="pt-BR" w:eastAsia="pt-PT"/>
+        </w:rPr>
+        <w:t>.1  Programação Orientada a Objetos</w:t>
+      </w:r>
+    </w:p>
+    <w:p>
+      <w:pPr>
+        <w:ind w:firstLine="0"/>
+        <w:rPr>
+          <w:lang w:val="pt-BR" w:eastAsia="pt-PT"/>
+        </w:rPr>
+      </w:pPr>
+      <w:r>
+        <w:rPr>
+          <w:lang w:val="pt-BR" w:eastAsia="pt-PT"/>
+        </w:rPr>
+        <w:t>De forma geral, os princípios da Programação Orientada a Objetos foram bem seguidos.</w:t>
+      </w:r>
+    </w:p>
+    <w:p>
+      <w:pPr>
+        <w:ind w:firstLine="0"/>
+        <w:rPr>
+          <w:lang w:val="pt-BR" w:eastAsia="pt-PT"/>
+        </w:rPr>
+      </w:pPr>
+    </w:p>
+    <w:p>
+      <w:pPr>
+        <w:ind w:firstLine="0"/>
+        <w:rPr>
+          <w:lang w:val="pt-BR" w:eastAsia="pt-PT"/>
+        </w:rPr>
+      </w:pPr>
+      <w:r>
+        <w:rPr>
+          <w:lang w:val="pt-BR" w:eastAsia="pt-PT"/>
+        </w:rPr>
+        <w:t>As classes (Player, Ship, Board, Game) guardam os dados de forma privada e só permitem acesso através de métodos</w:t>
+      </w:r>
+      <w:r>
+        <w:rPr>
+          <w:lang w:val="pt-BR" w:eastAsia="pt-PT"/>
+        </w:rPr>
+        <w:t>.</w:t>
+      </w:r>
+    </w:p>
+    <w:p>
+      <w:pPr>
+        <w:ind w:firstLine="0"/>
+        <w:rPr>
+          <w:lang w:val="pt-BR" w:eastAsia="pt-PT"/>
+        </w:rPr>
+      </w:pPr>
+    </w:p>
+    <w:p>
+      <w:pPr>
+        <w:ind w:firstLine="0"/>
+        <w:rPr>
+          <w:lang w:val="pt-BR" w:eastAsia="pt-PT"/>
+        </w:rPr>
+      </w:pPr>
+      <w:r>
+        <w:rPr>
+          <w:lang w:val="pt-BR" w:eastAsia="pt-PT"/>
+        </w:rPr>
+        <w:lastRenderedPageBreak/>
+        <w:t xml:space="preserve">Os DTOs mostram apenas a informação essencial, escondendo a forma como ela é guardada internamente. </w:t>
+      </w:r>
+    </w:p>
+    <w:p>
+      <w:pPr>
+        <w:ind w:firstLine="0"/>
+        <w:rPr>
+          <w:lang w:val="pt-BR" w:eastAsia="pt-PT"/>
+        </w:rPr>
+      </w:pPr>
+    </w:p>
+    <w:p>
+      <w:pPr>
+        <w:ind w:firstLine="0"/>
+        <w:rPr>
+          <w:lang w:val="pt-BR" w:eastAsia="pt-PT"/>
+        </w:rPr>
+      </w:pPr>
+      <w:r>
+        <w:rPr>
+          <w:lang w:val="pt-BR" w:eastAsia="pt-PT"/>
+        </w:rPr>
+        <w:t>As heranças são usadas</w:t>
+      </w:r>
+      <w:r>
+        <w:rPr>
+          <w:lang w:val="pt-BR" w:eastAsia="pt-PT"/>
+        </w:rPr>
+        <w:t xml:space="preserve"> de forma simples e correta</w:t>
+      </w:r>
+      <w:r>
+        <w:rPr>
+          <w:lang w:val="pt-BR" w:eastAsia="pt-PT"/>
+        </w:rPr>
+        <w:t xml:space="preserve">, </w:t>
+      </w:r>
+      <w:r>
+        <w:rPr>
+          <w:lang w:val="pt-BR" w:eastAsia="pt-PT"/>
+        </w:rPr>
+        <w:t xml:space="preserve">as </w:t>
+      </w:r>
+      <w:r>
+        <w:rPr>
+          <w:lang w:val="pt-BR" w:eastAsia="pt-PT"/>
+        </w:rPr>
+        <w:t>exceções herdam</w:t>
+      </w:r>
+      <w:r>
+        <w:rPr>
+          <w:lang w:val="pt-BR" w:eastAsia="pt-PT"/>
+        </w:rPr>
+        <w:t xml:space="preserve"> de exception</w:t>
+      </w:r>
+      <w:r>
+        <w:rPr>
+          <w:lang w:val="pt-BR" w:eastAsia="pt-PT"/>
         </w:rPr>
         <w:t xml:space="preserve">. </w:t>
       </w:r>
       <w:r>
         <w:rPr>
-          <w:rStyle w:val="citation-657"/>
-          <w:lang w:val="pt-BR"/>
-        </w:rPr>
-        <w:t>Será</w:t>
-      </w:r>
-      <w:r>
-        <w:rPr>
-          <w:rStyle w:val="citation-657"/>
-          <w:lang w:val="pt-BR"/>
-        </w:rPr>
-        <w:t xml:space="preserve"> através dele que</w:t>
-      </w:r>
-      <w:r>
-        <w:rPr>
-          <w:rStyle w:val="citation-657"/>
-          <w:lang w:val="pt-BR"/>
+          <w:lang w:val="pt-BR" w:eastAsia="pt-PT"/>
+        </w:rPr>
+        <w:t>Não há herança entre Ship, Player, Board e Game</w:t>
+      </w:r>
+      <w:r>
+        <w:rPr>
+          <w:lang w:val="pt-BR" w:eastAsia="pt-PT"/>
+        </w:rPr>
+        <w:t>.</w:t>
+      </w:r>
+    </w:p>
+    <w:p>
+      <w:pPr>
+        <w:ind w:firstLine="0"/>
+        <w:rPr>
+          <w:lang w:val="pt-BR" w:eastAsia="pt-PT"/>
+        </w:rPr>
+      </w:pPr>
+    </w:p>
+    <w:p>
+      <w:pPr>
+        <w:ind w:firstLine="0"/>
+        <w:rPr>
+          <w:lang w:val="pt-BR" w:eastAsia="pt-PT"/>
+        </w:rPr>
+      </w:pPr>
+      <w:r>
+        <w:rPr>
+          <w:lang w:val="pt-BR" w:eastAsia="pt-PT"/>
+        </w:rPr>
+        <w:t>Em resumo, os princípios foram bem aplicados ao longo de toda a implementação.</w:t>
+      </w:r>
+    </w:p>
+    <w:p>
+      <w:pPr>
+        <w:pStyle w:val="heading2"/>
+        <w:rPr>
+          <w:lang w:val="pt-PT" w:eastAsia="pt-PT"/>
+        </w:rPr>
+      </w:pPr>
+      <w:r>
+        <w:rPr>
+          <w:lang w:val="pt-PT" w:eastAsia="pt-PT"/>
+        </w:rPr>
+        <w:t xml:space="preserve">14.2 </w:t>
+      </w:r>
+      <w:r>
+        <w:rPr>
+          <w:lang w:val="pt-PT" w:eastAsia="pt-PT"/>
+        </w:rPr>
+        <w:t>Cumprimento dos Requisitos</w:t>
+      </w:r>
+      <w:r>
+        <w:rPr>
+          <w:lang w:val="pt-PT" w:eastAsia="pt-PT"/>
+        </w:rPr>
+        <w:t xml:space="preserve"> Funcionais</w:t>
+      </w:r>
+    </w:p>
+    <w:p>
+      <w:pPr>
+        <w:pStyle w:val="p1a"/>
+        <w:rPr>
+          <w:lang w:val="pt-PT" w:eastAsia="pt-PT"/>
+        </w:rPr>
+      </w:pPr>
+      <w:r>
+        <w:rPr>
+          <w:lang w:val="pt-PT" w:eastAsia="pt-PT"/>
+        </w:rPr>
+        <w:t xml:space="preserve">Relativamente aos requisitos funcionais, </w:t>
+      </w:r>
+      <w:r>
+        <w:rPr>
+          <w:lang w:val="pt-PT" w:eastAsia="pt-PT"/>
+        </w:rPr>
+        <w:t>todos os doze Casos de Uso foram implementados e seguidos</w:t>
+      </w:r>
+      <w:r>
+        <w:rPr>
+          <w:lang w:val="pt-PT" w:eastAsia="pt-PT"/>
+        </w:rPr>
+        <w:t>.</w:t>
+      </w:r>
+      <w:r>
+        <w:rPr>
+          <w:lang w:val="pt-PT" w:eastAsia="pt-PT"/>
         </w:rPr>
         <w:t xml:space="preserve"> </w:t>
       </w:r>
       <w:r>
         <w:rPr>
-          <w:rStyle w:val="citation-656"/>
-          <w:lang w:val="pt-BR"/>
-        </w:rPr>
-        <w:t>garantiremos</w:t>
-      </w:r>
-      <w:r>
-        <w:rPr>
-          <w:rStyle w:val="citation-656"/>
-          <w:lang w:val="pt-BR"/>
-        </w:rPr>
-        <w:t xml:space="preserve"> que o projeto não se foque apenas na mecânica de jogo, mas também em </w:t>
-      </w:r>
-      <w:r>
-        <w:rPr>
-          <w:rStyle w:val="citation-656"/>
-          <w:lang w:val="pt-BR"/>
-        </w:rPr>
-        <w:t xml:space="preserve">outras </w:t>
-      </w:r>
-      <w:r>
-        <w:rPr>
-          <w:rStyle w:val="citation-656"/>
-          <w:lang w:val="pt-BR"/>
-        </w:rPr>
-        <w:t xml:space="preserve">funcionalidades como o </w:t>
-      </w:r>
-      <w:r>
-        <w:rPr>
-          <w:rStyle w:val="citation-656"/>
-          <w:bCs/>
-          <w:lang w:val="pt-BR"/>
-        </w:rPr>
-        <w:t>sistema de ranking</w:t>
-      </w:r>
-      <w:r>
-        <w:rPr>
-          <w:rStyle w:val="citation-656"/>
-          <w:lang w:val="pt-BR"/>
-        </w:rPr>
-        <w:t xml:space="preserve"> e as </w:t>
-      </w:r>
-      <w:r>
-        <w:rPr>
-          <w:rStyle w:val="citation-656"/>
-          <w:bCs/>
-          <w:lang w:val="pt-BR"/>
-        </w:rPr>
-        <w:t>estatísticas individuais</w:t>
-      </w:r>
-      <w:r>
-        <w:rPr>
-          <w:lang w:val="pt-BR"/>
+          <w:lang w:val="pt-PT" w:eastAsia="pt-PT"/>
+        </w:rPr>
+        <w:t>Os</w:t>
+      </w:r>
+      <w:r>
+        <w:rPr>
+          <w:lang w:val="pt-PT" w:eastAsia="pt-PT"/>
+        </w:rPr>
+        <w:t xml:space="preserve"> casos de uso abrangiam a gestão d</w:t>
+      </w:r>
+      <w:r>
+        <w:rPr>
+          <w:lang w:val="pt-PT" w:eastAsia="pt-PT"/>
+        </w:rPr>
+        <w:t>os</w:t>
+      </w:r>
+      <w:r>
+        <w:rPr>
+          <w:lang w:val="pt-PT" w:eastAsia="pt-PT"/>
+        </w:rPr>
+        <w:t xml:space="preserve"> perfis</w:t>
+      </w:r>
+      <w:r>
+        <w:rPr>
+          <w:lang w:val="pt-PT" w:eastAsia="pt-PT"/>
+        </w:rPr>
+        <w:t xml:space="preserve"> dos utilizadores</w:t>
+      </w:r>
+      <w:r>
+        <w:rPr>
+          <w:lang w:val="pt-PT" w:eastAsia="pt-PT"/>
+        </w:rPr>
+        <w:t xml:space="preserve">, as estatísticas, </w:t>
+      </w:r>
+      <w:r>
+        <w:rPr>
+          <w:lang w:val="pt-PT" w:eastAsia="pt-PT"/>
+        </w:rPr>
+        <w:t xml:space="preserve">o início das partidas e </w:t>
+      </w:r>
+      <w:r>
+        <w:rPr>
+          <w:lang w:val="pt-PT" w:eastAsia="pt-PT"/>
+        </w:rPr>
+        <w:t>a lógica do jogo</w:t>
+      </w:r>
+      <w:r>
+        <w:rPr>
+          <w:lang w:val="pt-PT" w:eastAsia="pt-PT"/>
         </w:rPr>
         <w:t>.</w:t>
       </w:r>
-    </w:p>
-    <w:p>
-      <w:pPr>
-        <w:pStyle w:val="heading2"/>
-        <w:rPr>
-          <w:lang w:val="pt-BR" w:eastAsia="pt-PT"/>
-        </w:rPr>
-      </w:pPr>
-      <w:r>
-        <w:rPr>
-          <w:lang w:val="pt-BR" w:eastAsia="pt-PT"/>
-        </w:rPr>
-        <w:t>1</w:t>
-      </w:r>
-      <w:r>
-        <w:rPr>
-          <w:lang w:val="pt-BR" w:eastAsia="pt-PT"/>
-        </w:rPr>
-        <w:t>4</w:t>
-      </w:r>
-      <w:r>
-        <w:rPr>
-          <w:lang w:val="pt-BR" w:eastAsia="pt-PT"/>
-        </w:rPr>
-        <w:t>.1  Programação Orientada a Objetos</w:t>
-      </w:r>
-    </w:p>
-    <w:p>
-      <w:pPr>
-        <w:ind w:firstLine="0"/>
-        <w:rPr>
-          <w:lang w:val="pt-BR" w:eastAsia="pt-PT"/>
-        </w:rPr>
-      </w:pPr>
-      <w:r>
-        <w:rPr>
-          <w:lang w:val="pt-BR" w:eastAsia="pt-PT"/>
-        </w:rPr>
-        <w:t>De forma geral, os princípios da Programação Orientada a Objetos foram bem seguidos.</w:t>
-      </w:r>
-    </w:p>
-    <w:p>
-      <w:pPr>
-        <w:ind w:firstLine="0"/>
-        <w:rPr>
-          <w:lang w:val="pt-BR" w:eastAsia="pt-PT"/>
-        </w:rPr>
-      </w:pPr>
-    </w:p>
-    <w:p>
-      <w:pPr>
-        <w:ind w:firstLine="0"/>
-        <w:rPr>
-          <w:lang w:val="pt-BR" w:eastAsia="pt-PT"/>
-        </w:rPr>
-      </w:pPr>
-      <w:r>
-        <w:rPr>
-          <w:lang w:val="pt-BR" w:eastAsia="pt-PT"/>
-        </w:rPr>
-        <w:t>As classes (Player, Ship, Board, Game) guardam os dados de forma privada e só permitem acesso através de métodos</w:t>
-      </w:r>
-      <w:r>
-        <w:rPr>
-          <w:lang w:val="pt-BR" w:eastAsia="pt-PT"/>
-        </w:rPr>
-        <w:t>.</w:t>
-      </w:r>
-    </w:p>
-    <w:p>
-      <w:pPr>
-        <w:ind w:firstLine="0"/>
-        <w:rPr>
-          <w:lang w:val="pt-BR" w:eastAsia="pt-PT"/>
-        </w:rPr>
-      </w:pPr>
-    </w:p>
-    <w:p>
-      <w:pPr>
-        <w:ind w:firstLine="0"/>
-        <w:rPr>
-          <w:lang w:val="pt-BR" w:eastAsia="pt-PT"/>
-        </w:rPr>
-      </w:pPr>
-      <w:r>
-        <w:rPr>
-          <w:lang w:val="pt-BR" w:eastAsia="pt-PT"/>
-        </w:rPr>
-        <w:t xml:space="preserve">Os DTOs mostram apenas a informação essencial, escondendo a forma como ela é guardada internamente. </w:t>
-      </w:r>
-    </w:p>
-    <w:p>
-      <w:pPr>
-        <w:ind w:firstLine="0"/>
-        <w:rPr>
-          <w:lang w:val="pt-BR" w:eastAsia="pt-PT"/>
-        </w:rPr>
-      </w:pPr>
-    </w:p>
-    <w:p>
-      <w:pPr>
-        <w:ind w:firstLine="0"/>
-        <w:rPr>
-          <w:lang w:val="pt-BR" w:eastAsia="pt-PT"/>
-        </w:rPr>
-      </w:pPr>
-      <w:r>
-        <w:rPr>
-          <w:lang w:val="pt-BR" w:eastAsia="pt-PT"/>
-        </w:rPr>
-        <w:t>As heranças são usadas</w:t>
-      </w:r>
-      <w:r>
-        <w:rPr>
-          <w:lang w:val="pt-BR" w:eastAsia="pt-PT"/>
-        </w:rPr>
-        <w:t xml:space="preserve"> de forma simples e correta</w:t>
-      </w:r>
-      <w:r>
-        <w:rPr>
-          <w:lang w:val="pt-BR" w:eastAsia="pt-PT"/>
-        </w:rPr>
-        <w:t xml:space="preserve">, </w:t>
-      </w:r>
-      <w:r>
-        <w:rPr>
-          <w:lang w:val="pt-BR" w:eastAsia="pt-PT"/>
-        </w:rPr>
-        <w:t xml:space="preserve">as </w:t>
-      </w:r>
-      <w:r>
-        <w:rPr>
-          <w:lang w:val="pt-BR" w:eastAsia="pt-PT"/>
-        </w:rPr>
-        <w:t>exceções herdam</w:t>
-      </w:r>
-      <w:r>
-        <w:rPr>
-          <w:lang w:val="pt-BR" w:eastAsia="pt-PT"/>
-        </w:rPr>
-        <w:t xml:space="preserve"> de exception</w:t>
-      </w:r>
-      <w:r>
-        <w:rPr>
-          <w:lang w:val="pt-BR" w:eastAsia="pt-PT"/>
-        </w:rPr>
-        <w:t xml:space="preserve">. </w:t>
-      </w:r>
-      <w:r>
-        <w:rPr>
-          <w:lang w:val="pt-BR" w:eastAsia="pt-PT"/>
-        </w:rPr>
-        <w:t>Não há herança entre Ship, Player, Board e Game</w:t>
-      </w:r>
-      <w:r>
-        <w:rPr>
-          <w:lang w:val="pt-BR" w:eastAsia="pt-PT"/>
-        </w:rPr>
-        <w:t>.</w:t>
-      </w:r>
-    </w:p>
-    <w:p>
-      <w:pPr>
-        <w:ind w:firstLine="0"/>
-        <w:rPr>
-          <w:lang w:val="pt-BR" w:eastAsia="pt-PT"/>
-        </w:rPr>
-      </w:pPr>
-    </w:p>
-    <w:p>
-      <w:pPr>
-        <w:ind w:firstLine="0"/>
-        <w:rPr>
-          <w:lang w:val="pt-BR" w:eastAsia="pt-PT"/>
-        </w:rPr>
-      </w:pPr>
-      <w:r>
-        <w:rPr>
-          <w:lang w:val="pt-BR" w:eastAsia="pt-PT"/>
-        </w:rPr>
-        <w:t>Em resumo, os princípios foram bem aplicados ao longo de toda a implementação.</w:t>
-      </w:r>
-    </w:p>
-    <w:p>
-      <w:pPr>
-        <w:ind w:firstLine="0"/>
-        <w:rPr>
-          <w:lang w:val="pt-BR" w:eastAsia="pt-PT"/>
-        </w:rPr>
-      </w:pPr>
-    </w:p>
-    <w:p>
-      <w:pPr>
-        <w:ind w:firstLine="0"/>
-        <w:rPr>
-          <w:lang w:val="pt-BR" w:eastAsia="pt-PT"/>
-        </w:rPr>
-      </w:pPr>
     </w:p>
     <w:sectPr>
       <w:type w:val="continuous"/>

</xml_diff>

<commit_message>
Adição do pdf do relatório
</commit_message>
<xml_diff>
--- a/Documentation/iteration03/fsoft2026_1DA_4.docx
+++ b/Documentation/iteration03/fsoft2026_1DA_4.docx
@@ -5502,6 +5502,22 @@
     </w:p>
     <w:p>
       <w:pPr>
+        <w:pStyle w:val="author"/>
+        <w:ind w:firstLine="0"/>
+        <w:jc w:val="both"/>
+        <w:rPr>
+          <w:lang w:val="pt-BR"/>
+        </w:rPr>
+      </w:pPr>
+      <w:r>
+        <w:rPr>
+          <w:lang w:val="pt-BR"/>
+        </w:rPr>
+        <w:br w:type="page"/>
+      </w:r>
+    </w:p>
+    <w:p>
+      <w:pPr>
         <w:pStyle w:val="Legenda"/>
       </w:pPr>
       <w:r>
@@ -5810,15 +5826,7 @@
                 <w:sz w:val="20"/>
                 <w:lang w:val="pt-BR"/>
               </w:rPr>
-              <w:t xml:space="preserve"> até que </w:t>
-            </w:r>
-            <w:r>
-              <w:rPr>
-                <w:sz w:val="20"/>
-                <w:lang w:val="pt-BR"/>
-              </w:rPr>
-              <w:lastRenderedPageBreak/>
-              <w:t>todos os navios estejam posicionados</w:t>
+              <w:t xml:space="preserve"> até que todos os navios estejam posicionados</w:t>
             </w:r>
           </w:p>
           <w:p>
@@ -5851,6 +5859,20 @@
           <w:lang w:val="pt-BR"/>
         </w:rPr>
       </w:pPr>
+    </w:p>
+    <w:p>
+      <w:pPr>
+        <w:pStyle w:val="author"/>
+        <w:rPr>
+          <w:lang w:val="pt-BR"/>
+        </w:rPr>
+      </w:pPr>
+      <w:r>
+        <w:rPr>
+          <w:lang w:val="pt-BR"/>
+        </w:rPr>
+        <w:br w:type="page"/>
+      </w:r>
     </w:p>
     <w:p>
       <w:pPr>
@@ -7676,49 +7698,13 @@
         <w:rPr>
           <w:lang w:val="pt-BR" w:eastAsia="pt-PT"/>
         </w:rPr>
-        <w:fldChar w:fldCharType="begin"/>
+        <w:t xml:space="preserve">Fig. 5 </w:t>
       </w:r>
       <w:r>
         <w:rPr>
           <w:lang w:val="pt-BR" w:eastAsia="pt-PT"/>
         </w:rPr>
-        <w:instrText xml:space="preserve"> REF _Ref232178039 \h  \* MERGEFORMAT </w:instrText>
-      </w:r>
-      <w:r>
-        <w:rPr>
-          <w:lang w:val="pt-BR" w:eastAsia="pt-PT"/>
-        </w:rPr>
-      </w:r>
-      <w:r>
-        <w:rPr>
-          <w:lang w:val="pt-BR" w:eastAsia="pt-PT"/>
-        </w:rPr>
-        <w:fldChar w:fldCharType="separate"/>
-      </w:r>
-      <w:r>
-        <w:rPr>
-          <w:lang w:val="pt-BR"/>
-        </w:rPr>
-        <w:t xml:space="preserve">Fig. </w:t>
-      </w:r>
-      <w:r>
-        <w:rPr>
-          <w:noProof/>
-          <w:lang w:val="pt-BR"/>
-        </w:rPr>
-        <w:t>5</w:t>
-      </w:r>
-      <w:r>
-        <w:rPr>
-          <w:lang w:val="pt-BR" w:eastAsia="pt-PT"/>
-        </w:rPr>
-        <w:fldChar w:fldCharType="end"/>
-      </w:r>
-      <w:r>
-        <w:rPr>
-          <w:lang w:val="pt-BR" w:eastAsia="pt-PT"/>
-        </w:rPr>
-        <w:t xml:space="preserve"> mostra como o código da aplicação está organizado, assim como as dependências de inclusão existentes entre cada um.</w:t>
+        <w:t>mostra como o código da aplicação está organizado, assim como as dependências de inclusão existentes entre cada um.</w:t>
       </w:r>
     </w:p>
     <w:p>
@@ -7747,128 +7733,15 @@
       </w:pPr>
       <w:r>
         <w:rPr>
+          <w:noProof/>
           <w:lang w:val="pt-BR" w:eastAsia="pt-PT"/>
         </w:rPr>
-        <w:fldChar w:fldCharType="begin"/>
-      </w:r>
-      <w:r>
-        <w:rPr>
-          <w:lang w:val="pt-BR" w:eastAsia="pt-PT"/>
-        </w:rPr>
-        <w:instrText xml:space="preserve"> INCLUDEPICTURE "C:\\Users\\tiago\\Downloads\\Organização do Código.png" \* MERGEFORMATINET </w:instrText>
-      </w:r>
-      <w:r>
-        <w:rPr>
-          <w:lang w:val="pt-BR" w:eastAsia="pt-PT"/>
-        </w:rPr>
-        <w:fldChar w:fldCharType="separate"/>
-      </w:r>
-      <w:r>
-        <w:rPr>
-          <w:lang w:val="pt-BR" w:eastAsia="pt-PT"/>
-        </w:rPr>
-        <w:fldChar w:fldCharType="begin"/>
-      </w:r>
-      <w:r>
-        <w:rPr>
-          <w:lang w:val="pt-BR" w:eastAsia="pt-PT"/>
-        </w:rPr>
-        <w:instrText xml:space="preserve"> INCLUDEPICTURE  "C:\\Users\\tiago\\Downloads\\Organização do Código.png" \* MERGEFORMATINET </w:instrText>
-      </w:r>
-      <w:r>
-        <w:rPr>
-          <w:lang w:val="pt-BR" w:eastAsia="pt-PT"/>
-        </w:rPr>
-        <w:fldChar w:fldCharType="separate"/>
-      </w:r>
-      <w:r>
-        <w:rPr>
-          <w:lang w:val="pt-BR" w:eastAsia="pt-PT"/>
-        </w:rPr>
-        <w:fldChar w:fldCharType="begin"/>
-      </w:r>
-      <w:r>
-        <w:rPr>
-          <w:lang w:val="pt-BR" w:eastAsia="pt-PT"/>
-        </w:rPr>
-        <w:instrText xml:space="preserve"> INCLUDEPICTURE  "C:\\Users\\arthu\\Desktop\\Downloads\\Organização do Código.png" \* MERGEFORMATINET </w:instrText>
-      </w:r>
-      <w:r>
-        <w:rPr>
-          <w:lang w:val="pt-BR" w:eastAsia="pt-PT"/>
-        </w:rPr>
-        <w:fldChar w:fldCharType="separate"/>
-      </w:r>
-      <w:r>
-        <w:rPr>
-          <w:lang w:val="pt-BR" w:eastAsia="pt-PT"/>
-        </w:rPr>
-        <w:fldChar w:fldCharType="begin"/>
-      </w:r>
-      <w:r>
-        <w:rPr>
-          <w:lang w:val="pt-BR" w:eastAsia="pt-PT"/>
-        </w:rPr>
-        <w:instrText xml:space="preserve"> </w:instrText>
-      </w:r>
-      <w:r>
-        <w:rPr>
-          <w:lang w:val="pt-BR" w:eastAsia="pt-PT"/>
-        </w:rPr>
-        <w:instrText>INCLUDEPICTURE  "C:\\Users\\arthu\\Deskto</w:instrText>
-      </w:r>
-      <w:r>
-        <w:rPr>
-          <w:lang w:val="pt-BR" w:eastAsia="pt-PT"/>
-        </w:rPr>
-        <w:instrText>p\\Downloads\\Organização do Código.png" \* MERGEFORMATINET</w:instrText>
-      </w:r>
-      <w:r>
-        <w:rPr>
-          <w:lang w:val="pt-BR" w:eastAsia="pt-PT"/>
-        </w:rPr>
-        <w:instrText xml:space="preserve"> </w:instrText>
-      </w:r>
-      <w:r>
-        <w:rPr>
-          <w:lang w:val="pt-BR" w:eastAsia="pt-PT"/>
-        </w:rPr>
-        <w:fldChar w:fldCharType="separate"/>
-      </w:r>
-      <w:r>
-        <w:rPr>
-          <w:lang w:val="pt-BR" w:eastAsia="pt-PT"/>
-        </w:rPr>
-        <w:pict w14:anchorId="58FF8682">
-          <v:shape id="_x0000_i1030" type="#_x0000_t75" alt="" style="width:365.4pt;height:291pt">
-            <v:imagedata r:id="rId13" r:href="rId14"/>
+        <w:pict w14:anchorId="21C0A537">
+          <v:shape id="_x0000_i1053" type="#_x0000_t75" style="width:346.2pt;height:273.6pt;visibility:visible;mso-wrap-style:square">
+            <v:imagedata r:id="rId13" o:title=""/>
           </v:shape>
         </w:pict>
       </w:r>
-      <w:r>
-        <w:rPr>
-          <w:lang w:val="pt-BR" w:eastAsia="pt-PT"/>
-        </w:rPr>
-        <w:fldChar w:fldCharType="end"/>
-      </w:r>
-      <w:r>
-        <w:rPr>
-          <w:lang w:val="pt-BR" w:eastAsia="pt-PT"/>
-        </w:rPr>
-        <w:fldChar w:fldCharType="end"/>
-      </w:r>
-      <w:r>
-        <w:rPr>
-          <w:lang w:val="pt-BR" w:eastAsia="pt-PT"/>
-        </w:rPr>
-        <w:fldChar w:fldCharType="end"/>
-      </w:r>
-      <w:r>
-        <w:rPr>
-          <w:lang w:val="pt-BR" w:eastAsia="pt-PT"/>
-        </w:rPr>
-        <w:fldChar w:fldCharType="end"/>
-      </w:r>
     </w:p>
     <w:p>
       <w:pPr>
@@ -8033,7 +7906,113 @@
           <w:lang w:val="pt-BR"/>
         </w:rPr>
         <w:pict w14:anchorId="703AFE75">
-          <v:shape id="_x0000_i1031" type="#_x0000_t75" style="width:234pt;height:411pt;visibility:visible">
+          <v:shape id="_x0000_i1030" type="#_x0000_t75" style="width:234pt;height:411pt;visibility:visible">
+            <v:imagedata r:id="rId14" o:title=""/>
+          </v:shape>
+        </w:pict>
+      </w:r>
+    </w:p>
+    <w:p>
+      <w:pPr>
+        <w:pStyle w:val="Legenda"/>
+      </w:pPr>
+      <w:bookmarkStart w:id="4" w:name="_Ref232178308"/>
+      <w:r>
+        <w:t>Fig.</w:t>
+      </w:r>
+      <w:bookmarkEnd w:id="4"/>
+      <w:r>
+        <w:t xml:space="preserve"> </w:t>
+      </w:r>
+      <w:r>
+        <w:t>6</w:t>
+      </w:r>
+      <w:r>
+        <w:t>. Diagrama de classes de modelo que serão utilizadas na aplicação</w:t>
+      </w:r>
+    </w:p>
+    <w:p>
+      <w:pPr>
+        <w:pStyle w:val="heading1"/>
+        <w:rPr>
+          <w:lang w:val="pt-BR" w:eastAsia="pt-PT"/>
+        </w:rPr>
+      </w:pPr>
+      <w:r>
+        <w:rPr>
+          <w:lang w:val="pt-BR" w:eastAsia="pt-PT"/>
+        </w:rPr>
+        <w:lastRenderedPageBreak/>
+        <w:t>10</w:t>
+      </w:r>
+      <w:r>
+        <w:rPr>
+          <w:lang w:val="pt-BR" w:eastAsia="pt-PT"/>
+        </w:rPr>
+        <w:t xml:space="preserve">   </w:t>
+      </w:r>
+      <w:r>
+        <w:rPr>
+          <w:lang w:val="pt-BR" w:eastAsia="pt-PT"/>
+        </w:rPr>
+        <w:t>Diagrama de Classes de Exceções</w:t>
+      </w:r>
+    </w:p>
+    <w:p>
+      <w:pPr>
+        <w:pStyle w:val="p1a"/>
+        <w:rPr>
+          <w:lang w:val="pt-BR" w:eastAsia="pt-PT"/>
+        </w:rPr>
+      </w:pPr>
+      <w:r>
+        <w:rPr>
+          <w:lang w:val="pt-BR" w:eastAsia="pt-PT"/>
+        </w:rPr>
+        <w:t>Para o tratamento de erros e a validação de dados, foram definidas três classes de exceções personalizadas: DuplicatedDataException, InvalidDataException e NoDataException. Estas derivam da classe std::exception O diagrama seguinte (</w:t>
+      </w:r>
+      <w:r>
+        <w:rPr>
+          <w:lang w:val="pt-BR" w:eastAsia="pt-PT"/>
+        </w:rPr>
+        <w:t xml:space="preserve">Fig. </w:t>
+      </w:r>
+      <w:r>
+        <w:rPr>
+          <w:lang w:val="pt-BR" w:eastAsia="pt-PT"/>
+        </w:rPr>
+        <w:t>7</w:t>
+      </w:r>
+      <w:r>
+        <w:rPr>
+          <w:lang w:val="pt-BR" w:eastAsia="pt-PT"/>
+        </w:rPr>
+        <w:t>) apresenta estas classes, bem como os respetivos atributos e métodos.</w:t>
+      </w:r>
+    </w:p>
+    <w:p>
+      <w:pPr>
+        <w:pStyle w:val="p1a"/>
+        <w:rPr>
+          <w:lang w:val="pt-BR" w:eastAsia="pt-PT"/>
+        </w:rPr>
+      </w:pPr>
+    </w:p>
+    <w:p>
+      <w:pPr>
+        <w:pStyle w:val="p1a"/>
+        <w:keepNext/>
+        <w:rPr>
+          <w:lang w:val="pt-BR"/>
+        </w:rPr>
+      </w:pPr>
+      <w:r>
+        <w:rPr>
+          <w:noProof/>
+          <w:lang w:val="pt-BR" w:eastAsia="pt-PT"/>
+        </w:rPr>
+        <w:pict w14:anchorId="2240C604">
+          <v:shape id="_x0000_i1031" type="#_x0000_t75" style="width:346.2pt;height:139.2pt;visibility:visible">
             <v:imagedata r:id="rId15" o:title=""/>
           </v:shape>
         </w:pict>
@@ -8043,19 +8022,19 @@
       <w:pPr>
         <w:pStyle w:val="Legenda"/>
       </w:pPr>
-      <w:bookmarkStart w:id="4" w:name="_Ref232178308"/>
+      <w:bookmarkStart w:id="5" w:name="_Ref232178690"/>
       <w:r>
         <w:t>Fig.</w:t>
       </w:r>
-      <w:bookmarkEnd w:id="4"/>
+      <w:bookmarkEnd w:id="5"/>
       <w:r>
         <w:t xml:space="preserve"> </w:t>
       </w:r>
       <w:r>
-        <w:t>6</w:t>
-      </w:r>
-      <w:r>
-        <w:t>. Diagrama de classes de modelo que serão utilizadas na aplicação</w:t>
+        <w:t>7</w:t>
+      </w:r>
+      <w:r>
+        <w:t>. Diagrama de classes de exceções que serão utilizadas na aplicação</w:t>
       </w:r>
     </w:p>
     <w:p>
@@ -8069,20 +8048,19 @@
         <w:rPr>
           <w:lang w:val="pt-BR" w:eastAsia="pt-PT"/>
         </w:rPr>
-        <w:lastRenderedPageBreak/>
-        <w:t>10</w:t>
+        <w:t>1</w:t>
       </w:r>
       <w:r>
         <w:rPr>
           <w:lang w:val="pt-BR" w:eastAsia="pt-PT"/>
         </w:rPr>
-        <w:t xml:space="preserve">   </w:t>
+        <w:t>1</w:t>
       </w:r>
       <w:r>
         <w:rPr>
           <w:lang w:val="pt-BR" w:eastAsia="pt-PT"/>
         </w:rPr>
-        <w:t>Diagrama de Classes de Exceções</w:t>
+        <w:t xml:space="preserve">   Interface de Usuário</w:t>
       </w:r>
     </w:p>
     <w:p>
@@ -8096,39 +8074,68 @@
         <w:rPr>
           <w:lang w:val="pt-BR" w:eastAsia="pt-PT"/>
         </w:rPr>
-        <w:t>Para o tratamento de erros e a validação de dados, foram definidas três classes de exceções personalizadas: DuplicatedDataException, InvalidDataException e NoDataException. Estas derivam da classe std::exception O diagrama seguinte (</w:t>
+        <w:t>A interface de usuário</w:t>
       </w:r>
       <w:r>
         <w:rPr>
           <w:lang w:val="pt-BR" w:eastAsia="pt-PT"/>
         </w:rPr>
+        <w:t xml:space="preserve"> (</w:t>
+      </w:r>
+      <w:r>
+        <w:rPr>
+          <w:lang w:val="pt-BR" w:eastAsia="pt-PT"/>
+        </w:rPr>
         <w:t xml:space="preserve">Fig. </w:t>
       </w:r>
       <w:r>
         <w:rPr>
           <w:lang w:val="pt-BR" w:eastAsia="pt-PT"/>
         </w:rPr>
-        <w:t>7</w:t>
+        <w:t>8</w:t>
       </w:r>
       <w:r>
         <w:rPr>
           <w:lang w:val="pt-BR" w:eastAsia="pt-PT"/>
         </w:rPr>
-        <w:t>) apresenta estas classes, bem como os respetivos atributos e métodos.</w:t>
-      </w:r>
-    </w:p>
-    <w:p>
-      <w:pPr>
-        <w:pStyle w:val="p1a"/>
+        <w:t>)</w:t>
+      </w:r>
+      <w:r>
         <w:rPr>
           <w:lang w:val="pt-BR" w:eastAsia="pt-PT"/>
         </w:rPr>
-      </w:pPr>
+        <w:t xml:space="preserve"> </w:t>
+      </w:r>
+      <w:r>
+        <w:rPr>
+          <w:lang w:val="pt-BR" w:eastAsia="pt-PT"/>
+        </w:rPr>
+        <w:t xml:space="preserve">mostra o </w:t>
+      </w:r>
+      <w:r>
+        <w:rPr>
+          <w:lang w:val="pt-BR" w:eastAsia="pt-PT"/>
+        </w:rPr>
+        <w:t>funcionamento</w:t>
+      </w:r>
+      <w:r>
+        <w:rPr>
+          <w:lang w:val="pt-BR" w:eastAsia="pt-PT"/>
+        </w:rPr>
+        <w:t xml:space="preserve"> da aplicação do ponto de vista do usuário, isto é, a estrutura das interfaces pelas quais o utilizador irá navegar para </w:t>
+      </w:r>
+      <w:r>
+        <w:rPr>
+          <w:lang w:val="pt-BR" w:eastAsia="pt-PT"/>
+        </w:rPr>
+        <w:t>aceder aos diferentes menus do sistema: menu de login, menu principal, novo jogo, dificuldade, posicionamento dos navios, tipo de ranking, estatísticas e ajuda e regras, e especificando as opções disponíveis em cada menu.</w:t>
+      </w:r>
     </w:p>
     <w:p>
       <w:pPr>
         <w:pStyle w:val="p1a"/>
         <w:keepNext/>
+        <w:jc w:val="center"/>
         <w:rPr>
           <w:lang w:val="pt-BR"/>
         </w:rPr>
@@ -8138,8 +8145,9 @@
           <w:noProof/>
           <w:lang w:val="pt-BR" w:eastAsia="pt-PT"/>
         </w:rPr>
-        <w:pict w14:anchorId="2240C604">
-          <v:shape id="_x0000_i1032" type="#_x0000_t75" style="width:346.2pt;height:139.2pt;visibility:visible">
+        <w:lastRenderedPageBreak/>
+        <w:pict w14:anchorId="29F95681">
+          <v:shape id="_x0000_i1032" type="#_x0000_t75" style="width:334.8pt;height:271.8pt;visibility:visible">
             <v:imagedata r:id="rId16" o:title=""/>
           </v:shape>
         </w:pict>
@@ -8149,132 +8157,116 @@
       <w:pPr>
         <w:pStyle w:val="Legenda"/>
       </w:pPr>
-      <w:bookmarkStart w:id="5" w:name="_Ref232178690"/>
+      <w:bookmarkStart w:id="6" w:name="_Ref232179583"/>
       <w:r>
         <w:t>Fig.</w:t>
       </w:r>
-      <w:bookmarkEnd w:id="5"/>
+      <w:bookmarkEnd w:id="6"/>
       <w:r>
         <w:t xml:space="preserve"> </w:t>
       </w:r>
       <w:r>
-        <w:t>7</w:t>
-      </w:r>
-      <w:r>
-        <w:t>. Diagrama de classes de exceções que serão utilizadas na aplicação</w:t>
-      </w:r>
+        <w:t>8</w:t>
+      </w:r>
+      <w:r>
+        <w:t>. Interface de usuário da aplicação</w:t>
+      </w:r>
+    </w:p>
+    <w:p>
+      <w:pPr>
+        <w:rPr>
+          <w:bCs/>
+          <w:lang w:val="pt-BR"/>
+        </w:rPr>
+      </w:pPr>
     </w:p>
     <w:p>
       <w:pPr>
         <w:pStyle w:val="heading1"/>
         <w:rPr>
-          <w:lang w:val="pt-BR" w:eastAsia="pt-PT"/>
-        </w:rPr>
-      </w:pPr>
-      <w:r>
-        <w:rPr>
-          <w:lang w:val="pt-BR" w:eastAsia="pt-PT"/>
-        </w:rPr>
+          <w:lang w:val="pt-BR"/>
+        </w:rPr>
+      </w:pPr>
+      <w:r>
+        <w:rPr>
+          <w:lang w:val="pt-BR"/>
+        </w:rPr>
+        <w:lastRenderedPageBreak/>
         <w:t>1</w:t>
       </w:r>
       <w:r>
         <w:rPr>
-          <w:lang w:val="pt-BR" w:eastAsia="pt-PT"/>
+          <w:lang w:val="pt-BR"/>
+        </w:rPr>
+        <w:t>2</w:t>
+      </w:r>
+      <w:r>
+        <w:rPr>
+          <w:lang w:val="pt-BR"/>
+        </w:rPr>
+        <w:t xml:space="preserve">   Implementação</w:t>
+      </w:r>
+    </w:p>
+    <w:p>
+      <w:pPr>
+        <w:pStyle w:val="heading2"/>
+        <w:rPr>
+          <w:lang w:val="pt-BR"/>
+        </w:rPr>
+      </w:pPr>
+      <w:r>
+        <w:rPr>
+          <w:lang w:val="pt-BR"/>
         </w:rPr>
         <w:t>1</w:t>
       </w:r>
       <w:r>
         <w:rPr>
-          <w:lang w:val="pt-BR" w:eastAsia="pt-PT"/>
-        </w:rPr>
-        <w:t xml:space="preserve">   Interface de Usuário</w:t>
-      </w:r>
-    </w:p>
-    <w:p>
-      <w:pPr>
-        <w:pStyle w:val="p1a"/>
-        <w:rPr>
-          <w:lang w:val="pt-BR" w:eastAsia="pt-PT"/>
-        </w:rPr>
-      </w:pPr>
-      <w:r>
-        <w:rPr>
-          <w:lang w:val="pt-BR" w:eastAsia="pt-PT"/>
-        </w:rPr>
-        <w:t>A interface de usuário</w:t>
-      </w:r>
-      <w:r>
-        <w:rPr>
-          <w:lang w:val="pt-BR" w:eastAsia="pt-PT"/>
-        </w:rPr>
-        <w:t xml:space="preserve"> (</w:t>
-      </w:r>
-      <w:r>
-        <w:rPr>
-          <w:lang w:val="pt-BR" w:eastAsia="pt-PT"/>
-        </w:rPr>
-        <w:t xml:space="preserve">Fig. </w:t>
-      </w:r>
-      <w:r>
-        <w:rPr>
-          <w:lang w:val="pt-BR" w:eastAsia="pt-PT"/>
-        </w:rPr>
-        <w:t>8</w:t>
-      </w:r>
-      <w:r>
-        <w:rPr>
-          <w:lang w:val="pt-BR" w:eastAsia="pt-PT"/>
-        </w:rPr>
-        <w:t>)</w:t>
-      </w:r>
-      <w:r>
-        <w:rPr>
-          <w:lang w:val="pt-BR" w:eastAsia="pt-PT"/>
+          <w:lang w:val="pt-BR"/>
+        </w:rPr>
+        <w:t>2</w:t>
+      </w:r>
+      <w:r>
+        <w:rPr>
+          <w:lang w:val="pt-BR"/>
+        </w:rPr>
+        <w:t>.1</w:t>
+      </w:r>
+      <w:r>
+        <w:rPr>
+          <w:lang w:val="pt-BR"/>
         </w:rPr>
         <w:t xml:space="preserve"> </w:t>
       </w:r>
       <w:r>
         <w:rPr>
-          <w:lang w:val="pt-BR" w:eastAsia="pt-PT"/>
-        </w:rPr>
-        <w:t xml:space="preserve">mostra o </w:t>
-      </w:r>
-      <w:r>
-        <w:rPr>
-          <w:lang w:val="pt-BR" w:eastAsia="pt-PT"/>
-        </w:rPr>
-        <w:t>funcionamento</w:t>
-      </w:r>
-      <w:r>
-        <w:rPr>
-          <w:lang w:val="pt-BR" w:eastAsia="pt-PT"/>
-        </w:rPr>
-        <w:t xml:space="preserve"> da aplicação do ponto de vista do usuário, isto é, a estrutura das interfaces pelas quais o utilizador irá navegar para </w:t>
-      </w:r>
-      <w:r>
-        <w:rPr>
-          <w:lang w:val="pt-BR" w:eastAsia="pt-PT"/>
-        </w:rPr>
-        <w:t>aceder aos diferentes menus do sistema: menu de login, menu principal, novo jogo, dificuldade, posicionamento dos navios, tipo de ranking, estatísticas e ajuda e regras, e especificando as opções disponíveis em cada menu.</w:t>
-      </w:r>
-    </w:p>
-    <w:p>
-      <w:pPr>
-        <w:pStyle w:val="p1a"/>
-        <w:keepNext/>
+          <w:lang w:val="pt-BR"/>
+        </w:rPr>
+        <w:t xml:space="preserve">  </w:t>
+      </w:r>
+      <w:r>
+        <w:rPr>
+          <w:lang w:val="pt-BR"/>
+        </w:rPr>
+        <w:t>DTO</w:t>
+      </w:r>
+    </w:p>
+    <w:p>
+      <w:pPr>
+        <w:ind w:firstLine="0"/>
         <w:jc w:val="center"/>
-        <w:rPr>
-          <w:lang w:val="pt-BR"/>
-        </w:rPr>
-      </w:pPr>
-      <w:r>
         <w:rPr>
           <w:noProof/>
           <w:lang w:val="pt-BR" w:eastAsia="pt-PT"/>
         </w:rPr>
-        <w:lastRenderedPageBreak/>
-        <w:pict w14:anchorId="29F95681">
-          <v:shape id="_x0000_i1033" type="#_x0000_t75" style="width:334.8pt;height:271.8pt;visibility:visible">
+      </w:pPr>
+      <w:r>
+        <w:rPr>
+          <w:noProof/>
+          <w:lang w:val="pt-BR" w:eastAsia="pt-PT"/>
+        </w:rPr>
+        <w:pict w14:anchorId="174F1BEB">
+          <v:shape id="_x0000_i1033" type="#_x0000_t75" style="width:159pt;height:152.4pt;visibility:visible;mso-wrap-style:square">
             <v:imagedata r:id="rId17" o:title=""/>
           </v:shape>
         </w:pict>
@@ -8284,103 +8276,88 @@
       <w:pPr>
         <w:pStyle w:val="Legenda"/>
       </w:pPr>
-      <w:bookmarkStart w:id="6" w:name="_Ref232179583"/>
-      <w:r>
-        <w:t>Fig.</w:t>
-      </w:r>
-      <w:bookmarkEnd w:id="6"/>
-      <w:r>
-        <w:t xml:space="preserve"> </w:t>
-      </w:r>
-      <w:r>
-        <w:t>8</w:t>
-      </w:r>
-      <w:r>
-        <w:t>. Interface de usuário da aplicação</w:t>
-      </w:r>
-    </w:p>
-    <w:p>
-      <w:pPr>
-        <w:rPr>
-          <w:bCs/>
-          <w:lang w:val="pt-BR"/>
-        </w:rPr>
-      </w:pPr>
-    </w:p>
-    <w:p>
-      <w:pPr>
-        <w:pStyle w:val="heading1"/>
-        <w:rPr>
-          <w:lang w:val="pt-BR"/>
-        </w:rPr>
-      </w:pPr>
-      <w:r>
-        <w:rPr>
-          <w:lang w:val="pt-BR"/>
-        </w:rPr>
-        <w:lastRenderedPageBreak/>
+      <w:r>
+        <w:t xml:space="preserve">Fig. </w:t>
+      </w:r>
+      <w:r>
+        <w:t>9</w:t>
+      </w:r>
+      <w:r>
+        <w:t>. Código de PlayerDTO</w:t>
+      </w:r>
+      <w:r>
+        <w:t>.h</w:t>
+      </w:r>
+    </w:p>
+    <w:p>
+      <w:pPr>
+        <w:pStyle w:val="Legenda"/>
+        <w:jc w:val="both"/>
+        <w:rPr>
+          <w:rStyle w:val="p1aZchn"/>
+          <w:b/>
+          <w:sz w:val="20"/>
+          <w:lang w:val="pt-BR"/>
+        </w:rPr>
+      </w:pPr>
+      <w:r>
+        <w:rPr>
+          <w:rStyle w:val="p1aZchn"/>
+          <w:sz w:val="20"/>
+          <w:lang w:val="pt-BR"/>
+        </w:rPr>
+        <w:t xml:space="preserve">PlayerDTO é uma estrutura que transporta os dados do jogador entre camadas </w:t>
+      </w:r>
+      <w:r>
+        <w:rPr>
+          <w:rStyle w:val="p1aZchn"/>
+          <w:sz w:val="20"/>
+          <w:lang w:val="pt-BR"/>
+        </w:rPr>
+        <w:t>(Services, Controller e View). A</w:t>
+      </w:r>
+      <w:r>
+        <w:rPr>
+          <w:rStyle w:val="p1aZchn"/>
+          <w:sz w:val="20"/>
+          <w:lang w:val="pt-BR"/>
+        </w:rPr>
+        <w:t>penas armazena campos como nickname, estatísticas e precisão. Isto evita que a lógica de domínio seja exposta à interface.</w:t>
+      </w:r>
+    </w:p>
+    <w:p>
+      <w:pPr>
+        <w:pStyle w:val="heading2"/>
+        <w:rPr>
+          <w:rStyle w:val="p1aZchn"/>
+          <w:lang w:val="pt-BR"/>
+        </w:rPr>
+      </w:pPr>
+      <w:r>
+        <w:rPr>
+          <w:rStyle w:val="p1aZchn"/>
+          <w:lang w:val="pt-BR"/>
+        </w:rPr>
         <w:t>1</w:t>
       </w:r>
       <w:r>
         <w:rPr>
+          <w:rStyle w:val="p1aZchn"/>
           <w:lang w:val="pt-BR"/>
         </w:rPr>
         <w:t>2</w:t>
       </w:r>
       <w:r>
         <w:rPr>
-          <w:lang w:val="pt-BR"/>
-        </w:rPr>
-        <w:t xml:space="preserve">   Implementação</w:t>
-      </w:r>
-    </w:p>
-    <w:p>
-      <w:pPr>
-        <w:pStyle w:val="heading2"/>
-        <w:rPr>
-          <w:lang w:val="pt-BR"/>
-        </w:rPr>
-      </w:pPr>
-      <w:r>
-        <w:rPr>
-          <w:lang w:val="pt-BR"/>
-        </w:rPr>
-        <w:t>1</w:t>
-      </w:r>
-      <w:r>
-        <w:rPr>
-          <w:lang w:val="pt-BR"/>
-        </w:rPr>
-        <w:t>2</w:t>
-      </w:r>
-      <w:r>
-        <w:rPr>
-          <w:lang w:val="pt-BR"/>
-        </w:rPr>
-        <w:t>.1</w:t>
-      </w:r>
-      <w:r>
-        <w:rPr>
-          <w:lang w:val="pt-BR"/>
-        </w:rPr>
-        <w:t xml:space="preserve"> </w:t>
-      </w:r>
-      <w:r>
-        <w:rPr>
-          <w:lang w:val="pt-BR"/>
-        </w:rPr>
-        <w:t xml:space="preserve">  </w:t>
-      </w:r>
-      <w:r>
-        <w:rPr>
-          <w:lang w:val="pt-BR"/>
-        </w:rPr>
-        <w:t>DTO</w:t>
-      </w:r>
-    </w:p>
-    <w:p>
-      <w:pPr>
-        <w:ind w:firstLine="0"/>
+          <w:rStyle w:val="p1aZchn"/>
+          <w:lang w:val="pt-BR"/>
+        </w:rPr>
+        <w:t>.2   Exceptions</w:t>
+      </w:r>
+    </w:p>
+    <w:p>
+      <w:pPr>
+        <w:pStyle w:val="p1a"/>
         <w:jc w:val="center"/>
         <w:rPr>
           <w:noProof/>
@@ -8392,8 +8369,8 @@
           <w:noProof/>
           <w:lang w:val="pt-BR" w:eastAsia="pt-PT"/>
         </w:rPr>
-        <w:pict w14:anchorId="174F1BEB">
-          <v:shape id="_x0000_i1034" type="#_x0000_t75" style="width:159pt;height:152.4pt;visibility:visible;mso-wrap-style:square">
+        <w:pict w14:anchorId="01F5E132">
+          <v:shape id="_x0000_i1034" type="#_x0000_t75" style="width:300.6pt;height:118.2pt;visibility:visible;mso-wrap-style:square">
             <v:imagedata r:id="rId18" o:title=""/>
           </v:shape>
         </w:pict>
@@ -8407,13 +8384,601 @@
         <w:t xml:space="preserve">Fig. </w:t>
       </w:r>
       <w:r>
+        <w:t>10</w:t>
+      </w:r>
+      <w:r>
+        <w:t>. Código de InvalidDataException.h</w:t>
+      </w:r>
+    </w:p>
+    <w:p>
+      <w:pPr>
+        <w:pStyle w:val="p1a"/>
+        <w:jc w:val="center"/>
+        <w:rPr>
+          <w:noProof/>
+          <w:lang w:val="pt-BR" w:eastAsia="pt-PT"/>
+        </w:rPr>
+      </w:pPr>
+      <w:r>
+        <w:rPr>
+          <w:noProof/>
+          <w:lang w:val="pt-BR" w:eastAsia="pt-PT"/>
+        </w:rPr>
+        <w:lastRenderedPageBreak/>
+        <w:pict w14:anchorId="676740B9">
+          <v:shape id="_x0000_i1035" type="#_x0000_t75" style="width:353.4pt;height:106.8pt;visibility:visible;mso-wrap-style:square">
+            <v:imagedata r:id="rId19" o:title=""/>
+          </v:shape>
+        </w:pict>
+      </w:r>
+    </w:p>
+    <w:p>
+      <w:pPr>
+        <w:pStyle w:val="Legenda"/>
+      </w:pPr>
+      <w:r>
+        <w:t xml:space="preserve">Fig. </w:t>
+      </w:r>
+      <w:r>
+        <w:t>11</w:t>
+      </w:r>
+      <w:r>
+        <w:t>. Código de InvalidDataException.cpp</w:t>
+      </w:r>
+    </w:p>
+    <w:p>
+      <w:pPr>
+        <w:pStyle w:val="p1a"/>
+        <w:rPr>
+          <w:lang w:val="pt-BR"/>
+        </w:rPr>
+      </w:pPr>
+      <w:r>
+        <w:rPr>
+          <w:lang w:val="pt-BR"/>
+        </w:rPr>
+        <w:t xml:space="preserve">InvalidDataException é uma exceção personalizada que herda de std::exception, ela recebe uma mensagem de erro e o método what() </w:t>
+      </w:r>
+      <w:r>
+        <w:rPr>
+          <w:lang w:val="pt-BR"/>
+        </w:rPr>
+        <w:t xml:space="preserve">e </w:t>
+      </w:r>
+      <w:r>
+        <w:rPr>
+          <w:lang w:val="pt-BR"/>
+        </w:rPr>
+        <w:t>devolve essa mensagem, permitindo que o Controller mostre o erro ao utilizador de forma simples. As exceções NoDataException e DuplicatedDataException funcionam da mesma forma, mudando apenas a mensagem apresentada.</w:t>
+      </w:r>
+    </w:p>
+    <w:p>
+      <w:pPr>
+        <w:pStyle w:val="heading2"/>
+        <w:rPr>
+          <w:lang w:val="pt-BR"/>
+        </w:rPr>
+      </w:pPr>
+      <w:r>
+        <w:rPr>
+          <w:lang w:val="pt-BR"/>
+        </w:rPr>
+        <w:t>1</w:t>
+      </w:r>
+      <w:r>
+        <w:rPr>
+          <w:lang w:val="pt-BR"/>
+        </w:rPr>
+        <w:t>2</w:t>
+      </w:r>
+      <w:r>
+        <w:rPr>
+          <w:lang w:val="pt-BR"/>
+        </w:rPr>
+        <w:t>.3   Model</w:t>
+      </w:r>
+    </w:p>
+    <w:p>
+      <w:pPr>
+        <w:pStyle w:val="heading2"/>
+        <w:jc w:val="center"/>
+        <w:rPr>
+          <w:noProof/>
+          <w:lang w:val="pt-BR" w:eastAsia="pt-PT"/>
+        </w:rPr>
+      </w:pPr>
+      <w:r>
+        <w:rPr>
+          <w:noProof/>
+          <w:lang w:val="pt-BR" w:eastAsia="pt-PT"/>
+        </w:rPr>
+        <w:pict w14:anchorId="47FBF954">
+          <v:shape id="_x0000_i1036" type="#_x0000_t75" style="width:309pt;height:242.4pt;visibility:visible;mso-wrap-style:square">
+            <v:imagedata r:id="rId20" o:title=""/>
+          </v:shape>
+        </w:pict>
+      </w:r>
+    </w:p>
+    <w:p>
+      <w:pPr>
+        <w:pStyle w:val="Legenda"/>
+      </w:pPr>
+      <w:r>
+        <w:t>Fig.1</w:t>
+      </w:r>
+      <w:r>
+        <w:t>2</w:t>
+      </w:r>
+      <w:r>
+        <w:t>. Código de Board.h</w:t>
+      </w:r>
+    </w:p>
+    <w:p>
+      <w:pPr>
+        <w:pStyle w:val="heading2"/>
+        <w:jc w:val="center"/>
+        <w:rPr>
+          <w:noProof/>
+          <w:lang w:val="pt-BR" w:eastAsia="pt-PT"/>
+        </w:rPr>
+      </w:pPr>
+      <w:r>
+        <w:rPr>
+          <w:noProof/>
+          <w:lang w:val="pt-BR" w:eastAsia="pt-PT"/>
+        </w:rPr>
+        <w:lastRenderedPageBreak/>
+        <w:pict w14:anchorId="772D06E1">
+          <v:shape id="_x0000_i1037" type="#_x0000_t75" style="width:317.4pt;height:188.4pt;visibility:visible;mso-wrap-style:square">
+            <v:imagedata r:id="rId21" o:title=""/>
+          </v:shape>
+        </w:pict>
+      </w:r>
+    </w:p>
+    <w:p>
+      <w:pPr>
+        <w:pStyle w:val="Legenda"/>
+      </w:pPr>
+      <w:r>
+        <w:t>Fig. 1</w:t>
+      </w:r>
+      <w:r>
+        <w:t>3</w:t>
+      </w:r>
+      <w:r>
+        <w:t>. Código de validatePosi</w:t>
+      </w:r>
+      <w:r>
+        <w:t xml:space="preserve">tion() </w:t>
+      </w:r>
+      <w:r>
+        <w:t xml:space="preserve">em </w:t>
+      </w:r>
+      <w:r>
+        <w:t>Board.cpp</w:t>
+      </w:r>
+    </w:p>
+    <w:p>
+      <w:pPr>
+        <w:pStyle w:val="Legenda"/>
+        <w:jc w:val="both"/>
+      </w:pPr>
+      <w:r>
+        <w:rPr>
+          <w:rStyle w:val="p1aZchn"/>
+          <w:sz w:val="20"/>
+          <w:lang w:val="pt-BR"/>
+        </w:rPr>
+        <w:t>Board representa o tabuleiro do jogo, com uma grelha de 10x10 onde cada posição pode conter água, navio, acerto ou falha. O método validatePosition() verifica se um navio pode ser colocado numa determinada posição, garantindo que não fica encostado a outros navios. Já os métodos placeShip() e registerShot() atualizam o estado do tabuleiro, enquanto allShipsSunk() verifica se todos os navios foram afundados e se o jogo terminou</w:t>
+      </w:r>
+      <w:r>
+        <w:t>.</w:t>
+      </w:r>
+    </w:p>
+    <w:p>
+      <w:pPr>
+        <w:pStyle w:val="heading2"/>
+        <w:rPr>
+          <w:lang w:val="pt-BR"/>
+        </w:rPr>
+      </w:pPr>
+      <w:r>
+        <w:rPr>
+          <w:lang w:val="pt-BR"/>
+        </w:rPr>
+        <w:t>1</w:t>
+      </w:r>
+      <w:r>
+        <w:rPr>
+          <w:lang w:val="pt-BR"/>
+        </w:rPr>
+        <w:t>2</w:t>
+      </w:r>
+      <w:r>
+        <w:rPr>
+          <w:lang w:val="pt-BR"/>
+        </w:rPr>
+        <w:t xml:space="preserve">.4 </w:t>
+      </w:r>
+      <w:r>
+        <w:rPr>
+          <w:lang w:val="pt-BR"/>
+        </w:rPr>
+        <w:t xml:space="preserve">  </w:t>
+      </w:r>
+      <w:r>
+        <w:rPr>
+          <w:lang w:val="pt-BR"/>
+        </w:rPr>
+        <w:t>Mappers</w:t>
+      </w:r>
+    </w:p>
+    <w:p>
+      <w:pPr>
+        <w:pStyle w:val="p1a"/>
+        <w:jc w:val="center"/>
+        <w:rPr>
+          <w:noProof/>
+          <w:lang w:val="pt-BR" w:eastAsia="pt-PT"/>
+        </w:rPr>
+      </w:pPr>
+      <w:r>
+        <w:rPr>
+          <w:noProof/>
+          <w:lang w:val="pt-BR" w:eastAsia="pt-PT"/>
+        </w:rPr>
+        <w:pict w14:anchorId="4C7A1D6E">
+          <v:shape id="_x0000_i1038" type="#_x0000_t75" style="width:320.4pt;height:63pt;visibility:visible;mso-wrap-style:square">
+            <v:imagedata r:id="rId22" o:title=""/>
+          </v:shape>
+        </w:pict>
+      </w:r>
+    </w:p>
+    <w:p>
+      <w:pPr>
+        <w:pStyle w:val="Legenda"/>
+      </w:pPr>
+      <w:r>
+        <w:t>Fig. 1</w:t>
+      </w:r>
+      <w:r>
+        <w:t>4</w:t>
+      </w:r>
+      <w:r>
+        <w:t>. Código de BoardMapper.h</w:t>
+      </w:r>
+    </w:p>
+    <w:p>
+      <w:pPr>
+        <w:jc w:val="center"/>
+        <w:rPr>
+          <w:noProof/>
+          <w:lang w:val="pt-BR" w:eastAsia="pt-PT"/>
+        </w:rPr>
+      </w:pPr>
+      <w:r>
+        <w:rPr>
+          <w:noProof/>
+          <w:lang w:val="pt-BR" w:eastAsia="pt-PT"/>
+        </w:rPr>
+        <w:lastRenderedPageBreak/>
+        <w:pict w14:anchorId="15ADAE60">
+          <v:shape id="_x0000_i1039" type="#_x0000_t75" style="width:284.4pt;height:184.2pt;visibility:visible;mso-wrap-style:square">
+            <v:imagedata r:id="rId23" o:title=""/>
+          </v:shape>
+        </w:pict>
+      </w:r>
+    </w:p>
+    <w:p>
+      <w:pPr>
+        <w:pStyle w:val="Legenda"/>
+      </w:pPr>
+      <w:r>
+        <w:t>Fig. 1</w:t>
+      </w:r>
+      <w:r>
+        <w:t>5</w:t>
+      </w:r>
+      <w:r>
+        <w:t>. Código de BoadMapper.cpp</w:t>
+      </w:r>
+    </w:p>
+    <w:p>
+      <w:pPr>
+        <w:pStyle w:val="p1a"/>
+        <w:rPr>
+          <w:rFonts w:ascii="Times New Roman" w:hAnsi="Times New Roman"/>
+          <w:lang w:val="pt-BR"/>
+        </w:rPr>
+      </w:pPr>
+      <w:r>
+        <w:rPr>
+          <w:rStyle w:val="Forte"/>
+          <w:rFonts w:ascii="Times New Roman" w:hAnsi="Times New Roman"/>
+          <w:b w:val="0"/>
+          <w:lang w:val="pt-BR"/>
+        </w:rPr>
+        <w:t>BoardMapper</w:t>
+      </w:r>
+      <w:r>
+        <w:rPr>
+          <w:rFonts w:ascii="Times New Roman" w:hAnsi="Times New Roman"/>
+          <w:lang w:val="pt-BR"/>
+        </w:rPr>
+        <w:t xml:space="preserve"> converte um objeto </w:t>
+      </w:r>
+      <w:r>
+        <w:rPr>
+          <w:rStyle w:val="CdigoHTML"/>
+          <w:rFonts w:ascii="Times New Roman" w:hAnsi="Times New Roman" w:cs="Times New Roman"/>
+          <w:lang w:val="pt-BR"/>
+        </w:rPr>
+        <w:t>Board</w:t>
+      </w:r>
+      <w:r>
+        <w:rPr>
+          <w:rFonts w:ascii="Times New Roman" w:hAnsi="Times New Roman"/>
+          <w:lang w:val="pt-BR"/>
+        </w:rPr>
+        <w:t xml:space="preserve"> num </w:t>
+      </w:r>
+      <w:r>
+        <w:rPr>
+          <w:rStyle w:val="CdigoHTML"/>
+          <w:rFonts w:ascii="Times New Roman" w:hAnsi="Times New Roman" w:cs="Times New Roman"/>
+          <w:lang w:val="pt-BR"/>
+        </w:rPr>
+        <w:t>BoardDTO</w:t>
+      </w:r>
+      <w:r>
+        <w:rPr>
+          <w:rFonts w:ascii="Times New Roman" w:hAnsi="Times New Roman"/>
+          <w:lang w:val="pt-BR"/>
+        </w:rPr>
+        <w:t xml:space="preserve">, copiando as informações necessárias para serem apresentadas na interface. Também utiliza o </w:t>
+      </w:r>
+      <w:r>
+        <w:rPr>
+          <w:rStyle w:val="CdigoHTML"/>
+          <w:rFonts w:ascii="Times New Roman" w:hAnsi="Times New Roman" w:cs="Times New Roman"/>
+          <w:lang w:val="pt-BR"/>
+        </w:rPr>
+        <w:t>ShipMapper</w:t>
+      </w:r>
+      <w:r>
+        <w:rPr>
+          <w:rFonts w:ascii="Times New Roman" w:hAnsi="Times New Roman"/>
+          <w:lang w:val="pt-BR"/>
+        </w:rPr>
+        <w:t xml:space="preserve"> para converter os navios da frota. O método é </w:t>
+      </w:r>
+      <w:r>
+        <w:rPr>
+          <w:rStyle w:val="CdigoHTML"/>
+          <w:rFonts w:ascii="Times New Roman" w:hAnsi="Times New Roman" w:cs="Times New Roman"/>
+          <w:lang w:val="pt-BR"/>
+        </w:rPr>
+        <w:t>static</w:t>
+      </w:r>
+      <w:r>
+        <w:rPr>
+          <w:rFonts w:ascii="Times New Roman" w:hAnsi="Times New Roman"/>
+          <w:lang w:val="pt-BR"/>
+        </w:rPr>
+        <w:t xml:space="preserve"> porque apenas realiza a conversão de dados e não precisa de guardar qualquer estado.</w:t>
+      </w:r>
+    </w:p>
+    <w:p>
+      <w:pPr>
+        <w:pStyle w:val="heading2"/>
+        <w:rPr>
+          <w:lang w:val="pt-BR"/>
+        </w:rPr>
+      </w:pPr>
+      <w:r>
+        <w:rPr>
+          <w:lang w:val="pt-BR"/>
+        </w:rPr>
+        <w:lastRenderedPageBreak/>
+        <w:t>1</w:t>
+      </w:r>
+      <w:r>
+        <w:rPr>
+          <w:lang w:val="pt-BR"/>
+        </w:rPr>
+        <w:t>2</w:t>
+      </w:r>
+      <w:r>
+        <w:rPr>
+          <w:lang w:val="pt-BR"/>
+        </w:rPr>
+        <w:t>.5   Repo</w:t>
+      </w:r>
+    </w:p>
+    <w:p>
+      <w:pPr>
+        <w:pStyle w:val="Legenda"/>
+      </w:pPr>
+      <w:r>
+        <w:pict w14:anchorId="1B6DD970">
+          <v:shape id="_x0000_i1040" type="#_x0000_t75" style="width:298.2pt;height:263.4pt;visibility:visible;mso-wrap-style:square">
+            <v:imagedata r:id="rId24" o:title=""/>
+          </v:shape>
+        </w:pict>
+      </w:r>
+    </w:p>
+    <w:p>
+      <w:pPr>
+        <w:pStyle w:val="Legenda"/>
+      </w:pPr>
+      <w:r>
+        <w:t>Fig. 1</w:t>
+      </w:r>
+      <w:r>
+        <w:t>6</w:t>
+      </w:r>
+      <w:r>
+        <w:t>. Código de ProfileRepositoryFile.h</w:t>
+      </w:r>
+    </w:p>
+    <w:p>
+      <w:pPr>
+        <w:ind w:firstLine="0"/>
+        <w:jc w:val="center"/>
+        <w:rPr>
+          <w:noProof/>
+          <w:lang w:val="pt-BR" w:eastAsia="pt-PT"/>
+        </w:rPr>
+      </w:pPr>
+      <w:r>
+        <w:rPr>
+          <w:noProof/>
+          <w:lang w:val="pt-BR" w:eastAsia="pt-PT"/>
+        </w:rPr>
+        <w:pict w14:anchorId="10781889">
+          <v:shape id="_x0000_i1041" type="#_x0000_t75" style="width:313.8pt;height:142.2pt;visibility:visible;mso-wrap-style:square">
+            <v:imagedata r:id="rId25" o:title=""/>
+          </v:shape>
+        </w:pict>
+      </w:r>
+    </w:p>
+    <w:p>
+      <w:pPr>
+        <w:pStyle w:val="Legenda"/>
+      </w:pPr>
+      <w:r>
+        <w:t>Fig. 1</w:t>
+      </w:r>
+      <w:r>
+        <w:t>7</w:t>
+      </w:r>
+      <w:r>
+        <w:t>. Código de save() em ProfileRepositoryFile.cpp</w:t>
+      </w:r>
+    </w:p>
+    <w:p>
+      <w:pPr>
+        <w:pStyle w:val="p1a"/>
+        <w:rPr>
+          <w:lang w:val="pt-BR"/>
+        </w:rPr>
+      </w:pPr>
+      <w:r>
+        <w:rPr>
+          <w:rStyle w:val="Forte"/>
+          <w:b w:val="0"/>
+          <w:lang w:val="pt-BR"/>
+        </w:rPr>
+        <w:t>ProfileRepositoryFile</w:t>
+      </w:r>
+      <w:r>
+        <w:rPr>
+          <w:lang w:val="pt-BR"/>
+        </w:rPr>
+        <w:t xml:space="preserve"> é a classe responsável por guardar e carregar os perfi</w:t>
+      </w:r>
+      <w:r>
+        <w:rPr>
+          <w:lang w:val="pt-BR"/>
+        </w:rPr>
+        <w:t>s dos jogadores num ficheiro de texto</w:t>
+      </w:r>
+      <w:r>
+        <w:rPr>
+          <w:lang w:val="pt-BR"/>
+        </w:rPr>
+        <w:t xml:space="preserve"> (players.txt). Os métodos load() e save() permitem ler e guardar os dados dos jogadores, mantendo as suas estatísticas entre diferentes execuções do programa.</w:t>
+      </w:r>
+    </w:p>
+    <w:p>
+      <w:pPr>
+        <w:pStyle w:val="heading2"/>
+        <w:rPr>
+          <w:lang w:val="pt-BR"/>
+        </w:rPr>
+      </w:pPr>
+      <w:r>
+        <w:rPr>
+          <w:lang w:val="pt-BR"/>
+        </w:rPr>
+        <w:lastRenderedPageBreak/>
+        <w:t>1</w:t>
+      </w:r>
+      <w:r>
+        <w:rPr>
+          <w:lang w:val="pt-BR"/>
+        </w:rPr>
+        <w:t>2</w:t>
+      </w:r>
+      <w:r>
+        <w:rPr>
+          <w:lang w:val="pt-BR"/>
+        </w:rPr>
+        <w:t>.6   Services</w:t>
+      </w:r>
+    </w:p>
+    <w:p>
+      <w:pPr>
+        <w:pStyle w:val="p1a"/>
+        <w:jc w:val="center"/>
+        <w:rPr>
+          <w:noProof/>
+          <w:lang w:val="pt-BR" w:eastAsia="pt-PT"/>
+        </w:rPr>
+      </w:pPr>
+      <w:r>
+        <w:rPr>
+          <w:noProof/>
+          <w:lang w:val="pt-BR" w:eastAsia="pt-PT"/>
+        </w:rPr>
+        <w:pict w14:anchorId="57831F45">
+          <v:shape id="_x0000_i1042" type="#_x0000_t75" style="width:297pt;height:229.2pt;visibility:visible;mso-wrap-style:square">
+            <v:imagedata r:id="rId26" o:title=""/>
+          </v:shape>
+        </w:pict>
+      </w:r>
+    </w:p>
+    <w:p>
+      <w:pPr>
+        <w:pStyle w:val="Legenda"/>
+      </w:pPr>
+      <w:r>
+        <w:t>Fig.1</w:t>
+      </w:r>
+      <w:r>
+        <w:t>8</w:t>
+      </w:r>
+      <w:r>
+        <w:t>. Código de PlayerService.h</w:t>
+      </w:r>
+    </w:p>
+    <w:p>
+      <w:pPr>
+        <w:pStyle w:val="Legenda"/>
+      </w:pPr>
+      <w:r>
+        <w:pict w14:anchorId="6E4C43A9">
+          <v:shape id="_x0000_i1043" type="#_x0000_t75" style="width:340.8pt;height:133.2pt;visibility:visible;mso-wrap-style:square">
+            <v:imagedata r:id="rId27" o:title=""/>
+          </v:shape>
+        </w:pict>
+      </w:r>
+    </w:p>
+    <w:p>
+      <w:pPr>
+        <w:pStyle w:val="Legenda"/>
+        <w:rPr>
+          <w:szCs w:val="24"/>
+        </w:rPr>
+      </w:pPr>
+      <w:r>
+        <w:t>Fig. 1</w:t>
+      </w:r>
+      <w:r>
         <w:t>9</w:t>
       </w:r>
       <w:r>
-        <w:t>. Código de PlayerDTO</w:t>
-      </w:r>
-      <w:r>
-        <w:t>.h</w:t>
+        <w:t>. Código de registerPlayer() em PlayerService</w:t>
       </w:r>
     </w:p>
     <w:p>
@@ -8433,58 +8998,39 @@
           <w:sz w:val="20"/>
           <w:lang w:val="pt-BR"/>
         </w:rPr>
-        <w:t xml:space="preserve">PlayerDTO é uma estrutura que transporta os dados do jogador entre camadas </w:t>
-      </w:r>
-      <w:r>
-        <w:rPr>
-          <w:rStyle w:val="p1aZchn"/>
-          <w:sz w:val="20"/>
-          <w:lang w:val="pt-BR"/>
-        </w:rPr>
-        <w:t>(Services, Controller e View). A</w:t>
-      </w:r>
-      <w:r>
-        <w:rPr>
-          <w:rStyle w:val="p1aZchn"/>
-          <w:sz w:val="20"/>
-          <w:lang w:val="pt-BR"/>
-        </w:rPr>
-        <w:t>penas armazena campos como nickname, estatísticas e precisão. Isto evita que a lógica de domínio seja exposta à interface.</w:t>
+        <w:t>PlayerService é a camada responsável pelas regras de negócio relacionadas com os jogadores. Faz validações no registo, verifica se já existem jogadores com o mesmo nome e obtém os rankings. Também organiza os jogadores com base nas vitórias ou na precisão. Em caso de erro, lança exceções específicas para que o Controller trate a situação adequadamente.</w:t>
       </w:r>
     </w:p>
     <w:p>
       <w:pPr>
         <w:pStyle w:val="heading2"/>
         <w:rPr>
-          <w:rStyle w:val="p1aZchn"/>
-          <w:lang w:val="pt-BR"/>
-        </w:rPr>
-      </w:pPr>
-      <w:r>
-        <w:rPr>
-          <w:rStyle w:val="p1aZchn"/>
-          <w:lang w:val="pt-BR"/>
-        </w:rPr>
+          <w:lang w:val="pt-BR"/>
+        </w:rPr>
+      </w:pPr>
+      <w:r>
+        <w:rPr>
+          <w:lang w:val="pt-BR"/>
+        </w:rPr>
+        <w:lastRenderedPageBreak/>
         <w:t>1</w:t>
       </w:r>
       <w:r>
         <w:rPr>
-          <w:rStyle w:val="p1aZchn"/>
           <w:lang w:val="pt-BR"/>
         </w:rPr>
         <w:t>2</w:t>
       </w:r>
       <w:r>
         <w:rPr>
-          <w:rStyle w:val="p1aZchn"/>
-          <w:lang w:val="pt-BR"/>
-        </w:rPr>
-        <w:t>.2   Exceptions</w:t>
-      </w:r>
-    </w:p>
-    <w:p>
-      <w:pPr>
-        <w:pStyle w:val="p1a"/>
+          <w:lang w:val="pt-BR"/>
+        </w:rPr>
+        <w:t>.7   View</w:t>
+      </w:r>
+    </w:p>
+    <w:p>
+      <w:pPr>
+        <w:ind w:firstLine="0"/>
         <w:jc w:val="center"/>
         <w:rPr>
           <w:noProof/>
@@ -8496,600 +9042,8 @@
           <w:noProof/>
           <w:lang w:val="pt-BR" w:eastAsia="pt-PT"/>
         </w:rPr>
-        <w:pict w14:anchorId="01F5E132">
-          <v:shape id="_x0000_i1035" type="#_x0000_t75" style="width:300.6pt;height:118.2pt;visibility:visible;mso-wrap-style:square">
-            <v:imagedata r:id="rId19" o:title=""/>
-          </v:shape>
-        </w:pict>
-      </w:r>
-    </w:p>
-    <w:p>
-      <w:pPr>
-        <w:pStyle w:val="Legenda"/>
-      </w:pPr>
-      <w:r>
-        <w:t xml:space="preserve">Fig. </w:t>
-      </w:r>
-      <w:r>
-        <w:t>10</w:t>
-      </w:r>
-      <w:r>
-        <w:t>. Código de InvalidDataException.h</w:t>
-      </w:r>
-    </w:p>
-    <w:p>
-      <w:pPr>
-        <w:pStyle w:val="p1a"/>
-        <w:jc w:val="center"/>
-        <w:rPr>
-          <w:noProof/>
-          <w:lang w:val="pt-BR" w:eastAsia="pt-PT"/>
-        </w:rPr>
-      </w:pPr>
-      <w:r>
-        <w:rPr>
-          <w:noProof/>
-          <w:lang w:val="pt-BR" w:eastAsia="pt-PT"/>
-        </w:rPr>
-        <w:lastRenderedPageBreak/>
-        <w:pict w14:anchorId="676740B9">
-          <v:shape id="_x0000_i1036" type="#_x0000_t75" style="width:353.4pt;height:106.8pt;visibility:visible;mso-wrap-style:square">
-            <v:imagedata r:id="rId20" o:title=""/>
-          </v:shape>
-        </w:pict>
-      </w:r>
-    </w:p>
-    <w:p>
-      <w:pPr>
-        <w:pStyle w:val="Legenda"/>
-      </w:pPr>
-      <w:r>
-        <w:t xml:space="preserve">Fig. </w:t>
-      </w:r>
-      <w:r>
-        <w:t>11</w:t>
-      </w:r>
-      <w:r>
-        <w:t>. Código de InvalidDataException.cpp</w:t>
-      </w:r>
-    </w:p>
-    <w:p>
-      <w:pPr>
-        <w:pStyle w:val="p1a"/>
-        <w:rPr>
-          <w:lang w:val="pt-BR"/>
-        </w:rPr>
-      </w:pPr>
-      <w:r>
-        <w:rPr>
-          <w:lang w:val="pt-BR"/>
-        </w:rPr>
-        <w:t xml:space="preserve">InvalidDataException é uma exceção personalizada que herda de std::exception, ela recebe uma mensagem de erro e o método what() </w:t>
-      </w:r>
-      <w:r>
-        <w:rPr>
-          <w:lang w:val="pt-BR"/>
-        </w:rPr>
-        <w:t xml:space="preserve">e </w:t>
-      </w:r>
-      <w:r>
-        <w:rPr>
-          <w:lang w:val="pt-BR"/>
-        </w:rPr>
-        <w:t>devolve essa mensagem, permitindo que o Controller mostre o erro ao utilizador de forma simples. As exceções NoDataException e DuplicatedDataException funcionam da mesma forma, mudando apenas a mensagem apresentada.</w:t>
-      </w:r>
-    </w:p>
-    <w:p>
-      <w:pPr>
-        <w:pStyle w:val="heading2"/>
-        <w:rPr>
-          <w:lang w:val="pt-BR"/>
-        </w:rPr>
-      </w:pPr>
-      <w:r>
-        <w:rPr>
-          <w:lang w:val="pt-BR"/>
-        </w:rPr>
-        <w:t>1</w:t>
-      </w:r>
-      <w:r>
-        <w:rPr>
-          <w:lang w:val="pt-BR"/>
-        </w:rPr>
-        <w:t>2</w:t>
-      </w:r>
-      <w:r>
-        <w:rPr>
-          <w:lang w:val="pt-BR"/>
-        </w:rPr>
-        <w:t>.3   Model</w:t>
-      </w:r>
-    </w:p>
-    <w:p>
-      <w:pPr>
-        <w:pStyle w:val="heading2"/>
-        <w:jc w:val="center"/>
-        <w:rPr>
-          <w:noProof/>
-          <w:lang w:val="pt-BR" w:eastAsia="pt-PT"/>
-        </w:rPr>
-      </w:pPr>
-      <w:r>
-        <w:rPr>
-          <w:noProof/>
-          <w:lang w:val="pt-BR" w:eastAsia="pt-PT"/>
-        </w:rPr>
-        <w:pict w14:anchorId="47FBF954">
-          <v:shape id="_x0000_i1037" type="#_x0000_t75" style="width:309pt;height:242.4pt;visibility:visible;mso-wrap-style:square">
-            <v:imagedata r:id="rId21" o:title=""/>
-          </v:shape>
-        </w:pict>
-      </w:r>
-    </w:p>
-    <w:p>
-      <w:pPr>
-        <w:pStyle w:val="Legenda"/>
-      </w:pPr>
-      <w:r>
-        <w:t>Fig.1</w:t>
-      </w:r>
-      <w:r>
-        <w:t>2</w:t>
-      </w:r>
-      <w:r>
-        <w:t>. Código de Board.h</w:t>
-      </w:r>
-    </w:p>
-    <w:p>
-      <w:pPr>
-        <w:pStyle w:val="heading2"/>
-        <w:jc w:val="center"/>
-        <w:rPr>
-          <w:noProof/>
-          <w:lang w:val="pt-BR" w:eastAsia="pt-PT"/>
-        </w:rPr>
-      </w:pPr>
-      <w:r>
-        <w:rPr>
-          <w:noProof/>
-          <w:lang w:val="pt-BR" w:eastAsia="pt-PT"/>
-        </w:rPr>
-        <w:lastRenderedPageBreak/>
-        <w:pict w14:anchorId="772D06E1">
-          <v:shape id="_x0000_i1038" type="#_x0000_t75" style="width:317.4pt;height:188.4pt;visibility:visible;mso-wrap-style:square">
-            <v:imagedata r:id="rId22" o:title=""/>
-          </v:shape>
-        </w:pict>
-      </w:r>
-    </w:p>
-    <w:p>
-      <w:pPr>
-        <w:pStyle w:val="Legenda"/>
-      </w:pPr>
-      <w:r>
-        <w:t>Fig. 1</w:t>
-      </w:r>
-      <w:r>
-        <w:t>3</w:t>
-      </w:r>
-      <w:r>
-        <w:t>. Código de validatePosi</w:t>
-      </w:r>
-      <w:r>
-        <w:t xml:space="preserve">tion() </w:t>
-      </w:r>
-      <w:r>
-        <w:t xml:space="preserve">em </w:t>
-      </w:r>
-      <w:r>
-        <w:t>Board.cpp</w:t>
-      </w:r>
-    </w:p>
-    <w:p>
-      <w:pPr>
-        <w:pStyle w:val="Legenda"/>
-        <w:jc w:val="both"/>
-      </w:pPr>
-      <w:r>
-        <w:rPr>
-          <w:rStyle w:val="p1aZchn"/>
-          <w:sz w:val="20"/>
-          <w:lang w:val="pt-BR"/>
-        </w:rPr>
-        <w:t>Board representa o tabuleiro do jogo, com uma grelha de 10x10 onde cada posição pode conter água, navio, acerto ou falha. O método validatePosition() verifica se um navio pode ser colocado numa determinada posição, garantindo que não fica encostado a outros navios. Já os métodos placeShip() e registerShot() atualizam o estado do tabuleiro, enquanto allShipsSunk() verifica se todos os navios foram afundados e se o jogo terminou</w:t>
-      </w:r>
-      <w:r>
-        <w:t>.</w:t>
-      </w:r>
-    </w:p>
-    <w:p>
-      <w:pPr>
-        <w:pStyle w:val="heading2"/>
-        <w:rPr>
-          <w:lang w:val="pt-BR"/>
-        </w:rPr>
-      </w:pPr>
-      <w:r>
-        <w:rPr>
-          <w:lang w:val="pt-BR"/>
-        </w:rPr>
-        <w:t>1</w:t>
-      </w:r>
-      <w:r>
-        <w:rPr>
-          <w:lang w:val="pt-BR"/>
-        </w:rPr>
-        <w:t>2</w:t>
-      </w:r>
-      <w:r>
-        <w:rPr>
-          <w:lang w:val="pt-BR"/>
-        </w:rPr>
-        <w:t xml:space="preserve">.4 </w:t>
-      </w:r>
-      <w:r>
-        <w:rPr>
-          <w:lang w:val="pt-BR"/>
-        </w:rPr>
-        <w:t xml:space="preserve">  </w:t>
-      </w:r>
-      <w:r>
-        <w:rPr>
-          <w:lang w:val="pt-BR"/>
-        </w:rPr>
-        <w:t>Mappers</w:t>
-      </w:r>
-    </w:p>
-    <w:p>
-      <w:pPr>
-        <w:pStyle w:val="p1a"/>
-        <w:jc w:val="center"/>
-        <w:rPr>
-          <w:noProof/>
-          <w:lang w:val="pt-BR" w:eastAsia="pt-PT"/>
-        </w:rPr>
-      </w:pPr>
-      <w:r>
-        <w:rPr>
-          <w:noProof/>
-          <w:lang w:val="pt-BR" w:eastAsia="pt-PT"/>
-        </w:rPr>
-        <w:pict w14:anchorId="4C7A1D6E">
-          <v:shape id="_x0000_i1039" type="#_x0000_t75" style="width:320.4pt;height:63pt;visibility:visible;mso-wrap-style:square">
-            <v:imagedata r:id="rId23" o:title=""/>
-          </v:shape>
-        </w:pict>
-      </w:r>
-    </w:p>
-    <w:p>
-      <w:pPr>
-        <w:pStyle w:val="Legenda"/>
-      </w:pPr>
-      <w:r>
-        <w:t>Fig. 1</w:t>
-      </w:r>
-      <w:r>
-        <w:t>4</w:t>
-      </w:r>
-      <w:r>
-        <w:t>. Código de BoardMapper.h</w:t>
-      </w:r>
-      <w:bookmarkStart w:id="7" w:name="_GoBack"/>
-      <w:bookmarkEnd w:id="7"/>
-    </w:p>
-    <w:p>
-      <w:pPr>
-        <w:jc w:val="center"/>
-        <w:rPr>
-          <w:noProof/>
-          <w:lang w:val="pt-BR" w:eastAsia="pt-PT"/>
-        </w:rPr>
-      </w:pPr>
-      <w:r>
-        <w:rPr>
-          <w:noProof/>
-          <w:lang w:val="pt-BR" w:eastAsia="pt-PT"/>
-        </w:rPr>
-        <w:lastRenderedPageBreak/>
-        <w:pict w14:anchorId="15ADAE60">
-          <v:shape id="_x0000_i1040" type="#_x0000_t75" style="width:284.4pt;height:184.2pt;visibility:visible;mso-wrap-style:square">
-            <v:imagedata r:id="rId24" o:title=""/>
-          </v:shape>
-        </w:pict>
-      </w:r>
-    </w:p>
-    <w:p>
-      <w:pPr>
-        <w:pStyle w:val="Legenda"/>
-      </w:pPr>
-      <w:r>
-        <w:t>Fig. 1</w:t>
-      </w:r>
-      <w:r>
-        <w:t>5</w:t>
-      </w:r>
-      <w:r>
-        <w:t>. Código de BoadMapper.cpp</w:t>
-      </w:r>
-    </w:p>
-    <w:p>
-      <w:pPr>
-        <w:pStyle w:val="p1a"/>
-        <w:rPr>
-          <w:rFonts w:ascii="Times New Roman" w:hAnsi="Times New Roman"/>
-          <w:lang w:val="pt-BR"/>
-        </w:rPr>
-      </w:pPr>
-      <w:r>
-        <w:rPr>
-          <w:rStyle w:val="Forte"/>
-          <w:rFonts w:ascii="Times New Roman" w:hAnsi="Times New Roman"/>
-          <w:b w:val="0"/>
-          <w:lang w:val="pt-BR"/>
-        </w:rPr>
-        <w:t>BoardMapper</w:t>
-      </w:r>
-      <w:r>
-        <w:rPr>
-          <w:rFonts w:ascii="Times New Roman" w:hAnsi="Times New Roman"/>
-          <w:lang w:val="pt-BR"/>
-        </w:rPr>
-        <w:t xml:space="preserve"> converte um objeto </w:t>
-      </w:r>
-      <w:r>
-        <w:rPr>
-          <w:rStyle w:val="CdigoHTML"/>
-          <w:rFonts w:ascii="Times New Roman" w:hAnsi="Times New Roman" w:cs="Times New Roman"/>
-          <w:lang w:val="pt-BR"/>
-        </w:rPr>
-        <w:t>Board</w:t>
-      </w:r>
-      <w:r>
-        <w:rPr>
-          <w:rFonts w:ascii="Times New Roman" w:hAnsi="Times New Roman"/>
-          <w:lang w:val="pt-BR"/>
-        </w:rPr>
-        <w:t xml:space="preserve"> num </w:t>
-      </w:r>
-      <w:r>
-        <w:rPr>
-          <w:rStyle w:val="CdigoHTML"/>
-          <w:rFonts w:ascii="Times New Roman" w:hAnsi="Times New Roman" w:cs="Times New Roman"/>
-          <w:lang w:val="pt-BR"/>
-        </w:rPr>
-        <w:t>BoardDTO</w:t>
-      </w:r>
-      <w:r>
-        <w:rPr>
-          <w:rFonts w:ascii="Times New Roman" w:hAnsi="Times New Roman"/>
-          <w:lang w:val="pt-BR"/>
-        </w:rPr>
-        <w:t xml:space="preserve">, copiando as informações necessárias para serem apresentadas na interface. Também utiliza o </w:t>
-      </w:r>
-      <w:r>
-        <w:rPr>
-          <w:rStyle w:val="CdigoHTML"/>
-          <w:rFonts w:ascii="Times New Roman" w:hAnsi="Times New Roman" w:cs="Times New Roman"/>
-          <w:lang w:val="pt-BR"/>
-        </w:rPr>
-        <w:t>ShipMapper</w:t>
-      </w:r>
-      <w:r>
-        <w:rPr>
-          <w:rFonts w:ascii="Times New Roman" w:hAnsi="Times New Roman"/>
-          <w:lang w:val="pt-BR"/>
-        </w:rPr>
-        <w:t xml:space="preserve"> para converter os navios da frota. O método é </w:t>
-      </w:r>
-      <w:r>
-        <w:rPr>
-          <w:rStyle w:val="CdigoHTML"/>
-          <w:rFonts w:ascii="Times New Roman" w:hAnsi="Times New Roman" w:cs="Times New Roman"/>
-          <w:lang w:val="pt-BR"/>
-        </w:rPr>
-        <w:t>static</w:t>
-      </w:r>
-      <w:r>
-        <w:rPr>
-          <w:rFonts w:ascii="Times New Roman" w:hAnsi="Times New Roman"/>
-          <w:lang w:val="pt-BR"/>
-        </w:rPr>
-        <w:t xml:space="preserve"> porque apenas realiza a conversão de dados e não precisa de guardar qualquer estado.</w:t>
-      </w:r>
-    </w:p>
-    <w:p>
-      <w:pPr>
-        <w:pStyle w:val="heading2"/>
-        <w:rPr>
-          <w:lang w:val="pt-BR"/>
-        </w:rPr>
-      </w:pPr>
-      <w:r>
-        <w:rPr>
-          <w:lang w:val="pt-BR"/>
-        </w:rPr>
-        <w:lastRenderedPageBreak/>
-        <w:t>1</w:t>
-      </w:r>
-      <w:r>
-        <w:rPr>
-          <w:lang w:val="pt-BR"/>
-        </w:rPr>
-        <w:t>2</w:t>
-      </w:r>
-      <w:r>
-        <w:rPr>
-          <w:lang w:val="pt-BR"/>
-        </w:rPr>
-        <w:t>.5   Repo</w:t>
-      </w:r>
-    </w:p>
-    <w:p>
-      <w:pPr>
-        <w:pStyle w:val="Legenda"/>
-      </w:pPr>
-      <w:r>
-        <w:pict w14:anchorId="1B6DD970">
-          <v:shape id="_x0000_i1041" type="#_x0000_t75" style="width:298.2pt;height:263.4pt;visibility:visible;mso-wrap-style:square">
-            <v:imagedata r:id="rId25" o:title=""/>
-          </v:shape>
-        </w:pict>
-      </w:r>
-    </w:p>
-    <w:p>
-      <w:pPr>
-        <w:pStyle w:val="Legenda"/>
-      </w:pPr>
-      <w:r>
-        <w:t>Fig. 1</w:t>
-      </w:r>
-      <w:r>
-        <w:t>6</w:t>
-      </w:r>
-      <w:r>
-        <w:t>. Código de ProfileRepositoryFile.h</w:t>
-      </w:r>
-    </w:p>
-    <w:p>
-      <w:pPr>
-        <w:ind w:firstLine="0"/>
-        <w:jc w:val="center"/>
-        <w:rPr>
-          <w:noProof/>
-          <w:lang w:val="pt-BR" w:eastAsia="pt-PT"/>
-        </w:rPr>
-      </w:pPr>
-      <w:r>
-        <w:rPr>
-          <w:noProof/>
-          <w:lang w:val="pt-BR" w:eastAsia="pt-PT"/>
-        </w:rPr>
-        <w:pict w14:anchorId="10781889">
-          <v:shape id="_x0000_i1042" type="#_x0000_t75" style="width:313.8pt;height:142.2pt;visibility:visible;mso-wrap-style:square">
-            <v:imagedata r:id="rId26" o:title=""/>
-          </v:shape>
-        </w:pict>
-      </w:r>
-    </w:p>
-    <w:p>
-      <w:pPr>
-        <w:pStyle w:val="Legenda"/>
-      </w:pPr>
-      <w:r>
-        <w:t>Fig. 1</w:t>
-      </w:r>
-      <w:r>
-        <w:t>7</w:t>
-      </w:r>
-      <w:r>
-        <w:t>. Código de save() em ProfileRepositoryFile.cpp</w:t>
-      </w:r>
-    </w:p>
-    <w:p>
-      <w:pPr>
-        <w:pStyle w:val="p1a"/>
-        <w:rPr>
-          <w:lang w:val="pt-BR"/>
-        </w:rPr>
-      </w:pPr>
-      <w:r>
-        <w:rPr>
-          <w:rStyle w:val="Forte"/>
-          <w:b w:val="0"/>
-          <w:lang w:val="pt-BR"/>
-        </w:rPr>
-        <w:t>ProfileRepositoryFile</w:t>
-      </w:r>
-      <w:r>
-        <w:rPr>
-          <w:lang w:val="pt-BR"/>
-        </w:rPr>
-        <w:t xml:space="preserve"> é a classe responsável por guardar e carregar os perfis dos jogadores num ficheiro CSV (players.txt). Utiliza o padrão </w:t>
-      </w:r>
-      <w:r>
-        <w:rPr>
-          <w:rStyle w:val="Forte"/>
-          <w:b w:val="0"/>
-          <w:lang w:val="pt-BR"/>
-        </w:rPr>
-        <w:t>Singleton</w:t>
-      </w:r>
-      <w:r>
-        <w:rPr>
-          <w:lang w:val="pt-BR"/>
-        </w:rPr>
-        <w:t>, garantindo que existe apenas uma instância da classe. Os métodos load() e save() permitem ler e guardar os dados dos jogadores, mantendo as suas estatísticas entre diferentes execuções do programa.</w:t>
-      </w:r>
-    </w:p>
-    <w:p>
-      <w:pPr>
-        <w:pStyle w:val="heading2"/>
-        <w:rPr>
-          <w:lang w:val="pt-BR"/>
-        </w:rPr>
-      </w:pPr>
-      <w:r>
-        <w:rPr>
-          <w:lang w:val="pt-BR"/>
-        </w:rPr>
-        <w:lastRenderedPageBreak/>
-        <w:t>1</w:t>
-      </w:r>
-      <w:r>
-        <w:rPr>
-          <w:lang w:val="pt-BR"/>
-        </w:rPr>
-        <w:t>2</w:t>
-      </w:r>
-      <w:r>
-        <w:rPr>
-          <w:lang w:val="pt-BR"/>
-        </w:rPr>
-        <w:t>.6   Services</w:t>
-      </w:r>
-    </w:p>
-    <w:p>
-      <w:pPr>
-        <w:pStyle w:val="p1a"/>
-        <w:jc w:val="center"/>
-        <w:rPr>
-          <w:noProof/>
-          <w:lang w:val="pt-BR" w:eastAsia="pt-PT"/>
-        </w:rPr>
-      </w:pPr>
-      <w:r>
-        <w:rPr>
-          <w:noProof/>
-          <w:lang w:val="pt-BR" w:eastAsia="pt-PT"/>
-        </w:rPr>
-        <w:pict w14:anchorId="57831F45">
-          <v:shape id="_x0000_i1043" type="#_x0000_t75" style="width:297pt;height:229.2pt;visibility:visible;mso-wrap-style:square">
-            <v:imagedata r:id="rId27" o:title=""/>
-          </v:shape>
-        </w:pict>
-      </w:r>
-    </w:p>
-    <w:p>
-      <w:pPr>
-        <w:pStyle w:val="Legenda"/>
-      </w:pPr>
-      <w:r>
-        <w:t>Fig.1</w:t>
-      </w:r>
-      <w:r>
-        <w:t>8</w:t>
-      </w:r>
-      <w:r>
-        <w:t>. Código de PlayerService.h</w:t>
-      </w:r>
-    </w:p>
-    <w:p>
-      <w:pPr>
-        <w:pStyle w:val="Legenda"/>
-      </w:pPr>
-      <w:r>
-        <w:pict w14:anchorId="6E4C43A9">
-          <v:shape id="_x0000_i1044" type="#_x0000_t75" style="width:340.8pt;height:133.2pt;visibility:visible;mso-wrap-style:square">
+        <w:pict w14:anchorId="763FE111">
+          <v:shape id="_x0000_i1044" type="#_x0000_t75" style="width:346.2pt;height:215.4pt;visibility:visible;mso-wrap-style:square">
             <v:imagedata r:id="rId28" o:title=""/>
           </v:shape>
         </w:pict>
@@ -9098,18 +9052,173 @@
     <w:p>
       <w:pPr>
         <w:pStyle w:val="Legenda"/>
-        <w:rPr>
-          <w:szCs w:val="24"/>
-        </w:rPr>
-      </w:pPr>
-      <w:r>
-        <w:t>Fig. 1</w:t>
-      </w:r>
-      <w:r>
-        <w:t>9</w:t>
-      </w:r>
-      <w:r>
-        <w:t>. Código de registerPlayer() em PlayerService</w:t>
+      </w:pPr>
+      <w:r>
+        <w:t xml:space="preserve">Fig. </w:t>
+      </w:r>
+      <w:r>
+        <w:t>20</w:t>
+      </w:r>
+      <w:r>
+        <w:t>. Código de View.h</w:t>
+      </w:r>
+    </w:p>
+    <w:p>
+      <w:pPr>
+        <w:ind w:firstLine="0"/>
+        <w:jc w:val="center"/>
+        <w:rPr>
+          <w:noProof/>
+          <w:lang w:val="pt-BR" w:eastAsia="pt-PT"/>
+        </w:rPr>
+      </w:pPr>
+      <w:r>
+        <w:rPr>
+          <w:noProof/>
+          <w:lang w:val="pt-BR" w:eastAsia="pt-PT"/>
+        </w:rPr>
+        <w:lastRenderedPageBreak/>
+        <w:pict w14:anchorId="6A559318">
+          <v:shape id="_x0000_i1045" type="#_x0000_t75" style="width:329.4pt;height:290.4pt;visibility:visible;mso-wrap-style:square">
+            <v:imagedata r:id="rId29" o:title=""/>
+          </v:shape>
+        </w:pict>
+      </w:r>
+    </w:p>
+    <w:p>
+      <w:pPr>
+        <w:pStyle w:val="Legenda"/>
+      </w:pPr>
+      <w:r>
+        <w:t xml:space="preserve">Fig. </w:t>
+      </w:r>
+      <w:r>
+        <w:t>21</w:t>
+      </w:r>
+      <w:r>
+        <w:t>. Código em showBoard() em View.cpp</w:t>
+      </w:r>
+    </w:p>
+    <w:p>
+      <w:pPr>
+        <w:pStyle w:val="p1a"/>
+        <w:rPr>
+          <w:lang w:val="pt-BR" w:eastAsia="pt-PT"/>
+        </w:rPr>
+      </w:pPr>
+      <w:r>
+        <w:rPr>
+          <w:rStyle w:val="Forte"/>
+          <w:b w:val="0"/>
+          <w:lang w:val="pt-BR"/>
+        </w:rPr>
+        <w:t>View</w:t>
+      </w:r>
+      <w:r>
+        <w:rPr>
+          <w:lang w:val="pt-BR"/>
+        </w:rPr>
+        <w:t xml:space="preserve"> é a classe responsável pela interação com o utilizador através da consola. Mostra o tabuleiro, recebe as jogadas e apresenta mensagens e resultados do jogo. Também oculta os navios do adver</w:t>
+      </w:r>
+      <w:r>
+        <w:rPr>
+          <w:lang w:val="pt-BR"/>
+        </w:rPr>
+        <w:t>sário durante a partida e exibi</w:t>
+      </w:r>
+      <w:r>
+        <w:rPr>
+          <w:lang w:val="pt-BR"/>
+        </w:rPr>
+        <w:t xml:space="preserve"> as estatísticas finais quando o jogo termina.</w:t>
+      </w:r>
+    </w:p>
+    <w:p>
+      <w:pPr>
+        <w:pStyle w:val="heading2"/>
+        <w:rPr>
+          <w:lang w:val="pt-BR"/>
+        </w:rPr>
+      </w:pPr>
+      <w:r>
+        <w:rPr>
+          <w:lang w:val="pt-BR"/>
+        </w:rPr>
+        <w:lastRenderedPageBreak/>
+        <w:t>1</w:t>
+      </w:r>
+      <w:r>
+        <w:rPr>
+          <w:lang w:val="pt-BR"/>
+        </w:rPr>
+        <w:t>2</w:t>
+      </w:r>
+      <w:r>
+        <w:rPr>
+          <w:lang w:val="pt-BR"/>
+        </w:rPr>
+        <w:t>.8   Controller</w:t>
+      </w:r>
+    </w:p>
+    <w:p>
+      <w:pPr>
+        <w:pStyle w:val="Legenda"/>
+      </w:pPr>
+      <w:r>
+        <w:pict w14:anchorId="1B5E44F9">
+          <v:shape id="_x0000_i1046" type="#_x0000_t75" style="width:237.6pt;height:345.6pt;visibility:visible;mso-wrap-style:square">
+            <v:imagedata r:id="rId30" o:title=""/>
+          </v:shape>
+        </w:pict>
+      </w:r>
+    </w:p>
+    <w:p>
+      <w:pPr>
+        <w:pStyle w:val="Legenda"/>
+      </w:pPr>
+      <w:r>
+        <w:t>Fig. 2</w:t>
+      </w:r>
+      <w:r>
+        <w:t>2</w:t>
+      </w:r>
+      <w:r>
+        <w:t>. Código de Controller.h</w:t>
+      </w:r>
+    </w:p>
+    <w:p>
+      <w:pPr>
+        <w:jc w:val="center"/>
+        <w:rPr>
+          <w:noProof/>
+          <w:lang w:val="pt-BR" w:eastAsia="pt-PT"/>
+        </w:rPr>
+      </w:pPr>
+      <w:r>
+        <w:rPr>
+          <w:noProof/>
+          <w:lang w:val="pt-BR" w:eastAsia="pt-PT"/>
+        </w:rPr>
+        <w:lastRenderedPageBreak/>
+        <w:pict w14:anchorId="447639AE">
+          <v:shape id="_x0000_i1047" type="#_x0000_t75" style="width:202.2pt;height:370.2pt;visibility:visible;mso-wrap-style:square">
+            <v:imagedata r:id="rId31" o:title=""/>
+          </v:shape>
+        </w:pict>
+      </w:r>
+    </w:p>
+    <w:p>
+      <w:pPr>
+        <w:pStyle w:val="Legenda"/>
+      </w:pPr>
+      <w:r>
+        <w:t>Fig. 2</w:t>
+      </w:r>
+      <w:r>
+        <w:t>3</w:t>
+      </w:r>
+      <w:r>
+        <w:t>. Código de runMain() em Controller.cpp</w:t>
       </w:r>
     </w:p>
     <w:p>
@@ -9129,91 +9238,166 @@
           <w:sz w:val="20"/>
           <w:lang w:val="pt-BR"/>
         </w:rPr>
-        <w:t>PlayerService é a camada responsável pelas regras de negócio relacionadas com os jogadores. Faz validações no registo, verifica se já existem jogadores com o mesmo nome e obtém os rankings. Também organiza os jogadores com base nas vitórias ou na precisão. Em caso de erro, lança exceções específicas para que o Controller trate a situação adequadamente.</w:t>
-      </w:r>
-    </w:p>
-    <w:p>
-      <w:pPr>
-        <w:pStyle w:val="heading2"/>
-        <w:rPr>
-          <w:lang w:val="pt-BR"/>
-        </w:rPr>
-      </w:pPr>
+        <w:t>Controller é a classe principal da aplicação, responsável por ligar a View, os Services e o Model. Controla o fluxo do programa, recebendo ações do utilizador, executando as regras de negócio e atualizando o estado do jogo. Além disso, organiza as diferentes funcionalidades em métodos separados.</w:t>
+      </w:r>
+      <w:bookmarkStart w:id="7" w:name="_GoBack"/>
+      <w:bookmarkEnd w:id="7"/>
+    </w:p>
+    <w:p>
+      <w:pPr>
+        <w:pStyle w:val="heading1"/>
+        <w:rPr>
+          <w:lang w:val="pt-BR"/>
+        </w:rPr>
+      </w:pPr>
+      <w:r>
+        <w:rPr>
+          <w:rStyle w:val="p1aZchn"/>
+          <w:b w:val="0"/>
+          <w:sz w:val="20"/>
+          <w:lang w:val="pt-BR"/>
+        </w:rPr>
+        <w:br w:type="page"/>
+      </w:r>
       <w:r>
         <w:rPr>
           <w:lang w:val="pt-BR"/>
         </w:rPr>
         <w:lastRenderedPageBreak/>
+        <w:br/>
+      </w:r>
+      <w:r>
+        <w:rPr>
+          <w:lang w:val="pt-BR"/>
+        </w:rPr>
         <w:t>1</w:t>
       </w:r>
       <w:r>
         <w:rPr>
           <w:lang w:val="pt-BR"/>
         </w:rPr>
-        <w:t>2</w:t>
-      </w:r>
-      <w:r>
-        <w:rPr>
-          <w:lang w:val="pt-BR"/>
-        </w:rPr>
-        <w:t>.7   View</w:t>
-      </w:r>
-    </w:p>
-    <w:p>
-      <w:pPr>
-        <w:ind w:firstLine="0"/>
-        <w:jc w:val="center"/>
-        <w:rPr>
-          <w:noProof/>
-          <w:lang w:val="pt-BR" w:eastAsia="pt-PT"/>
-        </w:rPr>
-      </w:pPr>
-      <w:r>
-        <w:rPr>
-          <w:noProof/>
-          <w:lang w:val="pt-BR" w:eastAsia="pt-PT"/>
-        </w:rPr>
-        <w:pict w14:anchorId="763FE111">
-          <v:shape id="_x0000_i1045" type="#_x0000_t75" style="width:346.2pt;height:215.4pt;visibility:visible;mso-wrap-style:square">
-            <v:imagedata r:id="rId29" o:title=""/>
-          </v:shape>
-        </w:pict>
+        <w:t>3</w:t>
+      </w:r>
+      <w:r>
+        <w:rPr>
+          <w:lang w:val="pt-BR"/>
+        </w:rPr>
+        <w:t xml:space="preserve">   Testes</w:t>
+      </w:r>
+    </w:p>
+    <w:p>
+      <w:pPr>
+        <w:pStyle w:val="p1a"/>
+        <w:rPr>
+          <w:lang w:val="pt-BR"/>
+        </w:rPr>
+      </w:pPr>
+      <w:r>
+        <w:rPr>
+          <w:lang w:val="pt-BR"/>
+        </w:rPr>
+        <w:br/>
+      </w:r>
+      <w:r>
+        <w:rPr>
+          <w:lang w:val="pt-BR"/>
+        </w:rPr>
+        <w:br/>
+        <w:t>Para garantir o correto funcionamento das classes</w:t>
+      </w:r>
+      <w:r>
+        <w:rPr>
+          <w:lang w:val="pt-BR"/>
+        </w:rPr>
+        <w:t xml:space="preserve">, </w:t>
+      </w:r>
+      <w:r>
+        <w:rPr>
+          <w:lang w:val="pt-BR"/>
+        </w:rPr>
+        <w:t>foram realizados testes unitá</w:t>
+      </w:r>
+      <w:r>
+        <w:rPr>
+          <w:lang w:val="pt-BR"/>
+        </w:rPr>
+        <w:t>rios utilizando a framework Goog</w:t>
+      </w:r>
+      <w:r>
+        <w:rPr>
+          <w:lang w:val="pt-BR"/>
+        </w:rPr>
+        <w:t xml:space="preserve">le C++ Testing Framework. Os testes feitos, cobrem </w:t>
+      </w:r>
+      <w:r>
+        <w:rPr>
+          <w:lang w:val="pt-BR"/>
+        </w:rPr>
+        <w:t>construtores</w:t>
+      </w:r>
+      <w:r>
+        <w:rPr>
+          <w:lang w:val="pt-BR"/>
+        </w:rPr>
+        <w:t>, funções e operadores de cada classe presente no projeto.</w:t>
+      </w:r>
+    </w:p>
+    <w:p>
+      <w:pPr>
+        <w:pStyle w:val="p1a"/>
+        <w:rPr>
+          <w:lang w:val="pt-BR"/>
+        </w:rPr>
+      </w:pPr>
+      <w:r>
+        <w:rPr>
+          <w:lang w:val="pt-BR"/>
+        </w:rPr>
+        <w:br/>
+        <w:t>Segue-se um exemplo de teste</w:t>
+      </w:r>
+      <w:r>
+        <w:rPr>
+          <w:lang w:val="pt-BR"/>
+        </w:rPr>
+        <w:t xml:space="preserve"> realizado</w:t>
+      </w:r>
+      <w:r>
+        <w:rPr>
+          <w:lang w:val="pt-BR"/>
+        </w:rPr>
+        <w:t xml:space="preserve"> </w:t>
+      </w:r>
+      <w:r>
+        <w:rPr>
+          <w:lang w:val="pt-BR"/>
+        </w:rPr>
+        <w:t>de cada classe.</w:t>
       </w:r>
     </w:p>
     <w:p>
       <w:pPr>
         <w:pStyle w:val="Legenda"/>
-      </w:pPr>
-      <w:r>
-        <w:t xml:space="preserve">Fig. </w:t>
-      </w:r>
-      <w:r>
-        <w:t>20</w:t>
-      </w:r>
-      <w:r>
-        <w:t>. Código de View.h</w:t>
-      </w:r>
-    </w:p>
-    <w:p>
-      <w:pPr>
-        <w:ind w:firstLine="0"/>
-        <w:jc w:val="center"/>
-        <w:rPr>
-          <w:noProof/>
-          <w:lang w:val="pt-BR" w:eastAsia="pt-PT"/>
-        </w:rPr>
-      </w:pPr>
-      <w:r>
-        <w:rPr>
-          <w:noProof/>
-          <w:lang w:val="pt-BR" w:eastAsia="pt-PT"/>
-        </w:rPr>
-        <w:lastRenderedPageBreak/>
-        <w:pict w14:anchorId="6A559318">
-          <v:shape id="_x0000_i1046" type="#_x0000_t75" style="width:329.4pt;height:290.4pt;visibility:visible;mso-wrap-style:square">
-            <v:imagedata r:id="rId30" o:title=""/>
-          </v:shape>
-        </w:pict>
+        <w:jc w:val="both"/>
+      </w:pPr>
+      <w:r>
+        <w:br/>
+      </w:r>
+      <w:r>
+        <w:rPr>
+          <w:sz w:val="20"/>
+        </w:rPr>
+        <w:t>Exemplo de teste para a classe Player:</w:t>
+      </w:r>
+      <w:r>
+        <w:br/>
+      </w:r>
+      <w:r>
+        <w:br/>
+        <w:t>Este teste verifica que o construtor da classe Player lança uma InvalidDataException quando o nickname introduzido pelo jogador, tem menos de 3 caracteres. Com isto, este teste assegura que a validação do nickname está corretamente implementada no projeto.</w:t>
+      </w:r>
+      <w:r>
+        <w:br/>
       </w:r>
     </w:p>
     <w:p>
@@ -9221,338 +9405,92 @@
         <w:pStyle w:val="Legenda"/>
       </w:pPr>
       <w:r>
-        <w:t xml:space="preserve">Fig. </w:t>
-      </w:r>
-      <w:r>
-        <w:t>21</w:t>
-      </w:r>
-      <w:r>
-        <w:t>. Código em showBoard() em View.cpp</w:t>
-      </w:r>
-    </w:p>
-    <w:p>
-      <w:pPr>
-        <w:pStyle w:val="p1a"/>
-        <w:rPr>
-          <w:lang w:val="pt-BR" w:eastAsia="pt-PT"/>
-        </w:rPr>
-      </w:pPr>
-      <w:r>
-        <w:rPr>
-          <w:rStyle w:val="Forte"/>
-          <w:b w:val="0"/>
-          <w:lang w:val="pt-BR"/>
-        </w:rPr>
-        <w:t>View</w:t>
-      </w:r>
-      <w:r>
-        <w:rPr>
-          <w:lang w:val="pt-BR"/>
-        </w:rPr>
-        <w:t xml:space="preserve"> é a classe responsável pela interação com o utilizador através da consola. Mostra o tabuleiro, recebe as jogadas e apresenta mensagens e resultados do jogo. Também oculta os navios do adversário durante a partida e exibir as estatísticas finais quando o jogo termina.</w:t>
-      </w:r>
-    </w:p>
-    <w:p>
-      <w:pPr>
-        <w:pStyle w:val="heading2"/>
-        <w:rPr>
-          <w:lang w:val="pt-BR"/>
-        </w:rPr>
-      </w:pPr>
-      <w:r>
-        <w:rPr>
-          <w:lang w:val="pt-BR"/>
-        </w:rPr>
-        <w:lastRenderedPageBreak/>
-        <w:t>1</w:t>
-      </w:r>
-      <w:r>
-        <w:rPr>
-          <w:lang w:val="pt-BR"/>
-        </w:rPr>
-        <w:t>2</w:t>
-      </w:r>
-      <w:r>
-        <w:rPr>
-          <w:lang w:val="pt-BR"/>
-        </w:rPr>
-        <w:t>.8   Controller</w:t>
-      </w:r>
-    </w:p>
-    <w:p>
-      <w:pPr>
-        <w:pStyle w:val="Legenda"/>
-      </w:pPr>
-      <w:r>
-        <w:pict w14:anchorId="1B5E44F9">
-          <v:shape id="_x0000_i1047" type="#_x0000_t75" style="width:237.6pt;height:345.6pt;visibility:visible;mso-wrap-style:square">
-            <v:imagedata r:id="rId31" o:title=""/>
-          </v:shape>
-        </w:pict>
-      </w:r>
-    </w:p>
-    <w:p>
-      <w:pPr>
-        <w:pStyle w:val="Legenda"/>
-      </w:pPr>
-      <w:r>
-        <w:t>Fig. 2</w:t>
-      </w:r>
-      <w:r>
-        <w:t>2</w:t>
-      </w:r>
-      <w:r>
-        <w:t>. Código de Controller.h</w:t>
-      </w:r>
-    </w:p>
-    <w:p>
-      <w:pPr>
-        <w:jc w:val="center"/>
-        <w:rPr>
-          <w:noProof/>
-          <w:lang w:val="pt-BR" w:eastAsia="pt-PT"/>
-        </w:rPr>
-      </w:pPr>
-      <w:r>
-        <w:rPr>
-          <w:noProof/>
-          <w:lang w:val="pt-BR" w:eastAsia="pt-PT"/>
-        </w:rPr>
-        <w:lastRenderedPageBreak/>
-        <w:pict w14:anchorId="447639AE">
-          <v:shape id="_x0000_i1048" type="#_x0000_t75" style="width:202.2pt;height:370.2pt;visibility:visible;mso-wrap-style:square">
+        <w:br/>
+      </w:r>
+      <w:r>
+        <w:pict w14:anchorId="5D785E8A">
+          <v:shape id="_x0000_i1048" type="#_x0000_t75" style="width:343.2pt;height:162pt;visibility:visible">
             <v:imagedata r:id="rId32" o:title=""/>
           </v:shape>
         </w:pict>
       </w:r>
+      <w:r>
+        <w:br/>
+      </w:r>
+      <w:r>
+        <w:t xml:space="preserve">                   Fig. </w:t>
+      </w:r>
+      <w:r>
+        <w:t>24</w:t>
+      </w:r>
+      <w:r>
+        <w:t>. Teste unitário da classe Player – validação do nickname</w:t>
+      </w:r>
     </w:p>
     <w:p>
       <w:pPr>
         <w:pStyle w:val="Legenda"/>
       </w:pPr>
-      <w:r>
-        <w:t>Fig. 2</w:t>
-      </w:r>
-      <w:r>
-        <w:t>3</w:t>
-      </w:r>
-      <w:r>
-        <w:t>. Código de runMain() em Controller.cpp</w:t>
-      </w:r>
     </w:p>
     <w:p>
       <w:pPr>
         <w:pStyle w:val="Legenda"/>
-        <w:jc w:val="both"/>
-        <w:rPr>
-          <w:rStyle w:val="p1aZchn"/>
-          <w:b/>
+        <w:jc w:val="left"/>
+      </w:pPr>
+      <w:r>
+        <w:br/>
+      </w:r>
+      <w:r>
+        <w:rPr>
           <w:sz w:val="20"/>
-          <w:lang w:val="pt-BR"/>
-        </w:rPr>
-      </w:pPr>
-      <w:r>
-        <w:rPr>
-          <w:rStyle w:val="p1aZchn"/>
+        </w:rPr>
+        <w:t>Exemplo de teste para a classe Ship:</w:t>
+      </w:r>
+      <w:r>
+        <w:br/>
+      </w:r>
+      <w:r>
+        <w:br/>
+      </w:r>
+      <w:r>
+        <w:rPr>
           <w:sz w:val="20"/>
-          <w:lang w:val="pt-BR"/>
-        </w:rPr>
-        <w:t>Controller é a classe principal da aplicação, responsável por ligar a View, os Services e o Model. Controla o fluxo do programa, recebendo ações do utilizador, executando as regras de negócio e atualizando o estado do jogo. Além disso, organiza as diferentes funcionalidades em métodos separados.</w:t>
-      </w:r>
-    </w:p>
-    <w:p>
-      <w:pPr>
-        <w:pStyle w:val="heading1"/>
-        <w:rPr>
-          <w:lang w:val="pt-BR"/>
-        </w:rPr>
-      </w:pPr>
-      <w:r>
-        <w:rPr>
-          <w:rStyle w:val="p1aZchn"/>
-          <w:b w:val="0"/>
-          <w:sz w:val="20"/>
-          <w:lang w:val="pt-BR"/>
-        </w:rPr>
-        <w:br w:type="page"/>
-      </w:r>
-      <w:r>
-        <w:rPr>
-          <w:lang w:val="pt-BR"/>
-        </w:rPr>
+        </w:rPr>
+        <w:t>Este teste verifica que um navio é considerado afundado, após receber um número de hits igual ao seu tamanho. Neste caso, foram adicionados 2 hits, dado o tamanho da fragata.  Este teste comprova que o método isSunk() reflete o estado do navio ao longo da partida.</w:t>
+      </w:r>
+    </w:p>
+    <w:p>
+      <w:pPr>
+        <w:pStyle w:val="Legenda"/>
+      </w:pPr>
+      <w:r>
         <w:lastRenderedPageBreak/>
         <w:br/>
       </w:r>
       <w:r>
-        <w:rPr>
-          <w:lang w:val="pt-BR"/>
-        </w:rPr>
-        <w:t>1</w:t>
-      </w:r>
-      <w:r>
-        <w:rPr>
-          <w:lang w:val="pt-BR"/>
-        </w:rPr>
-        <w:t>3</w:t>
-      </w:r>
-      <w:r>
-        <w:rPr>
-          <w:lang w:val="pt-BR"/>
-        </w:rPr>
-        <w:t xml:space="preserve">   Testes</w:t>
-      </w:r>
-    </w:p>
-    <w:p>
-      <w:pPr>
-        <w:pStyle w:val="p1a"/>
-        <w:rPr>
-          <w:lang w:val="pt-BR"/>
-        </w:rPr>
-      </w:pPr>
-      <w:r>
-        <w:rPr>
-          <w:lang w:val="pt-BR"/>
-        </w:rPr>
-        <w:br/>
-      </w:r>
-      <w:r>
-        <w:rPr>
-          <w:lang w:val="pt-BR"/>
-        </w:rPr>
-        <w:br/>
-        <w:t>Para garantir o correto funcionamento das classes</w:t>
-      </w:r>
-      <w:r>
-        <w:rPr>
-          <w:lang w:val="pt-BR"/>
-        </w:rPr>
-        <w:t xml:space="preserve">, </w:t>
-      </w:r>
-      <w:r>
-        <w:rPr>
-          <w:lang w:val="pt-BR"/>
-        </w:rPr>
-        <w:t>foram realizados testes unitá</w:t>
-      </w:r>
-      <w:r>
-        <w:rPr>
-          <w:lang w:val="pt-BR"/>
-        </w:rPr>
-        <w:t>rios utilizando a framework Goog</w:t>
-      </w:r>
-      <w:r>
-        <w:rPr>
-          <w:lang w:val="pt-BR"/>
-        </w:rPr>
-        <w:t xml:space="preserve">le C++ Testing Framework. Os testes feitos, cobrem </w:t>
-      </w:r>
-      <w:r>
-        <w:rPr>
-          <w:lang w:val="pt-BR"/>
-        </w:rPr>
-        <w:t>construtores</w:t>
-      </w:r>
-      <w:r>
-        <w:rPr>
-          <w:lang w:val="pt-BR"/>
-        </w:rPr>
-        <w:t>, funções e operadores de cada classe presente no projeto.</w:t>
-      </w:r>
-    </w:p>
-    <w:p>
-      <w:pPr>
-        <w:pStyle w:val="p1a"/>
-        <w:rPr>
-          <w:lang w:val="pt-BR"/>
-        </w:rPr>
-      </w:pPr>
-      <w:r>
-        <w:rPr>
-          <w:lang w:val="pt-BR"/>
-        </w:rPr>
-        <w:br/>
-        <w:t>Segue-se um exemplo de teste</w:t>
-      </w:r>
-      <w:r>
-        <w:rPr>
-          <w:lang w:val="pt-BR"/>
-        </w:rPr>
-        <w:t xml:space="preserve"> realizado</w:t>
-      </w:r>
-      <w:r>
-        <w:rPr>
-          <w:lang w:val="pt-BR"/>
-        </w:rPr>
-        <w:t xml:space="preserve"> </w:t>
-      </w:r>
-      <w:r>
-        <w:rPr>
-          <w:lang w:val="pt-BR"/>
-        </w:rPr>
-        <w:t>de cada classe.</w:t>
-      </w:r>
-    </w:p>
-    <w:p>
-      <w:pPr>
-        <w:pStyle w:val="Legenda"/>
-        <w:jc w:val="both"/>
-      </w:pPr>
-      <w:r>
-        <w:br/>
-      </w:r>
-      <w:r>
-        <w:rPr>
-          <w:sz w:val="20"/>
-        </w:rPr>
-        <w:t>Exemplo de teste para a classe Player:</w:t>
-      </w:r>
-      <w:r>
-        <w:br/>
-      </w:r>
-      <w:r>
-        <w:br/>
-        <w:t>Este teste verifica que o construtor da classe Player lança uma InvalidDataException quando o nickname introduzido pelo jogador, tem menos de 3 caracteres. Com isto, este teste assegura que a validação do nickname está corretamente implementada no projeto.</w:t>
-      </w:r>
-      <w:r>
-        <w:br/>
-      </w:r>
-    </w:p>
-    <w:p>
-      <w:pPr>
-        <w:pStyle w:val="Legenda"/>
-      </w:pPr>
-      <w:r>
-        <w:br/>
-      </w:r>
-      <w:r>
-        <w:pict w14:anchorId="5D785E8A">
-          <v:shape id="_x0000_i1049" type="#_x0000_t75" style="width:343.2pt;height:162pt;visibility:visible">
+        <w:pict w14:anchorId="6DCFBF81">
+          <v:shape id="_x0000_i1049" type="#_x0000_t75" style="width:346.2pt;height:103.2pt;visibility:visible">
             <v:imagedata r:id="rId33" o:title=""/>
           </v:shape>
         </w:pict>
       </w:r>
       <w:r>
+        <w:t xml:space="preserve">                  Fig. </w:t>
+      </w:r>
+      <w:r>
+        <w:t>25</w:t>
+      </w:r>
+      <w:r>
+        <w:t>. Teste unitário da classe Ship – verificação de navio afundado</w:t>
+      </w:r>
+      <w:r>
         <w:br/>
       </w:r>
-      <w:r>
-        <w:t xml:space="preserve">                   Fig. </w:t>
-      </w:r>
-      <w:r>
-        <w:t>24</w:t>
-      </w:r>
-      <w:r>
-        <w:t>. Teste unitário da classe Player – validação do nickname</w:t>
-      </w:r>
     </w:p>
     <w:p>
       <w:pPr>
         <w:pStyle w:val="Legenda"/>
-      </w:pPr>
-    </w:p>
-    <w:p>
-      <w:pPr>
-        <w:pStyle w:val="Legenda"/>
-        <w:jc w:val="left"/>
+        <w:jc w:val="both"/>
       </w:pPr>
       <w:r>
         <w:br/>
@@ -9561,81 +9499,79 @@
         <w:rPr>
           <w:sz w:val="20"/>
         </w:rPr>
-        <w:t>Exemplo de teste para a classe Ship:</w:t>
+        <w:t xml:space="preserve">Exemplo de teste para a classe </w:t>
+      </w:r>
+      <w:r>
+        <w:rPr>
+          <w:sz w:val="20"/>
+        </w:rPr>
+        <w:t>Board</w:t>
+      </w:r>
+      <w:r>
+        <w:rPr>
+          <w:sz w:val="20"/>
+        </w:rPr>
+        <w:t>:</w:t>
       </w:r>
       <w:r>
         <w:br/>
       </w:r>
       <w:r>
         <w:br/>
-      </w:r>
-      <w:r>
-        <w:rPr>
-          <w:sz w:val="20"/>
-        </w:rPr>
-        <w:t>Este teste verifica que um navio é considerado afundado, após receber um número de hits igual ao seu tamanho. Neste caso, foram adicionados 2 hits, dado o tamanho da fragata.  Este teste comprova que o método isSunk() reflete o estado do navio ao longo da partida.</w:t>
-      </w:r>
-    </w:p>
-    <w:p>
-      <w:pPr>
-        <w:pStyle w:val="Legenda"/>
-      </w:pPr>
-      <w:r>
-        <w:lastRenderedPageBreak/>
+        <w:t>Este teste verifica que ao efetuar um disparo numa célula ocupada por um navio, neste caso novamente uma fragata, o método registerShot() devolve “X” e atualiza o estado do tabuleiro. Isto garante que ao longo da partida, após cada jogada, o tabuleiro é atualizado de forma correta.</w:t>
+      </w:r>
+      <w:r>
         <w:br/>
       </w:r>
       <w:r>
-        <w:pict w14:anchorId="6DCFBF81">
-          <v:shape id="_x0000_i1050" type="#_x0000_t75" style="width:346.2pt;height:103.2pt;visibility:visible">
+        <w:br/>
+      </w:r>
+      <w:r>
+        <w:pict w14:anchorId="55F29CDE">
+          <v:shape id="_x0000_i1050" type="#_x0000_t75" style="width:349.8pt;height:129.6pt;visibility:visible">
             <v:imagedata r:id="rId34" o:title=""/>
           </v:shape>
         </w:pict>
       </w:r>
       <w:r>
-        <w:t xml:space="preserve">                  Fig. </w:t>
-      </w:r>
-      <w:r>
-        <w:t>25</w:t>
-      </w:r>
-      <w:r>
-        <w:t>. Teste unitário da classe Ship – verificação de navio afundado</w:t>
+        <w:t xml:space="preserve">                    Fig. </w:t>
+      </w:r>
+      <w:r>
+        <w:t>26</w:t>
+      </w:r>
+      <w:r>
+        <w:t xml:space="preserve">. Teste unitário da classe Board – registo de tiro no navio                   </w:t>
       </w:r>
       <w:r>
         <w:br/>
       </w:r>
-    </w:p>
-    <w:p>
-      <w:pPr>
-        <w:pStyle w:val="Legenda"/>
-        <w:jc w:val="both"/>
-      </w:pPr>
       <w:r>
         <w:br/>
       </w:r>
       <w:r>
+        <w:br/>
+      </w:r>
+      <w:r>
+        <w:br/>
+      </w:r>
+      <w:r>
         <w:rPr>
           <w:sz w:val="20"/>
         </w:rPr>
-        <w:t xml:space="preserve">Exemplo de teste para a classe </w:t>
-      </w:r>
-      <w:r>
-        <w:rPr>
-          <w:sz w:val="20"/>
-        </w:rPr>
-        <w:t>Board</w:t>
-      </w:r>
-      <w:r>
-        <w:rPr>
-          <w:sz w:val="20"/>
-        </w:rPr>
-        <w:t>:</w:t>
+        <w:t>Exemplo de teste para a classe Game:</w:t>
       </w:r>
       <w:r>
         <w:br/>
       </w:r>
       <w:r>
         <w:br/>
-        <w:t>Este teste verifica que ao efetuar um disparo numa célula ocupada por um navio, neste caso novamente uma fragata, o método registerShot() devolve “X” e atualiza o estado do tabuleiro. Isto garante que ao longo da partida, após cada jogada, o tabuleiro é atualizado de forma correta.</w:t>
+        <w:t xml:space="preserve">Este teste verifica que quando um jogador acerta num navio do adversário, o turno não é alterado, permitindo assim que o jogador continue a jogar até falhar algum navio. Isto verifica que o projeto segue a regra do jogo </w:t>
+      </w:r>
+      <w:r>
+        <w:t>clássico</w:t>
+      </w:r>
+      <w:r>
+        <w:t xml:space="preserve"> de batalha naval.</w:t>
       </w:r>
       <w:r>
         <w:br/>
@@ -9644,67 +9580,14 @@
         <w:br/>
       </w:r>
       <w:r>
-        <w:pict w14:anchorId="55F29CDE">
-          <v:shape id="_x0000_i1051" type="#_x0000_t75" style="width:349.8pt;height:129.6pt;visibility:visible">
+        <w:lastRenderedPageBreak/>
+        <w:pict w14:anchorId="5778C4CB">
+          <v:shape id="_x0000_i1051" type="#_x0000_t75" style="width:345.6pt;height:154.8pt;visibility:visible">
             <v:imagedata r:id="rId35" o:title=""/>
           </v:shape>
         </w:pict>
       </w:r>
       <w:r>
-        <w:t xml:space="preserve">                    Fig. </w:t>
-      </w:r>
-      <w:r>
-        <w:t>26</w:t>
-      </w:r>
-      <w:r>
-        <w:t xml:space="preserve">. Teste unitário da classe Board – registo de tiro no navio                   </w:t>
-      </w:r>
-      <w:r>
-        <w:br/>
-      </w:r>
-      <w:r>
-        <w:br/>
-      </w:r>
-      <w:r>
-        <w:br/>
-      </w:r>
-      <w:r>
-        <w:br/>
-      </w:r>
-      <w:r>
-        <w:rPr>
-          <w:sz w:val="20"/>
-        </w:rPr>
-        <w:t>Exemplo de teste para a classe Game:</w:t>
-      </w:r>
-      <w:r>
-        <w:br/>
-      </w:r>
-      <w:r>
-        <w:br/>
-        <w:t xml:space="preserve">Este teste verifica que quando um jogador acerta num navio do adversário, o turno não é alterado, permitindo assim que o jogador continue a jogar até falhar algum navio. Isto verifica que o projeto segue a regra do jogo </w:t>
-      </w:r>
-      <w:r>
-        <w:t>clássico</w:t>
-      </w:r>
-      <w:r>
-        <w:t xml:space="preserve"> de batalha naval.</w:t>
-      </w:r>
-      <w:r>
-        <w:br/>
-      </w:r>
-      <w:r>
-        <w:br/>
-      </w:r>
-      <w:r>
-        <w:lastRenderedPageBreak/>
-        <w:pict w14:anchorId="5778C4CB">
-          <v:shape id="_x0000_i1052" type="#_x0000_t75" style="width:345.6pt;height:154.8pt;visibility:visible">
-            <v:imagedata r:id="rId36" o:title=""/>
-          </v:shape>
-        </w:pict>
-      </w:r>
-      <w:r>
         <w:br/>
         <w:t xml:space="preserve">                Fig. </w:t>
       </w:r>
@@ -9758,8 +9641,8 @@
       </w:r>
       <w:r>
         <w:pict w14:anchorId="4F2278E9">
-          <v:shape id="_x0000_i1053" type="#_x0000_t75" style="width:351pt;height:165.6pt;visibility:visible">
-            <v:imagedata r:id="rId37" o:title=""/>
+          <v:shape id="_x0000_i1052" type="#_x0000_t75" style="width:351pt;height:165.6pt;visibility:visible">
+            <v:imagedata r:id="rId36" o:title=""/>
           </v:shape>
         </w:pict>
       </w:r>
@@ -16839,7 +16722,7 @@
 </file>
 
 <file path=customXml/itemProps1.xml><?xml version="1.0" encoding="utf-8"?>
-<ds:datastoreItem xmlns:ds="http://schemas.openxmlformats.org/officeDocument/2006/customXml" ds:itemID="{6CFEFB6A-FEF1-4AB0-B8D2-D6DAECF756C7}">
+<ds:datastoreItem xmlns:ds="http://schemas.openxmlformats.org/officeDocument/2006/customXml" ds:itemID="{48D33C1A-2339-4FF1-825C-A69107D808C7}">
   <ds:schemaRefs>
     <ds:schemaRef ds:uri="http://schemas.openxmlformats.org/officeDocument/2006/bibliography"/>
   </ds:schemaRefs>

</xml_diff>